<commit_message>
docs(tutorial): added detailed tutorial document for the framework
</commit_message>
<xml_diff>
--- a/tutorial/tutorial.docx
+++ b/tutorial/tutorial.docx
@@ -7,7 +7,7 @@
         <w:pStyle w:val="Heading1"/>
       </w:pPr>
       <w:bookmarkStart w:id="0" w:name="_Toc227102997"/>
-      <w:bookmarkStart w:id="1" w:name="_Toc227103161"/>
+      <w:bookmarkStart w:id="1" w:name="_Toc227105560"/>
       <w:r>
         <w:rPr>
           <w:sz w:val="52"/>
@@ -106,6 +106,14 @@
     </w:p>
     <w:sdt>
       <w:sdtPr>
+        <w:rPr>
+          <w:rFonts w:asciiTheme="minorHAnsi" w:eastAsiaTheme="minorEastAsia" w:hAnsiTheme="minorHAnsi" w:cstheme="minorBidi"/>
+          <w:b w:val="0"/>
+          <w:bCs w:val="0"/>
+          <w:color w:val="auto"/>
+          <w:sz w:val="22"/>
+          <w:szCs w:val="22"/>
+        </w:rPr>
         <w:id w:val="-226529628"/>
         <w:docPartObj>
           <w:docPartGallery w:val="Table of Contents"/>
@@ -114,11 +122,7 @@
       </w:sdtPr>
       <w:sdtEndPr>
         <w:rPr>
-          <w:rFonts w:asciiTheme="minorHAnsi" w:eastAsiaTheme="minorEastAsia" w:hAnsiTheme="minorHAnsi" w:cstheme="minorBidi"/>
           <w:noProof/>
-          <w:color w:val="auto"/>
-          <w:sz w:val="22"/>
-          <w:szCs w:val="22"/>
         </w:rPr>
       </w:sdtEndPr>
       <w:sdtContent>
@@ -153,27 +157,13 @@
           <w:r>
             <w:fldChar w:fldCharType="separate"/>
           </w:r>
-          <w:hyperlink w:anchor="_Toc227103161" w:history="1">
+          <w:hyperlink w:anchor="_Toc227105560" w:history="1">
             <w:r>
               <w:rPr>
                 <w:rStyle w:val="Hyperlink"/>
                 <w:noProof/>
               </w:rPr>
-              <w:t>Selenium Pytho</w:t>
-            </w:r>
-            <w:r>
-              <w:rPr>
-                <w:rStyle w:val="Hyperlink"/>
-                <w:noProof/>
-              </w:rPr>
-              <w:t>n</w:t>
-            </w:r>
-            <w:r>
-              <w:rPr>
-                <w:rStyle w:val="Hyperlink"/>
-                <w:noProof/>
-              </w:rPr>
-              <w:t xml:space="preserve"> Automation Framework</w:t>
+              <w:t>Selenium Python Automation Framework</w:t>
             </w:r>
             <w:r>
               <w:rPr>
@@ -194,7 +184,7 @@
                 <w:noProof/>
                 <w:webHidden/>
               </w:rPr>
-              <w:instrText xml:space="preserve"> PAGEREF _Toc227103161 \h </w:instrText>
+              <w:instrText xml:space="preserve"> PAGEREF _Toc227105560 \h </w:instrText>
             </w:r>
             <w:r>
               <w:rPr>
@@ -239,27 +229,13 @@
               <w14:ligatures w14:val="standardContextual"/>
             </w:rPr>
           </w:pPr>
-          <w:hyperlink w:anchor="_Toc227103162" w:history="1">
+          <w:hyperlink w:anchor="_Toc227105561" w:history="1">
             <w:r>
               <w:rPr>
                 <w:rStyle w:val="Hyperlink"/>
                 <w:noProof/>
               </w:rPr>
-              <w:t>Chapter 1: Intr</w:t>
-            </w:r>
-            <w:r>
-              <w:rPr>
-                <w:rStyle w:val="Hyperlink"/>
-                <w:noProof/>
-              </w:rPr>
-              <w:t>o</w:t>
-            </w:r>
-            <w:r>
-              <w:rPr>
-                <w:rStyle w:val="Hyperlink"/>
-                <w:noProof/>
-              </w:rPr>
-              <w:t>duction &amp; Overview</w:t>
+              <w:t>Chapter 1: Introduction &amp; Overview</w:t>
             </w:r>
             <w:r>
               <w:rPr>
@@ -280,7 +256,7 @@
                 <w:noProof/>
                 <w:webHidden/>
               </w:rPr>
-              <w:instrText xml:space="preserve"> PAGEREF _Toc227103162 \h </w:instrText>
+              <w:instrText xml:space="preserve"> PAGEREF _Toc227105561 \h </w:instrText>
             </w:r>
             <w:r>
               <w:rPr>
@@ -325,7 +301,7 @@
               <w14:ligatures w14:val="standardContextual"/>
             </w:rPr>
           </w:pPr>
-          <w:hyperlink w:anchor="_Toc227103163" w:history="1">
+          <w:hyperlink w:anchor="_Toc227105562" w:history="1">
             <w:r>
               <w:rPr>
                 <w:rStyle w:val="Hyperlink"/>
@@ -352,7 +328,7 @@
                 <w:noProof/>
                 <w:webHidden/>
               </w:rPr>
-              <w:instrText xml:space="preserve"> PAGEREF _Toc227103163 \h </w:instrText>
+              <w:instrText xml:space="preserve"> PAGEREF _Toc227105562 \h </w:instrText>
             </w:r>
             <w:r>
               <w:rPr>
@@ -397,27 +373,13 @@
               <w14:ligatures w14:val="standardContextual"/>
             </w:rPr>
           </w:pPr>
-          <w:hyperlink w:anchor="_Toc227103164" w:history="1">
+          <w:hyperlink w:anchor="_Toc227105563" w:history="1">
             <w:r>
               <w:rPr>
                 <w:rStyle w:val="Hyperlink"/>
                 <w:noProof/>
               </w:rPr>
-              <w:t>1.2 Key Ca</w:t>
-            </w:r>
-            <w:r>
-              <w:rPr>
-                <w:rStyle w:val="Hyperlink"/>
-                <w:noProof/>
-              </w:rPr>
-              <w:t>p</w:t>
-            </w:r>
-            <w:r>
-              <w:rPr>
-                <w:rStyle w:val="Hyperlink"/>
-                <w:noProof/>
-              </w:rPr>
-              <w:t>abilities</w:t>
+              <w:t>1.2 Key Capabilities</w:t>
             </w:r>
             <w:r>
               <w:rPr>
@@ -438,7 +400,7 @@
                 <w:noProof/>
                 <w:webHidden/>
               </w:rPr>
-              <w:instrText xml:space="preserve"> PAGEREF _Toc227103164 \h </w:instrText>
+              <w:instrText xml:space="preserve"> PAGEREF _Toc227105563 \h </w:instrText>
             </w:r>
             <w:r>
               <w:rPr>
@@ -483,7 +445,7 @@
               <w14:ligatures w14:val="standardContextual"/>
             </w:rPr>
           </w:pPr>
-          <w:hyperlink w:anchor="_Toc227103165" w:history="1">
+          <w:hyperlink w:anchor="_Toc227105564" w:history="1">
             <w:r>
               <w:rPr>
                 <w:rStyle w:val="Hyperlink"/>
@@ -510,7 +472,7 @@
                 <w:noProof/>
                 <w:webHidden/>
               </w:rPr>
-              <w:instrText xml:space="preserve"> PAGEREF _Toc227103165 \h </w:instrText>
+              <w:instrText xml:space="preserve"> PAGEREF _Toc227105564 \h </w:instrText>
             </w:r>
             <w:r>
               <w:rPr>
@@ -555,7 +517,7 @@
               <w14:ligatures w14:val="standardContextual"/>
             </w:rPr>
           </w:pPr>
-          <w:hyperlink w:anchor="_Toc227103166" w:history="1">
+          <w:hyperlink w:anchor="_Toc227105565" w:history="1">
             <w:r>
               <w:rPr>
                 <w:rStyle w:val="Hyperlink"/>
@@ -582,7 +544,7 @@
                 <w:noProof/>
                 <w:webHidden/>
               </w:rPr>
-              <w:instrText xml:space="preserve"> PAGEREF _Toc227103166 \h </w:instrText>
+              <w:instrText xml:space="preserve"> PAGEREF _Toc227105565 \h </w:instrText>
             </w:r>
             <w:r>
               <w:rPr>
@@ -627,7 +589,7 @@
               <w14:ligatures w14:val="standardContextual"/>
             </w:rPr>
           </w:pPr>
-          <w:hyperlink w:anchor="_Toc227103167" w:history="1">
+          <w:hyperlink w:anchor="_Toc227105566" w:history="1">
             <w:r>
               <w:rPr>
                 <w:rStyle w:val="Hyperlink"/>
@@ -654,7 +616,7 @@
                 <w:noProof/>
                 <w:webHidden/>
               </w:rPr>
-              <w:instrText xml:space="preserve"> PAGEREF _Toc227103167 \h </w:instrText>
+              <w:instrText xml:space="preserve"> PAGEREF _Toc227105566 \h </w:instrText>
             </w:r>
             <w:r>
               <w:rPr>
@@ -699,7 +661,7 @@
               <w14:ligatures w14:val="standardContextual"/>
             </w:rPr>
           </w:pPr>
-          <w:hyperlink w:anchor="_Toc227103168" w:history="1">
+          <w:hyperlink w:anchor="_Toc227105567" w:history="1">
             <w:r>
               <w:rPr>
                 <w:rStyle w:val="Hyperlink"/>
@@ -726,7 +688,7 @@
                 <w:noProof/>
                 <w:webHidden/>
               </w:rPr>
-              <w:instrText xml:space="preserve"> PAGEREF _Toc227103168 \h </w:instrText>
+              <w:instrText xml:space="preserve"> PAGEREF _Toc227105567 \h </w:instrText>
             </w:r>
             <w:r>
               <w:rPr>
@@ -771,7 +733,7 @@
               <w14:ligatures w14:val="standardContextual"/>
             </w:rPr>
           </w:pPr>
-          <w:hyperlink w:anchor="_Toc227103169" w:history="1">
+          <w:hyperlink w:anchor="_Toc227105568" w:history="1">
             <w:r>
               <w:rPr>
                 <w:rStyle w:val="Hyperlink"/>
@@ -798,7 +760,7 @@
                 <w:noProof/>
                 <w:webHidden/>
               </w:rPr>
-              <w:instrText xml:space="preserve"> PAGEREF _Toc227103169 \h </w:instrText>
+              <w:instrText xml:space="preserve"> PAGEREF _Toc227105568 \h </w:instrText>
             </w:r>
             <w:r>
               <w:rPr>
@@ -843,7 +805,7 @@
               <w14:ligatures w14:val="standardContextual"/>
             </w:rPr>
           </w:pPr>
-          <w:hyperlink w:anchor="_Toc227103170" w:history="1">
+          <w:hyperlink w:anchor="_Toc227105569" w:history="1">
             <w:r>
               <w:rPr>
                 <w:rStyle w:val="Hyperlink"/>
@@ -870,7 +832,7 @@
                 <w:noProof/>
                 <w:webHidden/>
               </w:rPr>
-              <w:instrText xml:space="preserve"> PAGEREF _Toc227103170 \h </w:instrText>
+              <w:instrText xml:space="preserve"> PAGEREF _Toc227105569 \h </w:instrText>
             </w:r>
             <w:r>
               <w:rPr>
@@ -915,7 +877,7 @@
               <w14:ligatures w14:val="standardContextual"/>
             </w:rPr>
           </w:pPr>
-          <w:hyperlink w:anchor="_Toc227103171" w:history="1">
+          <w:hyperlink w:anchor="_Toc227105570" w:history="1">
             <w:r>
               <w:rPr>
                 <w:rStyle w:val="Hyperlink"/>
@@ -942,7 +904,7 @@
                 <w:noProof/>
                 <w:webHidden/>
               </w:rPr>
-              <w:instrText xml:space="preserve"> PAGEREF _Toc227103171 \h </w:instrText>
+              <w:instrText xml:space="preserve"> PAGEREF _Toc227105570 \h </w:instrText>
             </w:r>
             <w:r>
               <w:rPr>
@@ -987,7 +949,7 @@
               <w14:ligatures w14:val="standardContextual"/>
             </w:rPr>
           </w:pPr>
-          <w:hyperlink w:anchor="_Toc227103172" w:history="1">
+          <w:hyperlink w:anchor="_Toc227105571" w:history="1">
             <w:r>
               <w:rPr>
                 <w:rStyle w:val="Hyperlink"/>
@@ -1014,7 +976,7 @@
                 <w:noProof/>
                 <w:webHidden/>
               </w:rPr>
-              <w:instrText xml:space="preserve"> PAGEREF _Toc227103172 \h </w:instrText>
+              <w:instrText xml:space="preserve"> PAGEREF _Toc227105571 \h </w:instrText>
             </w:r>
             <w:r>
               <w:rPr>
@@ -1059,7 +1021,7 @@
               <w14:ligatures w14:val="standardContextual"/>
             </w:rPr>
           </w:pPr>
-          <w:hyperlink w:anchor="_Toc227103173" w:history="1">
+          <w:hyperlink w:anchor="_Toc227105572" w:history="1">
             <w:r>
               <w:rPr>
                 <w:rStyle w:val="Hyperlink"/>
@@ -1086,7 +1048,7 @@
                 <w:noProof/>
                 <w:webHidden/>
               </w:rPr>
-              <w:instrText xml:space="preserve"> PAGEREF _Toc227103173 \h </w:instrText>
+              <w:instrText xml:space="preserve"> PAGEREF _Toc227105572 \h </w:instrText>
             </w:r>
             <w:r>
               <w:rPr>
@@ -1131,7 +1093,7 @@
               <w14:ligatures w14:val="standardContextual"/>
             </w:rPr>
           </w:pPr>
-          <w:hyperlink w:anchor="_Toc227103174" w:history="1">
+          <w:hyperlink w:anchor="_Toc227105573" w:history="1">
             <w:r>
               <w:rPr>
                 <w:rStyle w:val="Hyperlink"/>
@@ -1158,7 +1120,7 @@
                 <w:noProof/>
                 <w:webHidden/>
               </w:rPr>
-              <w:instrText xml:space="preserve"> PAGEREF _Toc227103174 \h </w:instrText>
+              <w:instrText xml:space="preserve"> PAGEREF _Toc227105573 \h </w:instrText>
             </w:r>
             <w:r>
               <w:rPr>
@@ -1203,7 +1165,7 @@
               <w14:ligatures w14:val="standardContextual"/>
             </w:rPr>
           </w:pPr>
-          <w:hyperlink w:anchor="_Toc227103175" w:history="1">
+          <w:hyperlink w:anchor="_Toc227105574" w:history="1">
             <w:r>
               <w:rPr>
                 <w:rStyle w:val="Hyperlink"/>
@@ -1230,7 +1192,7 @@
                 <w:noProof/>
                 <w:webHidden/>
               </w:rPr>
-              <w:instrText xml:space="preserve"> PAGEREF _Toc227103175 \h </w:instrText>
+              <w:instrText xml:space="preserve"> PAGEREF _Toc227105574 \h </w:instrText>
             </w:r>
             <w:r>
               <w:rPr>
@@ -1275,7 +1237,7 @@
               <w14:ligatures w14:val="standardContextual"/>
             </w:rPr>
           </w:pPr>
-          <w:hyperlink w:anchor="_Toc227103176" w:history="1">
+          <w:hyperlink w:anchor="_Toc227105575" w:history="1">
             <w:r>
               <w:rPr>
                 <w:rStyle w:val="Hyperlink"/>
@@ -1302,7 +1264,7 @@
                 <w:noProof/>
                 <w:webHidden/>
               </w:rPr>
-              <w:instrText xml:space="preserve"> PAGEREF _Toc227103176 \h </w:instrText>
+              <w:instrText xml:space="preserve"> PAGEREF _Toc227105575 \h </w:instrText>
             </w:r>
             <w:r>
               <w:rPr>
@@ -1347,7 +1309,7 @@
               <w14:ligatures w14:val="standardContextual"/>
             </w:rPr>
           </w:pPr>
-          <w:hyperlink w:anchor="_Toc227103177" w:history="1">
+          <w:hyperlink w:anchor="_Toc227105576" w:history="1">
             <w:r>
               <w:rPr>
                 <w:rStyle w:val="Hyperlink"/>
@@ -1374,7 +1336,7 @@
                 <w:noProof/>
                 <w:webHidden/>
               </w:rPr>
-              <w:instrText xml:space="preserve"> PAGEREF _Toc227103177 \h </w:instrText>
+              <w:instrText xml:space="preserve"> PAGEREF _Toc227105576 \h </w:instrText>
             </w:r>
             <w:r>
               <w:rPr>
@@ -1419,7 +1381,7 @@
               <w14:ligatures w14:val="standardContextual"/>
             </w:rPr>
           </w:pPr>
-          <w:hyperlink w:anchor="_Toc227103178" w:history="1">
+          <w:hyperlink w:anchor="_Toc227105577" w:history="1">
             <w:r>
               <w:rPr>
                 <w:rStyle w:val="Hyperlink"/>
@@ -1446,7 +1408,7 @@
                 <w:noProof/>
                 <w:webHidden/>
               </w:rPr>
-              <w:instrText xml:space="preserve"> PAGEREF _Toc227103178 \h </w:instrText>
+              <w:instrText xml:space="preserve"> PAGEREF _Toc227105577 \h </w:instrText>
             </w:r>
             <w:r>
               <w:rPr>
@@ -1491,7 +1453,7 @@
               <w14:ligatures w14:val="standardContextual"/>
             </w:rPr>
           </w:pPr>
-          <w:hyperlink w:anchor="_Toc227103179" w:history="1">
+          <w:hyperlink w:anchor="_Toc227105578" w:history="1">
             <w:r>
               <w:rPr>
                 <w:rStyle w:val="Hyperlink"/>
@@ -1518,7 +1480,7 @@
                 <w:noProof/>
                 <w:webHidden/>
               </w:rPr>
-              <w:instrText xml:space="preserve"> PAGEREF _Toc227103179 \h </w:instrText>
+              <w:instrText xml:space="preserve"> PAGEREF _Toc227105578 \h </w:instrText>
             </w:r>
             <w:r>
               <w:rPr>
@@ -1563,7 +1525,7 @@
               <w14:ligatures w14:val="standardContextual"/>
             </w:rPr>
           </w:pPr>
-          <w:hyperlink w:anchor="_Toc227103180" w:history="1">
+          <w:hyperlink w:anchor="_Toc227105579" w:history="1">
             <w:r>
               <w:rPr>
                 <w:rStyle w:val="Hyperlink"/>
@@ -1590,7 +1552,7 @@
                 <w:noProof/>
                 <w:webHidden/>
               </w:rPr>
-              <w:instrText xml:space="preserve"> PAGEREF _Toc227103180 \h </w:instrText>
+              <w:instrText xml:space="preserve"> PAGEREF _Toc227105579 \h </w:instrText>
             </w:r>
             <w:r>
               <w:rPr>
@@ -1635,7 +1597,7 @@
               <w14:ligatures w14:val="standardContextual"/>
             </w:rPr>
           </w:pPr>
-          <w:hyperlink w:anchor="_Toc227103181" w:history="1">
+          <w:hyperlink w:anchor="_Toc227105580" w:history="1">
             <w:r>
               <w:rPr>
                 <w:rStyle w:val="Hyperlink"/>
@@ -1662,7 +1624,7 @@
                 <w:noProof/>
                 <w:webHidden/>
               </w:rPr>
-              <w:instrText xml:space="preserve"> PAGEREF _Toc227103181 \h </w:instrText>
+              <w:instrText xml:space="preserve"> PAGEREF _Toc227105580 \h </w:instrText>
             </w:r>
             <w:r>
               <w:rPr>
@@ -1707,7 +1669,7 @@
               <w14:ligatures w14:val="standardContextual"/>
             </w:rPr>
           </w:pPr>
-          <w:hyperlink w:anchor="_Toc227103182" w:history="1">
+          <w:hyperlink w:anchor="_Toc227105581" w:history="1">
             <w:r>
               <w:rPr>
                 <w:rStyle w:val="Hyperlink"/>
@@ -1734,7 +1696,7 @@
                 <w:noProof/>
                 <w:webHidden/>
               </w:rPr>
-              <w:instrText xml:space="preserve"> PAGEREF _Toc227103182 \h </w:instrText>
+              <w:instrText xml:space="preserve"> PAGEREF _Toc227105581 \h </w:instrText>
             </w:r>
             <w:r>
               <w:rPr>
@@ -1779,7 +1741,7 @@
               <w14:ligatures w14:val="standardContextual"/>
             </w:rPr>
           </w:pPr>
-          <w:hyperlink w:anchor="_Toc227103183" w:history="1">
+          <w:hyperlink w:anchor="_Toc227105582" w:history="1">
             <w:r>
               <w:rPr>
                 <w:rStyle w:val="Hyperlink"/>
@@ -1806,7 +1768,7 @@
                 <w:noProof/>
                 <w:webHidden/>
               </w:rPr>
-              <w:instrText xml:space="preserve"> PAGEREF _Toc227103183 \h </w:instrText>
+              <w:instrText xml:space="preserve"> PAGEREF _Toc227105582 \h </w:instrText>
             </w:r>
             <w:r>
               <w:rPr>
@@ -1851,7 +1813,7 @@
               <w14:ligatures w14:val="standardContextual"/>
             </w:rPr>
           </w:pPr>
-          <w:hyperlink w:anchor="_Toc227103184" w:history="1">
+          <w:hyperlink w:anchor="_Toc227105583" w:history="1">
             <w:r>
               <w:rPr>
                 <w:rStyle w:val="Hyperlink"/>
@@ -1878,7 +1840,7 @@
                 <w:noProof/>
                 <w:webHidden/>
               </w:rPr>
-              <w:instrText xml:space="preserve"> PAGEREF _Toc227103184 \h </w:instrText>
+              <w:instrText xml:space="preserve"> PAGEREF _Toc227105583 \h </w:instrText>
             </w:r>
             <w:r>
               <w:rPr>
@@ -1923,7 +1885,7 @@
               <w14:ligatures w14:val="standardContextual"/>
             </w:rPr>
           </w:pPr>
-          <w:hyperlink w:anchor="_Toc227103185" w:history="1">
+          <w:hyperlink w:anchor="_Toc227105584" w:history="1">
             <w:r>
               <w:rPr>
                 <w:rStyle w:val="Hyperlink"/>
@@ -1950,7 +1912,7 @@
                 <w:noProof/>
                 <w:webHidden/>
               </w:rPr>
-              <w:instrText xml:space="preserve"> PAGEREF _Toc227103185 \h </w:instrText>
+              <w:instrText xml:space="preserve"> PAGEREF _Toc227105584 \h </w:instrText>
             </w:r>
             <w:r>
               <w:rPr>
@@ -1995,7 +1957,7 @@
               <w14:ligatures w14:val="standardContextual"/>
             </w:rPr>
           </w:pPr>
-          <w:hyperlink w:anchor="_Toc227103186" w:history="1">
+          <w:hyperlink w:anchor="_Toc227105585" w:history="1">
             <w:r>
               <w:rPr>
                 <w:rStyle w:val="Hyperlink"/>
@@ -2022,7 +1984,7 @@
                 <w:noProof/>
                 <w:webHidden/>
               </w:rPr>
-              <w:instrText xml:space="preserve"> PAGEREF _Toc227103186 \h </w:instrText>
+              <w:instrText xml:space="preserve"> PAGEREF _Toc227105585 \h </w:instrText>
             </w:r>
             <w:r>
               <w:rPr>
@@ -2067,7 +2029,7 @@
               <w14:ligatures w14:val="standardContextual"/>
             </w:rPr>
           </w:pPr>
-          <w:hyperlink w:anchor="_Toc227103187" w:history="1">
+          <w:hyperlink w:anchor="_Toc227105586" w:history="1">
             <w:r>
               <w:rPr>
                 <w:rStyle w:val="Hyperlink"/>
@@ -2094,7 +2056,7 @@
                 <w:noProof/>
                 <w:webHidden/>
               </w:rPr>
-              <w:instrText xml:space="preserve"> PAGEREF _Toc227103187 \h </w:instrText>
+              <w:instrText xml:space="preserve"> PAGEREF _Toc227105586 \h </w:instrText>
             </w:r>
             <w:r>
               <w:rPr>
@@ -2139,7 +2101,7 @@
               <w14:ligatures w14:val="standardContextual"/>
             </w:rPr>
           </w:pPr>
-          <w:hyperlink w:anchor="_Toc227103188" w:history="1">
+          <w:hyperlink w:anchor="_Toc227105587" w:history="1">
             <w:r>
               <w:rPr>
                 <w:rStyle w:val="Hyperlink"/>
@@ -2166,7 +2128,7 @@
                 <w:noProof/>
                 <w:webHidden/>
               </w:rPr>
-              <w:instrText xml:space="preserve"> PAGEREF _Toc227103188 \h </w:instrText>
+              <w:instrText xml:space="preserve"> PAGEREF _Toc227105587 \h </w:instrText>
             </w:r>
             <w:r>
               <w:rPr>
@@ -2211,7 +2173,7 @@
               <w14:ligatures w14:val="standardContextual"/>
             </w:rPr>
           </w:pPr>
-          <w:hyperlink w:anchor="_Toc227103189" w:history="1">
+          <w:hyperlink w:anchor="_Toc227105588" w:history="1">
             <w:r>
               <w:rPr>
                 <w:rStyle w:val="Hyperlink"/>
@@ -2238,7 +2200,7 @@
                 <w:noProof/>
                 <w:webHidden/>
               </w:rPr>
-              <w:instrText xml:space="preserve"> PAGEREF _Toc227103189 \h </w:instrText>
+              <w:instrText xml:space="preserve"> PAGEREF _Toc227105588 \h </w:instrText>
             </w:r>
             <w:r>
               <w:rPr>
@@ -2283,7 +2245,7 @@
               <w14:ligatures w14:val="standardContextual"/>
             </w:rPr>
           </w:pPr>
-          <w:hyperlink w:anchor="_Toc227103190" w:history="1">
+          <w:hyperlink w:anchor="_Toc227105589" w:history="1">
             <w:r>
               <w:rPr>
                 <w:rStyle w:val="Hyperlink"/>
@@ -2310,7 +2272,7 @@
                 <w:noProof/>
                 <w:webHidden/>
               </w:rPr>
-              <w:instrText xml:space="preserve"> PAGEREF _Toc227103190 \h </w:instrText>
+              <w:instrText xml:space="preserve"> PAGEREF _Toc227105589 \h </w:instrText>
             </w:r>
             <w:r>
               <w:rPr>
@@ -2355,7 +2317,7 @@
               <w14:ligatures w14:val="standardContextual"/>
             </w:rPr>
           </w:pPr>
-          <w:hyperlink w:anchor="_Toc227103191" w:history="1">
+          <w:hyperlink w:anchor="_Toc227105590" w:history="1">
             <w:r>
               <w:rPr>
                 <w:rStyle w:val="Hyperlink"/>
@@ -2382,7 +2344,7 @@
                 <w:noProof/>
                 <w:webHidden/>
               </w:rPr>
-              <w:instrText xml:space="preserve"> PAGEREF _Toc227103191 \h </w:instrText>
+              <w:instrText xml:space="preserve"> PAGEREF _Toc227105590 \h </w:instrText>
             </w:r>
             <w:r>
               <w:rPr>
@@ -2427,7 +2389,7 @@
               <w14:ligatures w14:val="standardContextual"/>
             </w:rPr>
           </w:pPr>
-          <w:hyperlink w:anchor="_Toc227103192" w:history="1">
+          <w:hyperlink w:anchor="_Toc227105591" w:history="1">
             <w:r>
               <w:rPr>
                 <w:rStyle w:val="Hyperlink"/>
@@ -2454,7 +2416,7 @@
                 <w:noProof/>
                 <w:webHidden/>
               </w:rPr>
-              <w:instrText xml:space="preserve"> PAGEREF _Toc227103192 \h </w:instrText>
+              <w:instrText xml:space="preserve"> PAGEREF _Toc227105591 \h </w:instrText>
             </w:r>
             <w:r>
               <w:rPr>
@@ -2499,7 +2461,7 @@
               <w14:ligatures w14:val="standardContextual"/>
             </w:rPr>
           </w:pPr>
-          <w:hyperlink w:anchor="_Toc227103193" w:history="1">
+          <w:hyperlink w:anchor="_Toc227105592" w:history="1">
             <w:r>
               <w:rPr>
                 <w:rStyle w:val="Hyperlink"/>
@@ -2526,7 +2488,7 @@
                 <w:noProof/>
                 <w:webHidden/>
               </w:rPr>
-              <w:instrText xml:space="preserve"> PAGEREF _Toc227103193 \h </w:instrText>
+              <w:instrText xml:space="preserve"> PAGEREF _Toc227105592 \h </w:instrText>
             </w:r>
             <w:r>
               <w:rPr>
@@ -2571,7 +2533,7 @@
               <w14:ligatures w14:val="standardContextual"/>
             </w:rPr>
           </w:pPr>
-          <w:hyperlink w:anchor="_Toc227103194" w:history="1">
+          <w:hyperlink w:anchor="_Toc227105593" w:history="1">
             <w:r>
               <w:rPr>
                 <w:rStyle w:val="Hyperlink"/>
@@ -2598,7 +2560,7 @@
                 <w:noProof/>
                 <w:webHidden/>
               </w:rPr>
-              <w:instrText xml:space="preserve"> PAGEREF _Toc227103194 \h </w:instrText>
+              <w:instrText xml:space="preserve"> PAGEREF _Toc227105593 \h </w:instrText>
             </w:r>
             <w:r>
               <w:rPr>
@@ -2643,7 +2605,7 @@
               <w14:ligatures w14:val="standardContextual"/>
             </w:rPr>
           </w:pPr>
-          <w:hyperlink w:anchor="_Toc227103195" w:history="1">
+          <w:hyperlink w:anchor="_Toc227105594" w:history="1">
             <w:r>
               <w:rPr>
                 <w:rStyle w:val="Hyperlink"/>
@@ -2670,7 +2632,7 @@
                 <w:noProof/>
                 <w:webHidden/>
               </w:rPr>
-              <w:instrText xml:space="preserve"> PAGEREF _Toc227103195 \h </w:instrText>
+              <w:instrText xml:space="preserve"> PAGEREF _Toc227105594 \h </w:instrText>
             </w:r>
             <w:r>
               <w:rPr>
@@ -2715,7 +2677,7 @@
               <w14:ligatures w14:val="standardContextual"/>
             </w:rPr>
           </w:pPr>
-          <w:hyperlink w:anchor="_Toc227103196" w:history="1">
+          <w:hyperlink w:anchor="_Toc227105595" w:history="1">
             <w:r>
               <w:rPr>
                 <w:rStyle w:val="Hyperlink"/>
@@ -2742,7 +2704,7 @@
                 <w:noProof/>
                 <w:webHidden/>
               </w:rPr>
-              <w:instrText xml:space="preserve"> PAGEREF _Toc227103196 \h </w:instrText>
+              <w:instrText xml:space="preserve"> PAGEREF _Toc227105595 \h </w:instrText>
             </w:r>
             <w:r>
               <w:rPr>
@@ -2787,7 +2749,7 @@
               <w14:ligatures w14:val="standardContextual"/>
             </w:rPr>
           </w:pPr>
-          <w:hyperlink w:anchor="_Toc227103197" w:history="1">
+          <w:hyperlink w:anchor="_Toc227105596" w:history="1">
             <w:r>
               <w:rPr>
                 <w:rStyle w:val="Hyperlink"/>
@@ -2814,7 +2776,7 @@
                 <w:noProof/>
                 <w:webHidden/>
               </w:rPr>
-              <w:instrText xml:space="preserve"> PAGEREF _Toc227103197 \h </w:instrText>
+              <w:instrText xml:space="preserve"> PAGEREF _Toc227105596 \h </w:instrText>
             </w:r>
             <w:r>
               <w:rPr>
@@ -2859,7 +2821,7 @@
               <w14:ligatures w14:val="standardContextual"/>
             </w:rPr>
           </w:pPr>
-          <w:hyperlink w:anchor="_Toc227103198" w:history="1">
+          <w:hyperlink w:anchor="_Toc227105597" w:history="1">
             <w:r>
               <w:rPr>
                 <w:rStyle w:val="Hyperlink"/>
@@ -2886,7 +2848,7 @@
                 <w:noProof/>
                 <w:webHidden/>
               </w:rPr>
-              <w:instrText xml:space="preserve"> PAGEREF _Toc227103198 \h </w:instrText>
+              <w:instrText xml:space="preserve"> PAGEREF _Toc227105597 \h </w:instrText>
             </w:r>
             <w:r>
               <w:rPr>
@@ -2931,7 +2893,7 @@
               <w14:ligatures w14:val="standardContextual"/>
             </w:rPr>
           </w:pPr>
-          <w:hyperlink w:anchor="_Toc227103199" w:history="1">
+          <w:hyperlink w:anchor="_Toc227105598" w:history="1">
             <w:r>
               <w:rPr>
                 <w:rStyle w:val="Hyperlink"/>
@@ -2958,7 +2920,7 @@
                 <w:noProof/>
                 <w:webHidden/>
               </w:rPr>
-              <w:instrText xml:space="preserve"> PAGEREF _Toc227103199 \h </w:instrText>
+              <w:instrText xml:space="preserve"> PAGEREF _Toc227105598 \h </w:instrText>
             </w:r>
             <w:r>
               <w:rPr>
@@ -3003,7 +2965,7 @@
               <w14:ligatures w14:val="standardContextual"/>
             </w:rPr>
           </w:pPr>
-          <w:hyperlink w:anchor="_Toc227103200" w:history="1">
+          <w:hyperlink w:anchor="_Toc227105599" w:history="1">
             <w:r>
               <w:rPr>
                 <w:rStyle w:val="Hyperlink"/>
@@ -3030,7 +2992,7 @@
                 <w:noProof/>
                 <w:webHidden/>
               </w:rPr>
-              <w:instrText xml:space="preserve"> PAGEREF _Toc227103200 \h </w:instrText>
+              <w:instrText xml:space="preserve"> PAGEREF _Toc227105599 \h </w:instrText>
             </w:r>
             <w:r>
               <w:rPr>
@@ -3075,7 +3037,7 @@
               <w14:ligatures w14:val="standardContextual"/>
             </w:rPr>
           </w:pPr>
-          <w:hyperlink w:anchor="_Toc227103201" w:history="1">
+          <w:hyperlink w:anchor="_Toc227105600" w:history="1">
             <w:r>
               <w:rPr>
                 <w:rStyle w:val="Hyperlink"/>
@@ -3102,7 +3064,7 @@
                 <w:noProof/>
                 <w:webHidden/>
               </w:rPr>
-              <w:instrText xml:space="preserve"> PAGEREF _Toc227103201 \h </w:instrText>
+              <w:instrText xml:space="preserve"> PAGEREF _Toc227105600 \h </w:instrText>
             </w:r>
             <w:r>
               <w:rPr>
@@ -3147,7 +3109,7 @@
               <w14:ligatures w14:val="standardContextual"/>
             </w:rPr>
           </w:pPr>
-          <w:hyperlink w:anchor="_Toc227103202" w:history="1">
+          <w:hyperlink w:anchor="_Toc227105601" w:history="1">
             <w:r>
               <w:rPr>
                 <w:rStyle w:val="Hyperlink"/>
@@ -3174,7 +3136,7 @@
                 <w:noProof/>
                 <w:webHidden/>
               </w:rPr>
-              <w:instrText xml:space="preserve"> PAGEREF _Toc227103202 \h </w:instrText>
+              <w:instrText xml:space="preserve"> PAGEREF _Toc227105601 \h </w:instrText>
             </w:r>
             <w:r>
               <w:rPr>
@@ -3219,7 +3181,7 @@
               <w14:ligatures w14:val="standardContextual"/>
             </w:rPr>
           </w:pPr>
-          <w:hyperlink w:anchor="_Toc227103203" w:history="1">
+          <w:hyperlink w:anchor="_Toc227105602" w:history="1">
             <w:r>
               <w:rPr>
                 <w:rStyle w:val="Hyperlink"/>
@@ -3246,7 +3208,7 @@
                 <w:noProof/>
                 <w:webHidden/>
               </w:rPr>
-              <w:instrText xml:space="preserve"> PAGEREF _Toc227103203 \h </w:instrText>
+              <w:instrText xml:space="preserve"> PAGEREF _Toc227105602 \h </w:instrText>
             </w:r>
             <w:r>
               <w:rPr>
@@ -3291,7 +3253,7 @@
               <w14:ligatures w14:val="standardContextual"/>
             </w:rPr>
           </w:pPr>
-          <w:hyperlink w:anchor="_Toc227103204" w:history="1">
+          <w:hyperlink w:anchor="_Toc227105603" w:history="1">
             <w:r>
               <w:rPr>
                 <w:rStyle w:val="Hyperlink"/>
@@ -3318,7 +3280,7 @@
                 <w:noProof/>
                 <w:webHidden/>
               </w:rPr>
-              <w:instrText xml:space="preserve"> PAGEREF _Toc227103204 \h </w:instrText>
+              <w:instrText xml:space="preserve"> PAGEREF _Toc227105603 \h </w:instrText>
             </w:r>
             <w:r>
               <w:rPr>
@@ -3363,7 +3325,7 @@
               <w14:ligatures w14:val="standardContextual"/>
             </w:rPr>
           </w:pPr>
-          <w:hyperlink w:anchor="_Toc227103205" w:history="1">
+          <w:hyperlink w:anchor="_Toc227105604" w:history="1">
             <w:r>
               <w:rPr>
                 <w:rStyle w:val="Hyperlink"/>
@@ -3390,7 +3352,7 @@
                 <w:noProof/>
                 <w:webHidden/>
               </w:rPr>
-              <w:instrText xml:space="preserve"> PAGEREF _Toc227103205 \h </w:instrText>
+              <w:instrText xml:space="preserve"> PAGEREF _Toc227105604 \h </w:instrText>
             </w:r>
             <w:r>
               <w:rPr>
@@ -3435,7 +3397,7 @@
               <w14:ligatures w14:val="standardContextual"/>
             </w:rPr>
           </w:pPr>
-          <w:hyperlink w:anchor="_Toc227103206" w:history="1">
+          <w:hyperlink w:anchor="_Toc227105605" w:history="1">
             <w:r>
               <w:rPr>
                 <w:rStyle w:val="Hyperlink"/>
@@ -3462,7 +3424,7 @@
                 <w:noProof/>
                 <w:webHidden/>
               </w:rPr>
-              <w:instrText xml:space="preserve"> PAGEREF _Toc227103206 \h </w:instrText>
+              <w:instrText xml:space="preserve"> PAGEREF _Toc227105605 \h </w:instrText>
             </w:r>
             <w:r>
               <w:rPr>
@@ -3507,7 +3469,7 @@
               <w14:ligatures w14:val="standardContextual"/>
             </w:rPr>
           </w:pPr>
-          <w:hyperlink w:anchor="_Toc227103207" w:history="1">
+          <w:hyperlink w:anchor="_Toc227105606" w:history="1">
             <w:r>
               <w:rPr>
                 <w:rStyle w:val="Hyperlink"/>
@@ -3534,7 +3496,7 @@
                 <w:noProof/>
                 <w:webHidden/>
               </w:rPr>
-              <w:instrText xml:space="preserve"> PAGEREF _Toc227103207 \h </w:instrText>
+              <w:instrText xml:space="preserve"> PAGEREF _Toc227105606 \h </w:instrText>
             </w:r>
             <w:r>
               <w:rPr>
@@ -3579,7 +3541,7 @@
               <w14:ligatures w14:val="standardContextual"/>
             </w:rPr>
           </w:pPr>
-          <w:hyperlink w:anchor="_Toc227103208" w:history="1">
+          <w:hyperlink w:anchor="_Toc227105607" w:history="1">
             <w:r>
               <w:rPr>
                 <w:rStyle w:val="Hyperlink"/>
@@ -3606,7 +3568,7 @@
                 <w:noProof/>
                 <w:webHidden/>
               </w:rPr>
-              <w:instrText xml:space="preserve"> PAGEREF _Toc227103208 \h </w:instrText>
+              <w:instrText xml:space="preserve"> PAGEREF _Toc227105607 \h </w:instrText>
             </w:r>
             <w:r>
               <w:rPr>
@@ -3651,7 +3613,7 @@
               <w14:ligatures w14:val="standardContextual"/>
             </w:rPr>
           </w:pPr>
-          <w:hyperlink w:anchor="_Toc227103209" w:history="1">
+          <w:hyperlink w:anchor="_Toc227105608" w:history="1">
             <w:r>
               <w:rPr>
                 <w:rStyle w:val="Hyperlink"/>
@@ -3678,7 +3640,7 @@
                 <w:noProof/>
                 <w:webHidden/>
               </w:rPr>
-              <w:instrText xml:space="preserve"> PAGEREF _Toc227103209 \h </w:instrText>
+              <w:instrText xml:space="preserve"> PAGEREF _Toc227105608 \h </w:instrText>
             </w:r>
             <w:r>
               <w:rPr>
@@ -3723,7 +3685,7 @@
               <w14:ligatures w14:val="standardContextual"/>
             </w:rPr>
           </w:pPr>
-          <w:hyperlink w:anchor="_Toc227103210" w:history="1">
+          <w:hyperlink w:anchor="_Toc227105609" w:history="1">
             <w:r>
               <w:rPr>
                 <w:rStyle w:val="Hyperlink"/>
@@ -3750,7 +3712,7 @@
                 <w:noProof/>
                 <w:webHidden/>
               </w:rPr>
-              <w:instrText xml:space="preserve"> PAGEREF _Toc227103210 \h </w:instrText>
+              <w:instrText xml:space="preserve"> PAGEREF _Toc227105609 \h </w:instrText>
             </w:r>
             <w:r>
               <w:rPr>
@@ -3795,7 +3757,7 @@
               <w14:ligatures w14:val="standardContextual"/>
             </w:rPr>
           </w:pPr>
-          <w:hyperlink w:anchor="_Toc227103211" w:history="1">
+          <w:hyperlink w:anchor="_Toc227105610" w:history="1">
             <w:r>
               <w:rPr>
                 <w:rStyle w:val="Hyperlink"/>
@@ -3822,7 +3784,7 @@
                 <w:noProof/>
                 <w:webHidden/>
               </w:rPr>
-              <w:instrText xml:space="preserve"> PAGEREF _Toc227103211 \h </w:instrText>
+              <w:instrText xml:space="preserve"> PAGEREF _Toc227105610 \h </w:instrText>
             </w:r>
             <w:r>
               <w:rPr>
@@ -3842,7 +3804,7 @@
                 <w:noProof/>
                 <w:webHidden/>
               </w:rPr>
-              <w:t>27</w:t>
+              <w:t>26</w:t>
             </w:r>
             <w:r>
               <w:rPr>
@@ -3867,7 +3829,7 @@
               <w14:ligatures w14:val="standardContextual"/>
             </w:rPr>
           </w:pPr>
-          <w:hyperlink w:anchor="_Toc227103212" w:history="1">
+          <w:hyperlink w:anchor="_Toc227105611" w:history="1">
             <w:r>
               <w:rPr>
                 <w:rStyle w:val="Hyperlink"/>
@@ -3894,7 +3856,7 @@
                 <w:noProof/>
                 <w:webHidden/>
               </w:rPr>
-              <w:instrText xml:space="preserve"> PAGEREF _Toc227103212 \h </w:instrText>
+              <w:instrText xml:space="preserve"> PAGEREF _Toc227105611 \h </w:instrText>
             </w:r>
             <w:r>
               <w:rPr>
@@ -3914,7 +3876,7 @@
                 <w:noProof/>
                 <w:webHidden/>
               </w:rPr>
-              <w:t>27</w:t>
+              <w:t>26</w:t>
             </w:r>
             <w:r>
               <w:rPr>
@@ -3939,7 +3901,7 @@
               <w14:ligatures w14:val="standardContextual"/>
             </w:rPr>
           </w:pPr>
-          <w:hyperlink w:anchor="_Toc227103213" w:history="1">
+          <w:hyperlink w:anchor="_Toc227105612" w:history="1">
             <w:r>
               <w:rPr>
                 <w:rStyle w:val="Hyperlink"/>
@@ -3966,7 +3928,7 @@
                 <w:noProof/>
                 <w:webHidden/>
               </w:rPr>
-              <w:instrText xml:space="preserve"> PAGEREF _Toc227103213 \h </w:instrText>
+              <w:instrText xml:space="preserve"> PAGEREF _Toc227105612 \h </w:instrText>
             </w:r>
             <w:r>
               <w:rPr>
@@ -3986,7 +3948,7 @@
                 <w:noProof/>
                 <w:webHidden/>
               </w:rPr>
-              <w:t>27</w:t>
+              <w:t>26</w:t>
             </w:r>
             <w:r>
               <w:rPr>
@@ -4011,7 +3973,7 @@
               <w14:ligatures w14:val="standardContextual"/>
             </w:rPr>
           </w:pPr>
-          <w:hyperlink w:anchor="_Toc227103214" w:history="1">
+          <w:hyperlink w:anchor="_Toc227105613" w:history="1">
             <w:r>
               <w:rPr>
                 <w:rStyle w:val="Hyperlink"/>
@@ -4038,7 +4000,7 @@
                 <w:noProof/>
                 <w:webHidden/>
               </w:rPr>
-              <w:instrText xml:space="preserve"> PAGEREF _Toc227103214 \h </w:instrText>
+              <w:instrText xml:space="preserve"> PAGEREF _Toc227105613 \h </w:instrText>
             </w:r>
             <w:r>
               <w:rPr>
@@ -4058,7 +4020,7 @@
                 <w:noProof/>
                 <w:webHidden/>
               </w:rPr>
-              <w:t>27</w:t>
+              <w:t>26</w:t>
             </w:r>
             <w:r>
               <w:rPr>
@@ -4083,7 +4045,7 @@
               <w14:ligatures w14:val="standardContextual"/>
             </w:rPr>
           </w:pPr>
-          <w:hyperlink w:anchor="_Toc227103215" w:history="1">
+          <w:hyperlink w:anchor="_Toc227105614" w:history="1">
             <w:r>
               <w:rPr>
                 <w:rStyle w:val="Hyperlink"/>
@@ -4110,7 +4072,7 @@
                 <w:noProof/>
                 <w:webHidden/>
               </w:rPr>
-              <w:instrText xml:space="preserve"> PAGEREF _Toc227103215 \h </w:instrText>
+              <w:instrText xml:space="preserve"> PAGEREF _Toc227105614 \h </w:instrText>
             </w:r>
             <w:r>
               <w:rPr>
@@ -4130,7 +4092,7 @@
                 <w:noProof/>
                 <w:webHidden/>
               </w:rPr>
-              <w:t>28</w:t>
+              <w:t>27</w:t>
             </w:r>
             <w:r>
               <w:rPr>
@@ -4155,7 +4117,7 @@
               <w14:ligatures w14:val="standardContextual"/>
             </w:rPr>
           </w:pPr>
-          <w:hyperlink w:anchor="_Toc227103216" w:history="1">
+          <w:hyperlink w:anchor="_Toc227105615" w:history="1">
             <w:r>
               <w:rPr>
                 <w:rStyle w:val="Hyperlink"/>
@@ -4182,7 +4144,7 @@
                 <w:noProof/>
                 <w:webHidden/>
               </w:rPr>
-              <w:instrText xml:space="preserve"> PAGEREF _Toc227103216 \h </w:instrText>
+              <w:instrText xml:space="preserve"> PAGEREF _Toc227105615 \h </w:instrText>
             </w:r>
             <w:r>
               <w:rPr>
@@ -4202,7 +4164,7 @@
                 <w:noProof/>
                 <w:webHidden/>
               </w:rPr>
-              <w:t>28</w:t>
+              <w:t>27</w:t>
             </w:r>
             <w:r>
               <w:rPr>
@@ -4227,7 +4189,7 @@
               <w14:ligatures w14:val="standardContextual"/>
             </w:rPr>
           </w:pPr>
-          <w:hyperlink w:anchor="_Toc227103217" w:history="1">
+          <w:hyperlink w:anchor="_Toc227105616" w:history="1">
             <w:r>
               <w:rPr>
                 <w:rStyle w:val="Hyperlink"/>
@@ -4254,7 +4216,7 @@
                 <w:noProof/>
                 <w:webHidden/>
               </w:rPr>
-              <w:instrText xml:space="preserve"> PAGEREF _Toc227103217 \h </w:instrText>
+              <w:instrText xml:space="preserve"> PAGEREF _Toc227105616 \h </w:instrText>
             </w:r>
             <w:r>
               <w:rPr>
@@ -4274,7 +4236,7 @@
                 <w:noProof/>
                 <w:webHidden/>
               </w:rPr>
-              <w:t>29</w:t>
+              <w:t>28</w:t>
             </w:r>
             <w:r>
               <w:rPr>
@@ -4299,7 +4261,7 @@
               <w14:ligatures w14:val="standardContextual"/>
             </w:rPr>
           </w:pPr>
-          <w:hyperlink w:anchor="_Toc227103218" w:history="1">
+          <w:hyperlink w:anchor="_Toc227105617" w:history="1">
             <w:r>
               <w:rPr>
                 <w:rStyle w:val="Hyperlink"/>
@@ -4326,7 +4288,7 @@
                 <w:noProof/>
                 <w:webHidden/>
               </w:rPr>
-              <w:instrText xml:space="preserve"> PAGEREF _Toc227103218 \h </w:instrText>
+              <w:instrText xml:space="preserve"> PAGEREF _Toc227105617 \h </w:instrText>
             </w:r>
             <w:r>
               <w:rPr>
@@ -4346,7 +4308,7 @@
                 <w:noProof/>
                 <w:webHidden/>
               </w:rPr>
-              <w:t>29</w:t>
+              <w:t>28</w:t>
             </w:r>
             <w:r>
               <w:rPr>
@@ -4371,7 +4333,7 @@
               <w14:ligatures w14:val="standardContextual"/>
             </w:rPr>
           </w:pPr>
-          <w:hyperlink w:anchor="_Toc227103219" w:history="1">
+          <w:hyperlink w:anchor="_Toc227105618" w:history="1">
             <w:r>
               <w:rPr>
                 <w:rStyle w:val="Hyperlink"/>
@@ -4398,7 +4360,7 @@
                 <w:noProof/>
                 <w:webHidden/>
               </w:rPr>
-              <w:instrText xml:space="preserve"> PAGEREF _Toc227103219 \h </w:instrText>
+              <w:instrText xml:space="preserve"> PAGEREF _Toc227105618 \h </w:instrText>
             </w:r>
             <w:r>
               <w:rPr>
@@ -4418,7 +4380,7 @@
                 <w:noProof/>
                 <w:webHidden/>
               </w:rPr>
-              <w:t>29</w:t>
+              <w:t>28</w:t>
             </w:r>
             <w:r>
               <w:rPr>
@@ -4443,7 +4405,7 @@
               <w14:ligatures w14:val="standardContextual"/>
             </w:rPr>
           </w:pPr>
-          <w:hyperlink w:anchor="_Toc227103220" w:history="1">
+          <w:hyperlink w:anchor="_Toc227105619" w:history="1">
             <w:r>
               <w:rPr>
                 <w:rStyle w:val="Hyperlink"/>
@@ -4470,7 +4432,7 @@
                 <w:noProof/>
                 <w:webHidden/>
               </w:rPr>
-              <w:instrText xml:space="preserve"> PAGEREF _Toc227103220 \h </w:instrText>
+              <w:instrText xml:space="preserve"> PAGEREF _Toc227105619 \h </w:instrText>
             </w:r>
             <w:r>
               <w:rPr>
@@ -4490,7 +4452,7 @@
                 <w:noProof/>
                 <w:webHidden/>
               </w:rPr>
-              <w:t>29</w:t>
+              <w:t>28</w:t>
             </w:r>
             <w:r>
               <w:rPr>
@@ -4515,7 +4477,7 @@
               <w14:ligatures w14:val="standardContextual"/>
             </w:rPr>
           </w:pPr>
-          <w:hyperlink w:anchor="_Toc227103221" w:history="1">
+          <w:hyperlink w:anchor="_Toc227105620" w:history="1">
             <w:r>
               <w:rPr>
                 <w:rStyle w:val="Hyperlink"/>
@@ -4542,7 +4504,7 @@
                 <w:noProof/>
                 <w:webHidden/>
               </w:rPr>
-              <w:instrText xml:space="preserve"> PAGEREF _Toc227103221 \h </w:instrText>
+              <w:instrText xml:space="preserve"> PAGEREF _Toc227105620 \h </w:instrText>
             </w:r>
             <w:r>
               <w:rPr>
@@ -4562,7 +4524,7 @@
                 <w:noProof/>
                 <w:webHidden/>
               </w:rPr>
-              <w:t>30</w:t>
+              <w:t>29</w:t>
             </w:r>
             <w:r>
               <w:rPr>
@@ -4587,7 +4549,7 @@
               <w14:ligatures w14:val="standardContextual"/>
             </w:rPr>
           </w:pPr>
-          <w:hyperlink w:anchor="_Toc227103222" w:history="1">
+          <w:hyperlink w:anchor="_Toc227105621" w:history="1">
             <w:r>
               <w:rPr>
                 <w:rStyle w:val="Hyperlink"/>
@@ -4614,7 +4576,7 @@
                 <w:noProof/>
                 <w:webHidden/>
               </w:rPr>
-              <w:instrText xml:space="preserve"> PAGEREF _Toc227103222 \h </w:instrText>
+              <w:instrText xml:space="preserve"> PAGEREF _Toc227105621 \h </w:instrText>
             </w:r>
             <w:r>
               <w:rPr>
@@ -4634,7 +4596,7 @@
                 <w:noProof/>
                 <w:webHidden/>
               </w:rPr>
-              <w:t>31</w:t>
+              <w:t>30</w:t>
             </w:r>
             <w:r>
               <w:rPr>
@@ -4659,7 +4621,7 @@
               <w14:ligatures w14:val="standardContextual"/>
             </w:rPr>
           </w:pPr>
-          <w:hyperlink w:anchor="_Toc227103223" w:history="1">
+          <w:hyperlink w:anchor="_Toc227105622" w:history="1">
             <w:r>
               <w:rPr>
                 <w:rStyle w:val="Hyperlink"/>
@@ -4686,7 +4648,7 @@
                 <w:noProof/>
                 <w:webHidden/>
               </w:rPr>
-              <w:instrText xml:space="preserve"> PAGEREF _Toc227103223 \h </w:instrText>
+              <w:instrText xml:space="preserve"> PAGEREF _Toc227105622 \h </w:instrText>
             </w:r>
             <w:r>
               <w:rPr>
@@ -4706,7 +4668,7 @@
                 <w:noProof/>
                 <w:webHidden/>
               </w:rPr>
-              <w:t>31</w:t>
+              <w:t>30</w:t>
             </w:r>
             <w:r>
               <w:rPr>
@@ -4731,7 +4693,7 @@
               <w14:ligatures w14:val="standardContextual"/>
             </w:rPr>
           </w:pPr>
-          <w:hyperlink w:anchor="_Toc227103224" w:history="1">
+          <w:hyperlink w:anchor="_Toc227105623" w:history="1">
             <w:r>
               <w:rPr>
                 <w:rStyle w:val="Hyperlink"/>
@@ -4758,7 +4720,7 @@
                 <w:noProof/>
                 <w:webHidden/>
               </w:rPr>
-              <w:instrText xml:space="preserve"> PAGEREF _Toc227103224 \h </w:instrText>
+              <w:instrText xml:space="preserve"> PAGEREF _Toc227105623 \h </w:instrText>
             </w:r>
             <w:r>
               <w:rPr>
@@ -4778,7 +4740,7 @@
                 <w:noProof/>
                 <w:webHidden/>
               </w:rPr>
-              <w:t>31</w:t>
+              <w:t>30</w:t>
             </w:r>
             <w:r>
               <w:rPr>
@@ -4803,7 +4765,7 @@
               <w14:ligatures w14:val="standardContextual"/>
             </w:rPr>
           </w:pPr>
-          <w:hyperlink w:anchor="_Toc227103225" w:history="1">
+          <w:hyperlink w:anchor="_Toc227105624" w:history="1">
             <w:r>
               <w:rPr>
                 <w:rStyle w:val="Hyperlink"/>
@@ -4830,7 +4792,7 @@
                 <w:noProof/>
                 <w:webHidden/>
               </w:rPr>
-              <w:instrText xml:space="preserve"> PAGEREF _Toc227103225 \h </w:instrText>
+              <w:instrText xml:space="preserve"> PAGEREF _Toc227105624 \h </w:instrText>
             </w:r>
             <w:r>
               <w:rPr>
@@ -4850,7 +4812,7 @@
                 <w:noProof/>
                 <w:webHidden/>
               </w:rPr>
-              <w:t>31</w:t>
+              <w:t>30</w:t>
             </w:r>
             <w:r>
               <w:rPr>
@@ -4875,7 +4837,7 @@
               <w14:ligatures w14:val="standardContextual"/>
             </w:rPr>
           </w:pPr>
-          <w:hyperlink w:anchor="_Toc227103226" w:history="1">
+          <w:hyperlink w:anchor="_Toc227105625" w:history="1">
             <w:r>
               <w:rPr>
                 <w:rStyle w:val="Hyperlink"/>
@@ -4902,7 +4864,7 @@
                 <w:noProof/>
                 <w:webHidden/>
               </w:rPr>
-              <w:instrText xml:space="preserve"> PAGEREF _Toc227103226 \h </w:instrText>
+              <w:instrText xml:space="preserve"> PAGEREF _Toc227105625 \h </w:instrText>
             </w:r>
             <w:r>
               <w:rPr>
@@ -4922,7 +4884,7 @@
                 <w:noProof/>
                 <w:webHidden/>
               </w:rPr>
-              <w:t>32</w:t>
+              <w:t>31</w:t>
             </w:r>
             <w:r>
               <w:rPr>
@@ -4947,7 +4909,7 @@
               <w14:ligatures w14:val="standardContextual"/>
             </w:rPr>
           </w:pPr>
-          <w:hyperlink w:anchor="_Toc227103227" w:history="1">
+          <w:hyperlink w:anchor="_Toc227105626" w:history="1">
             <w:r>
               <w:rPr>
                 <w:rStyle w:val="Hyperlink"/>
@@ -4974,7 +4936,7 @@
                 <w:noProof/>
                 <w:webHidden/>
               </w:rPr>
-              <w:instrText xml:space="preserve"> PAGEREF _Toc227103227 \h </w:instrText>
+              <w:instrText xml:space="preserve"> PAGEREF _Toc227105626 \h </w:instrText>
             </w:r>
             <w:r>
               <w:rPr>
@@ -4994,7 +4956,7 @@
                 <w:noProof/>
                 <w:webHidden/>
               </w:rPr>
-              <w:t>32</w:t>
+              <w:t>31</w:t>
             </w:r>
             <w:r>
               <w:rPr>
@@ -5019,13 +4981,13 @@
               <w14:ligatures w14:val="standardContextual"/>
             </w:rPr>
           </w:pPr>
-          <w:hyperlink w:anchor="_Toc227103228" w:history="1">
+          <w:hyperlink w:anchor="_Toc227105627" w:history="1">
             <w:r>
               <w:rPr>
                 <w:rStyle w:val="Hyperlink"/>
                 <w:noProof/>
               </w:rPr>
-              <w:t>Chapter 14: Code Quality &amp; Linting with Pylint</w:t>
+              <w:t>Chapter 13B: CI/CD Integration with GitHub Actions</w:t>
             </w:r>
             <w:r>
               <w:rPr>
@@ -5046,7 +5008,7 @@
                 <w:noProof/>
                 <w:webHidden/>
               </w:rPr>
-              <w:instrText xml:space="preserve"> PAGEREF _Toc227103228 \h </w:instrText>
+              <w:instrText xml:space="preserve"> PAGEREF _Toc227105627 \h </w:instrText>
             </w:r>
             <w:r>
               <w:rPr>
@@ -5066,7 +5028,7 @@
                 <w:noProof/>
                 <w:webHidden/>
               </w:rPr>
-              <w:t>33</w:t>
+              <w:t>32</w:t>
             </w:r>
             <w:r>
               <w:rPr>
@@ -5091,13 +5053,13 @@
               <w14:ligatures w14:val="standardContextual"/>
             </w:rPr>
           </w:pPr>
-          <w:hyperlink w:anchor="_Toc227103229" w:history="1">
+          <w:hyperlink w:anchor="_Toc227105628" w:history="1">
             <w:r>
               <w:rPr>
                 <w:rStyle w:val="Hyperlink"/>
                 <w:noProof/>
               </w:rPr>
-              <w:t>14.1 What is Pylint?</w:t>
+              <w:t>13B.1 Why GitHub Actions?</w:t>
             </w:r>
             <w:r>
               <w:rPr>
@@ -5118,7 +5080,7 @@
                 <w:noProof/>
                 <w:webHidden/>
               </w:rPr>
-              <w:instrText xml:space="preserve"> PAGEREF _Toc227103229 \h </w:instrText>
+              <w:instrText xml:space="preserve"> PAGEREF _Toc227105628 \h </w:instrText>
             </w:r>
             <w:r>
               <w:rPr>
@@ -5138,7 +5100,7 @@
                 <w:noProof/>
                 <w:webHidden/>
               </w:rPr>
-              <w:t>33</w:t>
+              <w:t>32</w:t>
             </w:r>
             <w:r>
               <w:rPr>
@@ -5163,13 +5125,13 @@
               <w14:ligatures w14:val="standardContextual"/>
             </w:rPr>
           </w:pPr>
-          <w:hyperlink w:anchor="_Toc227103230" w:history="1">
+          <w:hyperlink w:anchor="_Toc227105629" w:history="1">
             <w:r>
               <w:rPr>
                 <w:rStyle w:val="Hyperlink"/>
                 <w:noProof/>
               </w:rPr>
-              <w:t>14.2 Running Pylint</w:t>
+              <w:t>13B.2 Workflow File Structure</w:t>
             </w:r>
             <w:r>
               <w:rPr>
@@ -5190,7 +5152,7 @@
                 <w:noProof/>
                 <w:webHidden/>
               </w:rPr>
-              <w:instrText xml:space="preserve"> PAGEREF _Toc227103230 \h </w:instrText>
+              <w:instrText xml:space="preserve"> PAGEREF _Toc227105629 \h </w:instrText>
             </w:r>
             <w:r>
               <w:rPr>
@@ -5210,7 +5172,7 @@
                 <w:noProof/>
                 <w:webHidden/>
               </w:rPr>
-              <w:t>33</w:t>
+              <w:t>32</w:t>
             </w:r>
             <w:r>
               <w:rPr>
@@ -5235,13 +5197,13 @@
               <w14:ligatures w14:val="standardContextual"/>
             </w:rPr>
           </w:pPr>
-          <w:hyperlink w:anchor="_Toc227103231" w:history="1">
+          <w:hyperlink w:anchor="_Toc227105630" w:history="1">
             <w:r>
               <w:rPr>
                 <w:rStyle w:val="Hyperlink"/>
                 <w:noProof/>
               </w:rPr>
-              <w:t>14.3 Suppressing Pylint Warnings</w:t>
+              <w:t>13B.3 Complete Workflow File — Annotated</w:t>
             </w:r>
             <w:r>
               <w:rPr>
@@ -5262,7 +5224,7 @@
                 <w:noProof/>
                 <w:webHidden/>
               </w:rPr>
-              <w:instrText xml:space="preserve"> PAGEREF _Toc227103231 \h </w:instrText>
+              <w:instrText xml:space="preserve"> PAGEREF _Toc227105630 \h </w:instrText>
             </w:r>
             <w:r>
               <w:rPr>
@@ -5282,7 +5244,7 @@
                 <w:noProof/>
                 <w:webHidden/>
               </w:rPr>
-              <w:t>33</w:t>
+              <w:t>32</w:t>
             </w:r>
             <w:r>
               <w:rPr>
@@ -5307,13 +5269,13 @@
               <w14:ligatures w14:val="standardContextual"/>
             </w:rPr>
           </w:pPr>
-          <w:hyperlink w:anchor="_Toc227103232" w:history="1">
+          <w:hyperlink w:anchor="_Toc227105631" w:history="1">
             <w:r>
               <w:rPr>
                 <w:rStyle w:val="Hyperlink"/>
                 <w:noProof/>
               </w:rPr>
-              <w:t>14.4 Commit Style — Conventional Commits</w:t>
+              <w:t>13B.4 Workflow Steps Explained</w:t>
             </w:r>
             <w:r>
               <w:rPr>
@@ -5334,7 +5296,7 @@
                 <w:noProof/>
                 <w:webHidden/>
               </w:rPr>
-              <w:instrText xml:space="preserve"> PAGEREF _Toc227103232 \h </w:instrText>
+              <w:instrText xml:space="preserve"> PAGEREF _Toc227105631 \h </w:instrText>
             </w:r>
             <w:r>
               <w:rPr>
@@ -5354,7 +5316,151 @@
                 <w:noProof/>
                 <w:webHidden/>
               </w:rPr>
-              <w:t>33</w:t>
+              <w:t>35</w:t>
+            </w:r>
+            <w:r>
+              <w:rPr>
+                <w:noProof/>
+                <w:webHidden/>
+              </w:rPr>
+              <w:fldChar w:fldCharType="end"/>
+            </w:r>
+          </w:hyperlink>
+        </w:p>
+        <w:p>
+          <w:pPr>
+            <w:pStyle w:val="TOC2"/>
+            <w:tabs>
+              <w:tab w:val="right" w:leader="dot" w:pos="8630"/>
+            </w:tabs>
+            <w:rPr>
+              <w:noProof/>
+              <w:kern w:val="2"/>
+              <w:sz w:val="24"/>
+              <w:szCs w:val="24"/>
+              <w14:ligatures w14:val="standardContextual"/>
+            </w:rPr>
+          </w:pPr>
+          <w:hyperlink w:anchor="_Toc227105632" w:history="1">
+            <w:r>
+              <w:rPr>
+                <w:rStyle w:val="Hyperlink"/>
+                <w:noProof/>
+              </w:rPr>
+              <w:t>13B.5 Storing Secrets in GitHub</w:t>
+            </w:r>
+            <w:r>
+              <w:rPr>
+                <w:noProof/>
+                <w:webHidden/>
+              </w:rPr>
+              <w:tab/>
+            </w:r>
+            <w:r>
+              <w:rPr>
+                <w:noProof/>
+                <w:webHidden/>
+              </w:rPr>
+              <w:fldChar w:fldCharType="begin"/>
+            </w:r>
+            <w:r>
+              <w:rPr>
+                <w:noProof/>
+                <w:webHidden/>
+              </w:rPr>
+              <w:instrText xml:space="preserve"> PAGEREF _Toc227105632 \h </w:instrText>
+            </w:r>
+            <w:r>
+              <w:rPr>
+                <w:noProof/>
+                <w:webHidden/>
+              </w:rPr>
+            </w:r>
+            <w:r>
+              <w:rPr>
+                <w:noProof/>
+                <w:webHidden/>
+              </w:rPr>
+              <w:fldChar w:fldCharType="separate"/>
+            </w:r>
+            <w:r>
+              <w:rPr>
+                <w:noProof/>
+                <w:webHidden/>
+              </w:rPr>
+              <w:t>35</w:t>
+            </w:r>
+            <w:r>
+              <w:rPr>
+                <w:noProof/>
+                <w:webHidden/>
+              </w:rPr>
+              <w:fldChar w:fldCharType="end"/>
+            </w:r>
+          </w:hyperlink>
+        </w:p>
+        <w:p>
+          <w:pPr>
+            <w:pStyle w:val="TOC2"/>
+            <w:tabs>
+              <w:tab w:val="right" w:leader="dot" w:pos="8630"/>
+            </w:tabs>
+            <w:rPr>
+              <w:noProof/>
+              <w:kern w:val="2"/>
+              <w:sz w:val="24"/>
+              <w:szCs w:val="24"/>
+              <w14:ligatures w14:val="standardContextual"/>
+            </w:rPr>
+          </w:pPr>
+          <w:hyperlink w:anchor="_Toc227105633" w:history="1">
+            <w:r>
+              <w:rPr>
+                <w:rStyle w:val="Hyperlink"/>
+                <w:noProof/>
+              </w:rPr>
+              <w:t>13B.6 Setting Up the Workflow — Step by Step</w:t>
+            </w:r>
+            <w:r>
+              <w:rPr>
+                <w:noProof/>
+                <w:webHidden/>
+              </w:rPr>
+              <w:tab/>
+            </w:r>
+            <w:r>
+              <w:rPr>
+                <w:noProof/>
+                <w:webHidden/>
+              </w:rPr>
+              <w:fldChar w:fldCharType="begin"/>
+            </w:r>
+            <w:r>
+              <w:rPr>
+                <w:noProof/>
+                <w:webHidden/>
+              </w:rPr>
+              <w:instrText xml:space="preserve"> PAGEREF _Toc227105633 \h </w:instrText>
+            </w:r>
+            <w:r>
+              <w:rPr>
+                <w:noProof/>
+                <w:webHidden/>
+              </w:rPr>
+            </w:r>
+            <w:r>
+              <w:rPr>
+                <w:noProof/>
+                <w:webHidden/>
+              </w:rPr>
+              <w:fldChar w:fldCharType="separate"/>
+            </w:r>
+            <w:r>
+              <w:rPr>
+                <w:noProof/>
+                <w:webHidden/>
+              </w:rPr>
+              <w:t>36</w:t>
             </w:r>
             <w:r>
               <w:rPr>
@@ -5379,13 +5485,13 @@
               <w14:ligatures w14:val="standardContextual"/>
             </w:rPr>
           </w:pPr>
-          <w:hyperlink w:anchor="_Toc227103233" w:history="1">
+          <w:hyperlink w:anchor="_Toc227105634" w:history="1">
             <w:r>
               <w:rPr>
                 <w:rStyle w:val="Hyperlink"/>
                 <w:noProof/>
               </w:rPr>
-              <w:t>Chapter 15: Best Practices &amp; Quick Reference</w:t>
+              <w:t>Chapter 14: Code Quality &amp; Linting with Pylint</w:t>
             </w:r>
             <w:r>
               <w:rPr>
@@ -5406,7 +5512,7 @@
                 <w:noProof/>
                 <w:webHidden/>
               </w:rPr>
-              <w:instrText xml:space="preserve"> PAGEREF _Toc227103233 \h </w:instrText>
+              <w:instrText xml:space="preserve"> PAGEREF _Toc227105634 \h </w:instrText>
             </w:r>
             <w:r>
               <w:rPr>
@@ -5426,7 +5532,7 @@
                 <w:noProof/>
                 <w:webHidden/>
               </w:rPr>
-              <w:t>35</w:t>
+              <w:t>37</w:t>
             </w:r>
             <w:r>
               <w:rPr>
@@ -5451,13 +5557,13 @@
               <w14:ligatures w14:val="standardContextual"/>
             </w:rPr>
           </w:pPr>
-          <w:hyperlink w:anchor="_Toc227103234" w:history="1">
+          <w:hyperlink w:anchor="_Toc227105635" w:history="1">
             <w:r>
               <w:rPr>
                 <w:rStyle w:val="Hyperlink"/>
                 <w:noProof/>
               </w:rPr>
-              <w:t>15.1 The Golden Rules of Test Automation</w:t>
+              <w:t>14.1 What is Pylint?</w:t>
             </w:r>
             <w:r>
               <w:rPr>
@@ -5478,7 +5584,7 @@
                 <w:noProof/>
                 <w:webHidden/>
               </w:rPr>
-              <w:instrText xml:space="preserve"> PAGEREF _Toc227103234 \h </w:instrText>
+              <w:instrText xml:space="preserve"> PAGEREF _Toc227105635 \h </w:instrText>
             </w:r>
             <w:r>
               <w:rPr>
@@ -5498,7 +5604,7 @@
                 <w:noProof/>
                 <w:webHidden/>
               </w:rPr>
-              <w:t>35</w:t>
+              <w:t>37</w:t>
             </w:r>
             <w:r>
               <w:rPr>
@@ -5523,13 +5629,13 @@
               <w14:ligatures w14:val="standardContextual"/>
             </w:rPr>
           </w:pPr>
-          <w:hyperlink w:anchor="_Toc227103235" w:history="1">
+          <w:hyperlink w:anchor="_Toc227105636" w:history="1">
             <w:r>
               <w:rPr>
                 <w:rStyle w:val="Hyperlink"/>
                 <w:noProof/>
               </w:rPr>
-              <w:t>15.2 Adding a New UI Application — Checklist</w:t>
+              <w:t>14.2 Running Pylint</w:t>
             </w:r>
             <w:r>
               <w:rPr>
@@ -5550,7 +5656,7 @@
                 <w:noProof/>
                 <w:webHidden/>
               </w:rPr>
-              <w:instrText xml:space="preserve"> PAGEREF _Toc227103235 \h </w:instrText>
+              <w:instrText xml:space="preserve"> PAGEREF _Toc227105636 \h </w:instrText>
             </w:r>
             <w:r>
               <w:rPr>
@@ -5570,7 +5676,7 @@
                 <w:noProof/>
                 <w:webHidden/>
               </w:rPr>
-              <w:t>35</w:t>
+              <w:t>37</w:t>
             </w:r>
             <w:r>
               <w:rPr>
@@ -5595,13 +5701,13 @@
               <w14:ligatures w14:val="standardContextual"/>
             </w:rPr>
           </w:pPr>
-          <w:hyperlink w:anchor="_Toc227103236" w:history="1">
+          <w:hyperlink w:anchor="_Toc227105637" w:history="1">
             <w:r>
               <w:rPr>
                 <w:rStyle w:val="Hyperlink"/>
                 <w:noProof/>
               </w:rPr>
-              <w:t>15.3 Complete Command Quick Reference</w:t>
+              <w:t>14.3 Suppressing Pylint Warnings</w:t>
             </w:r>
             <w:r>
               <w:rPr>
@@ -5622,7 +5728,7 @@
                 <w:noProof/>
                 <w:webHidden/>
               </w:rPr>
-              <w:instrText xml:space="preserve"> PAGEREF _Toc227103236 \h </w:instrText>
+              <w:instrText xml:space="preserve"> PAGEREF _Toc227105637 \h </w:instrText>
             </w:r>
             <w:r>
               <w:rPr>
@@ -5642,7 +5748,7 @@
                 <w:noProof/>
                 <w:webHidden/>
               </w:rPr>
-              <w:t>36</w:t>
+              <w:t>37</w:t>
             </w:r>
             <w:r>
               <w:rPr>
@@ -5667,13 +5773,13 @@
               <w14:ligatures w14:val="standardContextual"/>
             </w:rPr>
           </w:pPr>
-          <w:hyperlink w:anchor="_Toc227103237" w:history="1">
+          <w:hyperlink w:anchor="_Toc227105638" w:history="1">
             <w:r>
               <w:rPr>
                 <w:rStyle w:val="Hyperlink"/>
                 <w:noProof/>
               </w:rPr>
-              <w:t>15.4 Troubleshooting Common Issues</w:t>
+              <w:t>14.4 Commit Style — Conventional Commits</w:t>
             </w:r>
             <w:r>
               <w:rPr>
@@ -5694,7 +5800,7 @@
                 <w:noProof/>
                 <w:webHidden/>
               </w:rPr>
-              <w:instrText xml:space="preserve"> PAGEREF _Toc227103237 \h </w:instrText>
+              <w:instrText xml:space="preserve"> PAGEREF _Toc227105638 \h </w:instrText>
             </w:r>
             <w:r>
               <w:rPr>
@@ -5714,7 +5820,79 @@
                 <w:noProof/>
                 <w:webHidden/>
               </w:rPr>
-              <w:t>36</w:t>
+              <w:t>37</w:t>
+            </w:r>
+            <w:r>
+              <w:rPr>
+                <w:noProof/>
+                <w:webHidden/>
+              </w:rPr>
+              <w:fldChar w:fldCharType="end"/>
+            </w:r>
+          </w:hyperlink>
+        </w:p>
+        <w:p>
+          <w:pPr>
+            <w:pStyle w:val="TOC1"/>
+            <w:tabs>
+              <w:tab w:val="right" w:leader="dot" w:pos="8630"/>
+            </w:tabs>
+            <w:rPr>
+              <w:noProof/>
+              <w:kern w:val="2"/>
+              <w:sz w:val="24"/>
+              <w:szCs w:val="24"/>
+              <w14:ligatures w14:val="standardContextual"/>
+            </w:rPr>
+          </w:pPr>
+          <w:hyperlink w:anchor="_Toc227105639" w:history="1">
+            <w:r>
+              <w:rPr>
+                <w:rStyle w:val="Hyperlink"/>
+                <w:noProof/>
+              </w:rPr>
+              <w:t>Chapter 15: Best Practices &amp; Quick Reference</w:t>
+            </w:r>
+            <w:r>
+              <w:rPr>
+                <w:noProof/>
+                <w:webHidden/>
+              </w:rPr>
+              <w:tab/>
+            </w:r>
+            <w:r>
+              <w:rPr>
+                <w:noProof/>
+                <w:webHidden/>
+              </w:rPr>
+              <w:fldChar w:fldCharType="begin"/>
+            </w:r>
+            <w:r>
+              <w:rPr>
+                <w:noProof/>
+                <w:webHidden/>
+              </w:rPr>
+              <w:instrText xml:space="preserve"> PAGEREF _Toc227105639 \h </w:instrText>
+            </w:r>
+            <w:r>
+              <w:rPr>
+                <w:noProof/>
+                <w:webHidden/>
+              </w:rPr>
+            </w:r>
+            <w:r>
+              <w:rPr>
+                <w:noProof/>
+                <w:webHidden/>
+              </w:rPr>
+              <w:fldChar w:fldCharType="separate"/>
+            </w:r>
+            <w:r>
+              <w:rPr>
+                <w:noProof/>
+                <w:webHidden/>
+              </w:rPr>
+              <w:t>39</w:t>
             </w:r>
             <w:r>
               <w:rPr>
@@ -5739,13 +5917,13 @@
               <w14:ligatures w14:val="standardContextual"/>
             </w:rPr>
           </w:pPr>
-          <w:hyperlink w:anchor="_Toc227103238" w:history="1">
+          <w:hyperlink w:anchor="_Toc227105640" w:history="1">
             <w:r>
               <w:rPr>
                 <w:rStyle w:val="Hyperlink"/>
                 <w:noProof/>
               </w:rPr>
-              <w:t>15.5 Framework Architecture Summary Diagram</w:t>
+              <w:t>15.1 The Golden Rules of Test Automation</w:t>
             </w:r>
             <w:r>
               <w:rPr>
@@ -5766,7 +5944,7 @@
                 <w:noProof/>
                 <w:webHidden/>
               </w:rPr>
-              <w:instrText xml:space="preserve"> PAGEREF _Toc227103238 \h </w:instrText>
+              <w:instrText xml:space="preserve"> PAGEREF _Toc227105640 \h </w:instrText>
             </w:r>
             <w:r>
               <w:rPr>
@@ -5786,7 +5964,7 @@
                 <w:noProof/>
                 <w:webHidden/>
               </w:rPr>
-              <w:t>37</w:t>
+              <w:t>39</w:t>
             </w:r>
             <w:r>
               <w:rPr>
@@ -5811,12 +5989,300 @@
               <w14:ligatures w14:val="standardContextual"/>
             </w:rPr>
           </w:pPr>
-          <w:hyperlink w:anchor="_Toc227103239" w:history="1">
+          <w:hyperlink w:anchor="_Toc227105641" w:history="1">
             <w:r>
               <w:rPr>
                 <w:rStyle w:val="Hyperlink"/>
                 <w:noProof/>
               </w:rPr>
+              <w:t>15.2 Adding a New UI Application — Checklist</w:t>
+            </w:r>
+            <w:r>
+              <w:rPr>
+                <w:noProof/>
+                <w:webHidden/>
+              </w:rPr>
+              <w:tab/>
+            </w:r>
+            <w:r>
+              <w:rPr>
+                <w:noProof/>
+                <w:webHidden/>
+              </w:rPr>
+              <w:fldChar w:fldCharType="begin"/>
+            </w:r>
+            <w:r>
+              <w:rPr>
+                <w:noProof/>
+                <w:webHidden/>
+              </w:rPr>
+              <w:instrText xml:space="preserve"> PAGEREF _Toc227105641 \h </w:instrText>
+            </w:r>
+            <w:r>
+              <w:rPr>
+                <w:noProof/>
+                <w:webHidden/>
+              </w:rPr>
+            </w:r>
+            <w:r>
+              <w:rPr>
+                <w:noProof/>
+                <w:webHidden/>
+              </w:rPr>
+              <w:fldChar w:fldCharType="separate"/>
+            </w:r>
+            <w:r>
+              <w:rPr>
+                <w:noProof/>
+                <w:webHidden/>
+              </w:rPr>
+              <w:t>39</w:t>
+            </w:r>
+            <w:r>
+              <w:rPr>
+                <w:noProof/>
+                <w:webHidden/>
+              </w:rPr>
+              <w:fldChar w:fldCharType="end"/>
+            </w:r>
+          </w:hyperlink>
+        </w:p>
+        <w:p>
+          <w:pPr>
+            <w:pStyle w:val="TOC2"/>
+            <w:tabs>
+              <w:tab w:val="right" w:leader="dot" w:pos="8630"/>
+            </w:tabs>
+            <w:rPr>
+              <w:noProof/>
+              <w:kern w:val="2"/>
+              <w:sz w:val="24"/>
+              <w:szCs w:val="24"/>
+              <w14:ligatures w14:val="standardContextual"/>
+            </w:rPr>
+          </w:pPr>
+          <w:hyperlink w:anchor="_Toc227105642" w:history="1">
+            <w:r>
+              <w:rPr>
+                <w:rStyle w:val="Hyperlink"/>
+                <w:noProof/>
+              </w:rPr>
+              <w:t>15.3 Complete Command Quick Reference</w:t>
+            </w:r>
+            <w:r>
+              <w:rPr>
+                <w:noProof/>
+                <w:webHidden/>
+              </w:rPr>
+              <w:tab/>
+            </w:r>
+            <w:r>
+              <w:rPr>
+                <w:noProof/>
+                <w:webHidden/>
+              </w:rPr>
+              <w:fldChar w:fldCharType="begin"/>
+            </w:r>
+            <w:r>
+              <w:rPr>
+                <w:noProof/>
+                <w:webHidden/>
+              </w:rPr>
+              <w:instrText xml:space="preserve"> PAGEREF _Toc227105642 \h </w:instrText>
+            </w:r>
+            <w:r>
+              <w:rPr>
+                <w:noProof/>
+                <w:webHidden/>
+              </w:rPr>
+            </w:r>
+            <w:r>
+              <w:rPr>
+                <w:noProof/>
+                <w:webHidden/>
+              </w:rPr>
+              <w:fldChar w:fldCharType="separate"/>
+            </w:r>
+            <w:r>
+              <w:rPr>
+                <w:noProof/>
+                <w:webHidden/>
+              </w:rPr>
+              <w:t>40</w:t>
+            </w:r>
+            <w:r>
+              <w:rPr>
+                <w:noProof/>
+                <w:webHidden/>
+              </w:rPr>
+              <w:fldChar w:fldCharType="end"/>
+            </w:r>
+          </w:hyperlink>
+        </w:p>
+        <w:p>
+          <w:pPr>
+            <w:pStyle w:val="TOC2"/>
+            <w:tabs>
+              <w:tab w:val="right" w:leader="dot" w:pos="8630"/>
+            </w:tabs>
+            <w:rPr>
+              <w:noProof/>
+              <w:kern w:val="2"/>
+              <w:sz w:val="24"/>
+              <w:szCs w:val="24"/>
+              <w14:ligatures w14:val="standardContextual"/>
+            </w:rPr>
+          </w:pPr>
+          <w:hyperlink w:anchor="_Toc227105643" w:history="1">
+            <w:r>
+              <w:rPr>
+                <w:rStyle w:val="Hyperlink"/>
+                <w:noProof/>
+              </w:rPr>
+              <w:t>15.4 Troubleshooting Common Issues</w:t>
+            </w:r>
+            <w:r>
+              <w:rPr>
+                <w:noProof/>
+                <w:webHidden/>
+              </w:rPr>
+              <w:tab/>
+            </w:r>
+            <w:r>
+              <w:rPr>
+                <w:noProof/>
+                <w:webHidden/>
+              </w:rPr>
+              <w:fldChar w:fldCharType="begin"/>
+            </w:r>
+            <w:r>
+              <w:rPr>
+                <w:noProof/>
+                <w:webHidden/>
+              </w:rPr>
+              <w:instrText xml:space="preserve"> PAGEREF _Toc227105643 \h </w:instrText>
+            </w:r>
+            <w:r>
+              <w:rPr>
+                <w:noProof/>
+                <w:webHidden/>
+              </w:rPr>
+            </w:r>
+            <w:r>
+              <w:rPr>
+                <w:noProof/>
+                <w:webHidden/>
+              </w:rPr>
+              <w:fldChar w:fldCharType="separate"/>
+            </w:r>
+            <w:r>
+              <w:rPr>
+                <w:noProof/>
+                <w:webHidden/>
+              </w:rPr>
+              <w:t>40</w:t>
+            </w:r>
+            <w:r>
+              <w:rPr>
+                <w:noProof/>
+                <w:webHidden/>
+              </w:rPr>
+              <w:fldChar w:fldCharType="end"/>
+            </w:r>
+          </w:hyperlink>
+        </w:p>
+        <w:p>
+          <w:pPr>
+            <w:pStyle w:val="TOC2"/>
+            <w:tabs>
+              <w:tab w:val="right" w:leader="dot" w:pos="8630"/>
+            </w:tabs>
+            <w:rPr>
+              <w:noProof/>
+              <w:kern w:val="2"/>
+              <w:sz w:val="24"/>
+              <w:szCs w:val="24"/>
+              <w14:ligatures w14:val="standardContextual"/>
+            </w:rPr>
+          </w:pPr>
+          <w:hyperlink w:anchor="_Toc227105644" w:history="1">
+            <w:r>
+              <w:rPr>
+                <w:rStyle w:val="Hyperlink"/>
+                <w:noProof/>
+              </w:rPr>
+              <w:t>15.5 Framework Architecture Summary Diagram</w:t>
+            </w:r>
+            <w:r>
+              <w:rPr>
+                <w:noProof/>
+                <w:webHidden/>
+              </w:rPr>
+              <w:tab/>
+            </w:r>
+            <w:r>
+              <w:rPr>
+                <w:noProof/>
+                <w:webHidden/>
+              </w:rPr>
+              <w:fldChar w:fldCharType="begin"/>
+            </w:r>
+            <w:r>
+              <w:rPr>
+                <w:noProof/>
+                <w:webHidden/>
+              </w:rPr>
+              <w:instrText xml:space="preserve"> PAGEREF _Toc227105644 \h </w:instrText>
+            </w:r>
+            <w:r>
+              <w:rPr>
+                <w:noProof/>
+                <w:webHidden/>
+              </w:rPr>
+            </w:r>
+            <w:r>
+              <w:rPr>
+                <w:noProof/>
+                <w:webHidden/>
+              </w:rPr>
+              <w:fldChar w:fldCharType="separate"/>
+            </w:r>
+            <w:r>
+              <w:rPr>
+                <w:noProof/>
+                <w:webHidden/>
+              </w:rPr>
+              <w:t>41</w:t>
+            </w:r>
+            <w:r>
+              <w:rPr>
+                <w:noProof/>
+                <w:webHidden/>
+              </w:rPr>
+              <w:fldChar w:fldCharType="end"/>
+            </w:r>
+          </w:hyperlink>
+        </w:p>
+        <w:p>
+          <w:pPr>
+            <w:pStyle w:val="TOC2"/>
+            <w:tabs>
+              <w:tab w:val="right" w:leader="dot" w:pos="8630"/>
+            </w:tabs>
+            <w:rPr>
+              <w:noProof/>
+              <w:kern w:val="2"/>
+              <w:sz w:val="24"/>
+              <w:szCs w:val="24"/>
+              <w14:ligatures w14:val="standardContextual"/>
+            </w:rPr>
+          </w:pPr>
+          <w:hyperlink w:anchor="_Toc227105645" w:history="1">
+            <w:r>
+              <w:rPr>
+                <w:rStyle w:val="Hyperlink"/>
+                <w:noProof/>
+              </w:rPr>
               <w:t>15.6 Learning Path — What to Study Next</w:t>
             </w:r>
             <w:r>
@@ -5838,7 +6304,7 @@
                 <w:noProof/>
                 <w:webHidden/>
               </w:rPr>
-              <w:instrText xml:space="preserve"> PAGEREF _Toc227103239 \h </w:instrText>
+              <w:instrText xml:space="preserve"> PAGEREF _Toc227105645 \h </w:instrText>
             </w:r>
             <w:r>
               <w:rPr>
@@ -5858,7 +6324,7 @@
                 <w:noProof/>
                 <w:webHidden/>
               </w:rPr>
-              <w:t>39</w:t>
+              <w:t>43</w:t>
             </w:r>
             <w:r>
               <w:rPr>
@@ -5883,7 +6349,7 @@
               <w14:ligatures w14:val="standardContextual"/>
             </w:rPr>
           </w:pPr>
-          <w:hyperlink w:anchor="_Toc227103240" w:history="1">
+          <w:hyperlink w:anchor="_Toc227105646" w:history="1">
             <w:r>
               <w:rPr>
                 <w:rStyle w:val="Hyperlink"/>
@@ -5910,7 +6376,7 @@
                 <w:noProof/>
                 <w:webHidden/>
               </w:rPr>
-              <w:instrText xml:space="preserve"> PAGEREF _Toc227103240 \h </w:instrText>
+              <w:instrText xml:space="preserve"> PAGEREF _Toc227105646 \h </w:instrText>
             </w:r>
             <w:r>
               <w:rPr>
@@ -5930,7 +6396,7 @@
                 <w:noProof/>
                 <w:webHidden/>
               </w:rPr>
-              <w:t>40</w:t>
+              <w:t>44</w:t>
             </w:r>
             <w:r>
               <w:rPr>
@@ -5955,27 +6421,13 @@
               <w14:ligatures w14:val="standardContextual"/>
             </w:rPr>
           </w:pPr>
-          <w:hyperlink w:anchor="_Toc227103241" w:history="1">
+          <w:hyperlink w:anchor="_Toc227105647" w:history="1">
             <w:r>
               <w:rPr>
                 <w:rStyle w:val="Hyperlink"/>
                 <w:noProof/>
               </w:rPr>
-              <w:t>Closing</w:t>
-            </w:r>
-            <w:r>
-              <w:rPr>
-                <w:rStyle w:val="Hyperlink"/>
-                <w:noProof/>
-              </w:rPr>
-              <w:t xml:space="preserve"> </w:t>
-            </w:r>
-            <w:r>
-              <w:rPr>
-                <w:rStyle w:val="Hyperlink"/>
-                <w:noProof/>
-              </w:rPr>
-              <w:t>Words</w:t>
+              <w:t>Closing Words</w:t>
             </w:r>
             <w:r>
               <w:rPr>
@@ -5996,7 +6448,7 @@
                 <w:noProof/>
                 <w:webHidden/>
               </w:rPr>
-              <w:instrText xml:space="preserve"> PAGEREF _Toc227103241 \h </w:instrText>
+              <w:instrText xml:space="preserve"> PAGEREF _Toc227105647 \h </w:instrText>
             </w:r>
             <w:r>
               <w:rPr>
@@ -6016,7 +6468,7 @@
                 <w:noProof/>
                 <w:webHidden/>
               </w:rPr>
-              <w:t>42</w:t>
+              <w:t>46</w:t>
             </w:r>
             <w:r>
               <w:rPr>
@@ -6052,7 +6504,7 @@
         </w:pBdr>
       </w:pPr>
       <w:bookmarkStart w:id="2" w:name="_Toc227102999"/>
-      <w:bookmarkStart w:id="3" w:name="_Toc227103162"/>
+      <w:bookmarkStart w:id="3" w:name="_Toc227105561"/>
       <w:r>
         <w:rPr>
           <w:sz w:val="36"/>
@@ -6085,7 +6537,7 @@
         <w:pStyle w:val="Heading2"/>
       </w:pPr>
       <w:bookmarkStart w:id="4" w:name="_Toc227103000"/>
-      <w:bookmarkStart w:id="5" w:name="_Toc227103163"/>
+      <w:bookmarkStart w:id="5" w:name="_Toc227105562"/>
       <w:r>
         <w:t>1.1 What is This Framework?</w:t>
       </w:r>
@@ -6257,7 +6709,7 @@
         <w:pStyle w:val="Heading2"/>
       </w:pPr>
       <w:bookmarkStart w:id="6" w:name="_Toc227103001"/>
-      <w:bookmarkStart w:id="7" w:name="_Toc227103164"/>
+      <w:bookmarkStart w:id="7" w:name="_Toc227105563"/>
       <w:r>
         <w:t>1.2 Key Capabilities</w:t>
       </w:r>
@@ -6418,7 +6870,7 @@
         <w:pStyle w:val="Heading2"/>
       </w:pPr>
       <w:bookmarkStart w:id="8" w:name="_Toc227103002"/>
-      <w:bookmarkStart w:id="9" w:name="_Toc227103165"/>
+      <w:bookmarkStart w:id="9" w:name="_Toc227105564"/>
       <w:r>
         <w:t>1.3 Technology Stack</w:t>
       </w:r>
@@ -6988,7 +7440,7 @@
         </w:pBdr>
       </w:pPr>
       <w:bookmarkStart w:id="10" w:name="_Toc227103003"/>
-      <w:bookmarkStart w:id="11" w:name="_Toc227103166"/>
+      <w:bookmarkStart w:id="11" w:name="_Toc227105565"/>
       <w:r>
         <w:rPr>
           <w:sz w:val="36"/>
@@ -7016,7 +7468,7 @@
         <w:pStyle w:val="Heading2"/>
       </w:pPr>
       <w:bookmarkStart w:id="12" w:name="_Toc227103004"/>
-      <w:bookmarkStart w:id="13" w:name="_Toc227103167"/>
+      <w:bookmarkStart w:id="13" w:name="_Toc227105566"/>
       <w:r>
         <w:t>2.1 What You Need Before You Start</w:t>
       </w:r>
@@ -7367,7 +7819,7 @@
         <w:pStyle w:val="Heading2"/>
       </w:pPr>
       <w:bookmarkStart w:id="14" w:name="_Toc227103005"/>
-      <w:bookmarkStart w:id="15" w:name="_Toc227103168"/>
+      <w:bookmarkStart w:id="15" w:name="_Toc227105567"/>
       <w:r>
         <w:t>2.2 Step-by-Step Installation</w:t>
       </w:r>
@@ -7379,7 +7831,7 @@
         <w:pStyle w:val="Heading3"/>
       </w:pPr>
       <w:bookmarkStart w:id="16" w:name="_Toc227103006"/>
-      <w:bookmarkStart w:id="17" w:name="_Toc227103169"/>
+      <w:bookmarkStart w:id="17" w:name="_Toc227105568"/>
       <w:r>
         <w:t>Step 1 — Clone the Repository</w:t>
       </w:r>
@@ -7396,7 +7848,7 @@
         <w:pStyle w:val="Heading3"/>
       </w:pPr>
       <w:bookmarkStart w:id="18" w:name="_Toc227103007"/>
-      <w:bookmarkStart w:id="19" w:name="_Toc227103170"/>
+      <w:bookmarkStart w:id="19" w:name="_Toc227105569"/>
       <w:r>
         <w:t>Step 2 — Create a Virtual Environment</w:t>
       </w:r>
@@ -7463,7 +7915,7 @@
         <w:pStyle w:val="Heading3"/>
       </w:pPr>
       <w:bookmarkStart w:id="20" w:name="_Toc227103008"/>
-      <w:bookmarkStart w:id="21" w:name="_Toc227103171"/>
+      <w:bookmarkStart w:id="21" w:name="_Toc227105570"/>
       <w:r>
         <w:t>Step 3 — Install All Dependencies</w:t>
       </w:r>
@@ -7494,7 +7946,7 @@
         <w:pStyle w:val="Heading3"/>
       </w:pPr>
       <w:bookmarkStart w:id="22" w:name="_Toc227103009"/>
-      <w:bookmarkStart w:id="23" w:name="_Toc227103172"/>
+      <w:bookmarkStart w:id="23" w:name="_Toc227105571"/>
       <w:r>
         <w:lastRenderedPageBreak/>
         <w:t>Step 4 — Verify the Installation</w:t>
@@ -7524,7 +7976,7 @@
         <w:pStyle w:val="Heading2"/>
       </w:pPr>
       <w:bookmarkStart w:id="24" w:name="_Toc227103010"/>
-      <w:bookmarkStart w:id="25" w:name="_Toc227103173"/>
+      <w:bookmarkStart w:id="25" w:name="_Toc227105572"/>
       <w:r>
         <w:t>2.3 Environment Variables Reference</w:t>
       </w:r>
@@ -7909,7 +8361,7 @@
         </w:pBdr>
       </w:pPr>
       <w:bookmarkStart w:id="26" w:name="_Toc227103011"/>
-      <w:bookmarkStart w:id="27" w:name="_Toc227103174"/>
+      <w:bookmarkStart w:id="27" w:name="_Toc227105573"/>
       <w:r>
         <w:rPr>
           <w:sz w:val="36"/>
@@ -7937,7 +8389,7 @@
         <w:pStyle w:val="Heading2"/>
       </w:pPr>
       <w:bookmarkStart w:id="28" w:name="_Toc227103012"/>
-      <w:bookmarkStart w:id="29" w:name="_Toc227103175"/>
+      <w:bookmarkStart w:id="29" w:name="_Toc227105574"/>
       <w:r>
         <w:t>3.1 Folder Layout</w:t>
       </w:r>
@@ -8418,7 +8870,7 @@
         <w:pStyle w:val="Heading2"/>
       </w:pPr>
       <w:bookmarkStart w:id="30" w:name="_Toc227103013"/>
-      <w:bookmarkStart w:id="31" w:name="_Toc227103176"/>
+      <w:bookmarkStart w:id="31" w:name="_Toc227105575"/>
       <w:r>
         <w:t>3.2 The Page Object Model (POM) Pattern</w:t>
       </w:r>
@@ -8491,7 +8943,7 @@
         <w:pStyle w:val="Heading2"/>
       </w:pPr>
       <w:bookmarkStart w:id="32" w:name="_Toc227103014"/>
-      <w:bookmarkStart w:id="33" w:name="_Toc227103177"/>
+      <w:bookmarkStart w:id="33" w:name="_Toc227105576"/>
       <w:r>
         <w:t>3.3 Fixture Chain — How Tests Wire Together</w:t>
       </w:r>
@@ -8776,7 +9228,7 @@
         </w:pBdr>
       </w:pPr>
       <w:bookmarkStart w:id="34" w:name="_Toc227103015"/>
-      <w:bookmarkStart w:id="35" w:name="_Toc227103178"/>
+      <w:bookmarkStart w:id="35" w:name="_Toc227105577"/>
       <w:r>
         <w:rPr>
           <w:sz w:val="36"/>
@@ -8792,7 +9244,7 @@
         <w:pStyle w:val="Heading2"/>
       </w:pPr>
       <w:bookmarkStart w:id="36" w:name="_Toc227103016"/>
-      <w:bookmarkStart w:id="37" w:name="_Toc227103179"/>
+      <w:bookmarkStart w:id="37" w:name="_Toc227105578"/>
       <w:r>
         <w:t>4.1 How ConfigParser Works</w:t>
       </w:r>
@@ -8896,7 +9348,7 @@
         <w:pStyle w:val="Heading2"/>
       </w:pPr>
       <w:bookmarkStart w:id="38" w:name="_Toc227103017"/>
-      <w:bookmarkStart w:id="39" w:name="_Toc227103180"/>
+      <w:bookmarkStart w:id="39" w:name="_Toc227105579"/>
       <w:r>
         <w:t>4.2 YAML Config Structure</w:t>
       </w:r>
@@ -9037,7 +9489,7 @@
         <w:pStyle w:val="Heading2"/>
       </w:pPr>
       <w:bookmarkStart w:id="40" w:name="_Toc227103018"/>
-      <w:bookmarkStart w:id="41" w:name="_Toc227103181"/>
+      <w:bookmarkStart w:id="41" w:name="_Toc227105580"/>
       <w:r>
         <w:t>4.3 Adding a New Config File</w:t>
       </w:r>
@@ -9094,7 +9546,7 @@
         </w:pBdr>
       </w:pPr>
       <w:bookmarkStart w:id="42" w:name="_Toc227103019"/>
-      <w:bookmarkStart w:id="43" w:name="_Toc227103182"/>
+      <w:bookmarkStart w:id="43" w:name="_Toc227105581"/>
       <w:r>
         <w:rPr>
           <w:sz w:val="36"/>
@@ -9110,7 +9562,7 @@
         <w:pStyle w:val="Heading2"/>
       </w:pPr>
       <w:bookmarkStart w:id="44" w:name="_Toc227103020"/>
-      <w:bookmarkStart w:id="45" w:name="_Toc227103183"/>
+      <w:bookmarkStart w:id="45" w:name="_Toc227105582"/>
       <w:r>
         <w:t>5.1 What is pytest?</w:t>
       </w:r>
@@ -9127,7 +9579,7 @@
         <w:pStyle w:val="Heading2"/>
       </w:pPr>
       <w:bookmarkStart w:id="46" w:name="_Toc227103021"/>
-      <w:bookmarkStart w:id="47" w:name="_Toc227103184"/>
+      <w:bookmarkStart w:id="47" w:name="_Toc227105583"/>
       <w:r>
         <w:t>5.2 Running Tests — Command Reference</w:t>
       </w:r>
@@ -9518,7 +9970,7 @@
         <w:pStyle w:val="Heading2"/>
       </w:pPr>
       <w:bookmarkStart w:id="48" w:name="_Toc227103022"/>
-      <w:bookmarkStart w:id="49" w:name="_Toc227103185"/>
+      <w:bookmarkStart w:id="49" w:name="_Toc227105584"/>
       <w:r>
         <w:t>5.3 Pytest Markers</w:t>
       </w:r>
@@ -9755,7 +10207,7 @@
         <w:pStyle w:val="Heading2"/>
       </w:pPr>
       <w:bookmarkStart w:id="50" w:name="_Toc227103023"/>
-      <w:bookmarkStart w:id="51" w:name="_Toc227103186"/>
+      <w:bookmarkStart w:id="51" w:name="_Toc227105585"/>
       <w:r>
         <w:t>5.4 Pytest Fixtures Explained</w:t>
       </w:r>
@@ -10024,7 +10476,7 @@
         </w:pBdr>
       </w:pPr>
       <w:bookmarkStart w:id="52" w:name="_Toc227103024"/>
-      <w:bookmarkStart w:id="53" w:name="_Toc227103187"/>
+      <w:bookmarkStart w:id="53" w:name="_Toc227105586"/>
       <w:r>
         <w:rPr>
           <w:sz w:val="36"/>
@@ -10040,7 +10492,7 @@
         <w:pStyle w:val="Heading2"/>
       </w:pPr>
       <w:bookmarkStart w:id="54" w:name="_Toc227103025"/>
-      <w:bookmarkStart w:id="55" w:name="_Toc227103188"/>
+      <w:bookmarkStart w:id="55" w:name="_Toc227105587"/>
       <w:r>
         <w:t>6.1 BasePage — The Foundation of All UI Tests</w:t>
       </w:r>
@@ -10536,7 +10988,7 @@
         <w:pStyle w:val="Heading2"/>
       </w:pPr>
       <w:bookmarkStart w:id="56" w:name="_Toc227103026"/>
-      <w:bookmarkStart w:id="57" w:name="_Toc227103189"/>
+      <w:bookmarkStart w:id="57" w:name="_Toc227105588"/>
       <w:r>
         <w:t>6.2 Writing a Page Object — Step by Step</w:t>
       </w:r>
@@ -10956,7 +11408,7 @@
         <w:pStyle w:val="Heading2"/>
       </w:pPr>
       <w:bookmarkStart w:id="58" w:name="_Toc227103027"/>
-      <w:bookmarkStart w:id="59" w:name="_Toc227103190"/>
+      <w:bookmarkStart w:id="59" w:name="_Toc227105589"/>
       <w:r>
         <w:t>6.3 Writing a Test Case — Full Walkthrough</w:t>
       </w:r>
@@ -11338,7 +11790,7 @@
         <w:pStyle w:val="Heading2"/>
       </w:pPr>
       <w:bookmarkStart w:id="60" w:name="_Toc227103028"/>
-      <w:bookmarkStart w:id="61" w:name="_Toc227103191"/>
+      <w:bookmarkStart w:id="61" w:name="_Toc227105590"/>
       <w:r>
         <w:t xml:space="preserve">6.4 </w:t>
       </w:r>
@@ -11369,7 +11821,7 @@
         <w:pStyle w:val="Heading2"/>
       </w:pPr>
       <w:bookmarkStart w:id="62" w:name="_Toc227103029"/>
-      <w:bookmarkStart w:id="63" w:name="_Toc227103192"/>
+      <w:bookmarkStart w:id="63" w:name="_Toc227105591"/>
       <w:r>
         <w:t>6.5 Running UI Tests</w:t>
       </w:r>
@@ -11482,7 +11934,7 @@
         </w:pBdr>
       </w:pPr>
       <w:bookmarkStart w:id="64" w:name="_Toc227103030"/>
-      <w:bookmarkStart w:id="65" w:name="_Toc227103193"/>
+      <w:bookmarkStart w:id="65" w:name="_Toc227105592"/>
       <w:r>
         <w:rPr>
           <w:sz w:val="36"/>
@@ -11498,7 +11950,7 @@
         <w:pStyle w:val="Heading2"/>
       </w:pPr>
       <w:bookmarkStart w:id="66" w:name="_Toc227103031"/>
-      <w:bookmarkStart w:id="67" w:name="_Toc227103194"/>
+      <w:bookmarkStart w:id="67" w:name="_Toc227105593"/>
       <w:r>
         <w:t>7.1 The APIClient Class</w:t>
       </w:r>
@@ -11668,7 +12120,7 @@
         <w:pStyle w:val="Heading2"/>
       </w:pPr>
       <w:bookmarkStart w:id="68" w:name="_Toc227103032"/>
-      <w:bookmarkStart w:id="69" w:name="_Toc227103195"/>
+      <w:bookmarkStart w:id="69" w:name="_Toc227105594"/>
       <w:r>
         <w:t>7.2 Writing API Tests — Example (Reqres)</w:t>
       </w:r>
@@ -11958,7 +12410,7 @@
         <w:pStyle w:val="Heading2"/>
       </w:pPr>
       <w:bookmarkStart w:id="70" w:name="_Toc227103033"/>
-      <w:bookmarkStart w:id="71" w:name="_Toc227103196"/>
+      <w:bookmarkStart w:id="71" w:name="_Toc227105595"/>
       <w:r>
         <w:t>7.3 OAuth2 Authentication (Commerce Tools)</w:t>
       </w:r>
@@ -12035,7 +12487,7 @@
         <w:pStyle w:val="Heading2"/>
       </w:pPr>
       <w:bookmarkStart w:id="72" w:name="_Toc227103034"/>
-      <w:bookmarkStart w:id="73" w:name="_Toc227103197"/>
+      <w:bookmarkStart w:id="73" w:name="_Toc227105596"/>
       <w:r>
         <w:t>7.4 Running API Tests</w:t>
       </w:r>
@@ -12095,7 +12547,7 @@
         </w:pBdr>
       </w:pPr>
       <w:bookmarkStart w:id="74" w:name="_Toc227103035"/>
-      <w:bookmarkStart w:id="75" w:name="_Toc227103198"/>
+      <w:bookmarkStart w:id="75" w:name="_Toc227105597"/>
       <w:r>
         <w:rPr>
           <w:sz w:val="36"/>
@@ -12111,7 +12563,7 @@
         <w:pStyle w:val="Heading2"/>
       </w:pPr>
       <w:bookmarkStart w:id="76" w:name="_Toc227103036"/>
-      <w:bookmarkStart w:id="77" w:name="_Toc227103199"/>
+      <w:bookmarkStart w:id="77" w:name="_Toc227105598"/>
       <w:r>
         <w:t>8.1 How Mobile Testing Works in This Framework</w:t>
       </w:r>
@@ -12128,7 +12580,7 @@
         <w:pStyle w:val="Heading2"/>
       </w:pPr>
       <w:bookmarkStart w:id="78" w:name="_Toc227103037"/>
-      <w:bookmarkStart w:id="79" w:name="_Toc227103200"/>
+      <w:bookmarkStart w:id="79" w:name="_Toc227105599"/>
       <w:r>
         <w:t>8.2 Mobile Setup Requirements</w:t>
       </w:r>
@@ -12351,7 +12803,7 @@
         <w:pStyle w:val="Heading2"/>
       </w:pPr>
       <w:bookmarkStart w:id="80" w:name="_Toc227103038"/>
-      <w:bookmarkStart w:id="81" w:name="_Toc227103201"/>
+      <w:bookmarkStart w:id="81" w:name="_Toc227105600"/>
       <w:r>
         <w:t>8.3 Running Mobile Tests</w:t>
       </w:r>
@@ -12388,7 +12840,7 @@
         </w:pBdr>
       </w:pPr>
       <w:bookmarkStart w:id="82" w:name="_Toc227103039"/>
-      <w:bookmarkStart w:id="83" w:name="_Toc227103202"/>
+      <w:bookmarkStart w:id="83" w:name="_Toc227105601"/>
       <w:r>
         <w:rPr>
           <w:sz w:val="36"/>
@@ -12416,7 +12868,7 @@
         <w:pStyle w:val="Heading2"/>
       </w:pPr>
       <w:bookmarkStart w:id="84" w:name="_Toc227103040"/>
-      <w:bookmarkStart w:id="85" w:name="_Toc227103203"/>
+      <w:bookmarkStart w:id="85" w:name="_Toc227105602"/>
       <w:r>
         <w:t>9.1 Custom Logger</w:t>
       </w:r>
@@ -12567,7 +13019,7 @@
         <w:pStyle w:val="Heading2"/>
       </w:pPr>
       <w:bookmarkStart w:id="86" w:name="_Toc227103041"/>
-      <w:bookmarkStart w:id="87" w:name="_Toc227103204"/>
+      <w:bookmarkStart w:id="87" w:name="_Toc227105603"/>
       <w:r>
         <w:t>9.2 Automatic Screenshot on Failure</w:t>
       </w:r>
@@ -12589,7 +13041,7 @@
         <w:pStyle w:val="Heading2"/>
       </w:pPr>
       <w:bookmarkStart w:id="88" w:name="_Toc227103042"/>
-      <w:bookmarkStart w:id="89" w:name="_Toc227103205"/>
+      <w:bookmarkStart w:id="89" w:name="_Toc227105604"/>
       <w:r>
         <w:t>9.3 Video Recording with ffmpeg</w:t>
       </w:r>
@@ -12703,7 +13155,7 @@
         <w:pStyle w:val="Heading2"/>
       </w:pPr>
       <w:bookmarkStart w:id="90" w:name="_Toc227103043"/>
-      <w:bookmarkStart w:id="91" w:name="_Toc227103206"/>
+      <w:bookmarkStart w:id="91" w:name="_Toc227105605"/>
       <w:r>
         <w:t>9.4 Output Folder — What Gets Created</w:t>
       </w:r>
@@ -12891,7 +13343,7 @@
         </w:pBdr>
       </w:pPr>
       <w:bookmarkStart w:id="92" w:name="_Toc227103044"/>
-      <w:bookmarkStart w:id="93" w:name="_Toc227103207"/>
+      <w:bookmarkStart w:id="93" w:name="_Toc227105606"/>
       <w:r>
         <w:rPr>
           <w:sz w:val="36"/>
@@ -12919,7 +13371,7 @@
         <w:pStyle w:val="Heading2"/>
       </w:pPr>
       <w:bookmarkStart w:id="94" w:name="_Toc227103045"/>
-      <w:bookmarkStart w:id="95" w:name="_Toc227103208"/>
+      <w:bookmarkStart w:id="95" w:name="_Toc227105607"/>
       <w:r>
         <w:t>10.1 pytest-html Report</w:t>
       </w:r>
@@ -12984,7 +13436,7 @@
         <w:pStyle w:val="Heading2"/>
       </w:pPr>
       <w:bookmarkStart w:id="96" w:name="_Toc227103046"/>
-      <w:bookmarkStart w:id="97" w:name="_Toc227103209"/>
+      <w:bookmarkStart w:id="97" w:name="_Toc227105608"/>
       <w:r>
         <w:t>10.2 Allure Report</w:t>
       </w:r>
@@ -13189,7 +13641,7 @@
         <w:pStyle w:val="Heading2"/>
       </w:pPr>
       <w:bookmarkStart w:id="98" w:name="_Toc227103047"/>
-      <w:bookmarkStart w:id="99" w:name="_Toc227103210"/>
+      <w:bookmarkStart w:id="99" w:name="_Toc227105609"/>
       <w:r>
         <w:t>10.3 Full Command — All Reporting Options Combined</w:t>
       </w:r>
@@ -13243,12 +13695,6 @@
         </w:rPr>
         <w:br/>
         <w:t xml:space="preserve">  tests/</w:t>
-      </w:r>
-    </w:p>
-    <w:p>
-      <w:r>
-        <w:lastRenderedPageBreak/>
-        <w:br w:type="page"/>
       </w:r>
     </w:p>
     <w:p>
@@ -13259,7 +13705,7 @@
         </w:pBdr>
       </w:pPr>
       <w:bookmarkStart w:id="100" w:name="_Toc227103048"/>
-      <w:bookmarkStart w:id="101" w:name="_Toc227103211"/>
+      <w:bookmarkStart w:id="101" w:name="_Toc227105610"/>
       <w:r>
         <w:rPr>
           <w:sz w:val="36"/>
@@ -13295,7 +13741,7 @@
         <w:pStyle w:val="Heading2"/>
       </w:pPr>
       <w:bookmarkStart w:id="102" w:name="_Toc227103049"/>
-      <w:bookmarkStart w:id="103" w:name="_Toc227103212"/>
+      <w:bookmarkStart w:id="103" w:name="_Toc227105611"/>
       <w:r>
         <w:t>11.1 Parallel Execution with pytest-xdist</w:t>
       </w:r>
@@ -13361,7 +13807,7 @@
         <w:pStyle w:val="Heading2"/>
       </w:pPr>
       <w:bookmarkStart w:id="104" w:name="_Toc227103050"/>
-      <w:bookmarkStart w:id="105" w:name="_Toc227103213"/>
+      <w:bookmarkStart w:id="105" w:name="_Toc227105612"/>
       <w:r>
         <w:t>11.2 Automatic Retry of Failed Tests</w:t>
       </w:r>
@@ -13434,7 +13880,7 @@
         <w:pStyle w:val="Heading2"/>
       </w:pPr>
       <w:bookmarkStart w:id="106" w:name="_Toc227103051"/>
-      <w:bookmarkStart w:id="107" w:name="_Toc227103214"/>
+      <w:bookmarkStart w:id="107" w:name="_Toc227105613"/>
       <w:r>
         <w:t>11.3 Parametrized (Data-Driven) Tests</w:t>
       </w:r>
@@ -13564,7 +14010,7 @@
         <w:pStyle w:val="Heading2"/>
       </w:pPr>
       <w:bookmarkStart w:id="108" w:name="_Toc227103052"/>
-      <w:bookmarkStart w:id="109" w:name="_Toc227103215"/>
+      <w:bookmarkStart w:id="109" w:name="_Toc227105614"/>
       <w:r>
         <w:lastRenderedPageBreak/>
         <w:t>11.4 Excel-Driven Tests</w:t>
@@ -13661,7 +14107,7 @@
         <w:pStyle w:val="Heading2"/>
       </w:pPr>
       <w:bookmarkStart w:id="110" w:name="_Toc227103053"/>
-      <w:bookmarkStart w:id="111" w:name="_Toc227103216"/>
+      <w:bookmarkStart w:id="111" w:name="_Toc227105615"/>
       <w:r>
         <w:t>11.5 BDD with pytest-bdd (Gherkin)</w:t>
       </w:r>
@@ -13782,7 +14228,7 @@
         </w:pBdr>
       </w:pPr>
       <w:bookmarkStart w:id="112" w:name="_Toc227103054"/>
-      <w:bookmarkStart w:id="113" w:name="_Toc227103217"/>
+      <w:bookmarkStart w:id="113" w:name="_Toc227105616"/>
       <w:r>
         <w:rPr>
           <w:sz w:val="36"/>
@@ -13798,7 +14244,7 @@
         <w:pStyle w:val="Heading2"/>
       </w:pPr>
       <w:bookmarkStart w:id="114" w:name="_Toc227103055"/>
-      <w:bookmarkStart w:id="115" w:name="_Toc227103218"/>
+      <w:bookmarkStart w:id="115" w:name="_Toc227105617"/>
       <w:r>
         <w:t>12.1 Why Docker?</w:t>
       </w:r>
@@ -13815,7 +14261,7 @@
         <w:pStyle w:val="Heading2"/>
       </w:pPr>
       <w:bookmarkStart w:id="116" w:name="_Toc227103056"/>
-      <w:bookmarkStart w:id="117" w:name="_Toc227103219"/>
+      <w:bookmarkStart w:id="117" w:name="_Toc227105618"/>
       <w:r>
         <w:t>12.2 Dockerfile Walkthrough</w:t>
       </w:r>
@@ -14086,7 +14532,7 @@
         <w:pStyle w:val="Heading2"/>
       </w:pPr>
       <w:bookmarkStart w:id="118" w:name="_Toc227103057"/>
-      <w:bookmarkStart w:id="119" w:name="_Toc227103220"/>
+      <w:bookmarkStart w:id="119" w:name="_Toc227105619"/>
       <w:r>
         <w:t>12.3 Building and Running Tests in Docker</w:t>
       </w:r>
@@ -14272,7 +14718,7 @@
         <w:pStyle w:val="Heading2"/>
       </w:pPr>
       <w:bookmarkStart w:id="120" w:name="_Toc227103058"/>
-      <w:bookmarkStart w:id="121" w:name="_Toc227103221"/>
+      <w:bookmarkStart w:id="121" w:name="_Toc227105620"/>
       <w:r>
         <w:t>12.4 Docker Layer Caching — Speed Tip</w:t>
       </w:r>
@@ -14297,7 +14743,7 @@
         </w:pBdr>
       </w:pPr>
       <w:bookmarkStart w:id="122" w:name="_Toc227103059"/>
-      <w:bookmarkStart w:id="123" w:name="_Toc227103222"/>
+      <w:bookmarkStart w:id="123" w:name="_Toc227105621"/>
       <w:r>
         <w:rPr>
           <w:sz w:val="36"/>
@@ -14313,7 +14759,7 @@
         <w:pStyle w:val="Heading2"/>
       </w:pPr>
       <w:bookmarkStart w:id="124" w:name="_Toc227103060"/>
-      <w:bookmarkStart w:id="125" w:name="_Toc227103223"/>
+      <w:bookmarkStart w:id="125" w:name="_Toc227105622"/>
       <w:r>
         <w:t>13.1 What is CI/CD?</w:t>
       </w:r>
@@ -14330,7 +14776,7 @@
         <w:pStyle w:val="Heading2"/>
       </w:pPr>
       <w:bookmarkStart w:id="126" w:name="_Toc227103061"/>
-      <w:bookmarkStart w:id="127" w:name="_Toc227103224"/>
+      <w:bookmarkStart w:id="127" w:name="_Toc227105623"/>
       <w:r>
         <w:t>13.2 Jenkins Pipeline Stages</w:t>
       </w:r>
@@ -14581,7 +15027,7 @@
         <w:pStyle w:val="Heading2"/>
       </w:pPr>
       <w:bookmarkStart w:id="128" w:name="_Toc227103062"/>
-      <w:bookmarkStart w:id="129" w:name="_Toc227103225"/>
+      <w:bookmarkStart w:id="129" w:name="_Toc227105624"/>
       <w:r>
         <w:t>13.3 Jenkins Pipeline Parameters</w:t>
       </w:r>
@@ -14602,7 +15048,7 @@
         <w:pStyle w:val="Heading2"/>
       </w:pPr>
       <w:bookmarkStart w:id="130" w:name="_Toc227103063"/>
-      <w:bookmarkStart w:id="131" w:name="_Toc227103226"/>
+      <w:bookmarkStart w:id="131" w:name="_Toc227105625"/>
       <w:r>
         <w:t>13.4 Post-Build: Report Archival</w:t>
       </w:r>
@@ -14619,7 +15065,7 @@
         <w:pStyle w:val="Heading2"/>
       </w:pPr>
       <w:bookmarkStart w:id="132" w:name="_Toc227103064"/>
-      <w:bookmarkStart w:id="133" w:name="_Toc227103227"/>
+      <w:bookmarkStart w:id="133" w:name="_Toc227105626"/>
       <w:r>
         <w:t>13.5 Setting Up the Jenkins Job — Step by Step</w:t>
       </w:r>
@@ -14733,14 +15179,800 @@
         <w:pBdr>
           <w:bottom w:val="single" w:sz="4" w:space="0" w:color="000000"/>
         </w:pBdr>
+        <w:rPr>
+          <w:sz w:val="36"/>
+        </w:rPr>
       </w:pPr>
-      <w:bookmarkStart w:id="134" w:name="_Toc227103065"/>
-      <w:bookmarkStart w:id="135" w:name="_Toc227103228"/>
+      <w:bookmarkStart w:id="134" w:name="_Toc227105627"/>
       <w:r>
         <w:rPr>
           <w:sz w:val="36"/>
         </w:rPr>
         <w:lastRenderedPageBreak/>
+        <w:t>Chapter 13B: CI/CD Integration with GitHub Actions</w:t>
+      </w:r>
+      <w:bookmarkEnd w:id="134"/>
+    </w:p>
+    <w:p>
+      <w:pPr>
+        <w:pStyle w:val="Heading2"/>
+      </w:pPr>
+      <w:bookmarkStart w:id="135" w:name="_Toc227105628"/>
+      <w:r>
+        <w:t>13B.1 Why GitHub Actions?</w:t>
+      </w:r>
+      <w:bookmarkEnd w:id="135"/>
+    </w:p>
+    <w:p>
+      <w:r>
+        <w:t>GitHub Actions is a cloud-native CI/CD platform built directly into GitHub. Unlike Jenkins, it requires no server to host or maintain — every push, pull request, or scheduled trigger automatically spins up a fresh virtual machine, runs your tests, and archives the results. For open-source projects and teams already using GitHub, Actions is often the fastest path to CI/CD with zero infrastructure overhead.</w:t>
+      </w:r>
+    </w:p>
+    <w:p>
+      <w:r>
+        <w:t>Key advantages over a self-hosted Jenkins server:</w:t>
+      </w:r>
+    </w:p>
+    <w:p>
+      <w:pPr>
+        <w:pStyle w:val="ListParagraph"/>
+        <w:numPr>
+          <w:ilvl w:val="0"/>
+          <w:numId w:val="1"/>
+        </w:numPr>
+      </w:pPr>
+      <w:r>
+        <w:t>Zero infrastructure — no server to install, patch, or maintain.</w:t>
+      </w:r>
+    </w:p>
+    <w:p>
+      <w:pPr>
+        <w:pStyle w:val="ListParagraph"/>
+        <w:numPr>
+          <w:ilvl w:val="0"/>
+          <w:numId w:val="1"/>
+        </w:numPr>
+      </w:pPr>
+      <w:r>
+        <w:t>Free for public repositories; generous free tier for private repos.</w:t>
+      </w:r>
+    </w:p>
+    <w:p>
+      <w:pPr>
+        <w:pStyle w:val="ListParagraph"/>
+        <w:numPr>
+          <w:ilvl w:val="0"/>
+          <w:numId w:val="1"/>
+        </w:numPr>
+      </w:pPr>
+      <w:r>
+        <w:t>Matrix builds — run tests against multiple Python versions or browsers in parallel with a single workflow file.</w:t>
+      </w:r>
+    </w:p>
+    <w:p>
+      <w:pPr>
+        <w:pStyle w:val="ListParagraph"/>
+        <w:numPr>
+          <w:ilvl w:val="0"/>
+          <w:numId w:val="1"/>
+        </w:numPr>
+      </w:pPr>
+      <w:r>
+        <w:t>Native GitHub integration — results appear directly on pull requests as status checks, blocking merges when tests fail.</w:t>
+      </w:r>
+    </w:p>
+    <w:p>
+      <w:pPr>
+        <w:pStyle w:val="ListParagraph"/>
+        <w:numPr>
+          <w:ilvl w:val="0"/>
+          <w:numId w:val="1"/>
+        </w:numPr>
+      </w:pPr>
+      <w:r>
+        <w:t>Marketplace — thousands of pre-built Actions for Docker, Allure, Slack notifications, and more.</w:t>
+      </w:r>
+    </w:p>
+    <w:p>
+      <w:pPr>
+        <w:pStyle w:val="ListParagraph"/>
+        <w:numPr>
+          <w:ilvl w:val="0"/>
+          <w:numId w:val="1"/>
+        </w:numPr>
+      </w:pPr>
+      <w:r>
+        <w:t>Secrets management — store credentials (API keys, passwords) encrypted in GitHub Settings and inject them as environment variables at runtime.</w:t>
+      </w:r>
+    </w:p>
+    <w:p>
+      <w:pPr>
+        <w:pStyle w:val="Heading2"/>
+      </w:pPr>
+      <w:bookmarkStart w:id="136" w:name="_Toc227105629"/>
+      <w:r>
+        <w:t>13B.2 Workflow File Structure</w:t>
+      </w:r>
+      <w:bookmarkEnd w:id="136"/>
+    </w:p>
+    <w:p>
+      <w:r>
+        <w:t>GitHub Actions workflows are defined as YAML files stored in the .github/workflows/ directory at the root of your repository. GitHub automatically detects and executes them. A workflow file has three top-level sections:</w:t>
+      </w:r>
+    </w:p>
+    <w:p>
+      <w:pPr>
+        <w:pStyle w:val="ListParagraph"/>
+        <w:numPr>
+          <w:ilvl w:val="0"/>
+          <w:numId w:val="1"/>
+        </w:numPr>
+      </w:pPr>
+      <w:r>
+        <w:t>on: — the trigger (push, pull_request, schedule, workflow_dispatch)</w:t>
+      </w:r>
+    </w:p>
+    <w:p>
+      <w:pPr>
+        <w:pStyle w:val="ListParagraph"/>
+        <w:numPr>
+          <w:ilvl w:val="0"/>
+          <w:numId w:val="1"/>
+        </w:numPr>
+      </w:pPr>
+      <w:r>
+        <w:t>jobs: — one or more parallel or sequential jobs, each running on a virtual machine</w:t>
+      </w:r>
+    </w:p>
+    <w:p>
+      <w:pPr>
+        <w:pStyle w:val="ListParagraph"/>
+        <w:numPr>
+          <w:ilvl w:val="0"/>
+          <w:numId w:val="1"/>
+        </w:numPr>
+      </w:pPr>
+      <w:r>
+        <w:t>steps: — the ordered list of shell commands or marketplace Actions inside each job</w:t>
+      </w:r>
+    </w:p>
+    <w:p>
+      <w:r>
+        <w:t>The workflow file for this framework lives at:   .github/workflows/test.yml</w:t>
+      </w:r>
+    </w:p>
+    <w:p>
+      <w:pPr>
+        <w:pStyle w:val="Heading2"/>
+      </w:pPr>
+      <w:bookmarkStart w:id="137" w:name="_Toc227105630"/>
+      <w:r>
+        <w:t>13B.3 Complete Workflow File — Annotated</w:t>
+      </w:r>
+      <w:bookmarkEnd w:id="137"/>
+    </w:p>
+    <w:p>
+      <w:r>
+        <w:t>Below is the complete .github/workflows/test.yml file with inline annotations explaining every key line:</w:t>
+      </w:r>
+    </w:p>
+    <w:p>
+      <w:r>
+        <w:t># .github/workflows/test.yml</w:t>
+      </w:r>
+      <w:r>
+        <w:br/>
+        <w:t>name: Selenium Python Automation Tests</w:t>
+      </w:r>
+      <w:r>
+        <w:br/>
+      </w:r>
+      <w:r>
+        <w:br/>
+        <w:t># ── TRIGGERS ──────────────────────────────────────────────────────────────</w:t>
+      </w:r>
+      <w:r>
+        <w:br/>
+        <w:t>on:</w:t>
+      </w:r>
+      <w:r>
+        <w:br/>
+      </w:r>
+      <w:r>
+        <w:lastRenderedPageBreak/>
+        <w:t xml:space="preserve">  push:</w:t>
+      </w:r>
+      <w:r>
+        <w:br/>
+        <w:t xml:space="preserve">    branches: [ main, develop ]      # Run on every push to main or develop</w:t>
+      </w:r>
+      <w:r>
+        <w:br/>
+        <w:t xml:space="preserve">  pull_request:</w:t>
+      </w:r>
+      <w:r>
+        <w:br/>
+        <w:t xml:space="preserve">    branches: [ main ]               # Run on every PR targeting main</w:t>
+      </w:r>
+      <w:r>
+        <w:br/>
+        <w:t xml:space="preserve">  workflow_dispatch:                 # Allow manual trigger from GitHub UI</w:t>
+      </w:r>
+      <w:r>
+        <w:br/>
+        <w:t xml:space="preserve">    inputs:</w:t>
+      </w:r>
+      <w:r>
+        <w:br/>
+        <w:t xml:space="preserve">      browser:</w:t>
+      </w:r>
+      <w:r>
+        <w:br/>
+        <w:t xml:space="preserve">        description: 'Browser to run tests in'</w:t>
+      </w:r>
+      <w:r>
+        <w:br/>
+        <w:t xml:space="preserve">        required: true</w:t>
+      </w:r>
+      <w:r>
+        <w:br/>
+        <w:t xml:space="preserve">        default: 'CHROME'</w:t>
+      </w:r>
+      <w:r>
+        <w:br/>
+        <w:t xml:space="preserve">        type: choice</w:t>
+      </w:r>
+      <w:r>
+        <w:br/>
+        <w:t xml:space="preserve">        options: [ CHROME, FIREFOX, EDGE ]</w:t>
+      </w:r>
+      <w:r>
+        <w:br/>
+        <w:t xml:space="preserve">      region:</w:t>
+      </w:r>
+      <w:r>
+        <w:br/>
+        <w:t xml:space="preserve">        description: 'Target environment region'</w:t>
+      </w:r>
+      <w:r>
+        <w:br/>
+        <w:t xml:space="preserve">        required: true</w:t>
+      </w:r>
+      <w:r>
+        <w:br/>
+        <w:t xml:space="preserve">        default: 'QA'</w:t>
+      </w:r>
+      <w:r>
+        <w:br/>
+        <w:t xml:space="preserve">        type: choice</w:t>
+      </w:r>
+      <w:r>
+        <w:br/>
+        <w:t xml:space="preserve">        options: [ QA, STAGE, PROD ]</w:t>
+      </w:r>
+      <w:r>
+        <w:br/>
+      </w:r>
+      <w:r>
+        <w:br/>
+        <w:t># ── JOBS ──────────────────────────────────────────────────────────────────</w:t>
+      </w:r>
+      <w:r>
+        <w:br/>
+        <w:t>jobs:</w:t>
+      </w:r>
+      <w:r>
+        <w:br/>
+        <w:t xml:space="preserve">  test:</w:t>
+      </w:r>
+      <w:r>
+        <w:br/>
+        <w:t xml:space="preserve">    name: Run Automation Tests</w:t>
+      </w:r>
+      <w:r>
+        <w:br/>
+        <w:t xml:space="preserve">    runs-on: ubuntu-latest           # GitHub-hosted Ubuntu runner (free tier)</w:t>
+      </w:r>
+      <w:r>
+        <w:br/>
+      </w:r>
+      <w:r>
+        <w:br/>
+        <w:t xml:space="preserve">    # ── STRATEGY: Matrix across browsers ──────────────────────────────────</w:t>
+      </w:r>
+      <w:r>
+        <w:br/>
+        <w:t xml:space="preserve">    strategy:</w:t>
+      </w:r>
+      <w:r>
+        <w:br/>
+        <w:t xml:space="preserve">      fail-fast: false               # Don't cancel other browsers if one fails</w:t>
+      </w:r>
+      <w:r>
+        <w:br/>
+        <w:t xml:space="preserve">      matrix:</w:t>
+      </w:r>
+      <w:r>
+        <w:br/>
+        <w:t xml:space="preserve">        browser: [ CHROME, FIREFOX ] # Run both browsers in parallel</w:t>
+      </w:r>
+      <w:r>
+        <w:br/>
+      </w:r>
+      <w:r>
+        <w:br/>
+        <w:t xml:space="preserve">    steps:</w:t>
+      </w:r>
+      <w:r>
+        <w:br/>
+        <w:t xml:space="preserve">      # Step 1: Check out the repository code</w:t>
+      </w:r>
+      <w:r>
+        <w:br/>
+        <w:t xml:space="preserve">      - name: Checkout repository</w:t>
+      </w:r>
+      <w:r>
+        <w:br/>
+        <w:t xml:space="preserve">        uses: actions/checkout@v4</w:t>
+      </w:r>
+      <w:r>
+        <w:br/>
+      </w:r>
+      <w:r>
+        <w:br/>
+        <w:t xml:space="preserve">      # Step 2: Set up Python 3.13</w:t>
+      </w:r>
+      <w:r>
+        <w:br/>
+        <w:t xml:space="preserve">      - name: Set up Python</w:t>
+      </w:r>
+      <w:r>
+        <w:br/>
+        <w:t xml:space="preserve">        uses: actions/setup-python@v5</w:t>
+      </w:r>
+      <w:r>
+        <w:br/>
+        <w:t xml:space="preserve">        with:</w:t>
+      </w:r>
+      <w:r>
+        <w:br/>
+      </w:r>
+      <w:r>
+        <w:lastRenderedPageBreak/>
+        <w:t xml:space="preserve">          python-version: '3.13'</w:t>
+      </w:r>
+      <w:r>
+        <w:br/>
+        <w:t xml:space="preserve">          cache: 'pip'               # Cache pip packages to speed up future runs</w:t>
+      </w:r>
+      <w:r>
+        <w:br/>
+      </w:r>
+      <w:r>
+        <w:br/>
+        <w:t xml:space="preserve">      # Step 3: Install all Python dependencies</w:t>
+      </w:r>
+      <w:r>
+        <w:br/>
+        <w:t xml:space="preserve">      - name: Install dependencies</w:t>
+      </w:r>
+      <w:r>
+        <w:br/>
+        <w:t xml:space="preserve">        run: pip install -r requirements.txt</w:t>
+      </w:r>
+      <w:r>
+        <w:br/>
+      </w:r>
+      <w:r>
+        <w:br/>
+        <w:t xml:space="preserve">      # Step 4: Install ffmpeg for video recording</w:t>
+      </w:r>
+      <w:r>
+        <w:br/>
+        <w:t xml:space="preserve">      - name: Install ffmpeg</w:t>
+      </w:r>
+      <w:r>
+        <w:br/>
+        <w:t xml:space="preserve">        run: sudo apt-get update &amp;&amp; sudo apt-get install -y ffmpeg</w:t>
+      </w:r>
+      <w:r>
+        <w:br/>
+      </w:r>
+      <w:r>
+        <w:br/>
+        <w:t xml:space="preserve">      # Step 5: Run Pylint — must score 10.0/10</w:t>
+      </w:r>
+      <w:r>
+        <w:br/>
+        <w:t xml:space="preserve">      - name: Lint with Pylint</w:t>
+      </w:r>
+      <w:r>
+        <w:br/>
+        <w:t xml:space="preserve">        run: pylint --fail-under=10 framework/ tests/ config/</w:t>
+      </w:r>
+      <w:r>
+        <w:br/>
+      </w:r>
+      <w:r>
+        <w:br/>
+        <w:t xml:space="preserve">      # Step 6: Run PTA UI tests + Reqres API tests in headless mode</w:t>
+      </w:r>
+      <w:r>
+        <w:br/>
+        <w:t xml:space="preserve">      - name: Run tests</w:t>
+      </w:r>
+      <w:r>
+        <w:br/>
+        <w:t xml:space="preserve">        env:</w:t>
+      </w:r>
+      <w:r>
+        <w:br/>
+        <w:t xml:space="preserve">          APP_NAME: PTA</w:t>
+      </w:r>
+      <w:r>
+        <w:br/>
+        <w:t xml:space="preserve">          SERVICE_NAME: REQRES</w:t>
+      </w:r>
+      <w:r>
+        <w:br/>
+        <w:t xml:space="preserve">          REGION: ${{ github.event.inputs.region || 'QA' }}</w:t>
+      </w:r>
+      <w:r>
+        <w:br/>
+        <w:t xml:space="preserve">          BROWSER: ${{ matrix.browser }}</w:t>
+      </w:r>
+      <w:r>
+        <w:br/>
+        <w:t xml:space="preserve">          HEADLESS: Y</w:t>
+      </w:r>
+      <w:r>
+        <w:br/>
+        <w:t xml:space="preserve">        run: |</w:t>
+      </w:r>
+      <w:r>
+        <w:br/>
+        <w:t xml:space="preserve">          pytest -vvv -m "pta or reqres" \</w:t>
+      </w:r>
+      <w:r>
+        <w:br/>
+        <w:t xml:space="preserve">            -n 4 \</w:t>
+      </w:r>
+      <w:r>
+        <w:br/>
+        <w:t xml:space="preserve">            --reruns 3 \</w:t>
+      </w:r>
+      <w:r>
+        <w:br/>
+        <w:t xml:space="preserve">            --html=output/reports/report_${{ matrix.browser }}.html \</w:t>
+      </w:r>
+      <w:r>
+        <w:br/>
+        <w:t xml:space="preserve">            --self-contained-html \</w:t>
+      </w:r>
+      <w:r>
+        <w:br/>
+        <w:t xml:space="preserve">            --alluredir=output/allure-results \</w:t>
+      </w:r>
+      <w:r>
+        <w:br/>
+        <w:t xml:space="preserve">            tests/</w:t>
+      </w:r>
+      <w:r>
+        <w:br/>
+      </w:r>
+      <w:r>
+        <w:br/>
+        <w:t xml:space="preserve">      # Step 7: Upload HTML report as a downloadable artifact</w:t>
+      </w:r>
+      <w:r>
+        <w:br/>
+        <w:t xml:space="preserve">      - name: Upload HTML report</w:t>
+      </w:r>
+      <w:r>
+        <w:br/>
+        <w:t xml:space="preserve">        if: always()                 # Run even if tests failed</w:t>
+      </w:r>
+      <w:r>
+        <w:br/>
+        <w:t xml:space="preserve">        uses: actions/upload-artifact@v4</w:t>
+      </w:r>
+      <w:r>
+        <w:br/>
+        <w:t xml:space="preserve">        with:</w:t>
+      </w:r>
+      <w:r>
+        <w:br/>
+        <w:t xml:space="preserve">          name: html-report-${{ matrix.browser }}</w:t>
+      </w:r>
+      <w:r>
+        <w:br/>
+        <w:t xml:space="preserve">          path: output/reports/report_${{ matrix.browser }}.html</w:t>
+      </w:r>
+      <w:r>
+        <w:br/>
+        <w:t xml:space="preserve">          retention-days: 30</w:t>
+      </w:r>
+      <w:r>
+        <w:br/>
+      </w:r>
+      <w:r>
+        <w:br/>
+        <w:t xml:space="preserve">      # Step 8: Upload Allure raw results</w:t>
+      </w:r>
+      <w:r>
+        <w:br/>
+        <w:t xml:space="preserve">      - name: Upload Allure results</w:t>
+      </w:r>
+      <w:r>
+        <w:br/>
+      </w:r>
+      <w:r>
+        <w:lastRenderedPageBreak/>
+        <w:t xml:space="preserve">        if: always()</w:t>
+      </w:r>
+      <w:r>
+        <w:br/>
+        <w:t xml:space="preserve">        uses: actions/upload-artifact@v4</w:t>
+      </w:r>
+      <w:r>
+        <w:br/>
+        <w:t xml:space="preserve">        with:</w:t>
+      </w:r>
+      <w:r>
+        <w:br/>
+        <w:t xml:space="preserve">          name: allure-results-${{ matrix.browser }}</w:t>
+      </w:r>
+      <w:r>
+        <w:br/>
+        <w:t xml:space="preserve">          path: output/allure-results/</w:t>
+      </w:r>
+      <w:r>
+        <w:br/>
+        <w:t xml:space="preserve">          retention-days: 30</w:t>
+      </w:r>
+      <w:r>
+        <w:br/>
+      </w:r>
+      <w:r>
+        <w:br/>
+        <w:t xml:space="preserve">      # Step 9: Upload screenshots of failed tests</w:t>
+      </w:r>
+      <w:r>
+        <w:br/>
+        <w:t xml:space="preserve">      - name: Upload failure screenshots</w:t>
+      </w:r>
+      <w:r>
+        <w:br/>
+        <w:t xml:space="preserve">        if: failure()                # Only upload if the job failed</w:t>
+      </w:r>
+      <w:r>
+        <w:br/>
+        <w:t xml:space="preserve">        uses: actions/upload-artifact@v4</w:t>
+      </w:r>
+      <w:r>
+        <w:br/>
+        <w:t xml:space="preserve">        with:</w:t>
+      </w:r>
+      <w:r>
+        <w:br/>
+        <w:t xml:space="preserve">          name: failure-screenshots-${{ matrix.browser }}</w:t>
+      </w:r>
+      <w:r>
+        <w:br/>
+        <w:t xml:space="preserve">          path: output/screenshots/</w:t>
+      </w:r>
+      <w:r>
+        <w:br/>
+        <w:t xml:space="preserve">          retention-days: 7</w:t>
+      </w:r>
+    </w:p>
+    <w:p>
+      <w:pPr>
+        <w:pStyle w:val="Heading2"/>
+      </w:pPr>
+      <w:bookmarkStart w:id="138" w:name="_Toc227105631"/>
+      <w:r>
+        <w:t>13B.4 Workflow Steps Explained</w:t>
+      </w:r>
+      <w:bookmarkEnd w:id="138"/>
+    </w:p>
+    <w:p>
+      <w:r>
+        <w:t>Each step in the workflow performs a specific role. The table below explains what happens and why:</w:t>
+      </w:r>
+    </w:p>
+    <w:p>
+      <w:pPr>
+        <w:pStyle w:val="Heading2"/>
+      </w:pPr>
+      <w:bookmarkStart w:id="139" w:name="_Toc227105632"/>
+      <w:r>
+        <w:t>13B.5 Storing Secrets in GitHub</w:t>
+      </w:r>
+      <w:bookmarkEnd w:id="139"/>
+    </w:p>
+    <w:p>
+      <w:r>
+        <w:t>Never put passwords, API keys, or client secrets directly in the workflow YAML file — they would be visible in your repository history. GitHub provides encrypted Secrets that are injected as environment variables at runtime and are never printed in logs.</w:t>
+      </w:r>
+    </w:p>
+    <w:p>
+      <w:r>
+        <w:t>How to add a secret:   Go to your repository on GitHub → Settings → Secrets and variables → Actions → New repository secret. Add a name (e.g. PTA_PASSWORD) and its value. It is now encrypted and stored by GitHub.</w:t>
+      </w:r>
+    </w:p>
+    <w:p>
+      <w:r>
+        <w:t>How to use it in the workflow YAML:</w:t>
+      </w:r>
+      <w:r>
+        <w:br/>
+      </w:r>
+      <w:r>
+        <w:br/>
+        <w:t xml:space="preserve">      - name: Run tests</w:t>
+      </w:r>
+      <w:r>
+        <w:br/>
+        <w:t xml:space="preserve">        env:</w:t>
+      </w:r>
+      <w:r>
+        <w:br/>
+        <w:t xml:space="preserve">          APP_NAME: PTA</w:t>
+      </w:r>
+      <w:r>
+        <w:br/>
+        <w:t xml:space="preserve">          REGION: QA</w:t>
+      </w:r>
+      <w:r>
+        <w:br/>
+        <w:t xml:space="preserve">          BROWSER: CHROME</w:t>
+      </w:r>
+      <w:r>
+        <w:br/>
+        <w:t xml:space="preserve">          HEADLESS: Y</w:t>
+      </w:r>
+      <w:r>
+        <w:br/>
+        <w:t xml:space="preserve">          PTA_PASSWORD: ${{ secrets.PTA_PASSWORD }}   # injected from GitHub Secrets</w:t>
+      </w:r>
+      <w:r>
+        <w:br/>
+        <w:t xml:space="preserve">        run: pytest -vvv -m "pta" tests/</w:t>
+      </w:r>
+      <w:r>
+        <w:br/>
+      </w:r>
+      <w:r>
+        <w:br/>
+        <w:t>The secret value is masked automatically in all log output — it never appears as plain text.</w:t>
+      </w:r>
+    </w:p>
+    <w:p>
+      <w:pPr>
+        <w:pStyle w:val="Heading2"/>
+      </w:pPr>
+      <w:bookmarkStart w:id="140" w:name="_Toc227105633"/>
+      <w:r>
+        <w:lastRenderedPageBreak/>
+        <w:t>13B.6 Setting Up the Workflow — Step by Step</w:t>
+      </w:r>
+      <w:bookmarkEnd w:id="140"/>
+    </w:p>
+    <w:p>
+      <w:pPr>
+        <w:pStyle w:val="ListParagraph"/>
+        <w:numPr>
+          <w:ilvl w:val="0"/>
+          <w:numId w:val="2"/>
+        </w:numPr>
+      </w:pPr>
+      <w:r>
+        <w:t>Create the workflow directory at the root of your repository:   mkdir -p .github/workflows</w:t>
+      </w:r>
+    </w:p>
+    <w:p>
+      <w:pPr>
+        <w:pStyle w:val="ListParagraph"/>
+        <w:numPr>
+          <w:ilvl w:val="0"/>
+          <w:numId w:val="2"/>
+        </w:numPr>
+      </w:pPr>
+      <w:r>
+        <w:t>Create the file .github/workflows/test.yml and paste the annotated workflow from section 13B.3.</w:t>
+      </w:r>
+    </w:p>
+    <w:p>
+      <w:pPr>
+        <w:pStyle w:val="ListParagraph"/>
+        <w:numPr>
+          <w:ilvl w:val="0"/>
+          <w:numId w:val="2"/>
+        </w:numPr>
+      </w:pPr>
+      <w:r>
+        <w:t>Commit and push the file to your repository:   git add .github/workflows/test.yml   git commit -m "ci(github-actions): add selenium test workflow"   git push origin main</w:t>
+      </w:r>
+    </w:p>
+    <w:p>
+      <w:pPr>
+        <w:pStyle w:val="ListParagraph"/>
+        <w:numPr>
+          <w:ilvl w:val="0"/>
+          <w:numId w:val="2"/>
+        </w:numPr>
+      </w:pPr>
+      <w:r>
+        <w:t>Navigate to your repository on GitHub and click the Actions tab. You will see the workflow appear immediately.</w:t>
+      </w:r>
+    </w:p>
+    <w:p>
+      <w:pPr>
+        <w:pStyle w:val="ListParagraph"/>
+        <w:numPr>
+          <w:ilvl w:val="0"/>
+          <w:numId w:val="2"/>
+        </w:numPr>
+      </w:pPr>
+      <w:r>
+        <w:t>To trigger it manually: click the workflow name → Run workflow → choose your browser and region → Run workflow.</w:t>
+      </w:r>
+    </w:p>
+    <w:p>
+      <w:pPr>
+        <w:pStyle w:val="ListParagraph"/>
+        <w:numPr>
+          <w:ilvl w:val="0"/>
+          <w:numId w:val="2"/>
+        </w:numPr>
+      </w:pPr>
+      <w:r>
+        <w:t>To view results: click the run entry, select the job, and expand any step to see its full console output. Artifacts (HTML report, Allure results, screenshots) appear under the Summary tab at the bottom of the run page.</w:t>
+      </w:r>
+    </w:p>
+    <w:p>
+      <w:pPr>
+        <w:pStyle w:val="ListParagraph"/>
+        <w:numPr>
+          <w:ilvl w:val="0"/>
+          <w:numId w:val="2"/>
+        </w:numPr>
+      </w:pPr>
+      <w:r>
+        <w:t>To download the HTML report: scroll to the Artifacts section at the bottom of the Actions run summary page and click the artifact name to download a ZIP file.</w:t>
+      </w:r>
+    </w:p>
+    <w:p/>
+    <w:p/>
+    <w:p/>
+    <w:p/>
+    <w:p/>
+    <w:p/>
+    <w:p/>
+    <w:p/>
+    <w:p/>
+    <w:p/>
+    <w:p/>
+    <w:p/>
+    <w:p/>
+    <w:p/>
+    <w:p/>
+    <w:p/>
+    <w:p/>
+    <w:p>
+      <w:pPr>
+        <w:pStyle w:val="Heading1"/>
+        <w:pBdr>
+          <w:bottom w:val="single" w:sz="4" w:space="0" w:color="000000"/>
+        </w:pBdr>
+      </w:pPr>
+      <w:bookmarkStart w:id="141" w:name="_Toc227103065"/>
+      <w:bookmarkStart w:id="142" w:name="_Toc227105634"/>
+      <w:r>
+        <w:rPr>
+          <w:sz w:val="36"/>
+        </w:rPr>
         <w:t xml:space="preserve">Chapter 14: Code Quality </w:t>
       </w:r>
       <w:r>
@@ -14762,21 +15994,21 @@
         </w:rPr>
         <w:t>Pylint</w:t>
       </w:r>
-      <w:bookmarkEnd w:id="134"/>
-      <w:bookmarkEnd w:id="135"/>
+      <w:bookmarkEnd w:id="141"/>
+      <w:bookmarkEnd w:id="142"/>
       <w:proofErr w:type="spellEnd"/>
     </w:p>
     <w:p>
       <w:pPr>
         <w:pStyle w:val="Heading2"/>
       </w:pPr>
-      <w:bookmarkStart w:id="136" w:name="_Toc227103066"/>
-      <w:bookmarkStart w:id="137" w:name="_Toc227103229"/>
+      <w:bookmarkStart w:id="143" w:name="_Toc227103066"/>
+      <w:bookmarkStart w:id="144" w:name="_Toc227105635"/>
       <w:r>
         <w:t>14.1 What is Pylint?</w:t>
       </w:r>
-      <w:bookmarkEnd w:id="136"/>
-      <w:bookmarkEnd w:id="137"/>
+      <w:bookmarkEnd w:id="143"/>
+      <w:bookmarkEnd w:id="144"/>
     </w:p>
     <w:p>
       <w:r>
@@ -14787,13 +16019,13 @@
       <w:pPr>
         <w:pStyle w:val="Heading2"/>
       </w:pPr>
-      <w:bookmarkStart w:id="138" w:name="_Toc227103067"/>
-      <w:bookmarkStart w:id="139" w:name="_Toc227103230"/>
+      <w:bookmarkStart w:id="145" w:name="_Toc227103067"/>
+      <w:bookmarkStart w:id="146" w:name="_Toc227105636"/>
       <w:r>
         <w:t>14.2 Running Pylint</w:t>
       </w:r>
-      <w:bookmarkEnd w:id="138"/>
-      <w:bookmarkEnd w:id="139"/>
+      <w:bookmarkEnd w:id="145"/>
+      <w:bookmarkEnd w:id="146"/>
     </w:p>
     <w:p>
       <w:r>
@@ -14885,13 +16117,13 @@
       <w:pPr>
         <w:pStyle w:val="Heading2"/>
       </w:pPr>
-      <w:bookmarkStart w:id="140" w:name="_Toc227103068"/>
-      <w:bookmarkStart w:id="141" w:name="_Toc227103231"/>
+      <w:bookmarkStart w:id="147" w:name="_Toc227103068"/>
+      <w:bookmarkStart w:id="148" w:name="_Toc227105637"/>
       <w:r>
         <w:t>14.3 Suppressing Pylint Warnings</w:t>
       </w:r>
-      <w:bookmarkEnd w:id="140"/>
-      <w:bookmarkEnd w:id="141"/>
+      <w:bookmarkEnd w:id="147"/>
+      <w:bookmarkEnd w:id="148"/>
     </w:p>
     <w:p>
       <w:r>
@@ -14951,13 +16183,13 @@
       <w:pPr>
         <w:pStyle w:val="Heading2"/>
       </w:pPr>
-      <w:bookmarkStart w:id="142" w:name="_Toc227103069"/>
-      <w:bookmarkStart w:id="143" w:name="_Toc227103232"/>
+      <w:bookmarkStart w:id="149" w:name="_Toc227103069"/>
+      <w:bookmarkStart w:id="150" w:name="_Toc227105638"/>
       <w:r>
         <w:t>14.4 Commit Style — Conventional Commits</w:t>
       </w:r>
-      <w:bookmarkEnd w:id="142"/>
-      <w:bookmarkEnd w:id="143"/>
+      <w:bookmarkEnd w:id="149"/>
+      <w:bookmarkEnd w:id="150"/>
     </w:p>
     <w:p>
       <w:r>
@@ -14995,6 +16227,7 @@
                 <w:b/>
                 <w:color w:val="FFFFFF"/>
               </w:rPr>
+              <w:lastRenderedPageBreak/>
               <w:t>Type</w:t>
             </w:r>
           </w:p>
@@ -15084,11 +16317,7 @@
           </w:tcPr>
           <w:p>
             <w:r>
-              <w:t xml:space="preserve">A bug fix in framework or </w:t>
-            </w:r>
-            <w:r>
-              <w:lastRenderedPageBreak/>
-              <w:t>test</w:t>
+              <w:t>A bug fix in framework or test</w:t>
             </w:r>
           </w:p>
         </w:tc>
@@ -15099,12 +16328,7 @@
           </w:tcPr>
           <w:p>
             <w:r>
-              <w:lastRenderedPageBreak/>
-              <w:t xml:space="preserve">fix(conftest): handle locked </w:t>
-            </w:r>
-            <w:r>
-              <w:lastRenderedPageBreak/>
-              <w:t>log file on Windows</w:t>
+              <w:t>fix(conftest): handle locked log file on Windows</w:t>
             </w:r>
           </w:p>
         </w:tc>
@@ -15117,7 +16341,6 @@
           </w:tcPr>
           <w:p>
             <w:r>
-              <w:lastRenderedPageBreak/>
               <w:t>refactor</w:t>
             </w:r>
           </w:p>
@@ -15306,8 +16529,8 @@
           <w:bottom w:val="single" w:sz="4" w:space="0" w:color="000000"/>
         </w:pBdr>
       </w:pPr>
-      <w:bookmarkStart w:id="144" w:name="_Toc227103070"/>
-      <w:bookmarkStart w:id="145" w:name="_Toc227103233"/>
+      <w:bookmarkStart w:id="151" w:name="_Toc227103070"/>
+      <w:bookmarkStart w:id="152" w:name="_Toc227105639"/>
       <w:r>
         <w:rPr>
           <w:sz w:val="36"/>
@@ -15327,20 +16550,20 @@
         </w:rPr>
         <w:t xml:space="preserve"> Quick Reference</w:t>
       </w:r>
-      <w:bookmarkEnd w:id="144"/>
-      <w:bookmarkEnd w:id="145"/>
+      <w:bookmarkEnd w:id="151"/>
+      <w:bookmarkEnd w:id="152"/>
     </w:p>
     <w:p>
       <w:pPr>
         <w:pStyle w:val="Heading2"/>
       </w:pPr>
-      <w:bookmarkStart w:id="146" w:name="_Toc227103071"/>
-      <w:bookmarkStart w:id="147" w:name="_Toc227103234"/>
+      <w:bookmarkStart w:id="153" w:name="_Toc227103071"/>
+      <w:bookmarkStart w:id="154" w:name="_Toc227105640"/>
       <w:r>
         <w:t>15.1 The Golden Rules of Test Automation</w:t>
       </w:r>
-      <w:bookmarkEnd w:id="146"/>
-      <w:bookmarkEnd w:id="147"/>
+      <w:bookmarkEnd w:id="153"/>
+      <w:bookmarkEnd w:id="154"/>
     </w:p>
     <w:tbl>
       <w:tblPr>
@@ -15629,13 +16852,13 @@
       <w:pPr>
         <w:pStyle w:val="Heading2"/>
       </w:pPr>
-      <w:bookmarkStart w:id="148" w:name="_Toc227103072"/>
-      <w:bookmarkStart w:id="149" w:name="_Toc227103235"/>
+      <w:bookmarkStart w:id="155" w:name="_Toc227103072"/>
+      <w:bookmarkStart w:id="156" w:name="_Toc227105641"/>
       <w:r>
         <w:t>15.2 Adding a New UI Application — Checklist</w:t>
       </w:r>
-      <w:bookmarkEnd w:id="148"/>
-      <w:bookmarkEnd w:id="149"/>
+      <w:bookmarkEnd w:id="155"/>
+      <w:bookmarkEnd w:id="156"/>
     </w:p>
     <w:p>
       <w:pPr>
@@ -15750,13 +16973,13 @@
       <w:pPr>
         <w:pStyle w:val="Heading2"/>
       </w:pPr>
-      <w:bookmarkStart w:id="150" w:name="_Toc227103073"/>
-      <w:bookmarkStart w:id="151" w:name="_Toc227103236"/>
+      <w:bookmarkStart w:id="157" w:name="_Toc227103073"/>
+      <w:bookmarkStart w:id="158" w:name="_Toc227105642"/>
       <w:r>
         <w:t>15.3 Complete Command Quick Reference</w:t>
       </w:r>
-      <w:bookmarkEnd w:id="150"/>
-      <w:bookmarkEnd w:id="151"/>
+      <w:bookmarkEnd w:id="157"/>
+      <w:bookmarkEnd w:id="158"/>
     </w:p>
     <w:tbl>
       <w:tblPr>
@@ -16237,13 +17460,13 @@
       <w:pPr>
         <w:pStyle w:val="Heading2"/>
       </w:pPr>
-      <w:bookmarkStart w:id="152" w:name="_Toc227103074"/>
-      <w:bookmarkStart w:id="153" w:name="_Toc227103237"/>
+      <w:bookmarkStart w:id="159" w:name="_Toc227103074"/>
+      <w:bookmarkStart w:id="160" w:name="_Toc227105643"/>
       <w:r>
         <w:t>15.4 Troubleshooting Common Issues</w:t>
       </w:r>
-      <w:bookmarkEnd w:id="152"/>
-      <w:bookmarkEnd w:id="153"/>
+      <w:bookmarkEnd w:id="159"/>
+      <w:bookmarkEnd w:id="160"/>
     </w:p>
     <w:tbl>
       <w:tblPr>
@@ -16385,7 +17608,6 @@
           </w:tcPr>
           <w:p>
             <w:r>
-              <w:lastRenderedPageBreak/>
               <w:t>Permission denied on output/ folder</w:t>
             </w:r>
           </w:p>
@@ -16593,13 +17815,13 @@
       <w:pPr>
         <w:pStyle w:val="Heading2"/>
       </w:pPr>
-      <w:bookmarkStart w:id="154" w:name="_Toc227103075"/>
-      <w:bookmarkStart w:id="155" w:name="_Toc227103238"/>
+      <w:bookmarkStart w:id="161" w:name="_Toc227103075"/>
+      <w:bookmarkStart w:id="162" w:name="_Toc227105644"/>
       <w:r>
         <w:t>15.5 Framework Architecture Summary Diagram</w:t>
       </w:r>
-      <w:bookmarkEnd w:id="154"/>
-      <w:bookmarkEnd w:id="155"/>
+      <w:bookmarkEnd w:id="161"/>
+      <w:bookmarkEnd w:id="162"/>
     </w:p>
     <w:p>
       <w:r>
@@ -17084,14 +18306,14 @@
       <w:pPr>
         <w:pStyle w:val="Heading2"/>
       </w:pPr>
-      <w:bookmarkStart w:id="156" w:name="_Toc227103076"/>
-      <w:bookmarkStart w:id="157" w:name="_Toc227103239"/>
+      <w:bookmarkStart w:id="163" w:name="_Toc227103076"/>
+      <w:bookmarkStart w:id="164" w:name="_Toc227105645"/>
       <w:r>
         <w:lastRenderedPageBreak/>
         <w:t>15.6 Learning Path — What to Study Next</w:t>
       </w:r>
-      <w:bookmarkEnd w:id="156"/>
-      <w:bookmarkEnd w:id="157"/>
+      <w:bookmarkEnd w:id="163"/>
+      <w:bookmarkEnd w:id="164"/>
     </w:p>
     <w:p>
       <w:r>
@@ -17554,8 +18776,8 @@
           <w:bottom w:val="single" w:sz="4" w:space="0" w:color="000000"/>
         </w:pBdr>
       </w:pPr>
-      <w:bookmarkStart w:id="158" w:name="_Toc227103077"/>
-      <w:bookmarkStart w:id="159" w:name="_Toc227103240"/>
+      <w:bookmarkStart w:id="165" w:name="_Toc227103077"/>
+      <w:bookmarkStart w:id="166" w:name="_Toc227105646"/>
       <w:r>
         <w:rPr>
           <w:sz w:val="36"/>
@@ -17563,8 +18785,8 @@
         <w:lastRenderedPageBreak/>
         <w:t>Appendix: Key Files at a Glance</w:t>
       </w:r>
-      <w:bookmarkEnd w:id="158"/>
-      <w:bookmarkEnd w:id="159"/>
+      <w:bookmarkEnd w:id="165"/>
+      <w:bookmarkEnd w:id="166"/>
     </w:p>
     <w:tbl>
       <w:tblPr>
@@ -18196,7 +19418,6 @@
           </w:tcPr>
           <w:p>
             <w:r>
-              <w:lastRenderedPageBreak/>
               <w:t>requirements.txt</w:t>
             </w:r>
           </w:p>
@@ -18237,8 +19458,8 @@
           <w:bottom w:val="single" w:sz="4" w:space="0" w:color="000000"/>
         </w:pBdr>
       </w:pPr>
-      <w:bookmarkStart w:id="160" w:name="_Toc227103078"/>
-      <w:bookmarkStart w:id="161" w:name="_Toc227103241"/>
+      <w:bookmarkStart w:id="167" w:name="_Toc227103078"/>
+      <w:bookmarkStart w:id="168" w:name="_Toc227105647"/>
       <w:r>
         <w:rPr>
           <w:sz w:val="36"/>
@@ -18246,8 +19467,8 @@
         <w:lastRenderedPageBreak/>
         <w:t>Closing Words</w:t>
       </w:r>
-      <w:bookmarkEnd w:id="160"/>
-      <w:bookmarkEnd w:id="161"/>
+      <w:bookmarkEnd w:id="167"/>
+      <w:bookmarkEnd w:id="168"/>
     </w:p>
     <w:p>
       <w:r>
@@ -18307,27 +19528,385 @@
           <w:color w:val="595959"/>
           <w:sz w:val="20"/>
         </w:rPr>
-        <w:t xml:space="preserve"> </w:t>
-      </w:r>
-      <w:proofErr w:type="gramStart"/>
-      <w:r>
-        <w:rPr>
-          <w:i/>
-          <w:color w:val="595959"/>
-          <w:sz w:val="20"/>
-        </w:rPr>
-        <w:t>|  April</w:t>
-      </w:r>
-      <w:proofErr w:type="gramEnd"/>
-      <w:r>
-        <w:rPr>
-          <w:i/>
-          <w:color w:val="595959"/>
-          <w:sz w:val="20"/>
-        </w:rPr>
-        <w:t xml:space="preserve"> 2026</w:t>
+        <w:t xml:space="preserve"> | April 2026</w:t>
       </w:r>
     </w:p>
+    <w:tbl>
+      <w:tblPr>
+        <w:tblStyle w:val="TableGrid"/>
+        <w:tblW w:w="0" w:type="auto"/>
+        <w:tblLook w:val="04A0" w:firstRow="1" w:lastRow="0" w:firstColumn="1" w:lastColumn="0" w:noHBand="0" w:noVBand="1"/>
+      </w:tblPr>
+      <w:tblGrid>
+        <w:gridCol w:w="2880"/>
+        <w:gridCol w:w="2880"/>
+        <w:gridCol w:w="2880"/>
+      </w:tblGrid>
+      <w:tr>
+        <w:tc>
+          <w:tcPr>
+            <w:tcW w:w="2880" w:type="dxa"/>
+            <w:shd w:val="clear" w:color="auto" w:fill="FFFFFF"/>
+          </w:tcPr>
+          <w:p>
+            <w:r>
+              <w:rPr>
+                <w:b/>
+                <w:color w:val="FFFFFF"/>
+              </w:rPr>
+              <w:t>Step</w:t>
+            </w:r>
+          </w:p>
+        </w:tc>
+        <w:tc>
+          <w:tcPr>
+            <w:tcW w:w="2880" w:type="dxa"/>
+            <w:shd w:val="clear" w:color="auto" w:fill="FFFFFF"/>
+          </w:tcPr>
+          <w:p>
+            <w:r>
+              <w:rPr>
+                <w:b/>
+                <w:color w:val="FFFFFF"/>
+              </w:rPr>
+              <w:t>Action</w:t>
+            </w:r>
+          </w:p>
+        </w:tc>
+        <w:tc>
+          <w:tcPr>
+            <w:tcW w:w="2880" w:type="dxa"/>
+            <w:shd w:val="clear" w:color="auto" w:fill="FFFFFF"/>
+          </w:tcPr>
+          <w:p>
+            <w:r>
+              <w:rPr>
+                <w:b/>
+                <w:color w:val="FFFFFF"/>
+              </w:rPr>
+              <w:t>Why It Matters</w:t>
+            </w:r>
+          </w:p>
+        </w:tc>
+      </w:tr>
+      <w:tr>
+        <w:tc>
+          <w:tcPr>
+            <w:tcW w:w="2880" w:type="dxa"/>
+            <w:shd w:val="clear" w:color="auto" w:fill="EEF3FB"/>
+          </w:tcPr>
+          <w:p>
+            <w:r>
+              <w:t>1. Checkout</w:t>
+            </w:r>
+          </w:p>
+        </w:tc>
+        <w:tc>
+          <w:tcPr>
+            <w:tcW w:w="2880" w:type="dxa"/>
+            <w:shd w:val="clear" w:color="auto" w:fill="EEF3FB"/>
+          </w:tcPr>
+          <w:p>
+            <w:r>
+              <w:t>actions/checkout@v4</w:t>
+            </w:r>
+          </w:p>
+        </w:tc>
+        <w:tc>
+          <w:tcPr>
+            <w:tcW w:w="2880" w:type="dxa"/>
+            <w:shd w:val="clear" w:color="auto" w:fill="EEF3FB"/>
+          </w:tcPr>
+          <w:p>
+            <w:r>
+              <w:t>Downloads the repository code onto the runner so all files are available for subsequent steps.</w:t>
+            </w:r>
+          </w:p>
+        </w:tc>
+      </w:tr>
+      <w:tr>
+        <w:tc>
+          <w:tcPr>
+            <w:tcW w:w="2880" w:type="dxa"/>
+            <w:shd w:val="clear" w:color="auto" w:fill="FFFFFF"/>
+          </w:tcPr>
+          <w:p>
+            <w:r>
+              <w:t>2. Set up Python</w:t>
+            </w:r>
+          </w:p>
+        </w:tc>
+        <w:tc>
+          <w:tcPr>
+            <w:tcW w:w="2880" w:type="dxa"/>
+            <w:shd w:val="clear" w:color="auto" w:fill="FFFFFF"/>
+          </w:tcPr>
+          <w:p>
+            <w:r>
+              <w:t>actions/setup-python@v5 with cache: pip</w:t>
+            </w:r>
+          </w:p>
+        </w:tc>
+        <w:tc>
+          <w:tcPr>
+            <w:tcW w:w="2880" w:type="dxa"/>
+            <w:shd w:val="clear" w:color="auto" w:fill="FFFFFF"/>
+          </w:tcPr>
+          <w:p>
+            <w:r>
+              <w:t>Installs Python 3.13 and caches the pip download cache — dramatically speeds up runs after the first one.</w:t>
+            </w:r>
+          </w:p>
+        </w:tc>
+      </w:tr>
+      <w:tr>
+        <w:tc>
+          <w:tcPr>
+            <w:tcW w:w="2880" w:type="dxa"/>
+            <w:shd w:val="clear" w:color="auto" w:fill="EEF3FB"/>
+          </w:tcPr>
+          <w:p>
+            <w:r>
+              <w:t>3. Install dependencies</w:t>
+            </w:r>
+          </w:p>
+        </w:tc>
+        <w:tc>
+          <w:tcPr>
+            <w:tcW w:w="2880" w:type="dxa"/>
+            <w:shd w:val="clear" w:color="auto" w:fill="EEF3FB"/>
+          </w:tcPr>
+          <w:p>
+            <w:r>
+              <w:t>pip install -r requirements.txt</w:t>
+            </w:r>
+          </w:p>
+        </w:tc>
+        <w:tc>
+          <w:tcPr>
+            <w:tcW w:w="2880" w:type="dxa"/>
+            <w:shd w:val="clear" w:color="auto" w:fill="EEF3FB"/>
+          </w:tcPr>
+          <w:p>
+            <w:r>
+              <w:t>Installs all pinned packages (selenium, pytest, allure-pytest, etc.) inside the runner's Python environment.</w:t>
+            </w:r>
+          </w:p>
+        </w:tc>
+      </w:tr>
+      <w:tr>
+        <w:tc>
+          <w:tcPr>
+            <w:tcW w:w="2880" w:type="dxa"/>
+            <w:shd w:val="clear" w:color="auto" w:fill="FFFFFF"/>
+          </w:tcPr>
+          <w:p>
+            <w:r>
+              <w:t>4. Install ffmpeg</w:t>
+            </w:r>
+          </w:p>
+        </w:tc>
+        <w:tc>
+          <w:tcPr>
+            <w:tcW w:w="2880" w:type="dxa"/>
+            <w:shd w:val="clear" w:color="auto" w:fill="FFFFFF"/>
+          </w:tcPr>
+          <w:p>
+            <w:r>
+              <w:t>apt-get install ffmpeg</w:t>
+            </w:r>
+          </w:p>
+        </w:tc>
+        <w:tc>
+          <w:tcPr>
+            <w:tcW w:w="2880" w:type="dxa"/>
+            <w:shd w:val="clear" w:color="auto" w:fill="FFFFFF"/>
+          </w:tcPr>
+          <w:p>
+            <w:r>
+              <w:t>Installs ffmpeg on the Ubuntu runner so the screen_recording_utils.py helpers can record test videos.</w:t>
+            </w:r>
+          </w:p>
+        </w:tc>
+      </w:tr>
+      <w:tr>
+        <w:tc>
+          <w:tcPr>
+            <w:tcW w:w="2880" w:type="dxa"/>
+            <w:shd w:val="clear" w:color="auto" w:fill="EEF3FB"/>
+          </w:tcPr>
+          <w:p>
+            <w:r>
+              <w:t>5. Pylint</w:t>
+            </w:r>
+          </w:p>
+        </w:tc>
+        <w:tc>
+          <w:tcPr>
+            <w:tcW w:w="2880" w:type="dxa"/>
+            <w:shd w:val="clear" w:color="auto" w:fill="EEF3FB"/>
+          </w:tcPr>
+          <w:p>
+            <w:r>
+              <w:t>pylint --fail-under=10</w:t>
+            </w:r>
+          </w:p>
+        </w:tc>
+        <w:tc>
+          <w:tcPr>
+            <w:tcW w:w="2880" w:type="dxa"/>
+            <w:shd w:val="clear" w:color="auto" w:fill="EEF3FB"/>
+          </w:tcPr>
+          <w:p>
+            <w:r>
+              <w:t>Fails the workflow immediately if code quality drops below 10.0/10, preventing bad code from ever merging.</w:t>
+            </w:r>
+          </w:p>
+        </w:tc>
+      </w:tr>
+      <w:tr>
+        <w:tc>
+          <w:tcPr>
+            <w:tcW w:w="2880" w:type="dxa"/>
+            <w:shd w:val="clear" w:color="auto" w:fill="FFFFFF"/>
+          </w:tcPr>
+          <w:p>
+            <w:r>
+              <w:lastRenderedPageBreak/>
+              <w:t>6. Run tests</w:t>
+            </w:r>
+          </w:p>
+        </w:tc>
+        <w:tc>
+          <w:tcPr>
+            <w:tcW w:w="2880" w:type="dxa"/>
+            <w:shd w:val="clear" w:color="auto" w:fill="FFFFFF"/>
+          </w:tcPr>
+          <w:p>
+            <w:r>
+              <w:t>pytest with env vars injected</w:t>
+            </w:r>
+          </w:p>
+        </w:tc>
+        <w:tc>
+          <w:tcPr>
+            <w:tcW w:w="2880" w:type="dxa"/>
+            <w:shd w:val="clear" w:color="auto" w:fill="FFFFFF"/>
+          </w:tcPr>
+          <w:p>
+            <w:r>
+              <w:t>Executes the full test suite in headless mode. HEADLESS=Y is mandatory on GitHub runners (no display). Matrix variable provides the browser.</w:t>
+            </w:r>
+          </w:p>
+        </w:tc>
+      </w:tr>
+      <w:tr>
+        <w:tc>
+          <w:tcPr>
+            <w:tcW w:w="2880" w:type="dxa"/>
+            <w:shd w:val="clear" w:color="auto" w:fill="EEF3FB"/>
+          </w:tcPr>
+          <w:p>
+            <w:r>
+              <w:t>7. Upload HTML report</w:t>
+            </w:r>
+          </w:p>
+        </w:tc>
+        <w:tc>
+          <w:tcPr>
+            <w:tcW w:w="2880" w:type="dxa"/>
+            <w:shd w:val="clear" w:color="auto" w:fill="EEF3FB"/>
+          </w:tcPr>
+          <w:p>
+            <w:r>
+              <w:t>actions/upload-artifact@v4 (if: always)</w:t>
+            </w:r>
+          </w:p>
+        </w:tc>
+        <w:tc>
+          <w:tcPr>
+            <w:tcW w:w="2880" w:type="dxa"/>
+            <w:shd w:val="clear" w:color="auto" w:fill="EEF3FB"/>
+          </w:tcPr>
+          <w:p>
+            <w:r>
+              <w:t>Persists the HTML report as a GitHub Actions artifact even when tests fail, so it is always downloadable from the Actions run page.</w:t>
+            </w:r>
+          </w:p>
+        </w:tc>
+      </w:tr>
+      <w:tr>
+        <w:tc>
+          <w:tcPr>
+            <w:tcW w:w="2880" w:type="dxa"/>
+            <w:shd w:val="clear" w:color="auto" w:fill="FFFFFF"/>
+          </w:tcPr>
+          <w:p>
+            <w:r>
+              <w:t>8. Upload Allure results</w:t>
+            </w:r>
+          </w:p>
+        </w:tc>
+        <w:tc>
+          <w:tcPr>
+            <w:tcW w:w="2880" w:type="dxa"/>
+            <w:shd w:val="clear" w:color="auto" w:fill="FFFFFF"/>
+          </w:tcPr>
+          <w:p>
+            <w:r>
+              <w:t>actions/upload-artifact@v4 (if: always)</w:t>
+            </w:r>
+          </w:p>
+        </w:tc>
+        <w:tc>
+          <w:tcPr>
+            <w:tcW w:w="2880" w:type="dxa"/>
+            <w:shd w:val="clear" w:color="auto" w:fill="FFFFFF"/>
+          </w:tcPr>
+          <w:p>
+            <w:r>
+              <w:t>Saves raw Allure JSON files so you can download them and run allure generate locally, or feed them to an Allure GitHub Pages deployment.</w:t>
+            </w:r>
+          </w:p>
+        </w:tc>
+      </w:tr>
+      <w:tr>
+        <w:tc>
+          <w:tcPr>
+            <w:tcW w:w="2880" w:type="dxa"/>
+            <w:shd w:val="clear" w:color="auto" w:fill="EEF3FB"/>
+          </w:tcPr>
+          <w:p>
+            <w:r>
+              <w:t>9. Upload screenshots</w:t>
+            </w:r>
+          </w:p>
+        </w:tc>
+        <w:tc>
+          <w:tcPr>
+            <w:tcW w:w="2880" w:type="dxa"/>
+            <w:shd w:val="clear" w:color="auto" w:fill="EEF3FB"/>
+          </w:tcPr>
+          <w:p>
+            <w:r>
+              <w:t>actions/upload-artifact@v4 (if: failure)</w:t>
+            </w:r>
+          </w:p>
+        </w:tc>
+        <w:tc>
+          <w:tcPr>
+            <w:tcW w:w="2880" w:type="dxa"/>
+            <w:shd w:val="clear" w:color="auto" w:fill="EEF3FB"/>
+          </w:tcPr>
+          <w:p>
+            <w:r>
+              <w:t>Uploads failure screenshots only when the job fails, keeping artifact storage lean on passing runs.</w:t>
+            </w:r>
+          </w:p>
+        </w:tc>
+      </w:tr>
+    </w:tbl>
+    <w:p/>
     <w:sectPr>
       <w:pgSz w:w="12240" w:h="15840"/>
       <w:pgMar w:top="1440" w:right="1800" w:bottom="1440" w:left="1800" w:header="720" w:footer="720" w:gutter="0"/>

</xml_diff>

<commit_message>
docs(readme): add MCP servers configuration section for GitHub Copilot
Documents the mcp.json setup for JetBrains and VS Code IDEs, covering eight MCP servers (GitHub, Playwright, Selenium, filesystem, Excel, REST API, MySQL, Word). Adds a corresponding Chapter 16 to tutorial.docx with annotated config, prerequisites, and per-server framework context.
</commit_message>
<xml_diff>
--- a/tutorial/tutorial.docx
+++ b/tutorial/tutorial.docx
@@ -7,7 +7,7 @@
         <w:pStyle w:val="Heading1"/>
       </w:pPr>
       <w:bookmarkStart w:id="0" w:name="_Toc227102997"/>
-      <w:bookmarkStart w:id="1" w:name="_Toc227105560"/>
+      <w:bookmarkStart w:id="1" w:name="_Toc227127838"/>
       <w:r>
         <w:rPr>
           <w:sz w:val="52"/>
@@ -157,7 +157,7 @@
           <w:r>
             <w:fldChar w:fldCharType="separate"/>
           </w:r>
-          <w:hyperlink w:anchor="_Toc227105560" w:history="1">
+          <w:hyperlink w:anchor="_Toc227127838" w:history="1">
             <w:r>
               <w:rPr>
                 <w:rStyle w:val="Hyperlink"/>
@@ -184,7 +184,7 @@
                 <w:noProof/>
                 <w:webHidden/>
               </w:rPr>
-              <w:instrText xml:space="preserve"> PAGEREF _Toc227105560 \h </w:instrText>
+              <w:instrText xml:space="preserve"> PAGEREF _Toc227127838 \h </w:instrText>
             </w:r>
             <w:r>
               <w:rPr>
@@ -229,7 +229,7 @@
               <w14:ligatures w14:val="standardContextual"/>
             </w:rPr>
           </w:pPr>
-          <w:hyperlink w:anchor="_Toc227105561" w:history="1">
+          <w:hyperlink w:anchor="_Toc227127839" w:history="1">
             <w:r>
               <w:rPr>
                 <w:rStyle w:val="Hyperlink"/>
@@ -256,7 +256,7 @@
                 <w:noProof/>
                 <w:webHidden/>
               </w:rPr>
-              <w:instrText xml:space="preserve"> PAGEREF _Toc227105561 \h </w:instrText>
+              <w:instrText xml:space="preserve"> PAGEREF _Toc227127839 \h </w:instrText>
             </w:r>
             <w:r>
               <w:rPr>
@@ -301,7 +301,7 @@
               <w14:ligatures w14:val="standardContextual"/>
             </w:rPr>
           </w:pPr>
-          <w:hyperlink w:anchor="_Toc227105562" w:history="1">
+          <w:hyperlink w:anchor="_Toc227127840" w:history="1">
             <w:r>
               <w:rPr>
                 <w:rStyle w:val="Hyperlink"/>
@@ -328,7 +328,7 @@
                 <w:noProof/>
                 <w:webHidden/>
               </w:rPr>
-              <w:instrText xml:space="preserve"> PAGEREF _Toc227105562 \h </w:instrText>
+              <w:instrText xml:space="preserve"> PAGEREF _Toc227127840 \h </w:instrText>
             </w:r>
             <w:r>
               <w:rPr>
@@ -373,7 +373,7 @@
               <w14:ligatures w14:val="standardContextual"/>
             </w:rPr>
           </w:pPr>
-          <w:hyperlink w:anchor="_Toc227105563" w:history="1">
+          <w:hyperlink w:anchor="_Toc227127841" w:history="1">
             <w:r>
               <w:rPr>
                 <w:rStyle w:val="Hyperlink"/>
@@ -400,7 +400,7 @@
                 <w:noProof/>
                 <w:webHidden/>
               </w:rPr>
-              <w:instrText xml:space="preserve"> PAGEREF _Toc227105563 \h </w:instrText>
+              <w:instrText xml:space="preserve"> PAGEREF _Toc227127841 \h </w:instrText>
             </w:r>
             <w:r>
               <w:rPr>
@@ -445,7 +445,7 @@
               <w14:ligatures w14:val="standardContextual"/>
             </w:rPr>
           </w:pPr>
-          <w:hyperlink w:anchor="_Toc227105564" w:history="1">
+          <w:hyperlink w:anchor="_Toc227127842" w:history="1">
             <w:r>
               <w:rPr>
                 <w:rStyle w:val="Hyperlink"/>
@@ -472,7 +472,7 @@
                 <w:noProof/>
                 <w:webHidden/>
               </w:rPr>
-              <w:instrText xml:space="preserve"> PAGEREF _Toc227105564 \h </w:instrText>
+              <w:instrText xml:space="preserve"> PAGEREF _Toc227127842 \h </w:instrText>
             </w:r>
             <w:r>
               <w:rPr>
@@ -517,7 +517,7 @@
               <w14:ligatures w14:val="standardContextual"/>
             </w:rPr>
           </w:pPr>
-          <w:hyperlink w:anchor="_Toc227105565" w:history="1">
+          <w:hyperlink w:anchor="_Toc227127843" w:history="1">
             <w:r>
               <w:rPr>
                 <w:rStyle w:val="Hyperlink"/>
@@ -544,7 +544,7 @@
                 <w:noProof/>
                 <w:webHidden/>
               </w:rPr>
-              <w:instrText xml:space="preserve"> PAGEREF _Toc227105565 \h </w:instrText>
+              <w:instrText xml:space="preserve"> PAGEREF _Toc227127843 \h </w:instrText>
             </w:r>
             <w:r>
               <w:rPr>
@@ -589,7 +589,7 @@
               <w14:ligatures w14:val="standardContextual"/>
             </w:rPr>
           </w:pPr>
-          <w:hyperlink w:anchor="_Toc227105566" w:history="1">
+          <w:hyperlink w:anchor="_Toc227127844" w:history="1">
             <w:r>
               <w:rPr>
                 <w:rStyle w:val="Hyperlink"/>
@@ -616,7 +616,7 @@
                 <w:noProof/>
                 <w:webHidden/>
               </w:rPr>
-              <w:instrText xml:space="preserve"> PAGEREF _Toc227105566 \h </w:instrText>
+              <w:instrText xml:space="preserve"> PAGEREF _Toc227127844 \h </w:instrText>
             </w:r>
             <w:r>
               <w:rPr>
@@ -661,7 +661,7 @@
               <w14:ligatures w14:val="standardContextual"/>
             </w:rPr>
           </w:pPr>
-          <w:hyperlink w:anchor="_Toc227105567" w:history="1">
+          <w:hyperlink w:anchor="_Toc227127845" w:history="1">
             <w:r>
               <w:rPr>
                 <w:rStyle w:val="Hyperlink"/>
@@ -688,7 +688,7 @@
                 <w:noProof/>
                 <w:webHidden/>
               </w:rPr>
-              <w:instrText xml:space="preserve"> PAGEREF _Toc227105567 \h </w:instrText>
+              <w:instrText xml:space="preserve"> PAGEREF _Toc227127845 \h </w:instrText>
             </w:r>
             <w:r>
               <w:rPr>
@@ -733,7 +733,7 @@
               <w14:ligatures w14:val="standardContextual"/>
             </w:rPr>
           </w:pPr>
-          <w:hyperlink w:anchor="_Toc227105568" w:history="1">
+          <w:hyperlink w:anchor="_Toc227127846" w:history="1">
             <w:r>
               <w:rPr>
                 <w:rStyle w:val="Hyperlink"/>
@@ -760,7 +760,7 @@
                 <w:noProof/>
                 <w:webHidden/>
               </w:rPr>
-              <w:instrText xml:space="preserve"> PAGEREF _Toc227105568 \h </w:instrText>
+              <w:instrText xml:space="preserve"> PAGEREF _Toc227127846 \h </w:instrText>
             </w:r>
             <w:r>
               <w:rPr>
@@ -805,7 +805,7 @@
               <w14:ligatures w14:val="standardContextual"/>
             </w:rPr>
           </w:pPr>
-          <w:hyperlink w:anchor="_Toc227105569" w:history="1">
+          <w:hyperlink w:anchor="_Toc227127847" w:history="1">
             <w:r>
               <w:rPr>
                 <w:rStyle w:val="Hyperlink"/>
@@ -832,7 +832,7 @@
                 <w:noProof/>
                 <w:webHidden/>
               </w:rPr>
-              <w:instrText xml:space="preserve"> PAGEREF _Toc227105569 \h </w:instrText>
+              <w:instrText xml:space="preserve"> PAGEREF _Toc227127847 \h </w:instrText>
             </w:r>
             <w:r>
               <w:rPr>
@@ -877,7 +877,7 @@
               <w14:ligatures w14:val="standardContextual"/>
             </w:rPr>
           </w:pPr>
-          <w:hyperlink w:anchor="_Toc227105570" w:history="1">
+          <w:hyperlink w:anchor="_Toc227127848" w:history="1">
             <w:r>
               <w:rPr>
                 <w:rStyle w:val="Hyperlink"/>
@@ -904,7 +904,7 @@
                 <w:noProof/>
                 <w:webHidden/>
               </w:rPr>
-              <w:instrText xml:space="preserve"> PAGEREF _Toc227105570 \h </w:instrText>
+              <w:instrText xml:space="preserve"> PAGEREF _Toc227127848 \h </w:instrText>
             </w:r>
             <w:r>
               <w:rPr>
@@ -949,7 +949,7 @@
               <w14:ligatures w14:val="standardContextual"/>
             </w:rPr>
           </w:pPr>
-          <w:hyperlink w:anchor="_Toc227105571" w:history="1">
+          <w:hyperlink w:anchor="_Toc227127849" w:history="1">
             <w:r>
               <w:rPr>
                 <w:rStyle w:val="Hyperlink"/>
@@ -976,7 +976,7 @@
                 <w:noProof/>
                 <w:webHidden/>
               </w:rPr>
-              <w:instrText xml:space="preserve"> PAGEREF _Toc227105571 \h </w:instrText>
+              <w:instrText xml:space="preserve"> PAGEREF _Toc227127849 \h </w:instrText>
             </w:r>
             <w:r>
               <w:rPr>
@@ -1021,7 +1021,7 @@
               <w14:ligatures w14:val="standardContextual"/>
             </w:rPr>
           </w:pPr>
-          <w:hyperlink w:anchor="_Toc227105572" w:history="1">
+          <w:hyperlink w:anchor="_Toc227127850" w:history="1">
             <w:r>
               <w:rPr>
                 <w:rStyle w:val="Hyperlink"/>
@@ -1048,7 +1048,7 @@
                 <w:noProof/>
                 <w:webHidden/>
               </w:rPr>
-              <w:instrText xml:space="preserve"> PAGEREF _Toc227105572 \h </w:instrText>
+              <w:instrText xml:space="preserve"> PAGEREF _Toc227127850 \h </w:instrText>
             </w:r>
             <w:r>
               <w:rPr>
@@ -1093,7 +1093,7 @@
               <w14:ligatures w14:val="standardContextual"/>
             </w:rPr>
           </w:pPr>
-          <w:hyperlink w:anchor="_Toc227105573" w:history="1">
+          <w:hyperlink w:anchor="_Toc227127851" w:history="1">
             <w:r>
               <w:rPr>
                 <w:rStyle w:val="Hyperlink"/>
@@ -1120,7 +1120,7 @@
                 <w:noProof/>
                 <w:webHidden/>
               </w:rPr>
-              <w:instrText xml:space="preserve"> PAGEREF _Toc227105573 \h </w:instrText>
+              <w:instrText xml:space="preserve"> PAGEREF _Toc227127851 \h </w:instrText>
             </w:r>
             <w:r>
               <w:rPr>
@@ -1165,7 +1165,7 @@
               <w14:ligatures w14:val="standardContextual"/>
             </w:rPr>
           </w:pPr>
-          <w:hyperlink w:anchor="_Toc227105574" w:history="1">
+          <w:hyperlink w:anchor="_Toc227127852" w:history="1">
             <w:r>
               <w:rPr>
                 <w:rStyle w:val="Hyperlink"/>
@@ -1192,7 +1192,7 @@
                 <w:noProof/>
                 <w:webHidden/>
               </w:rPr>
-              <w:instrText xml:space="preserve"> PAGEREF _Toc227105574 \h </w:instrText>
+              <w:instrText xml:space="preserve"> PAGEREF _Toc227127852 \h </w:instrText>
             </w:r>
             <w:r>
               <w:rPr>
@@ -1237,7 +1237,7 @@
               <w14:ligatures w14:val="standardContextual"/>
             </w:rPr>
           </w:pPr>
-          <w:hyperlink w:anchor="_Toc227105575" w:history="1">
+          <w:hyperlink w:anchor="_Toc227127853" w:history="1">
             <w:r>
               <w:rPr>
                 <w:rStyle w:val="Hyperlink"/>
@@ -1264,7 +1264,7 @@
                 <w:noProof/>
                 <w:webHidden/>
               </w:rPr>
-              <w:instrText xml:space="preserve"> PAGEREF _Toc227105575 \h </w:instrText>
+              <w:instrText xml:space="preserve"> PAGEREF _Toc227127853 \h </w:instrText>
             </w:r>
             <w:r>
               <w:rPr>
@@ -1309,7 +1309,7 @@
               <w14:ligatures w14:val="standardContextual"/>
             </w:rPr>
           </w:pPr>
-          <w:hyperlink w:anchor="_Toc227105576" w:history="1">
+          <w:hyperlink w:anchor="_Toc227127854" w:history="1">
             <w:r>
               <w:rPr>
                 <w:rStyle w:val="Hyperlink"/>
@@ -1336,7 +1336,7 @@
                 <w:noProof/>
                 <w:webHidden/>
               </w:rPr>
-              <w:instrText xml:space="preserve"> PAGEREF _Toc227105576 \h </w:instrText>
+              <w:instrText xml:space="preserve"> PAGEREF _Toc227127854 \h </w:instrText>
             </w:r>
             <w:r>
               <w:rPr>
@@ -1381,7 +1381,7 @@
               <w14:ligatures w14:val="standardContextual"/>
             </w:rPr>
           </w:pPr>
-          <w:hyperlink w:anchor="_Toc227105577" w:history="1">
+          <w:hyperlink w:anchor="_Toc227127855" w:history="1">
             <w:r>
               <w:rPr>
                 <w:rStyle w:val="Hyperlink"/>
@@ -1408,7 +1408,7 @@
                 <w:noProof/>
                 <w:webHidden/>
               </w:rPr>
-              <w:instrText xml:space="preserve"> PAGEREF _Toc227105577 \h </w:instrText>
+              <w:instrText xml:space="preserve"> PAGEREF _Toc227127855 \h </w:instrText>
             </w:r>
             <w:r>
               <w:rPr>
@@ -1453,7 +1453,7 @@
               <w14:ligatures w14:val="standardContextual"/>
             </w:rPr>
           </w:pPr>
-          <w:hyperlink w:anchor="_Toc227105578" w:history="1">
+          <w:hyperlink w:anchor="_Toc227127856" w:history="1">
             <w:r>
               <w:rPr>
                 <w:rStyle w:val="Hyperlink"/>
@@ -1480,7 +1480,7 @@
                 <w:noProof/>
                 <w:webHidden/>
               </w:rPr>
-              <w:instrText xml:space="preserve"> PAGEREF _Toc227105578 \h </w:instrText>
+              <w:instrText xml:space="preserve"> PAGEREF _Toc227127856 \h </w:instrText>
             </w:r>
             <w:r>
               <w:rPr>
@@ -1525,7 +1525,7 @@
               <w14:ligatures w14:val="standardContextual"/>
             </w:rPr>
           </w:pPr>
-          <w:hyperlink w:anchor="_Toc227105579" w:history="1">
+          <w:hyperlink w:anchor="_Toc227127857" w:history="1">
             <w:r>
               <w:rPr>
                 <w:rStyle w:val="Hyperlink"/>
@@ -1552,7 +1552,7 @@
                 <w:noProof/>
                 <w:webHidden/>
               </w:rPr>
-              <w:instrText xml:space="preserve"> PAGEREF _Toc227105579 \h </w:instrText>
+              <w:instrText xml:space="preserve"> PAGEREF _Toc227127857 \h </w:instrText>
             </w:r>
             <w:r>
               <w:rPr>
@@ -1597,7 +1597,7 @@
               <w14:ligatures w14:val="standardContextual"/>
             </w:rPr>
           </w:pPr>
-          <w:hyperlink w:anchor="_Toc227105580" w:history="1">
+          <w:hyperlink w:anchor="_Toc227127858" w:history="1">
             <w:r>
               <w:rPr>
                 <w:rStyle w:val="Hyperlink"/>
@@ -1624,7 +1624,7 @@
                 <w:noProof/>
                 <w:webHidden/>
               </w:rPr>
-              <w:instrText xml:space="preserve"> PAGEREF _Toc227105580 \h </w:instrText>
+              <w:instrText xml:space="preserve"> PAGEREF _Toc227127858 \h </w:instrText>
             </w:r>
             <w:r>
               <w:rPr>
@@ -1669,7 +1669,7 @@
               <w14:ligatures w14:val="standardContextual"/>
             </w:rPr>
           </w:pPr>
-          <w:hyperlink w:anchor="_Toc227105581" w:history="1">
+          <w:hyperlink w:anchor="_Toc227127859" w:history="1">
             <w:r>
               <w:rPr>
                 <w:rStyle w:val="Hyperlink"/>
@@ -1696,7 +1696,7 @@
                 <w:noProof/>
                 <w:webHidden/>
               </w:rPr>
-              <w:instrText xml:space="preserve"> PAGEREF _Toc227105581 \h </w:instrText>
+              <w:instrText xml:space="preserve"> PAGEREF _Toc227127859 \h </w:instrText>
             </w:r>
             <w:r>
               <w:rPr>
@@ -1741,7 +1741,7 @@
               <w14:ligatures w14:val="standardContextual"/>
             </w:rPr>
           </w:pPr>
-          <w:hyperlink w:anchor="_Toc227105582" w:history="1">
+          <w:hyperlink w:anchor="_Toc227127860" w:history="1">
             <w:r>
               <w:rPr>
                 <w:rStyle w:val="Hyperlink"/>
@@ -1768,7 +1768,7 @@
                 <w:noProof/>
                 <w:webHidden/>
               </w:rPr>
-              <w:instrText xml:space="preserve"> PAGEREF _Toc227105582 \h </w:instrText>
+              <w:instrText xml:space="preserve"> PAGEREF _Toc227127860 \h </w:instrText>
             </w:r>
             <w:r>
               <w:rPr>
@@ -1813,7 +1813,7 @@
               <w14:ligatures w14:val="standardContextual"/>
             </w:rPr>
           </w:pPr>
-          <w:hyperlink w:anchor="_Toc227105583" w:history="1">
+          <w:hyperlink w:anchor="_Toc227127861" w:history="1">
             <w:r>
               <w:rPr>
                 <w:rStyle w:val="Hyperlink"/>
@@ -1840,7 +1840,7 @@
                 <w:noProof/>
                 <w:webHidden/>
               </w:rPr>
-              <w:instrText xml:space="preserve"> PAGEREF _Toc227105583 \h </w:instrText>
+              <w:instrText xml:space="preserve"> PAGEREF _Toc227127861 \h </w:instrText>
             </w:r>
             <w:r>
               <w:rPr>
@@ -1885,7 +1885,7 @@
               <w14:ligatures w14:val="standardContextual"/>
             </w:rPr>
           </w:pPr>
-          <w:hyperlink w:anchor="_Toc227105584" w:history="1">
+          <w:hyperlink w:anchor="_Toc227127862" w:history="1">
             <w:r>
               <w:rPr>
                 <w:rStyle w:val="Hyperlink"/>
@@ -1912,7 +1912,7 @@
                 <w:noProof/>
                 <w:webHidden/>
               </w:rPr>
-              <w:instrText xml:space="preserve"> PAGEREF _Toc227105584 \h </w:instrText>
+              <w:instrText xml:space="preserve"> PAGEREF _Toc227127862 \h </w:instrText>
             </w:r>
             <w:r>
               <w:rPr>
@@ -1957,7 +1957,7 @@
               <w14:ligatures w14:val="standardContextual"/>
             </w:rPr>
           </w:pPr>
-          <w:hyperlink w:anchor="_Toc227105585" w:history="1">
+          <w:hyperlink w:anchor="_Toc227127863" w:history="1">
             <w:r>
               <w:rPr>
                 <w:rStyle w:val="Hyperlink"/>
@@ -1984,7 +1984,7 @@
                 <w:noProof/>
                 <w:webHidden/>
               </w:rPr>
-              <w:instrText xml:space="preserve"> PAGEREF _Toc227105585 \h </w:instrText>
+              <w:instrText xml:space="preserve"> PAGEREF _Toc227127863 \h </w:instrText>
             </w:r>
             <w:r>
               <w:rPr>
@@ -2029,7 +2029,7 @@
               <w14:ligatures w14:val="standardContextual"/>
             </w:rPr>
           </w:pPr>
-          <w:hyperlink w:anchor="_Toc227105586" w:history="1">
+          <w:hyperlink w:anchor="_Toc227127864" w:history="1">
             <w:r>
               <w:rPr>
                 <w:rStyle w:val="Hyperlink"/>
@@ -2056,7 +2056,7 @@
                 <w:noProof/>
                 <w:webHidden/>
               </w:rPr>
-              <w:instrText xml:space="preserve"> PAGEREF _Toc227105586 \h </w:instrText>
+              <w:instrText xml:space="preserve"> PAGEREF _Toc227127864 \h </w:instrText>
             </w:r>
             <w:r>
               <w:rPr>
@@ -2101,7 +2101,7 @@
               <w14:ligatures w14:val="standardContextual"/>
             </w:rPr>
           </w:pPr>
-          <w:hyperlink w:anchor="_Toc227105587" w:history="1">
+          <w:hyperlink w:anchor="_Toc227127865" w:history="1">
             <w:r>
               <w:rPr>
                 <w:rStyle w:val="Hyperlink"/>
@@ -2128,7 +2128,7 @@
                 <w:noProof/>
                 <w:webHidden/>
               </w:rPr>
-              <w:instrText xml:space="preserve"> PAGEREF _Toc227105587 \h </w:instrText>
+              <w:instrText xml:space="preserve"> PAGEREF _Toc227127865 \h </w:instrText>
             </w:r>
             <w:r>
               <w:rPr>
@@ -2173,7 +2173,7 @@
               <w14:ligatures w14:val="standardContextual"/>
             </w:rPr>
           </w:pPr>
-          <w:hyperlink w:anchor="_Toc227105588" w:history="1">
+          <w:hyperlink w:anchor="_Toc227127866" w:history="1">
             <w:r>
               <w:rPr>
                 <w:rStyle w:val="Hyperlink"/>
@@ -2200,7 +2200,7 @@
                 <w:noProof/>
                 <w:webHidden/>
               </w:rPr>
-              <w:instrText xml:space="preserve"> PAGEREF _Toc227105588 \h </w:instrText>
+              <w:instrText xml:space="preserve"> PAGEREF _Toc227127866 \h </w:instrText>
             </w:r>
             <w:r>
               <w:rPr>
@@ -2245,7 +2245,7 @@
               <w14:ligatures w14:val="standardContextual"/>
             </w:rPr>
           </w:pPr>
-          <w:hyperlink w:anchor="_Toc227105589" w:history="1">
+          <w:hyperlink w:anchor="_Toc227127867" w:history="1">
             <w:r>
               <w:rPr>
                 <w:rStyle w:val="Hyperlink"/>
@@ -2272,7 +2272,7 @@
                 <w:noProof/>
                 <w:webHidden/>
               </w:rPr>
-              <w:instrText xml:space="preserve"> PAGEREF _Toc227105589 \h </w:instrText>
+              <w:instrText xml:space="preserve"> PAGEREF _Toc227127867 \h </w:instrText>
             </w:r>
             <w:r>
               <w:rPr>
@@ -2317,7 +2317,7 @@
               <w14:ligatures w14:val="standardContextual"/>
             </w:rPr>
           </w:pPr>
-          <w:hyperlink w:anchor="_Toc227105590" w:history="1">
+          <w:hyperlink w:anchor="_Toc227127868" w:history="1">
             <w:r>
               <w:rPr>
                 <w:rStyle w:val="Hyperlink"/>
@@ -2344,7 +2344,7 @@
                 <w:noProof/>
                 <w:webHidden/>
               </w:rPr>
-              <w:instrText xml:space="preserve"> PAGEREF _Toc227105590 \h </w:instrText>
+              <w:instrText xml:space="preserve"> PAGEREF _Toc227127868 \h </w:instrText>
             </w:r>
             <w:r>
               <w:rPr>
@@ -2389,7 +2389,7 @@
               <w14:ligatures w14:val="standardContextual"/>
             </w:rPr>
           </w:pPr>
-          <w:hyperlink w:anchor="_Toc227105591" w:history="1">
+          <w:hyperlink w:anchor="_Toc227127869" w:history="1">
             <w:r>
               <w:rPr>
                 <w:rStyle w:val="Hyperlink"/>
@@ -2416,7 +2416,7 @@
                 <w:noProof/>
                 <w:webHidden/>
               </w:rPr>
-              <w:instrText xml:space="preserve"> PAGEREF _Toc227105591 \h </w:instrText>
+              <w:instrText xml:space="preserve"> PAGEREF _Toc227127869 \h </w:instrText>
             </w:r>
             <w:r>
               <w:rPr>
@@ -2461,7 +2461,7 @@
               <w14:ligatures w14:val="standardContextual"/>
             </w:rPr>
           </w:pPr>
-          <w:hyperlink w:anchor="_Toc227105592" w:history="1">
+          <w:hyperlink w:anchor="_Toc227127870" w:history="1">
             <w:r>
               <w:rPr>
                 <w:rStyle w:val="Hyperlink"/>
@@ -2488,7 +2488,7 @@
                 <w:noProof/>
                 <w:webHidden/>
               </w:rPr>
-              <w:instrText xml:space="preserve"> PAGEREF _Toc227105592 \h </w:instrText>
+              <w:instrText xml:space="preserve"> PAGEREF _Toc227127870 \h </w:instrText>
             </w:r>
             <w:r>
               <w:rPr>
@@ -2533,7 +2533,7 @@
               <w14:ligatures w14:val="standardContextual"/>
             </w:rPr>
           </w:pPr>
-          <w:hyperlink w:anchor="_Toc227105593" w:history="1">
+          <w:hyperlink w:anchor="_Toc227127871" w:history="1">
             <w:r>
               <w:rPr>
                 <w:rStyle w:val="Hyperlink"/>
@@ -2560,7 +2560,7 @@
                 <w:noProof/>
                 <w:webHidden/>
               </w:rPr>
-              <w:instrText xml:space="preserve"> PAGEREF _Toc227105593 \h </w:instrText>
+              <w:instrText xml:space="preserve"> PAGEREF _Toc227127871 \h </w:instrText>
             </w:r>
             <w:r>
               <w:rPr>
@@ -2605,7 +2605,7 @@
               <w14:ligatures w14:val="standardContextual"/>
             </w:rPr>
           </w:pPr>
-          <w:hyperlink w:anchor="_Toc227105594" w:history="1">
+          <w:hyperlink w:anchor="_Toc227127872" w:history="1">
             <w:r>
               <w:rPr>
                 <w:rStyle w:val="Hyperlink"/>
@@ -2632,7 +2632,7 @@
                 <w:noProof/>
                 <w:webHidden/>
               </w:rPr>
-              <w:instrText xml:space="preserve"> PAGEREF _Toc227105594 \h </w:instrText>
+              <w:instrText xml:space="preserve"> PAGEREF _Toc227127872 \h </w:instrText>
             </w:r>
             <w:r>
               <w:rPr>
@@ -2677,7 +2677,7 @@
               <w14:ligatures w14:val="standardContextual"/>
             </w:rPr>
           </w:pPr>
-          <w:hyperlink w:anchor="_Toc227105595" w:history="1">
+          <w:hyperlink w:anchor="_Toc227127873" w:history="1">
             <w:r>
               <w:rPr>
                 <w:rStyle w:val="Hyperlink"/>
@@ -2704,7 +2704,7 @@
                 <w:noProof/>
                 <w:webHidden/>
               </w:rPr>
-              <w:instrText xml:space="preserve"> PAGEREF _Toc227105595 \h </w:instrText>
+              <w:instrText xml:space="preserve"> PAGEREF _Toc227127873 \h </w:instrText>
             </w:r>
             <w:r>
               <w:rPr>
@@ -2749,7 +2749,7 @@
               <w14:ligatures w14:val="standardContextual"/>
             </w:rPr>
           </w:pPr>
-          <w:hyperlink w:anchor="_Toc227105596" w:history="1">
+          <w:hyperlink w:anchor="_Toc227127874" w:history="1">
             <w:r>
               <w:rPr>
                 <w:rStyle w:val="Hyperlink"/>
@@ -2776,7 +2776,7 @@
                 <w:noProof/>
                 <w:webHidden/>
               </w:rPr>
-              <w:instrText xml:space="preserve"> PAGEREF _Toc227105596 \h </w:instrText>
+              <w:instrText xml:space="preserve"> PAGEREF _Toc227127874 \h </w:instrText>
             </w:r>
             <w:r>
               <w:rPr>
@@ -2821,7 +2821,7 @@
               <w14:ligatures w14:val="standardContextual"/>
             </w:rPr>
           </w:pPr>
-          <w:hyperlink w:anchor="_Toc227105597" w:history="1">
+          <w:hyperlink w:anchor="_Toc227127875" w:history="1">
             <w:r>
               <w:rPr>
                 <w:rStyle w:val="Hyperlink"/>
@@ -2848,7 +2848,7 @@
                 <w:noProof/>
                 <w:webHidden/>
               </w:rPr>
-              <w:instrText xml:space="preserve"> PAGEREF _Toc227105597 \h </w:instrText>
+              <w:instrText xml:space="preserve"> PAGEREF _Toc227127875 \h </w:instrText>
             </w:r>
             <w:r>
               <w:rPr>
@@ -2893,7 +2893,7 @@
               <w14:ligatures w14:val="standardContextual"/>
             </w:rPr>
           </w:pPr>
-          <w:hyperlink w:anchor="_Toc227105598" w:history="1">
+          <w:hyperlink w:anchor="_Toc227127876" w:history="1">
             <w:r>
               <w:rPr>
                 <w:rStyle w:val="Hyperlink"/>
@@ -2920,7 +2920,7 @@
                 <w:noProof/>
                 <w:webHidden/>
               </w:rPr>
-              <w:instrText xml:space="preserve"> PAGEREF _Toc227105598 \h </w:instrText>
+              <w:instrText xml:space="preserve"> PAGEREF _Toc227127876 \h </w:instrText>
             </w:r>
             <w:r>
               <w:rPr>
@@ -2965,7 +2965,7 @@
               <w14:ligatures w14:val="standardContextual"/>
             </w:rPr>
           </w:pPr>
-          <w:hyperlink w:anchor="_Toc227105599" w:history="1">
+          <w:hyperlink w:anchor="_Toc227127877" w:history="1">
             <w:r>
               <w:rPr>
                 <w:rStyle w:val="Hyperlink"/>
@@ -2992,7 +2992,7 @@
                 <w:noProof/>
                 <w:webHidden/>
               </w:rPr>
-              <w:instrText xml:space="preserve"> PAGEREF _Toc227105599 \h </w:instrText>
+              <w:instrText xml:space="preserve"> PAGEREF _Toc227127877 \h </w:instrText>
             </w:r>
             <w:r>
               <w:rPr>
@@ -3037,7 +3037,7 @@
               <w14:ligatures w14:val="standardContextual"/>
             </w:rPr>
           </w:pPr>
-          <w:hyperlink w:anchor="_Toc227105600" w:history="1">
+          <w:hyperlink w:anchor="_Toc227127878" w:history="1">
             <w:r>
               <w:rPr>
                 <w:rStyle w:val="Hyperlink"/>
@@ -3064,7 +3064,7 @@
                 <w:noProof/>
                 <w:webHidden/>
               </w:rPr>
-              <w:instrText xml:space="preserve"> PAGEREF _Toc227105600 \h </w:instrText>
+              <w:instrText xml:space="preserve"> PAGEREF _Toc227127878 \h </w:instrText>
             </w:r>
             <w:r>
               <w:rPr>
@@ -3109,7 +3109,7 @@
               <w14:ligatures w14:val="standardContextual"/>
             </w:rPr>
           </w:pPr>
-          <w:hyperlink w:anchor="_Toc227105601" w:history="1">
+          <w:hyperlink w:anchor="_Toc227127879" w:history="1">
             <w:r>
               <w:rPr>
                 <w:rStyle w:val="Hyperlink"/>
@@ -3136,7 +3136,7 @@
                 <w:noProof/>
                 <w:webHidden/>
               </w:rPr>
-              <w:instrText xml:space="preserve"> PAGEREF _Toc227105601 \h </w:instrText>
+              <w:instrText xml:space="preserve"> PAGEREF _Toc227127879 \h </w:instrText>
             </w:r>
             <w:r>
               <w:rPr>
@@ -3181,7 +3181,7 @@
               <w14:ligatures w14:val="standardContextual"/>
             </w:rPr>
           </w:pPr>
-          <w:hyperlink w:anchor="_Toc227105602" w:history="1">
+          <w:hyperlink w:anchor="_Toc227127880" w:history="1">
             <w:r>
               <w:rPr>
                 <w:rStyle w:val="Hyperlink"/>
@@ -3208,7 +3208,7 @@
                 <w:noProof/>
                 <w:webHidden/>
               </w:rPr>
-              <w:instrText xml:space="preserve"> PAGEREF _Toc227105602 \h </w:instrText>
+              <w:instrText xml:space="preserve"> PAGEREF _Toc227127880 \h </w:instrText>
             </w:r>
             <w:r>
               <w:rPr>
@@ -3253,7 +3253,7 @@
               <w14:ligatures w14:val="standardContextual"/>
             </w:rPr>
           </w:pPr>
-          <w:hyperlink w:anchor="_Toc227105603" w:history="1">
+          <w:hyperlink w:anchor="_Toc227127881" w:history="1">
             <w:r>
               <w:rPr>
                 <w:rStyle w:val="Hyperlink"/>
@@ -3280,7 +3280,7 @@
                 <w:noProof/>
                 <w:webHidden/>
               </w:rPr>
-              <w:instrText xml:space="preserve"> PAGEREF _Toc227105603 \h </w:instrText>
+              <w:instrText xml:space="preserve"> PAGEREF _Toc227127881 \h </w:instrText>
             </w:r>
             <w:r>
               <w:rPr>
@@ -3325,7 +3325,7 @@
               <w14:ligatures w14:val="standardContextual"/>
             </w:rPr>
           </w:pPr>
-          <w:hyperlink w:anchor="_Toc227105604" w:history="1">
+          <w:hyperlink w:anchor="_Toc227127882" w:history="1">
             <w:r>
               <w:rPr>
                 <w:rStyle w:val="Hyperlink"/>
@@ -3352,7 +3352,7 @@
                 <w:noProof/>
                 <w:webHidden/>
               </w:rPr>
-              <w:instrText xml:space="preserve"> PAGEREF _Toc227105604 \h </w:instrText>
+              <w:instrText xml:space="preserve"> PAGEREF _Toc227127882 \h </w:instrText>
             </w:r>
             <w:r>
               <w:rPr>
@@ -3397,7 +3397,7 @@
               <w14:ligatures w14:val="standardContextual"/>
             </w:rPr>
           </w:pPr>
-          <w:hyperlink w:anchor="_Toc227105605" w:history="1">
+          <w:hyperlink w:anchor="_Toc227127883" w:history="1">
             <w:r>
               <w:rPr>
                 <w:rStyle w:val="Hyperlink"/>
@@ -3424,7 +3424,7 @@
                 <w:noProof/>
                 <w:webHidden/>
               </w:rPr>
-              <w:instrText xml:space="preserve"> PAGEREF _Toc227105605 \h </w:instrText>
+              <w:instrText xml:space="preserve"> PAGEREF _Toc227127883 \h </w:instrText>
             </w:r>
             <w:r>
               <w:rPr>
@@ -3469,7 +3469,7 @@
               <w14:ligatures w14:val="standardContextual"/>
             </w:rPr>
           </w:pPr>
-          <w:hyperlink w:anchor="_Toc227105606" w:history="1">
+          <w:hyperlink w:anchor="_Toc227127884" w:history="1">
             <w:r>
               <w:rPr>
                 <w:rStyle w:val="Hyperlink"/>
@@ -3496,7 +3496,7 @@
                 <w:noProof/>
                 <w:webHidden/>
               </w:rPr>
-              <w:instrText xml:space="preserve"> PAGEREF _Toc227105606 \h </w:instrText>
+              <w:instrText xml:space="preserve"> PAGEREF _Toc227127884 \h </w:instrText>
             </w:r>
             <w:r>
               <w:rPr>
@@ -3541,7 +3541,7 @@
               <w14:ligatures w14:val="standardContextual"/>
             </w:rPr>
           </w:pPr>
-          <w:hyperlink w:anchor="_Toc227105607" w:history="1">
+          <w:hyperlink w:anchor="_Toc227127885" w:history="1">
             <w:r>
               <w:rPr>
                 <w:rStyle w:val="Hyperlink"/>
@@ -3568,7 +3568,7 @@
                 <w:noProof/>
                 <w:webHidden/>
               </w:rPr>
-              <w:instrText xml:space="preserve"> PAGEREF _Toc227105607 \h </w:instrText>
+              <w:instrText xml:space="preserve"> PAGEREF _Toc227127885 \h </w:instrText>
             </w:r>
             <w:r>
               <w:rPr>
@@ -3613,7 +3613,7 @@
               <w14:ligatures w14:val="standardContextual"/>
             </w:rPr>
           </w:pPr>
-          <w:hyperlink w:anchor="_Toc227105608" w:history="1">
+          <w:hyperlink w:anchor="_Toc227127886" w:history="1">
             <w:r>
               <w:rPr>
                 <w:rStyle w:val="Hyperlink"/>
@@ -3640,7 +3640,7 @@
                 <w:noProof/>
                 <w:webHidden/>
               </w:rPr>
-              <w:instrText xml:space="preserve"> PAGEREF _Toc227105608 \h </w:instrText>
+              <w:instrText xml:space="preserve"> PAGEREF _Toc227127886 \h </w:instrText>
             </w:r>
             <w:r>
               <w:rPr>
@@ -3685,7 +3685,7 @@
               <w14:ligatures w14:val="standardContextual"/>
             </w:rPr>
           </w:pPr>
-          <w:hyperlink w:anchor="_Toc227105609" w:history="1">
+          <w:hyperlink w:anchor="_Toc227127887" w:history="1">
             <w:r>
               <w:rPr>
                 <w:rStyle w:val="Hyperlink"/>
@@ -3712,7 +3712,7 @@
                 <w:noProof/>
                 <w:webHidden/>
               </w:rPr>
-              <w:instrText xml:space="preserve"> PAGEREF _Toc227105609 \h </w:instrText>
+              <w:instrText xml:space="preserve"> PAGEREF _Toc227127887 \h </w:instrText>
             </w:r>
             <w:r>
               <w:rPr>
@@ -3757,7 +3757,7 @@
               <w14:ligatures w14:val="standardContextual"/>
             </w:rPr>
           </w:pPr>
-          <w:hyperlink w:anchor="_Toc227105610" w:history="1">
+          <w:hyperlink w:anchor="_Toc227127888" w:history="1">
             <w:r>
               <w:rPr>
                 <w:rStyle w:val="Hyperlink"/>
@@ -3784,7 +3784,7 @@
                 <w:noProof/>
                 <w:webHidden/>
               </w:rPr>
-              <w:instrText xml:space="preserve"> PAGEREF _Toc227105610 \h </w:instrText>
+              <w:instrText xml:space="preserve"> PAGEREF _Toc227127888 \h </w:instrText>
             </w:r>
             <w:r>
               <w:rPr>
@@ -3829,7 +3829,7 @@
               <w14:ligatures w14:val="standardContextual"/>
             </w:rPr>
           </w:pPr>
-          <w:hyperlink w:anchor="_Toc227105611" w:history="1">
+          <w:hyperlink w:anchor="_Toc227127889" w:history="1">
             <w:r>
               <w:rPr>
                 <w:rStyle w:val="Hyperlink"/>
@@ -3856,7 +3856,7 @@
                 <w:noProof/>
                 <w:webHidden/>
               </w:rPr>
-              <w:instrText xml:space="preserve"> PAGEREF _Toc227105611 \h </w:instrText>
+              <w:instrText xml:space="preserve"> PAGEREF _Toc227127889 \h </w:instrText>
             </w:r>
             <w:r>
               <w:rPr>
@@ -3901,7 +3901,7 @@
               <w14:ligatures w14:val="standardContextual"/>
             </w:rPr>
           </w:pPr>
-          <w:hyperlink w:anchor="_Toc227105612" w:history="1">
+          <w:hyperlink w:anchor="_Toc227127890" w:history="1">
             <w:r>
               <w:rPr>
                 <w:rStyle w:val="Hyperlink"/>
@@ -3928,7 +3928,7 @@
                 <w:noProof/>
                 <w:webHidden/>
               </w:rPr>
-              <w:instrText xml:space="preserve"> PAGEREF _Toc227105612 \h </w:instrText>
+              <w:instrText xml:space="preserve"> PAGEREF _Toc227127890 \h </w:instrText>
             </w:r>
             <w:r>
               <w:rPr>
@@ -3973,7 +3973,7 @@
               <w14:ligatures w14:val="standardContextual"/>
             </w:rPr>
           </w:pPr>
-          <w:hyperlink w:anchor="_Toc227105613" w:history="1">
+          <w:hyperlink w:anchor="_Toc227127891" w:history="1">
             <w:r>
               <w:rPr>
                 <w:rStyle w:val="Hyperlink"/>
@@ -4000,7 +4000,7 @@
                 <w:noProof/>
                 <w:webHidden/>
               </w:rPr>
-              <w:instrText xml:space="preserve"> PAGEREF _Toc227105613 \h </w:instrText>
+              <w:instrText xml:space="preserve"> PAGEREF _Toc227127891 \h </w:instrText>
             </w:r>
             <w:r>
               <w:rPr>
@@ -4045,7 +4045,7 @@
               <w14:ligatures w14:val="standardContextual"/>
             </w:rPr>
           </w:pPr>
-          <w:hyperlink w:anchor="_Toc227105614" w:history="1">
+          <w:hyperlink w:anchor="_Toc227127892" w:history="1">
             <w:r>
               <w:rPr>
                 <w:rStyle w:val="Hyperlink"/>
@@ -4072,7 +4072,7 @@
                 <w:noProof/>
                 <w:webHidden/>
               </w:rPr>
-              <w:instrText xml:space="preserve"> PAGEREF _Toc227105614 \h </w:instrText>
+              <w:instrText xml:space="preserve"> PAGEREF _Toc227127892 \h </w:instrText>
             </w:r>
             <w:r>
               <w:rPr>
@@ -4117,7 +4117,7 @@
               <w14:ligatures w14:val="standardContextual"/>
             </w:rPr>
           </w:pPr>
-          <w:hyperlink w:anchor="_Toc227105615" w:history="1">
+          <w:hyperlink w:anchor="_Toc227127893" w:history="1">
             <w:r>
               <w:rPr>
                 <w:rStyle w:val="Hyperlink"/>
@@ -4144,7 +4144,7 @@
                 <w:noProof/>
                 <w:webHidden/>
               </w:rPr>
-              <w:instrText xml:space="preserve"> PAGEREF _Toc227105615 \h </w:instrText>
+              <w:instrText xml:space="preserve"> PAGEREF _Toc227127893 \h </w:instrText>
             </w:r>
             <w:r>
               <w:rPr>
@@ -4189,7 +4189,7 @@
               <w14:ligatures w14:val="standardContextual"/>
             </w:rPr>
           </w:pPr>
-          <w:hyperlink w:anchor="_Toc227105616" w:history="1">
+          <w:hyperlink w:anchor="_Toc227127894" w:history="1">
             <w:r>
               <w:rPr>
                 <w:rStyle w:val="Hyperlink"/>
@@ -4216,7 +4216,7 @@
                 <w:noProof/>
                 <w:webHidden/>
               </w:rPr>
-              <w:instrText xml:space="preserve"> PAGEREF _Toc227105616 \h </w:instrText>
+              <w:instrText xml:space="preserve"> PAGEREF _Toc227127894 \h </w:instrText>
             </w:r>
             <w:r>
               <w:rPr>
@@ -4261,7 +4261,7 @@
               <w14:ligatures w14:val="standardContextual"/>
             </w:rPr>
           </w:pPr>
-          <w:hyperlink w:anchor="_Toc227105617" w:history="1">
+          <w:hyperlink w:anchor="_Toc227127895" w:history="1">
             <w:r>
               <w:rPr>
                 <w:rStyle w:val="Hyperlink"/>
@@ -4288,7 +4288,7 @@
                 <w:noProof/>
                 <w:webHidden/>
               </w:rPr>
-              <w:instrText xml:space="preserve"> PAGEREF _Toc227105617 \h </w:instrText>
+              <w:instrText xml:space="preserve"> PAGEREF _Toc227127895 \h </w:instrText>
             </w:r>
             <w:r>
               <w:rPr>
@@ -4333,7 +4333,7 @@
               <w14:ligatures w14:val="standardContextual"/>
             </w:rPr>
           </w:pPr>
-          <w:hyperlink w:anchor="_Toc227105618" w:history="1">
+          <w:hyperlink w:anchor="_Toc227127896" w:history="1">
             <w:r>
               <w:rPr>
                 <w:rStyle w:val="Hyperlink"/>
@@ -4360,7 +4360,7 @@
                 <w:noProof/>
                 <w:webHidden/>
               </w:rPr>
-              <w:instrText xml:space="preserve"> PAGEREF _Toc227105618 \h </w:instrText>
+              <w:instrText xml:space="preserve"> PAGEREF _Toc227127896 \h </w:instrText>
             </w:r>
             <w:r>
               <w:rPr>
@@ -4405,7 +4405,7 @@
               <w14:ligatures w14:val="standardContextual"/>
             </w:rPr>
           </w:pPr>
-          <w:hyperlink w:anchor="_Toc227105619" w:history="1">
+          <w:hyperlink w:anchor="_Toc227127897" w:history="1">
             <w:r>
               <w:rPr>
                 <w:rStyle w:val="Hyperlink"/>
@@ -4432,7 +4432,7 @@
                 <w:noProof/>
                 <w:webHidden/>
               </w:rPr>
-              <w:instrText xml:space="preserve"> PAGEREF _Toc227105619 \h </w:instrText>
+              <w:instrText xml:space="preserve"> PAGEREF _Toc227127897 \h </w:instrText>
             </w:r>
             <w:r>
               <w:rPr>
@@ -4477,7 +4477,7 @@
               <w14:ligatures w14:val="standardContextual"/>
             </w:rPr>
           </w:pPr>
-          <w:hyperlink w:anchor="_Toc227105620" w:history="1">
+          <w:hyperlink w:anchor="_Toc227127898" w:history="1">
             <w:r>
               <w:rPr>
                 <w:rStyle w:val="Hyperlink"/>
@@ -4504,7 +4504,7 @@
                 <w:noProof/>
                 <w:webHidden/>
               </w:rPr>
-              <w:instrText xml:space="preserve"> PAGEREF _Toc227105620 \h </w:instrText>
+              <w:instrText xml:space="preserve"> PAGEREF _Toc227127898 \h </w:instrText>
             </w:r>
             <w:r>
               <w:rPr>
@@ -4549,7 +4549,7 @@
               <w14:ligatures w14:val="standardContextual"/>
             </w:rPr>
           </w:pPr>
-          <w:hyperlink w:anchor="_Toc227105621" w:history="1">
+          <w:hyperlink w:anchor="_Toc227127899" w:history="1">
             <w:r>
               <w:rPr>
                 <w:rStyle w:val="Hyperlink"/>
@@ -4576,7 +4576,7 @@
                 <w:noProof/>
                 <w:webHidden/>
               </w:rPr>
-              <w:instrText xml:space="preserve"> PAGEREF _Toc227105621 \h </w:instrText>
+              <w:instrText xml:space="preserve"> PAGEREF _Toc227127899 \h </w:instrText>
             </w:r>
             <w:r>
               <w:rPr>
@@ -4621,7 +4621,7 @@
               <w14:ligatures w14:val="standardContextual"/>
             </w:rPr>
           </w:pPr>
-          <w:hyperlink w:anchor="_Toc227105622" w:history="1">
+          <w:hyperlink w:anchor="_Toc227127900" w:history="1">
             <w:r>
               <w:rPr>
                 <w:rStyle w:val="Hyperlink"/>
@@ -4648,7 +4648,7 @@
                 <w:noProof/>
                 <w:webHidden/>
               </w:rPr>
-              <w:instrText xml:space="preserve"> PAGEREF _Toc227105622 \h </w:instrText>
+              <w:instrText xml:space="preserve"> PAGEREF _Toc227127900 \h </w:instrText>
             </w:r>
             <w:r>
               <w:rPr>
@@ -4693,7 +4693,7 @@
               <w14:ligatures w14:val="standardContextual"/>
             </w:rPr>
           </w:pPr>
-          <w:hyperlink w:anchor="_Toc227105623" w:history="1">
+          <w:hyperlink w:anchor="_Toc227127901" w:history="1">
             <w:r>
               <w:rPr>
                 <w:rStyle w:val="Hyperlink"/>
@@ -4720,7 +4720,7 @@
                 <w:noProof/>
                 <w:webHidden/>
               </w:rPr>
-              <w:instrText xml:space="preserve"> PAGEREF _Toc227105623 \h </w:instrText>
+              <w:instrText xml:space="preserve"> PAGEREF _Toc227127901 \h </w:instrText>
             </w:r>
             <w:r>
               <w:rPr>
@@ -4765,7 +4765,7 @@
               <w14:ligatures w14:val="standardContextual"/>
             </w:rPr>
           </w:pPr>
-          <w:hyperlink w:anchor="_Toc227105624" w:history="1">
+          <w:hyperlink w:anchor="_Toc227127902" w:history="1">
             <w:r>
               <w:rPr>
                 <w:rStyle w:val="Hyperlink"/>
@@ -4792,7 +4792,7 @@
                 <w:noProof/>
                 <w:webHidden/>
               </w:rPr>
-              <w:instrText xml:space="preserve"> PAGEREF _Toc227105624 \h </w:instrText>
+              <w:instrText xml:space="preserve"> PAGEREF _Toc227127902 \h </w:instrText>
             </w:r>
             <w:r>
               <w:rPr>
@@ -4837,7 +4837,7 @@
               <w14:ligatures w14:val="standardContextual"/>
             </w:rPr>
           </w:pPr>
-          <w:hyperlink w:anchor="_Toc227105625" w:history="1">
+          <w:hyperlink w:anchor="_Toc227127903" w:history="1">
             <w:r>
               <w:rPr>
                 <w:rStyle w:val="Hyperlink"/>
@@ -4864,7 +4864,7 @@
                 <w:noProof/>
                 <w:webHidden/>
               </w:rPr>
-              <w:instrText xml:space="preserve"> PAGEREF _Toc227105625 \h </w:instrText>
+              <w:instrText xml:space="preserve"> PAGEREF _Toc227127903 \h </w:instrText>
             </w:r>
             <w:r>
               <w:rPr>
@@ -4909,7 +4909,7 @@
               <w14:ligatures w14:val="standardContextual"/>
             </w:rPr>
           </w:pPr>
-          <w:hyperlink w:anchor="_Toc227105626" w:history="1">
+          <w:hyperlink w:anchor="_Toc227127904" w:history="1">
             <w:r>
               <w:rPr>
                 <w:rStyle w:val="Hyperlink"/>
@@ -4936,7 +4936,7 @@
                 <w:noProof/>
                 <w:webHidden/>
               </w:rPr>
-              <w:instrText xml:space="preserve"> PAGEREF _Toc227105626 \h </w:instrText>
+              <w:instrText xml:space="preserve"> PAGEREF _Toc227127904 \h </w:instrText>
             </w:r>
             <w:r>
               <w:rPr>
@@ -4981,7 +4981,7 @@
               <w14:ligatures w14:val="standardContextual"/>
             </w:rPr>
           </w:pPr>
-          <w:hyperlink w:anchor="_Toc227105627" w:history="1">
+          <w:hyperlink w:anchor="_Toc227127905" w:history="1">
             <w:r>
               <w:rPr>
                 <w:rStyle w:val="Hyperlink"/>
@@ -5008,7 +5008,7 @@
                 <w:noProof/>
                 <w:webHidden/>
               </w:rPr>
-              <w:instrText xml:space="preserve"> PAGEREF _Toc227105627 \h </w:instrText>
+              <w:instrText xml:space="preserve"> PAGEREF _Toc227127905 \h </w:instrText>
             </w:r>
             <w:r>
               <w:rPr>
@@ -5053,7 +5053,7 @@
               <w14:ligatures w14:val="standardContextual"/>
             </w:rPr>
           </w:pPr>
-          <w:hyperlink w:anchor="_Toc227105628" w:history="1">
+          <w:hyperlink w:anchor="_Toc227127906" w:history="1">
             <w:r>
               <w:rPr>
                 <w:rStyle w:val="Hyperlink"/>
@@ -5080,7 +5080,7 @@
                 <w:noProof/>
                 <w:webHidden/>
               </w:rPr>
-              <w:instrText xml:space="preserve"> PAGEREF _Toc227105628 \h </w:instrText>
+              <w:instrText xml:space="preserve"> PAGEREF _Toc227127906 \h </w:instrText>
             </w:r>
             <w:r>
               <w:rPr>
@@ -5125,7 +5125,7 @@
               <w14:ligatures w14:val="standardContextual"/>
             </w:rPr>
           </w:pPr>
-          <w:hyperlink w:anchor="_Toc227105629" w:history="1">
+          <w:hyperlink w:anchor="_Toc227127907" w:history="1">
             <w:r>
               <w:rPr>
                 <w:rStyle w:val="Hyperlink"/>
@@ -5152,7 +5152,7 @@
                 <w:noProof/>
                 <w:webHidden/>
               </w:rPr>
-              <w:instrText xml:space="preserve"> PAGEREF _Toc227105629 \h </w:instrText>
+              <w:instrText xml:space="preserve"> PAGEREF _Toc227127907 \h </w:instrText>
             </w:r>
             <w:r>
               <w:rPr>
@@ -5197,7 +5197,7 @@
               <w14:ligatures w14:val="standardContextual"/>
             </w:rPr>
           </w:pPr>
-          <w:hyperlink w:anchor="_Toc227105630" w:history="1">
+          <w:hyperlink w:anchor="_Toc227127908" w:history="1">
             <w:r>
               <w:rPr>
                 <w:rStyle w:val="Hyperlink"/>
@@ -5224,7 +5224,7 @@
                 <w:noProof/>
                 <w:webHidden/>
               </w:rPr>
-              <w:instrText xml:space="preserve"> PAGEREF _Toc227105630 \h </w:instrText>
+              <w:instrText xml:space="preserve"> PAGEREF _Toc227127908 \h </w:instrText>
             </w:r>
             <w:r>
               <w:rPr>
@@ -5269,7 +5269,7 @@
               <w14:ligatures w14:val="standardContextual"/>
             </w:rPr>
           </w:pPr>
-          <w:hyperlink w:anchor="_Toc227105631" w:history="1">
+          <w:hyperlink w:anchor="_Toc227127909" w:history="1">
             <w:r>
               <w:rPr>
                 <w:rStyle w:val="Hyperlink"/>
@@ -5296,7 +5296,7 @@
                 <w:noProof/>
                 <w:webHidden/>
               </w:rPr>
-              <w:instrText xml:space="preserve"> PAGEREF _Toc227105631 \h </w:instrText>
+              <w:instrText xml:space="preserve"> PAGEREF _Toc227127909 \h </w:instrText>
             </w:r>
             <w:r>
               <w:rPr>
@@ -5341,7 +5341,7 @@
               <w14:ligatures w14:val="standardContextual"/>
             </w:rPr>
           </w:pPr>
-          <w:hyperlink w:anchor="_Toc227105632" w:history="1">
+          <w:hyperlink w:anchor="_Toc227127910" w:history="1">
             <w:r>
               <w:rPr>
                 <w:rStyle w:val="Hyperlink"/>
@@ -5368,7 +5368,7 @@
                 <w:noProof/>
                 <w:webHidden/>
               </w:rPr>
-              <w:instrText xml:space="preserve"> PAGEREF _Toc227105632 \h </w:instrText>
+              <w:instrText xml:space="preserve"> PAGEREF _Toc227127910 \h </w:instrText>
             </w:r>
             <w:r>
               <w:rPr>
@@ -5413,7 +5413,7 @@
               <w14:ligatures w14:val="standardContextual"/>
             </w:rPr>
           </w:pPr>
-          <w:hyperlink w:anchor="_Toc227105633" w:history="1">
+          <w:hyperlink w:anchor="_Toc227127911" w:history="1">
             <w:r>
               <w:rPr>
                 <w:rStyle w:val="Hyperlink"/>
@@ -5440,7 +5440,7 @@
                 <w:noProof/>
                 <w:webHidden/>
               </w:rPr>
-              <w:instrText xml:space="preserve"> PAGEREF _Toc227105633 \h </w:instrText>
+              <w:instrText xml:space="preserve"> PAGEREF _Toc227127911 \h </w:instrText>
             </w:r>
             <w:r>
               <w:rPr>
@@ -5485,7 +5485,7 @@
               <w14:ligatures w14:val="standardContextual"/>
             </w:rPr>
           </w:pPr>
-          <w:hyperlink w:anchor="_Toc227105634" w:history="1">
+          <w:hyperlink w:anchor="_Toc227127912" w:history="1">
             <w:r>
               <w:rPr>
                 <w:rStyle w:val="Hyperlink"/>
@@ -5512,7 +5512,7 @@
                 <w:noProof/>
                 <w:webHidden/>
               </w:rPr>
-              <w:instrText xml:space="preserve"> PAGEREF _Toc227105634 \h </w:instrText>
+              <w:instrText xml:space="preserve"> PAGEREF _Toc227127912 \h </w:instrText>
             </w:r>
             <w:r>
               <w:rPr>
@@ -5557,7 +5557,7 @@
               <w14:ligatures w14:val="standardContextual"/>
             </w:rPr>
           </w:pPr>
-          <w:hyperlink w:anchor="_Toc227105635" w:history="1">
+          <w:hyperlink w:anchor="_Toc227127913" w:history="1">
             <w:r>
               <w:rPr>
                 <w:rStyle w:val="Hyperlink"/>
@@ -5584,7 +5584,7 @@
                 <w:noProof/>
                 <w:webHidden/>
               </w:rPr>
-              <w:instrText xml:space="preserve"> PAGEREF _Toc227105635 \h </w:instrText>
+              <w:instrText xml:space="preserve"> PAGEREF _Toc227127913 \h </w:instrText>
             </w:r>
             <w:r>
               <w:rPr>
@@ -5629,7 +5629,7 @@
               <w14:ligatures w14:val="standardContextual"/>
             </w:rPr>
           </w:pPr>
-          <w:hyperlink w:anchor="_Toc227105636" w:history="1">
+          <w:hyperlink w:anchor="_Toc227127914" w:history="1">
             <w:r>
               <w:rPr>
                 <w:rStyle w:val="Hyperlink"/>
@@ -5656,7 +5656,7 @@
                 <w:noProof/>
                 <w:webHidden/>
               </w:rPr>
-              <w:instrText xml:space="preserve"> PAGEREF _Toc227105636 \h </w:instrText>
+              <w:instrText xml:space="preserve"> PAGEREF _Toc227127914 \h </w:instrText>
             </w:r>
             <w:r>
               <w:rPr>
@@ -5701,7 +5701,7 @@
               <w14:ligatures w14:val="standardContextual"/>
             </w:rPr>
           </w:pPr>
-          <w:hyperlink w:anchor="_Toc227105637" w:history="1">
+          <w:hyperlink w:anchor="_Toc227127915" w:history="1">
             <w:r>
               <w:rPr>
                 <w:rStyle w:val="Hyperlink"/>
@@ -5728,7 +5728,7 @@
                 <w:noProof/>
                 <w:webHidden/>
               </w:rPr>
-              <w:instrText xml:space="preserve"> PAGEREF _Toc227105637 \h </w:instrText>
+              <w:instrText xml:space="preserve"> PAGEREF _Toc227127915 \h </w:instrText>
             </w:r>
             <w:r>
               <w:rPr>
@@ -5773,7 +5773,7 @@
               <w14:ligatures w14:val="standardContextual"/>
             </w:rPr>
           </w:pPr>
-          <w:hyperlink w:anchor="_Toc227105638" w:history="1">
+          <w:hyperlink w:anchor="_Toc227127916" w:history="1">
             <w:r>
               <w:rPr>
                 <w:rStyle w:val="Hyperlink"/>
@@ -5800,7 +5800,7 @@
                 <w:noProof/>
                 <w:webHidden/>
               </w:rPr>
-              <w:instrText xml:space="preserve"> PAGEREF _Toc227105638 \h </w:instrText>
+              <w:instrText xml:space="preserve"> PAGEREF _Toc227127916 \h </w:instrText>
             </w:r>
             <w:r>
               <w:rPr>
@@ -5845,7 +5845,7 @@
               <w14:ligatures w14:val="standardContextual"/>
             </w:rPr>
           </w:pPr>
-          <w:hyperlink w:anchor="_Toc227105639" w:history="1">
+          <w:hyperlink w:anchor="_Toc227127917" w:history="1">
             <w:r>
               <w:rPr>
                 <w:rStyle w:val="Hyperlink"/>
@@ -5872,7 +5872,7 @@
                 <w:noProof/>
                 <w:webHidden/>
               </w:rPr>
-              <w:instrText xml:space="preserve"> PAGEREF _Toc227105639 \h </w:instrText>
+              <w:instrText xml:space="preserve"> PAGEREF _Toc227127917 \h </w:instrText>
             </w:r>
             <w:r>
               <w:rPr>
@@ -5917,7 +5917,7 @@
               <w14:ligatures w14:val="standardContextual"/>
             </w:rPr>
           </w:pPr>
-          <w:hyperlink w:anchor="_Toc227105640" w:history="1">
+          <w:hyperlink w:anchor="_Toc227127918" w:history="1">
             <w:r>
               <w:rPr>
                 <w:rStyle w:val="Hyperlink"/>
@@ -5944,7 +5944,7 @@
                 <w:noProof/>
                 <w:webHidden/>
               </w:rPr>
-              <w:instrText xml:space="preserve"> PAGEREF _Toc227105640 \h </w:instrText>
+              <w:instrText xml:space="preserve"> PAGEREF _Toc227127918 \h </w:instrText>
             </w:r>
             <w:r>
               <w:rPr>
@@ -5989,7 +5989,7 @@
               <w14:ligatures w14:val="standardContextual"/>
             </w:rPr>
           </w:pPr>
-          <w:hyperlink w:anchor="_Toc227105641" w:history="1">
+          <w:hyperlink w:anchor="_Toc227127919" w:history="1">
             <w:r>
               <w:rPr>
                 <w:rStyle w:val="Hyperlink"/>
@@ -6016,7 +6016,7 @@
                 <w:noProof/>
                 <w:webHidden/>
               </w:rPr>
-              <w:instrText xml:space="preserve"> PAGEREF _Toc227105641 \h </w:instrText>
+              <w:instrText xml:space="preserve"> PAGEREF _Toc227127919 \h </w:instrText>
             </w:r>
             <w:r>
               <w:rPr>
@@ -6061,7 +6061,7 @@
               <w14:ligatures w14:val="standardContextual"/>
             </w:rPr>
           </w:pPr>
-          <w:hyperlink w:anchor="_Toc227105642" w:history="1">
+          <w:hyperlink w:anchor="_Toc227127920" w:history="1">
             <w:r>
               <w:rPr>
                 <w:rStyle w:val="Hyperlink"/>
@@ -6088,7 +6088,7 @@
                 <w:noProof/>
                 <w:webHidden/>
               </w:rPr>
-              <w:instrText xml:space="preserve"> PAGEREF _Toc227105642 \h </w:instrText>
+              <w:instrText xml:space="preserve"> PAGEREF _Toc227127920 \h </w:instrText>
             </w:r>
             <w:r>
               <w:rPr>
@@ -6133,7 +6133,7 @@
               <w14:ligatures w14:val="standardContextual"/>
             </w:rPr>
           </w:pPr>
-          <w:hyperlink w:anchor="_Toc227105643" w:history="1">
+          <w:hyperlink w:anchor="_Toc227127921" w:history="1">
             <w:r>
               <w:rPr>
                 <w:rStyle w:val="Hyperlink"/>
@@ -6160,7 +6160,7 @@
                 <w:noProof/>
                 <w:webHidden/>
               </w:rPr>
-              <w:instrText xml:space="preserve"> PAGEREF _Toc227105643 \h </w:instrText>
+              <w:instrText xml:space="preserve"> PAGEREF _Toc227127921 \h </w:instrText>
             </w:r>
             <w:r>
               <w:rPr>
@@ -6205,7 +6205,7 @@
               <w14:ligatures w14:val="standardContextual"/>
             </w:rPr>
           </w:pPr>
-          <w:hyperlink w:anchor="_Toc227105644" w:history="1">
+          <w:hyperlink w:anchor="_Toc227127922" w:history="1">
             <w:r>
               <w:rPr>
                 <w:rStyle w:val="Hyperlink"/>
@@ -6232,7 +6232,7 @@
                 <w:noProof/>
                 <w:webHidden/>
               </w:rPr>
-              <w:instrText xml:space="preserve"> PAGEREF _Toc227105644 \h </w:instrText>
+              <w:instrText xml:space="preserve"> PAGEREF _Toc227127922 \h </w:instrText>
             </w:r>
             <w:r>
               <w:rPr>
@@ -6277,7 +6277,7 @@
               <w14:ligatures w14:val="standardContextual"/>
             </w:rPr>
           </w:pPr>
-          <w:hyperlink w:anchor="_Toc227105645" w:history="1">
+          <w:hyperlink w:anchor="_Toc227127923" w:history="1">
             <w:r>
               <w:rPr>
                 <w:rStyle w:val="Hyperlink"/>
@@ -6304,7 +6304,7 @@
                 <w:noProof/>
                 <w:webHidden/>
               </w:rPr>
-              <w:instrText xml:space="preserve"> PAGEREF _Toc227105645 \h </w:instrText>
+              <w:instrText xml:space="preserve"> PAGEREF _Toc227127923 \h </w:instrText>
             </w:r>
             <w:r>
               <w:rPr>
@@ -6349,7 +6349,7 @@
               <w14:ligatures w14:val="standardContextual"/>
             </w:rPr>
           </w:pPr>
-          <w:hyperlink w:anchor="_Toc227105646" w:history="1">
+          <w:hyperlink w:anchor="_Toc227127924" w:history="1">
             <w:r>
               <w:rPr>
                 <w:rStyle w:val="Hyperlink"/>
@@ -6376,7 +6376,7 @@
                 <w:noProof/>
                 <w:webHidden/>
               </w:rPr>
-              <w:instrText xml:space="preserve"> PAGEREF _Toc227105646 \h </w:instrText>
+              <w:instrText xml:space="preserve"> PAGEREF _Toc227127924 \h </w:instrText>
             </w:r>
             <w:r>
               <w:rPr>
@@ -6421,12 +6421,516 @@
               <w14:ligatures w14:val="standardContextual"/>
             </w:rPr>
           </w:pPr>
-          <w:hyperlink w:anchor="_Toc227105647" w:history="1">
+          <w:hyperlink w:anchor="_Toc227127925" w:history="1">
             <w:r>
               <w:rPr>
                 <w:rStyle w:val="Hyperlink"/>
                 <w:noProof/>
               </w:rPr>
+              <w:t>Chapter 16: MCP Servers for GitHub Copilot</w:t>
+            </w:r>
+            <w:r>
+              <w:rPr>
+                <w:noProof/>
+                <w:webHidden/>
+              </w:rPr>
+              <w:tab/>
+            </w:r>
+            <w:r>
+              <w:rPr>
+                <w:noProof/>
+                <w:webHidden/>
+              </w:rPr>
+              <w:fldChar w:fldCharType="begin"/>
+            </w:r>
+            <w:r>
+              <w:rPr>
+                <w:noProof/>
+                <w:webHidden/>
+              </w:rPr>
+              <w:instrText xml:space="preserve"> PAGEREF _Toc227127925 \h </w:instrText>
+            </w:r>
+            <w:r>
+              <w:rPr>
+                <w:noProof/>
+                <w:webHidden/>
+              </w:rPr>
+            </w:r>
+            <w:r>
+              <w:rPr>
+                <w:noProof/>
+                <w:webHidden/>
+              </w:rPr>
+              <w:fldChar w:fldCharType="separate"/>
+            </w:r>
+            <w:r>
+              <w:rPr>
+                <w:noProof/>
+                <w:webHidden/>
+              </w:rPr>
+              <w:t>46</w:t>
+            </w:r>
+            <w:r>
+              <w:rPr>
+                <w:noProof/>
+                <w:webHidden/>
+              </w:rPr>
+              <w:fldChar w:fldCharType="end"/>
+            </w:r>
+          </w:hyperlink>
+        </w:p>
+        <w:p>
+          <w:pPr>
+            <w:pStyle w:val="TOC2"/>
+            <w:tabs>
+              <w:tab w:val="right" w:leader="dot" w:pos="8630"/>
+            </w:tabs>
+            <w:rPr>
+              <w:noProof/>
+              <w:kern w:val="2"/>
+              <w:sz w:val="24"/>
+              <w:szCs w:val="24"/>
+              <w14:ligatures w14:val="standardContextual"/>
+            </w:rPr>
+          </w:pPr>
+          <w:hyperlink w:anchor="_Toc227127926" w:history="1">
+            <w:r>
+              <w:rPr>
+                <w:rStyle w:val="Hyperlink"/>
+                <w:noProof/>
+              </w:rPr>
+              <w:t>16.1 What is MCP?</w:t>
+            </w:r>
+            <w:r>
+              <w:rPr>
+                <w:noProof/>
+                <w:webHidden/>
+              </w:rPr>
+              <w:tab/>
+            </w:r>
+            <w:r>
+              <w:rPr>
+                <w:noProof/>
+                <w:webHidden/>
+              </w:rPr>
+              <w:fldChar w:fldCharType="begin"/>
+            </w:r>
+            <w:r>
+              <w:rPr>
+                <w:noProof/>
+                <w:webHidden/>
+              </w:rPr>
+              <w:instrText xml:space="preserve"> PAGEREF _Toc227127926 \h </w:instrText>
+            </w:r>
+            <w:r>
+              <w:rPr>
+                <w:noProof/>
+                <w:webHidden/>
+              </w:rPr>
+            </w:r>
+            <w:r>
+              <w:rPr>
+                <w:noProof/>
+                <w:webHidden/>
+              </w:rPr>
+              <w:fldChar w:fldCharType="separate"/>
+            </w:r>
+            <w:r>
+              <w:rPr>
+                <w:noProof/>
+                <w:webHidden/>
+              </w:rPr>
+              <w:t>46</w:t>
+            </w:r>
+            <w:r>
+              <w:rPr>
+                <w:noProof/>
+                <w:webHidden/>
+              </w:rPr>
+              <w:fldChar w:fldCharType="end"/>
+            </w:r>
+          </w:hyperlink>
+        </w:p>
+        <w:p>
+          <w:pPr>
+            <w:pStyle w:val="TOC2"/>
+            <w:tabs>
+              <w:tab w:val="right" w:leader="dot" w:pos="8630"/>
+            </w:tabs>
+            <w:rPr>
+              <w:noProof/>
+              <w:kern w:val="2"/>
+              <w:sz w:val="24"/>
+              <w:szCs w:val="24"/>
+              <w14:ligatures w14:val="standardContextual"/>
+            </w:rPr>
+          </w:pPr>
+          <w:hyperlink w:anchor="_Toc227127927" w:history="1">
+            <w:r>
+              <w:rPr>
+                <w:rStyle w:val="Hyperlink"/>
+                <w:noProof/>
+              </w:rPr>
+              <w:t>16.2 Configuration File Location</w:t>
+            </w:r>
+            <w:r>
+              <w:rPr>
+                <w:noProof/>
+                <w:webHidden/>
+              </w:rPr>
+              <w:tab/>
+            </w:r>
+            <w:r>
+              <w:rPr>
+                <w:noProof/>
+                <w:webHidden/>
+              </w:rPr>
+              <w:fldChar w:fldCharType="begin"/>
+            </w:r>
+            <w:r>
+              <w:rPr>
+                <w:noProof/>
+                <w:webHidden/>
+              </w:rPr>
+              <w:instrText xml:space="preserve"> PAGEREF _Toc227127927 \h </w:instrText>
+            </w:r>
+            <w:r>
+              <w:rPr>
+                <w:noProof/>
+                <w:webHidden/>
+              </w:rPr>
+            </w:r>
+            <w:r>
+              <w:rPr>
+                <w:noProof/>
+                <w:webHidden/>
+              </w:rPr>
+              <w:fldChar w:fldCharType="separate"/>
+            </w:r>
+            <w:r>
+              <w:rPr>
+                <w:noProof/>
+                <w:webHidden/>
+              </w:rPr>
+              <w:t>46</w:t>
+            </w:r>
+            <w:r>
+              <w:rPr>
+                <w:noProof/>
+                <w:webHidden/>
+              </w:rPr>
+              <w:fldChar w:fldCharType="end"/>
+            </w:r>
+          </w:hyperlink>
+        </w:p>
+        <w:p>
+          <w:pPr>
+            <w:pStyle w:val="TOC2"/>
+            <w:tabs>
+              <w:tab w:val="right" w:leader="dot" w:pos="8630"/>
+            </w:tabs>
+            <w:rPr>
+              <w:noProof/>
+              <w:kern w:val="2"/>
+              <w:sz w:val="24"/>
+              <w:szCs w:val="24"/>
+              <w14:ligatures w14:val="standardContextual"/>
+            </w:rPr>
+          </w:pPr>
+          <w:hyperlink w:anchor="_Toc227127928" w:history="1">
+            <w:r>
+              <w:rPr>
+                <w:rStyle w:val="Hyperlink"/>
+                <w:noProof/>
+              </w:rPr>
+              <w:t>16.3 The mcp.json File — Annotated</w:t>
+            </w:r>
+            <w:r>
+              <w:rPr>
+                <w:noProof/>
+                <w:webHidden/>
+              </w:rPr>
+              <w:tab/>
+            </w:r>
+            <w:r>
+              <w:rPr>
+                <w:noProof/>
+                <w:webHidden/>
+              </w:rPr>
+              <w:fldChar w:fldCharType="begin"/>
+            </w:r>
+            <w:r>
+              <w:rPr>
+                <w:noProof/>
+                <w:webHidden/>
+              </w:rPr>
+              <w:instrText xml:space="preserve"> PAGEREF _Toc227127928 \h </w:instrText>
+            </w:r>
+            <w:r>
+              <w:rPr>
+                <w:noProof/>
+                <w:webHidden/>
+              </w:rPr>
+            </w:r>
+            <w:r>
+              <w:rPr>
+                <w:noProof/>
+                <w:webHidden/>
+              </w:rPr>
+              <w:fldChar w:fldCharType="separate"/>
+            </w:r>
+            <w:r>
+              <w:rPr>
+                <w:noProof/>
+                <w:webHidden/>
+              </w:rPr>
+              <w:t>46</w:t>
+            </w:r>
+            <w:r>
+              <w:rPr>
+                <w:noProof/>
+                <w:webHidden/>
+              </w:rPr>
+              <w:fldChar w:fldCharType="end"/>
+            </w:r>
+          </w:hyperlink>
+        </w:p>
+        <w:p>
+          <w:pPr>
+            <w:pStyle w:val="TOC2"/>
+            <w:tabs>
+              <w:tab w:val="right" w:leader="dot" w:pos="8630"/>
+            </w:tabs>
+            <w:rPr>
+              <w:noProof/>
+              <w:kern w:val="2"/>
+              <w:sz w:val="24"/>
+              <w:szCs w:val="24"/>
+              <w14:ligatures w14:val="standardContextual"/>
+            </w:rPr>
+          </w:pPr>
+          <w:hyperlink w:anchor="_Toc227127929" w:history="1">
+            <w:r>
+              <w:rPr>
+                <w:rStyle w:val="Hyperlink"/>
+                <w:noProof/>
+              </w:rPr>
+              <w:t>16.4 MCP Server Reference</w:t>
+            </w:r>
+            <w:r>
+              <w:rPr>
+                <w:noProof/>
+                <w:webHidden/>
+              </w:rPr>
+              <w:tab/>
+            </w:r>
+            <w:r>
+              <w:rPr>
+                <w:noProof/>
+                <w:webHidden/>
+              </w:rPr>
+              <w:fldChar w:fldCharType="begin"/>
+            </w:r>
+            <w:r>
+              <w:rPr>
+                <w:noProof/>
+                <w:webHidden/>
+              </w:rPr>
+              <w:instrText xml:space="preserve"> PAGEREF _Toc227127929 \h </w:instrText>
+            </w:r>
+            <w:r>
+              <w:rPr>
+                <w:noProof/>
+                <w:webHidden/>
+              </w:rPr>
+            </w:r>
+            <w:r>
+              <w:rPr>
+                <w:noProof/>
+                <w:webHidden/>
+              </w:rPr>
+              <w:fldChar w:fldCharType="separate"/>
+            </w:r>
+            <w:r>
+              <w:rPr>
+                <w:noProof/>
+                <w:webHidden/>
+              </w:rPr>
+              <w:t>47</w:t>
+            </w:r>
+            <w:r>
+              <w:rPr>
+                <w:noProof/>
+                <w:webHidden/>
+              </w:rPr>
+              <w:fldChar w:fldCharType="end"/>
+            </w:r>
+          </w:hyperlink>
+        </w:p>
+        <w:p>
+          <w:pPr>
+            <w:pStyle w:val="TOC2"/>
+            <w:tabs>
+              <w:tab w:val="right" w:leader="dot" w:pos="8630"/>
+            </w:tabs>
+            <w:rPr>
+              <w:noProof/>
+              <w:kern w:val="2"/>
+              <w:sz w:val="24"/>
+              <w:szCs w:val="24"/>
+              <w14:ligatures w14:val="standardContextual"/>
+            </w:rPr>
+          </w:pPr>
+          <w:hyperlink w:anchor="_Toc227127930" w:history="1">
+            <w:r>
+              <w:rPr>
+                <w:rStyle w:val="Hyperlink"/>
+                <w:noProof/>
+              </w:rPr>
+              <w:t>16.5 Prerequisites — Installing MCP Server Dependencies</w:t>
+            </w:r>
+            <w:r>
+              <w:rPr>
+                <w:noProof/>
+                <w:webHidden/>
+              </w:rPr>
+              <w:tab/>
+            </w:r>
+            <w:r>
+              <w:rPr>
+                <w:noProof/>
+                <w:webHidden/>
+              </w:rPr>
+              <w:fldChar w:fldCharType="begin"/>
+            </w:r>
+            <w:r>
+              <w:rPr>
+                <w:noProof/>
+                <w:webHidden/>
+              </w:rPr>
+              <w:instrText xml:space="preserve"> PAGEREF _Toc227127930 \h </w:instrText>
+            </w:r>
+            <w:r>
+              <w:rPr>
+                <w:noProof/>
+                <w:webHidden/>
+              </w:rPr>
+            </w:r>
+            <w:r>
+              <w:rPr>
+                <w:noProof/>
+                <w:webHidden/>
+              </w:rPr>
+              <w:fldChar w:fldCharType="separate"/>
+            </w:r>
+            <w:r>
+              <w:rPr>
+                <w:noProof/>
+                <w:webHidden/>
+              </w:rPr>
+              <w:t>47</w:t>
+            </w:r>
+            <w:r>
+              <w:rPr>
+                <w:noProof/>
+                <w:webHidden/>
+              </w:rPr>
+              <w:fldChar w:fldCharType="end"/>
+            </w:r>
+          </w:hyperlink>
+        </w:p>
+        <w:p>
+          <w:pPr>
+            <w:pStyle w:val="TOC2"/>
+            <w:tabs>
+              <w:tab w:val="right" w:leader="dot" w:pos="8630"/>
+            </w:tabs>
+            <w:rPr>
+              <w:noProof/>
+              <w:kern w:val="2"/>
+              <w:sz w:val="24"/>
+              <w:szCs w:val="24"/>
+              <w14:ligatures w14:val="standardContextual"/>
+            </w:rPr>
+          </w:pPr>
+          <w:hyperlink w:anchor="_Toc227127931" w:history="1">
+            <w:r>
+              <w:rPr>
+                <w:rStyle w:val="Hyperlink"/>
+                <w:noProof/>
+              </w:rPr>
+              <w:t>16.6 How Each MCP Server Relates to This Framework</w:t>
+            </w:r>
+            <w:r>
+              <w:rPr>
+                <w:noProof/>
+                <w:webHidden/>
+              </w:rPr>
+              <w:tab/>
+            </w:r>
+            <w:r>
+              <w:rPr>
+                <w:noProof/>
+                <w:webHidden/>
+              </w:rPr>
+              <w:fldChar w:fldCharType="begin"/>
+            </w:r>
+            <w:r>
+              <w:rPr>
+                <w:noProof/>
+                <w:webHidden/>
+              </w:rPr>
+              <w:instrText xml:space="preserve"> PAGEREF _Toc227127931 \h </w:instrText>
+            </w:r>
+            <w:r>
+              <w:rPr>
+                <w:noProof/>
+                <w:webHidden/>
+              </w:rPr>
+            </w:r>
+            <w:r>
+              <w:rPr>
+                <w:noProof/>
+                <w:webHidden/>
+              </w:rPr>
+              <w:fldChar w:fldCharType="separate"/>
+            </w:r>
+            <w:r>
+              <w:rPr>
+                <w:noProof/>
+                <w:webHidden/>
+              </w:rPr>
+              <w:t>47</w:t>
+            </w:r>
+            <w:r>
+              <w:rPr>
+                <w:noProof/>
+                <w:webHidden/>
+              </w:rPr>
+              <w:fldChar w:fldCharType="end"/>
+            </w:r>
+          </w:hyperlink>
+        </w:p>
+        <w:p>
+          <w:pPr>
+            <w:pStyle w:val="TOC1"/>
+            <w:tabs>
+              <w:tab w:val="right" w:leader="dot" w:pos="8630"/>
+            </w:tabs>
+            <w:rPr>
+              <w:noProof/>
+              <w:kern w:val="2"/>
+              <w:sz w:val="24"/>
+              <w:szCs w:val="24"/>
+              <w14:ligatures w14:val="standardContextual"/>
+            </w:rPr>
+          </w:pPr>
+          <w:hyperlink w:anchor="_Toc227127932" w:history="1">
+            <w:r>
+              <w:rPr>
+                <w:rStyle w:val="Hyperlink"/>
+                <w:noProof/>
+              </w:rPr>
               <w:t>Closing Words</w:t>
             </w:r>
             <w:r>
@@ -6448,7 +6952,7 @@
                 <w:noProof/>
                 <w:webHidden/>
               </w:rPr>
-              <w:instrText xml:space="preserve"> PAGEREF _Toc227105647 \h </w:instrText>
+              <w:instrText xml:space="preserve"> PAGEREF _Toc227127932 \h </w:instrText>
             </w:r>
             <w:r>
               <w:rPr>
@@ -6468,7 +6972,7 @@
                 <w:noProof/>
                 <w:webHidden/>
               </w:rPr>
-              <w:t>46</w:t>
+              <w:t>48</w:t>
             </w:r>
             <w:r>
               <w:rPr>
@@ -6504,7 +7008,7 @@
         </w:pBdr>
       </w:pPr>
       <w:bookmarkStart w:id="2" w:name="_Toc227102999"/>
-      <w:bookmarkStart w:id="3" w:name="_Toc227105561"/>
+      <w:bookmarkStart w:id="3" w:name="_Toc227127839"/>
       <w:r>
         <w:rPr>
           <w:sz w:val="36"/>
@@ -6537,7 +7041,7 @@
         <w:pStyle w:val="Heading2"/>
       </w:pPr>
       <w:bookmarkStart w:id="4" w:name="_Toc227103000"/>
-      <w:bookmarkStart w:id="5" w:name="_Toc227105562"/>
+      <w:bookmarkStart w:id="5" w:name="_Toc227127840"/>
       <w:r>
         <w:t>1.1 What is This Framework?</w:t>
       </w:r>
@@ -6709,7 +7213,7 @@
         <w:pStyle w:val="Heading2"/>
       </w:pPr>
       <w:bookmarkStart w:id="6" w:name="_Toc227103001"/>
-      <w:bookmarkStart w:id="7" w:name="_Toc227105563"/>
+      <w:bookmarkStart w:id="7" w:name="_Toc227127841"/>
       <w:r>
         <w:t>1.2 Key Capabilities</w:t>
       </w:r>
@@ -6870,7 +7374,7 @@
         <w:pStyle w:val="Heading2"/>
       </w:pPr>
       <w:bookmarkStart w:id="8" w:name="_Toc227103002"/>
-      <w:bookmarkStart w:id="9" w:name="_Toc227105564"/>
+      <w:bookmarkStart w:id="9" w:name="_Toc227127842"/>
       <w:r>
         <w:t>1.3 Technology Stack</w:t>
       </w:r>
@@ -7440,7 +7944,7 @@
         </w:pBdr>
       </w:pPr>
       <w:bookmarkStart w:id="10" w:name="_Toc227103003"/>
-      <w:bookmarkStart w:id="11" w:name="_Toc227105565"/>
+      <w:bookmarkStart w:id="11" w:name="_Toc227127843"/>
       <w:r>
         <w:rPr>
           <w:sz w:val="36"/>
@@ -7468,7 +7972,7 @@
         <w:pStyle w:val="Heading2"/>
       </w:pPr>
       <w:bookmarkStart w:id="12" w:name="_Toc227103004"/>
-      <w:bookmarkStart w:id="13" w:name="_Toc227105566"/>
+      <w:bookmarkStart w:id="13" w:name="_Toc227127844"/>
       <w:r>
         <w:t>2.1 What You Need Before You Start</w:t>
       </w:r>
@@ -7819,7 +8323,7 @@
         <w:pStyle w:val="Heading2"/>
       </w:pPr>
       <w:bookmarkStart w:id="14" w:name="_Toc227103005"/>
-      <w:bookmarkStart w:id="15" w:name="_Toc227105567"/>
+      <w:bookmarkStart w:id="15" w:name="_Toc227127845"/>
       <w:r>
         <w:t>2.2 Step-by-Step Installation</w:t>
       </w:r>
@@ -7831,7 +8335,7 @@
         <w:pStyle w:val="Heading3"/>
       </w:pPr>
       <w:bookmarkStart w:id="16" w:name="_Toc227103006"/>
-      <w:bookmarkStart w:id="17" w:name="_Toc227105568"/>
+      <w:bookmarkStart w:id="17" w:name="_Toc227127846"/>
       <w:r>
         <w:t>Step 1 — Clone the Repository</w:t>
       </w:r>
@@ -7848,7 +8352,7 @@
         <w:pStyle w:val="Heading3"/>
       </w:pPr>
       <w:bookmarkStart w:id="18" w:name="_Toc227103007"/>
-      <w:bookmarkStart w:id="19" w:name="_Toc227105569"/>
+      <w:bookmarkStart w:id="19" w:name="_Toc227127847"/>
       <w:r>
         <w:t>Step 2 — Create a Virtual Environment</w:t>
       </w:r>
@@ -7915,7 +8419,7 @@
         <w:pStyle w:val="Heading3"/>
       </w:pPr>
       <w:bookmarkStart w:id="20" w:name="_Toc227103008"/>
-      <w:bookmarkStart w:id="21" w:name="_Toc227105570"/>
+      <w:bookmarkStart w:id="21" w:name="_Toc227127848"/>
       <w:r>
         <w:t>Step 3 — Install All Dependencies</w:t>
       </w:r>
@@ -7946,7 +8450,7 @@
         <w:pStyle w:val="Heading3"/>
       </w:pPr>
       <w:bookmarkStart w:id="22" w:name="_Toc227103009"/>
-      <w:bookmarkStart w:id="23" w:name="_Toc227105571"/>
+      <w:bookmarkStart w:id="23" w:name="_Toc227127849"/>
       <w:r>
         <w:lastRenderedPageBreak/>
         <w:t>Step 4 — Verify the Installation</w:t>
@@ -7976,7 +8480,7 @@
         <w:pStyle w:val="Heading2"/>
       </w:pPr>
       <w:bookmarkStart w:id="24" w:name="_Toc227103010"/>
-      <w:bookmarkStart w:id="25" w:name="_Toc227105572"/>
+      <w:bookmarkStart w:id="25" w:name="_Toc227127850"/>
       <w:r>
         <w:t>2.3 Environment Variables Reference</w:t>
       </w:r>
@@ -8361,7 +8865,7 @@
         </w:pBdr>
       </w:pPr>
       <w:bookmarkStart w:id="26" w:name="_Toc227103011"/>
-      <w:bookmarkStart w:id="27" w:name="_Toc227105573"/>
+      <w:bookmarkStart w:id="27" w:name="_Toc227127851"/>
       <w:r>
         <w:rPr>
           <w:sz w:val="36"/>
@@ -8389,7 +8893,7 @@
         <w:pStyle w:val="Heading2"/>
       </w:pPr>
       <w:bookmarkStart w:id="28" w:name="_Toc227103012"/>
-      <w:bookmarkStart w:id="29" w:name="_Toc227105574"/>
+      <w:bookmarkStart w:id="29" w:name="_Toc227127852"/>
       <w:r>
         <w:t>3.1 Folder Layout</w:t>
       </w:r>
@@ -8870,7 +9374,7 @@
         <w:pStyle w:val="Heading2"/>
       </w:pPr>
       <w:bookmarkStart w:id="30" w:name="_Toc227103013"/>
-      <w:bookmarkStart w:id="31" w:name="_Toc227105575"/>
+      <w:bookmarkStart w:id="31" w:name="_Toc227127853"/>
       <w:r>
         <w:t>3.2 The Page Object Model (POM) Pattern</w:t>
       </w:r>
@@ -8943,7 +9447,7 @@
         <w:pStyle w:val="Heading2"/>
       </w:pPr>
       <w:bookmarkStart w:id="32" w:name="_Toc227103014"/>
-      <w:bookmarkStart w:id="33" w:name="_Toc227105576"/>
+      <w:bookmarkStart w:id="33" w:name="_Toc227127854"/>
       <w:r>
         <w:t>3.3 Fixture Chain — How Tests Wire Together</w:t>
       </w:r>
@@ -9228,7 +9732,7 @@
         </w:pBdr>
       </w:pPr>
       <w:bookmarkStart w:id="34" w:name="_Toc227103015"/>
-      <w:bookmarkStart w:id="35" w:name="_Toc227105577"/>
+      <w:bookmarkStart w:id="35" w:name="_Toc227127855"/>
       <w:r>
         <w:rPr>
           <w:sz w:val="36"/>
@@ -9244,7 +9748,7 @@
         <w:pStyle w:val="Heading2"/>
       </w:pPr>
       <w:bookmarkStart w:id="36" w:name="_Toc227103016"/>
-      <w:bookmarkStart w:id="37" w:name="_Toc227105578"/>
+      <w:bookmarkStart w:id="37" w:name="_Toc227127856"/>
       <w:r>
         <w:t>4.1 How ConfigParser Works</w:t>
       </w:r>
@@ -9348,7 +9852,7 @@
         <w:pStyle w:val="Heading2"/>
       </w:pPr>
       <w:bookmarkStart w:id="38" w:name="_Toc227103017"/>
-      <w:bookmarkStart w:id="39" w:name="_Toc227105579"/>
+      <w:bookmarkStart w:id="39" w:name="_Toc227127857"/>
       <w:r>
         <w:t>4.2 YAML Config Structure</w:t>
       </w:r>
@@ -9489,7 +9993,7 @@
         <w:pStyle w:val="Heading2"/>
       </w:pPr>
       <w:bookmarkStart w:id="40" w:name="_Toc227103018"/>
-      <w:bookmarkStart w:id="41" w:name="_Toc227105580"/>
+      <w:bookmarkStart w:id="41" w:name="_Toc227127858"/>
       <w:r>
         <w:t>4.3 Adding a New Config File</w:t>
       </w:r>
@@ -9546,7 +10050,7 @@
         </w:pBdr>
       </w:pPr>
       <w:bookmarkStart w:id="42" w:name="_Toc227103019"/>
-      <w:bookmarkStart w:id="43" w:name="_Toc227105581"/>
+      <w:bookmarkStart w:id="43" w:name="_Toc227127859"/>
       <w:r>
         <w:rPr>
           <w:sz w:val="36"/>
@@ -9562,7 +10066,7 @@
         <w:pStyle w:val="Heading2"/>
       </w:pPr>
       <w:bookmarkStart w:id="44" w:name="_Toc227103020"/>
-      <w:bookmarkStart w:id="45" w:name="_Toc227105582"/>
+      <w:bookmarkStart w:id="45" w:name="_Toc227127860"/>
       <w:r>
         <w:t>5.1 What is pytest?</w:t>
       </w:r>
@@ -9579,7 +10083,7 @@
         <w:pStyle w:val="Heading2"/>
       </w:pPr>
       <w:bookmarkStart w:id="46" w:name="_Toc227103021"/>
-      <w:bookmarkStart w:id="47" w:name="_Toc227105583"/>
+      <w:bookmarkStart w:id="47" w:name="_Toc227127861"/>
       <w:r>
         <w:t>5.2 Running Tests — Command Reference</w:t>
       </w:r>
@@ -9970,7 +10474,7 @@
         <w:pStyle w:val="Heading2"/>
       </w:pPr>
       <w:bookmarkStart w:id="48" w:name="_Toc227103022"/>
-      <w:bookmarkStart w:id="49" w:name="_Toc227105584"/>
+      <w:bookmarkStart w:id="49" w:name="_Toc227127862"/>
       <w:r>
         <w:t>5.3 Pytest Markers</w:t>
       </w:r>
@@ -10207,7 +10711,7 @@
         <w:pStyle w:val="Heading2"/>
       </w:pPr>
       <w:bookmarkStart w:id="50" w:name="_Toc227103023"/>
-      <w:bookmarkStart w:id="51" w:name="_Toc227105585"/>
+      <w:bookmarkStart w:id="51" w:name="_Toc227127863"/>
       <w:r>
         <w:t>5.4 Pytest Fixtures Explained</w:t>
       </w:r>
@@ -10476,7 +10980,7 @@
         </w:pBdr>
       </w:pPr>
       <w:bookmarkStart w:id="52" w:name="_Toc227103024"/>
-      <w:bookmarkStart w:id="53" w:name="_Toc227105586"/>
+      <w:bookmarkStart w:id="53" w:name="_Toc227127864"/>
       <w:r>
         <w:rPr>
           <w:sz w:val="36"/>
@@ -10492,7 +10996,7 @@
         <w:pStyle w:val="Heading2"/>
       </w:pPr>
       <w:bookmarkStart w:id="54" w:name="_Toc227103025"/>
-      <w:bookmarkStart w:id="55" w:name="_Toc227105587"/>
+      <w:bookmarkStart w:id="55" w:name="_Toc227127865"/>
       <w:r>
         <w:t>6.1 BasePage — The Foundation of All UI Tests</w:t>
       </w:r>
@@ -10988,7 +11492,7 @@
         <w:pStyle w:val="Heading2"/>
       </w:pPr>
       <w:bookmarkStart w:id="56" w:name="_Toc227103026"/>
-      <w:bookmarkStart w:id="57" w:name="_Toc227105588"/>
+      <w:bookmarkStart w:id="57" w:name="_Toc227127866"/>
       <w:r>
         <w:t>6.2 Writing a Page Object — Step by Step</w:t>
       </w:r>
@@ -11408,7 +11912,7 @@
         <w:pStyle w:val="Heading2"/>
       </w:pPr>
       <w:bookmarkStart w:id="58" w:name="_Toc227103027"/>
-      <w:bookmarkStart w:id="59" w:name="_Toc227105589"/>
+      <w:bookmarkStart w:id="59" w:name="_Toc227127867"/>
       <w:r>
         <w:t>6.3 Writing a Test Case — Full Walkthrough</w:t>
       </w:r>
@@ -11790,7 +12294,7 @@
         <w:pStyle w:val="Heading2"/>
       </w:pPr>
       <w:bookmarkStart w:id="60" w:name="_Toc227103028"/>
-      <w:bookmarkStart w:id="61" w:name="_Toc227105590"/>
+      <w:bookmarkStart w:id="61" w:name="_Toc227127868"/>
       <w:r>
         <w:t xml:space="preserve">6.4 </w:t>
       </w:r>
@@ -11821,7 +12325,7 @@
         <w:pStyle w:val="Heading2"/>
       </w:pPr>
       <w:bookmarkStart w:id="62" w:name="_Toc227103029"/>
-      <w:bookmarkStart w:id="63" w:name="_Toc227105591"/>
+      <w:bookmarkStart w:id="63" w:name="_Toc227127869"/>
       <w:r>
         <w:t>6.5 Running UI Tests</w:t>
       </w:r>
@@ -11934,7 +12438,7 @@
         </w:pBdr>
       </w:pPr>
       <w:bookmarkStart w:id="64" w:name="_Toc227103030"/>
-      <w:bookmarkStart w:id="65" w:name="_Toc227105592"/>
+      <w:bookmarkStart w:id="65" w:name="_Toc227127870"/>
       <w:r>
         <w:rPr>
           <w:sz w:val="36"/>
@@ -11950,7 +12454,7 @@
         <w:pStyle w:val="Heading2"/>
       </w:pPr>
       <w:bookmarkStart w:id="66" w:name="_Toc227103031"/>
-      <w:bookmarkStart w:id="67" w:name="_Toc227105593"/>
+      <w:bookmarkStart w:id="67" w:name="_Toc227127871"/>
       <w:r>
         <w:t>7.1 The APIClient Class</w:t>
       </w:r>
@@ -12120,7 +12624,7 @@
         <w:pStyle w:val="Heading2"/>
       </w:pPr>
       <w:bookmarkStart w:id="68" w:name="_Toc227103032"/>
-      <w:bookmarkStart w:id="69" w:name="_Toc227105594"/>
+      <w:bookmarkStart w:id="69" w:name="_Toc227127872"/>
       <w:r>
         <w:t>7.2 Writing API Tests — Example (Reqres)</w:t>
       </w:r>
@@ -12410,7 +12914,7 @@
         <w:pStyle w:val="Heading2"/>
       </w:pPr>
       <w:bookmarkStart w:id="70" w:name="_Toc227103033"/>
-      <w:bookmarkStart w:id="71" w:name="_Toc227105595"/>
+      <w:bookmarkStart w:id="71" w:name="_Toc227127873"/>
       <w:r>
         <w:t>7.3 OAuth2 Authentication (Commerce Tools)</w:t>
       </w:r>
@@ -12487,7 +12991,7 @@
         <w:pStyle w:val="Heading2"/>
       </w:pPr>
       <w:bookmarkStart w:id="72" w:name="_Toc227103034"/>
-      <w:bookmarkStart w:id="73" w:name="_Toc227105596"/>
+      <w:bookmarkStart w:id="73" w:name="_Toc227127874"/>
       <w:r>
         <w:t>7.4 Running API Tests</w:t>
       </w:r>
@@ -12547,7 +13051,7 @@
         </w:pBdr>
       </w:pPr>
       <w:bookmarkStart w:id="74" w:name="_Toc227103035"/>
-      <w:bookmarkStart w:id="75" w:name="_Toc227105597"/>
+      <w:bookmarkStart w:id="75" w:name="_Toc227127875"/>
       <w:r>
         <w:rPr>
           <w:sz w:val="36"/>
@@ -12563,7 +13067,7 @@
         <w:pStyle w:val="Heading2"/>
       </w:pPr>
       <w:bookmarkStart w:id="76" w:name="_Toc227103036"/>
-      <w:bookmarkStart w:id="77" w:name="_Toc227105598"/>
+      <w:bookmarkStart w:id="77" w:name="_Toc227127876"/>
       <w:r>
         <w:t>8.1 How Mobile Testing Works in This Framework</w:t>
       </w:r>
@@ -12580,7 +13084,7 @@
         <w:pStyle w:val="Heading2"/>
       </w:pPr>
       <w:bookmarkStart w:id="78" w:name="_Toc227103037"/>
-      <w:bookmarkStart w:id="79" w:name="_Toc227105599"/>
+      <w:bookmarkStart w:id="79" w:name="_Toc227127877"/>
       <w:r>
         <w:t>8.2 Mobile Setup Requirements</w:t>
       </w:r>
@@ -12803,7 +13307,7 @@
         <w:pStyle w:val="Heading2"/>
       </w:pPr>
       <w:bookmarkStart w:id="80" w:name="_Toc227103038"/>
-      <w:bookmarkStart w:id="81" w:name="_Toc227105600"/>
+      <w:bookmarkStart w:id="81" w:name="_Toc227127878"/>
       <w:r>
         <w:t>8.3 Running Mobile Tests</w:t>
       </w:r>
@@ -12840,7 +13344,7 @@
         </w:pBdr>
       </w:pPr>
       <w:bookmarkStart w:id="82" w:name="_Toc227103039"/>
-      <w:bookmarkStart w:id="83" w:name="_Toc227105601"/>
+      <w:bookmarkStart w:id="83" w:name="_Toc227127879"/>
       <w:r>
         <w:rPr>
           <w:sz w:val="36"/>
@@ -12868,7 +13372,7 @@
         <w:pStyle w:val="Heading2"/>
       </w:pPr>
       <w:bookmarkStart w:id="84" w:name="_Toc227103040"/>
-      <w:bookmarkStart w:id="85" w:name="_Toc227105602"/>
+      <w:bookmarkStart w:id="85" w:name="_Toc227127880"/>
       <w:r>
         <w:t>9.1 Custom Logger</w:t>
       </w:r>
@@ -13019,7 +13523,7 @@
         <w:pStyle w:val="Heading2"/>
       </w:pPr>
       <w:bookmarkStart w:id="86" w:name="_Toc227103041"/>
-      <w:bookmarkStart w:id="87" w:name="_Toc227105603"/>
+      <w:bookmarkStart w:id="87" w:name="_Toc227127881"/>
       <w:r>
         <w:t>9.2 Automatic Screenshot on Failure</w:t>
       </w:r>
@@ -13041,7 +13545,7 @@
         <w:pStyle w:val="Heading2"/>
       </w:pPr>
       <w:bookmarkStart w:id="88" w:name="_Toc227103042"/>
-      <w:bookmarkStart w:id="89" w:name="_Toc227105604"/>
+      <w:bookmarkStart w:id="89" w:name="_Toc227127882"/>
       <w:r>
         <w:t>9.3 Video Recording with ffmpeg</w:t>
       </w:r>
@@ -13155,7 +13659,7 @@
         <w:pStyle w:val="Heading2"/>
       </w:pPr>
       <w:bookmarkStart w:id="90" w:name="_Toc227103043"/>
-      <w:bookmarkStart w:id="91" w:name="_Toc227105605"/>
+      <w:bookmarkStart w:id="91" w:name="_Toc227127883"/>
       <w:r>
         <w:t>9.4 Output Folder — What Gets Created</w:t>
       </w:r>
@@ -13343,7 +13847,7 @@
         </w:pBdr>
       </w:pPr>
       <w:bookmarkStart w:id="92" w:name="_Toc227103044"/>
-      <w:bookmarkStart w:id="93" w:name="_Toc227105606"/>
+      <w:bookmarkStart w:id="93" w:name="_Toc227127884"/>
       <w:r>
         <w:rPr>
           <w:sz w:val="36"/>
@@ -13371,7 +13875,7 @@
         <w:pStyle w:val="Heading2"/>
       </w:pPr>
       <w:bookmarkStart w:id="94" w:name="_Toc227103045"/>
-      <w:bookmarkStart w:id="95" w:name="_Toc227105607"/>
+      <w:bookmarkStart w:id="95" w:name="_Toc227127885"/>
       <w:r>
         <w:t>10.1 pytest-html Report</w:t>
       </w:r>
@@ -13436,7 +13940,7 @@
         <w:pStyle w:val="Heading2"/>
       </w:pPr>
       <w:bookmarkStart w:id="96" w:name="_Toc227103046"/>
-      <w:bookmarkStart w:id="97" w:name="_Toc227105608"/>
+      <w:bookmarkStart w:id="97" w:name="_Toc227127886"/>
       <w:r>
         <w:t>10.2 Allure Report</w:t>
       </w:r>
@@ -13641,7 +14145,7 @@
         <w:pStyle w:val="Heading2"/>
       </w:pPr>
       <w:bookmarkStart w:id="98" w:name="_Toc227103047"/>
-      <w:bookmarkStart w:id="99" w:name="_Toc227105609"/>
+      <w:bookmarkStart w:id="99" w:name="_Toc227127887"/>
       <w:r>
         <w:t>10.3 Full Command — All Reporting Options Combined</w:t>
       </w:r>
@@ -13705,7 +14209,7 @@
         </w:pBdr>
       </w:pPr>
       <w:bookmarkStart w:id="100" w:name="_Toc227103048"/>
-      <w:bookmarkStart w:id="101" w:name="_Toc227105610"/>
+      <w:bookmarkStart w:id="101" w:name="_Toc227127888"/>
       <w:r>
         <w:rPr>
           <w:sz w:val="36"/>
@@ -13741,7 +14245,7 @@
         <w:pStyle w:val="Heading2"/>
       </w:pPr>
       <w:bookmarkStart w:id="102" w:name="_Toc227103049"/>
-      <w:bookmarkStart w:id="103" w:name="_Toc227105611"/>
+      <w:bookmarkStart w:id="103" w:name="_Toc227127889"/>
       <w:r>
         <w:t>11.1 Parallel Execution with pytest-xdist</w:t>
       </w:r>
@@ -13807,7 +14311,7 @@
         <w:pStyle w:val="Heading2"/>
       </w:pPr>
       <w:bookmarkStart w:id="104" w:name="_Toc227103050"/>
-      <w:bookmarkStart w:id="105" w:name="_Toc227105612"/>
+      <w:bookmarkStart w:id="105" w:name="_Toc227127890"/>
       <w:r>
         <w:t>11.2 Automatic Retry of Failed Tests</w:t>
       </w:r>
@@ -13880,7 +14384,7 @@
         <w:pStyle w:val="Heading2"/>
       </w:pPr>
       <w:bookmarkStart w:id="106" w:name="_Toc227103051"/>
-      <w:bookmarkStart w:id="107" w:name="_Toc227105613"/>
+      <w:bookmarkStart w:id="107" w:name="_Toc227127891"/>
       <w:r>
         <w:t>11.3 Parametrized (Data-Driven) Tests</w:t>
       </w:r>
@@ -14010,7 +14514,7 @@
         <w:pStyle w:val="Heading2"/>
       </w:pPr>
       <w:bookmarkStart w:id="108" w:name="_Toc227103052"/>
-      <w:bookmarkStart w:id="109" w:name="_Toc227105614"/>
+      <w:bookmarkStart w:id="109" w:name="_Toc227127892"/>
       <w:r>
         <w:lastRenderedPageBreak/>
         <w:t>11.4 Excel-Driven Tests</w:t>
@@ -14107,7 +14611,7 @@
         <w:pStyle w:val="Heading2"/>
       </w:pPr>
       <w:bookmarkStart w:id="110" w:name="_Toc227103053"/>
-      <w:bookmarkStart w:id="111" w:name="_Toc227105615"/>
+      <w:bookmarkStart w:id="111" w:name="_Toc227127893"/>
       <w:r>
         <w:t>11.5 BDD with pytest-bdd (Gherkin)</w:t>
       </w:r>
@@ -14228,7 +14732,7 @@
         </w:pBdr>
       </w:pPr>
       <w:bookmarkStart w:id="112" w:name="_Toc227103054"/>
-      <w:bookmarkStart w:id="113" w:name="_Toc227105616"/>
+      <w:bookmarkStart w:id="113" w:name="_Toc227127894"/>
       <w:r>
         <w:rPr>
           <w:sz w:val="36"/>
@@ -14244,7 +14748,7 @@
         <w:pStyle w:val="Heading2"/>
       </w:pPr>
       <w:bookmarkStart w:id="114" w:name="_Toc227103055"/>
-      <w:bookmarkStart w:id="115" w:name="_Toc227105617"/>
+      <w:bookmarkStart w:id="115" w:name="_Toc227127895"/>
       <w:r>
         <w:t>12.1 Why Docker?</w:t>
       </w:r>
@@ -14261,7 +14765,7 @@
         <w:pStyle w:val="Heading2"/>
       </w:pPr>
       <w:bookmarkStart w:id="116" w:name="_Toc227103056"/>
-      <w:bookmarkStart w:id="117" w:name="_Toc227105618"/>
+      <w:bookmarkStart w:id="117" w:name="_Toc227127896"/>
       <w:r>
         <w:t>12.2 Dockerfile Walkthrough</w:t>
       </w:r>
@@ -14532,7 +15036,7 @@
         <w:pStyle w:val="Heading2"/>
       </w:pPr>
       <w:bookmarkStart w:id="118" w:name="_Toc227103057"/>
-      <w:bookmarkStart w:id="119" w:name="_Toc227105619"/>
+      <w:bookmarkStart w:id="119" w:name="_Toc227127897"/>
       <w:r>
         <w:t>12.3 Building and Running Tests in Docker</w:t>
       </w:r>
@@ -14718,7 +15222,7 @@
         <w:pStyle w:val="Heading2"/>
       </w:pPr>
       <w:bookmarkStart w:id="120" w:name="_Toc227103058"/>
-      <w:bookmarkStart w:id="121" w:name="_Toc227105620"/>
+      <w:bookmarkStart w:id="121" w:name="_Toc227127898"/>
       <w:r>
         <w:t>12.4 Docker Layer Caching — Speed Tip</w:t>
       </w:r>
@@ -14743,7 +15247,7 @@
         </w:pBdr>
       </w:pPr>
       <w:bookmarkStart w:id="122" w:name="_Toc227103059"/>
-      <w:bookmarkStart w:id="123" w:name="_Toc227105621"/>
+      <w:bookmarkStart w:id="123" w:name="_Toc227127899"/>
       <w:r>
         <w:rPr>
           <w:sz w:val="36"/>
@@ -14759,7 +15263,7 @@
         <w:pStyle w:val="Heading2"/>
       </w:pPr>
       <w:bookmarkStart w:id="124" w:name="_Toc227103060"/>
-      <w:bookmarkStart w:id="125" w:name="_Toc227105622"/>
+      <w:bookmarkStart w:id="125" w:name="_Toc227127900"/>
       <w:r>
         <w:t>13.1 What is CI/CD?</w:t>
       </w:r>
@@ -14776,7 +15280,7 @@
         <w:pStyle w:val="Heading2"/>
       </w:pPr>
       <w:bookmarkStart w:id="126" w:name="_Toc227103061"/>
-      <w:bookmarkStart w:id="127" w:name="_Toc227105623"/>
+      <w:bookmarkStart w:id="127" w:name="_Toc227127901"/>
       <w:r>
         <w:t>13.2 Jenkins Pipeline Stages</w:t>
       </w:r>
@@ -15027,7 +15531,7 @@
         <w:pStyle w:val="Heading2"/>
       </w:pPr>
       <w:bookmarkStart w:id="128" w:name="_Toc227103062"/>
-      <w:bookmarkStart w:id="129" w:name="_Toc227105624"/>
+      <w:bookmarkStart w:id="129" w:name="_Toc227127902"/>
       <w:r>
         <w:t>13.3 Jenkins Pipeline Parameters</w:t>
       </w:r>
@@ -15048,7 +15552,7 @@
         <w:pStyle w:val="Heading2"/>
       </w:pPr>
       <w:bookmarkStart w:id="130" w:name="_Toc227103063"/>
-      <w:bookmarkStart w:id="131" w:name="_Toc227105625"/>
+      <w:bookmarkStart w:id="131" w:name="_Toc227127903"/>
       <w:r>
         <w:t>13.4 Post-Build: Report Archival</w:t>
       </w:r>
@@ -15065,7 +15569,7 @@
         <w:pStyle w:val="Heading2"/>
       </w:pPr>
       <w:bookmarkStart w:id="132" w:name="_Toc227103064"/>
-      <w:bookmarkStart w:id="133" w:name="_Toc227105626"/>
+      <w:bookmarkStart w:id="133" w:name="_Toc227127904"/>
       <w:r>
         <w:t>13.5 Setting Up the Jenkins Job — Step by Step</w:t>
       </w:r>
@@ -15183,7 +15687,7 @@
           <w:sz w:val="36"/>
         </w:rPr>
       </w:pPr>
-      <w:bookmarkStart w:id="134" w:name="_Toc227105627"/>
+      <w:bookmarkStart w:id="134" w:name="_Toc227127905"/>
       <w:r>
         <w:rPr>
           <w:sz w:val="36"/>
@@ -15197,7 +15701,7 @@
       <w:pPr>
         <w:pStyle w:val="Heading2"/>
       </w:pPr>
-      <w:bookmarkStart w:id="135" w:name="_Toc227105628"/>
+      <w:bookmarkStart w:id="135" w:name="_Toc227127906"/>
       <w:r>
         <w:t>13B.1 Why GitHub Actions?</w:t>
       </w:r>
@@ -15289,7 +15793,7 @@
       <w:pPr>
         <w:pStyle w:val="Heading2"/>
       </w:pPr>
-      <w:bookmarkStart w:id="136" w:name="_Toc227105629"/>
+      <w:bookmarkStart w:id="136" w:name="_Toc227127907"/>
       <w:r>
         <w:t>13B.2 Workflow File Structure</w:t>
       </w:r>
@@ -15345,7 +15849,7 @@
       <w:pPr>
         <w:pStyle w:val="Heading2"/>
       </w:pPr>
-      <w:bookmarkStart w:id="137" w:name="_Toc227105630"/>
+      <w:bookmarkStart w:id="137" w:name="_Toc227127908"/>
       <w:r>
         <w:t>13B.3 Complete Workflow File — Annotated</w:t>
       </w:r>
@@ -15770,7 +16274,7 @@
       <w:pPr>
         <w:pStyle w:val="Heading2"/>
       </w:pPr>
-      <w:bookmarkStart w:id="138" w:name="_Toc227105631"/>
+      <w:bookmarkStart w:id="138" w:name="_Toc227127909"/>
       <w:r>
         <w:t>13B.4 Workflow Steps Explained</w:t>
       </w:r>
@@ -15785,7 +16289,7 @@
       <w:pPr>
         <w:pStyle w:val="Heading2"/>
       </w:pPr>
-      <w:bookmarkStart w:id="139" w:name="_Toc227105632"/>
+      <w:bookmarkStart w:id="139" w:name="_Toc227127910"/>
       <w:r>
         <w:t>13B.5 Storing Secrets in GitHub</w:t>
       </w:r>
@@ -15852,7 +16356,7 @@
       <w:pPr>
         <w:pStyle w:val="Heading2"/>
       </w:pPr>
-      <w:bookmarkStart w:id="140" w:name="_Toc227105633"/>
+      <w:bookmarkStart w:id="140" w:name="_Toc227127911"/>
       <w:r>
         <w:lastRenderedPageBreak/>
         <w:t>13B.6 Setting Up the Workflow — Step by Step</w:t>
@@ -15968,7 +16472,7 @@
         </w:pBdr>
       </w:pPr>
       <w:bookmarkStart w:id="141" w:name="_Toc227103065"/>
-      <w:bookmarkStart w:id="142" w:name="_Toc227105634"/>
+      <w:bookmarkStart w:id="142" w:name="_Toc227127912"/>
       <w:r>
         <w:rPr>
           <w:sz w:val="36"/>
@@ -16003,7 +16507,7 @@
         <w:pStyle w:val="Heading2"/>
       </w:pPr>
       <w:bookmarkStart w:id="143" w:name="_Toc227103066"/>
-      <w:bookmarkStart w:id="144" w:name="_Toc227105635"/>
+      <w:bookmarkStart w:id="144" w:name="_Toc227127913"/>
       <w:r>
         <w:t>14.1 What is Pylint?</w:t>
       </w:r>
@@ -16020,7 +16524,7 @@
         <w:pStyle w:val="Heading2"/>
       </w:pPr>
       <w:bookmarkStart w:id="145" w:name="_Toc227103067"/>
-      <w:bookmarkStart w:id="146" w:name="_Toc227105636"/>
+      <w:bookmarkStart w:id="146" w:name="_Toc227127914"/>
       <w:r>
         <w:t>14.2 Running Pylint</w:t>
       </w:r>
@@ -16118,7 +16622,7 @@
         <w:pStyle w:val="Heading2"/>
       </w:pPr>
       <w:bookmarkStart w:id="147" w:name="_Toc227103068"/>
-      <w:bookmarkStart w:id="148" w:name="_Toc227105637"/>
+      <w:bookmarkStart w:id="148" w:name="_Toc227127915"/>
       <w:r>
         <w:t>14.3 Suppressing Pylint Warnings</w:t>
       </w:r>
@@ -16184,7 +16688,7 @@
         <w:pStyle w:val="Heading2"/>
       </w:pPr>
       <w:bookmarkStart w:id="149" w:name="_Toc227103069"/>
-      <w:bookmarkStart w:id="150" w:name="_Toc227105638"/>
+      <w:bookmarkStart w:id="150" w:name="_Toc227127916"/>
       <w:r>
         <w:t>14.4 Commit Style — Conventional Commits</w:t>
       </w:r>
@@ -16530,7 +17034,7 @@
         </w:pBdr>
       </w:pPr>
       <w:bookmarkStart w:id="151" w:name="_Toc227103070"/>
-      <w:bookmarkStart w:id="152" w:name="_Toc227105639"/>
+      <w:bookmarkStart w:id="152" w:name="_Toc227127917"/>
       <w:r>
         <w:rPr>
           <w:sz w:val="36"/>
@@ -16558,7 +17062,7 @@
         <w:pStyle w:val="Heading2"/>
       </w:pPr>
       <w:bookmarkStart w:id="153" w:name="_Toc227103071"/>
-      <w:bookmarkStart w:id="154" w:name="_Toc227105640"/>
+      <w:bookmarkStart w:id="154" w:name="_Toc227127918"/>
       <w:r>
         <w:t>15.1 The Golden Rules of Test Automation</w:t>
       </w:r>
@@ -16853,7 +17357,7 @@
         <w:pStyle w:val="Heading2"/>
       </w:pPr>
       <w:bookmarkStart w:id="155" w:name="_Toc227103072"/>
-      <w:bookmarkStart w:id="156" w:name="_Toc227105641"/>
+      <w:bookmarkStart w:id="156" w:name="_Toc227127919"/>
       <w:r>
         <w:t>15.2 Adding a New UI Application — Checklist</w:t>
       </w:r>
@@ -16974,7 +17478,7 @@
         <w:pStyle w:val="Heading2"/>
       </w:pPr>
       <w:bookmarkStart w:id="157" w:name="_Toc227103073"/>
-      <w:bookmarkStart w:id="158" w:name="_Toc227105642"/>
+      <w:bookmarkStart w:id="158" w:name="_Toc227127920"/>
       <w:r>
         <w:t>15.3 Complete Command Quick Reference</w:t>
       </w:r>
@@ -17461,7 +17965,7 @@
         <w:pStyle w:val="Heading2"/>
       </w:pPr>
       <w:bookmarkStart w:id="159" w:name="_Toc227103074"/>
-      <w:bookmarkStart w:id="160" w:name="_Toc227105643"/>
+      <w:bookmarkStart w:id="160" w:name="_Toc227127921"/>
       <w:r>
         <w:t>15.4 Troubleshooting Common Issues</w:t>
       </w:r>
@@ -17608,6 +18112,7 @@
           </w:tcPr>
           <w:p>
             <w:r>
+              <w:lastRenderedPageBreak/>
               <w:t>Permission denied on output/ folder</w:t>
             </w:r>
           </w:p>
@@ -17816,7 +18321,7 @@
         <w:pStyle w:val="Heading2"/>
       </w:pPr>
       <w:bookmarkStart w:id="161" w:name="_Toc227103075"/>
-      <w:bookmarkStart w:id="162" w:name="_Toc227105644"/>
+      <w:bookmarkStart w:id="162" w:name="_Toc227127922"/>
       <w:r>
         <w:t>15.5 Framework Architecture Summary Diagram</w:t>
       </w:r>
@@ -18307,7 +18812,7 @@
         <w:pStyle w:val="Heading2"/>
       </w:pPr>
       <w:bookmarkStart w:id="163" w:name="_Toc227103076"/>
-      <w:bookmarkStart w:id="164" w:name="_Toc227105645"/>
+      <w:bookmarkStart w:id="164" w:name="_Toc227127923"/>
       <w:r>
         <w:lastRenderedPageBreak/>
         <w:t>15.6 Learning Path — What to Study Next</w:t>
@@ -18777,7 +19282,7 @@
         </w:pBdr>
       </w:pPr>
       <w:bookmarkStart w:id="165" w:name="_Toc227103077"/>
-      <w:bookmarkStart w:id="166" w:name="_Toc227105646"/>
+      <w:bookmarkStart w:id="166" w:name="_Toc227127924"/>
       <w:r>
         <w:rPr>
           <w:sz w:val="36"/>
@@ -19418,6 +19923,7 @@
           </w:tcPr>
           <w:p>
             <w:r>
+              <w:lastRenderedPageBreak/>
               <w:t>requirements.txt</w:t>
             </w:r>
           </w:p>
@@ -19449,6 +19955,290 @@
     <w:p>
       <w:r>
         <w:br w:type="page"/>
+      </w:r>
+    </w:p>
+    <w:p>
+      <w:pPr>
+        <w:pStyle w:val="Heading1"/>
+      </w:pPr>
+      <w:bookmarkStart w:id="167" w:name="_Toc227127925"/>
+      <w:r>
+        <w:lastRenderedPageBreak/>
+        <w:t>Chapter 16: MCP Servers for GitHub Copilot</w:t>
+      </w:r>
+      <w:bookmarkEnd w:id="167"/>
+    </w:p>
+    <w:p>
+      <w:pPr>
+        <w:pStyle w:val="Heading2"/>
+      </w:pPr>
+      <w:bookmarkStart w:id="168" w:name="_Toc227127926"/>
+      <w:r>
+        <w:t>16.1 What is MCP?</w:t>
+      </w:r>
+      <w:bookmarkEnd w:id="168"/>
+    </w:p>
+    <w:p>
+      <w:r>
+        <w:t>The Model Context Protocol (MCP) is an open standard that lets AI assistants like GitHub Copilot connect to external tools and data sources through lightweight server processes. Instead of being limited to code context alone, Copilot can use MCP servers to browse the web, interact with databases, read and write files, control a browser with Selenium or Playwright, call REST APIs, manipulate Excel and Word documents, and manage GitHub repositories — all from within the editor.</w:t>
+      </w:r>
+    </w:p>
+    <w:p>
+      <w:r>
+        <w:t>For this automation framework, MCP servers make it possible to have GitHub Copilot actively assist with test execution, report analysis, data file manipulation, and API validation — directly from your IDE without switching tools.</w:t>
+      </w:r>
+    </w:p>
+    <w:p>
+      <w:pPr>
+        <w:pStyle w:val="Heading2"/>
+      </w:pPr>
+      <w:bookmarkStart w:id="169" w:name="_Toc227127927"/>
+      <w:r>
+        <w:t>16.2 Configuration File Location</w:t>
+      </w:r>
+      <w:bookmarkEnd w:id="169"/>
+    </w:p>
+    <w:p>
+      <w:r>
+        <w:t>MCP servers are configured in a JSON file that GitHub Copilot reads at startup. The file location depends on your IDE:</w:t>
+      </w:r>
+    </w:p>
+    <w:p>
+      <w:pPr>
+        <w:pStyle w:val="ListParagraph"/>
+        <w:numPr>
+          <w:ilvl w:val="0"/>
+          <w:numId w:val="1"/>
+        </w:numPr>
+      </w:pPr>
+      <w:r>
+        <w:t>JetBrains IDEs (IntelliJ, PyCharm):   %LOCALAPPDATA%\github-copilot\intellij\mcp.json</w:t>
+      </w:r>
+    </w:p>
+    <w:p>
+      <w:pPr>
+        <w:pStyle w:val="ListParagraph"/>
+        <w:numPr>
+          <w:ilvl w:val="0"/>
+          <w:numId w:val="1"/>
+        </w:numPr>
+      </w:pPr>
+      <w:r>
+        <w:t>VS Code:   %APPDATA%\Code\User\globalStorage\github.copilot-chat\mcp.json</w:t>
+      </w:r>
+    </w:p>
+    <w:p>
+      <w:r>
+        <w:t>Each entry in the servers object defines one MCP server. Servers can be remote (URL-based) or local processes launched via a command (npx, node, uvx, etc.). Replace &lt;your-username&gt; in any path with your actual Windows username.</w:t>
+      </w:r>
+    </w:p>
+    <w:p>
+      <w:pPr>
+        <w:pStyle w:val="Heading2"/>
+      </w:pPr>
+      <w:bookmarkStart w:id="170" w:name="_Toc227127928"/>
+      <w:r>
+        <w:t>16.3 The mcp.json File — Annotated</w:t>
+      </w:r>
+      <w:bookmarkEnd w:id="170"/>
+    </w:p>
+    <w:p>
+      <w:r>
+        <w:t>Below is the complete mcp.json used in this project. Copy it to the path shown in section 16.2 for your IDE, then replace the placeholder paths with your own username.</w:t>
+      </w:r>
+    </w:p>
+    <w:p>
+      <w:r>
+        <w:t>{ "servers": { "github": { "url": "https://api.githubcopilot.com/mcp/" }, "playwright": { "command": "npx", "args": ["@playwright/mcp@latest"] }, "selenium": { "command": "npx", "args": ["-y", "@angiejones/mcp-selenium"] }, "filesystem": { "command": "npx", "args": ["-y", "@modelcontextprotocol/server-filesystem", "C:\\Users\\&lt;your-username&gt;\\files_claude"] }, "excel": { "command": "cmd", "args": ["/c", "npx", "--yes", "@negokaz/excel-mcp-server"], "env": { "EXCEL_MCP_PAGING_CELLS_LIMIT": "4000" } }, "rest-api": { "command": "node", "args": ["C:\\Users\\&lt;your-username&gt;\\AppData\\Roaming\\npm\\node_modules\\dkmaker-mcp-rest-api\\build\\index.js"], "env": { "REST_BASE_URL": "https://rahulshettyacademy.com/", "HEADER_Accept": "application/json" } }, "mysql": { "command": "C:\\Python\\3.13.7\\Scripts\\uv.exe", "args": ["--directory", "C:\\Python\\3.13.7\\Lib\\site-packages", "run", "mysql_mcp_server"], "env": { "MYSQL_HOST": "localhost", "MYSQL_PORT": "3306", "MYSQL_USER": "root", "MYSQL_PASSWORD": "root", "MYSQL_DATABASE": "rahulshettyacademy" } }, "word-</w:t>
+      </w:r>
+      <w:r>
+        <w:lastRenderedPageBreak/>
+        <w:t>document-server": { "command": "uvx", "args": ["--from", "office-word-mcp-server", "word_mcp_server"] } } }</w:t>
+      </w:r>
+    </w:p>
+    <w:p>
+      <w:pPr>
+        <w:pStyle w:val="Heading2"/>
+      </w:pPr>
+      <w:bookmarkStart w:id="171" w:name="_Toc227127929"/>
+      <w:r>
+        <w:t>16.4 MCP Server Reference</w:t>
+      </w:r>
+      <w:bookmarkEnd w:id="171"/>
+    </w:p>
+    <w:p>
+      <w:r>
+        <w:t>The table below describes each MCP server, the package that provides it, and what it enables GitHub Copilot to do in this project.</w:t>
+      </w:r>
+    </w:p>
+    <w:p>
+      <w:pPr>
+        <w:pStyle w:val="Heading2"/>
+      </w:pPr>
+      <w:bookmarkStart w:id="172" w:name="_Toc227127930"/>
+      <w:r>
+        <w:t>16.5 Prerequisites — Installing MCP Server Dependencies</w:t>
+      </w:r>
+      <w:bookmarkEnd w:id="172"/>
+    </w:p>
+    <w:p>
+      <w:r>
+        <w:t>Node.js v18+ is required for all npx-based MCP servers. Python uv is required for the mysql and word-document-server entries. Run the following once to set everything up:</w:t>
+      </w:r>
+    </w:p>
+    <w:p>
+      <w:r>
+        <w:t># Verify Node.js (v18+ required)</w:t>
+      </w:r>
+      <w:r>
+        <w:br/>
+        <w:t>node --version</w:t>
+      </w:r>
+      <w:r>
+        <w:br/>
+      </w:r>
+      <w:r>
+        <w:br/>
+        <w:t># Install Python uv — option A via pip</w:t>
+      </w:r>
+      <w:r>
+        <w:br/>
+        <w:t>pip install uv</w:t>
+      </w:r>
+      <w:r>
+        <w:br/>
+        <w:t># Install Python uv — option B via winget (Windows)</w:t>
+      </w:r>
+      <w:r>
+        <w:br/>
+        <w:t>winget install astral-sh.uv</w:t>
+      </w:r>
+      <w:r>
+        <w:br/>
+      </w:r>
+      <w:r>
+        <w:br/>
+        <w:t># Install the REST API MCP server globally (required for the rest-api entry)</w:t>
+      </w:r>
+      <w:r>
+        <w:br/>
+        <w:t>npm install -g dkmaker-mcp-rest-api</w:t>
+      </w:r>
+      <w:r>
+        <w:br/>
+      </w:r>
+      <w:r>
+        <w:br/>
+        <w:t># Verify uv is available</w:t>
+      </w:r>
+      <w:r>
+        <w:br/>
+        <w:t>uv --version</w:t>
+      </w:r>
+    </w:p>
+    <w:p>
+      <w:pPr>
+        <w:pStyle w:val="Heading2"/>
+      </w:pPr>
+      <w:bookmarkStart w:id="173" w:name="_Toc227127931"/>
+      <w:r>
+        <w:t>16.6 How Each MCP Server Relates to This Framework</w:t>
+      </w:r>
+      <w:bookmarkEnd w:id="173"/>
+    </w:p>
+    <w:p>
+      <w:r>
+        <w:t>Each MCP server unlocks a specific capability that directly supports this automation framework:</w:t>
+      </w:r>
+    </w:p>
+    <w:p>
+      <w:pPr>
+        <w:pStyle w:val="ListParagraph"/>
+        <w:numPr>
+          <w:ilvl w:val="0"/>
+          <w:numId w:val="1"/>
+        </w:numPr>
+      </w:pPr>
+      <w:r>
+        <w:t>github — manage pull requests, review test results in CI, create issues for failing tests, all from the IDE.</w:t>
+      </w:r>
+    </w:p>
+    <w:p>
+      <w:pPr>
+        <w:pStyle w:val="ListParagraph"/>
+        <w:numPr>
+          <w:ilvl w:val="0"/>
+          <w:numId w:val="1"/>
+        </w:numPr>
+      </w:pPr>
+      <w:r>
+        <w:t>playwright / selenium — let Copilot drive a browser to demonstrate or debug test steps interactively.</w:t>
+      </w:r>
+    </w:p>
+    <w:p>
+      <w:pPr>
+        <w:pStyle w:val="ListParagraph"/>
+        <w:numPr>
+          <w:ilvl w:val="0"/>
+          <w:numId w:val="1"/>
+        </w:numPr>
+      </w:pPr>
+      <w:r>
+        <w:t>filesystem — read test output files, logs, and screenshots directly so Copilot can analyse failures.</w:t>
+      </w:r>
+    </w:p>
+    <w:p>
+      <w:pPr>
+        <w:pStyle w:val="ListParagraph"/>
+        <w:numPr>
+          <w:ilvl w:val="0"/>
+          <w:numId w:val="1"/>
+        </w:numPr>
+      </w:pPr>
+      <w:r>
+        <w:t>excel — read and write ui_test_excel_data_config.xlsx test data files without opening Excel.</w:t>
+      </w:r>
+    </w:p>
+    <w:p>
+      <w:pPr>
+        <w:pStyle w:val="ListParagraph"/>
+        <w:numPr>
+          <w:ilvl w:val="0"/>
+          <w:numId w:val="1"/>
+        </w:numPr>
+      </w:pPr>
+      <w:r>
+        <w:t>rest-api — call the rahulshettyacademy.com API endpoints used in the API test suite to verify responses.</w:t>
+      </w:r>
+    </w:p>
+    <w:p>
+      <w:pPr>
+        <w:pStyle w:val="ListParagraph"/>
+        <w:numPr>
+          <w:ilvl w:val="0"/>
+          <w:numId w:val="1"/>
+        </w:numPr>
+      </w:pPr>
+      <w:r>
+        <w:t>mysql — query the rahulshettyacademy MySQL database to cross-check test data against the DB state.</w:t>
+      </w:r>
+    </w:p>
+    <w:p>
+      <w:pPr>
+        <w:pStyle w:val="ListParagraph"/>
+        <w:numPr>
+          <w:ilvl w:val="0"/>
+          <w:numId w:val="1"/>
+        </w:numPr>
+      </w:pPr>
+      <w:r>
+        <w:t>word-document-server — create and update this tutorial.docx and other Word documentation from the IDE.</w:t>
+      </w:r>
+    </w:p>
+    <w:p>
+      <w:r>
+        <w:lastRenderedPageBreak/>
+        <w:t>NOTE: MCP servers are optional tooling for the AI assistant — they have no impact on test execution or the pytest framework itself. They purely extend what GitHub Copilot can help you with while writing, debugging, and maintaining tests in this project.</w:t>
       </w:r>
     </w:p>
     <w:p>
@@ -19458,17 +20248,16 @@
           <w:bottom w:val="single" w:sz="4" w:space="0" w:color="000000"/>
         </w:pBdr>
       </w:pPr>
-      <w:bookmarkStart w:id="167" w:name="_Toc227103078"/>
-      <w:bookmarkStart w:id="168" w:name="_Toc227105647"/>
+      <w:bookmarkStart w:id="174" w:name="_Toc227103078"/>
+      <w:bookmarkStart w:id="175" w:name="_Toc227127932"/>
       <w:r>
         <w:rPr>
           <w:sz w:val="36"/>
         </w:rPr>
-        <w:lastRenderedPageBreak/>
         <w:t>Closing Words</w:t>
       </w:r>
-      <w:bookmarkEnd w:id="167"/>
-      <w:bookmarkEnd w:id="168"/>
+      <w:bookmarkEnd w:id="174"/>
+      <w:bookmarkEnd w:id="175"/>
     </w:p>
     <w:p>
       <w:r>
@@ -19737,6 +20526,7 @@
           </w:tcPr>
           <w:p>
             <w:r>
+              <w:lastRenderedPageBreak/>
               <w:t>5. Pylint</w:t>
             </w:r>
           </w:p>
@@ -19772,7 +20562,6 @@
           </w:tcPr>
           <w:p>
             <w:r>
-              <w:lastRenderedPageBreak/>
               <w:t>6. Run tests</w:t>
             </w:r>
           </w:p>
@@ -19901,6 +20690,513 @@
           <w:p>
             <w:r>
               <w:t>Uploads failure screenshots only when the job fails, keeping artifact storage lean on passing runs.</w:t>
+            </w:r>
+          </w:p>
+        </w:tc>
+      </w:tr>
+    </w:tbl>
+    <w:p/>
+    <w:tbl>
+      <w:tblPr>
+        <w:tblStyle w:val="TableGrid"/>
+        <w:tblW w:w="0" w:type="auto"/>
+        <w:tblLook w:val="04A0" w:firstRow="1" w:lastRow="0" w:firstColumn="1" w:lastColumn="0" w:noHBand="0" w:noVBand="1"/>
+      </w:tblPr>
+      <w:tblGrid>
+        <w:gridCol w:w="2720"/>
+        <w:gridCol w:w="3277"/>
+        <w:gridCol w:w="2859"/>
+      </w:tblGrid>
+      <w:tr>
+        <w:tc>
+          <w:tcPr>
+            <w:tcW w:w="2880" w:type="dxa"/>
+            <w:tcBorders>
+              <w:top w:val="single" w:sz="4" w:space="0" w:color="000000"/>
+              <w:left w:val="single" w:sz="4" w:space="0" w:color="000000"/>
+              <w:bottom w:val="single" w:sz="4" w:space="0" w:color="000000"/>
+              <w:right w:val="single" w:sz="4" w:space="0" w:color="000000"/>
+            </w:tcBorders>
+            <w:shd w:val="clear" w:color="auto" w:fill="FFFFFF"/>
+          </w:tcPr>
+          <w:p>
+            <w:r>
+              <w:rPr>
+                <w:b/>
+                <w:color w:val="FFFFFF"/>
+              </w:rPr>
+              <w:t>Server Key</w:t>
+            </w:r>
+          </w:p>
+        </w:tc>
+        <w:tc>
+          <w:tcPr>
+            <w:tcW w:w="2880" w:type="dxa"/>
+            <w:tcBorders>
+              <w:top w:val="single" w:sz="4" w:space="0" w:color="000000"/>
+              <w:left w:val="single" w:sz="4" w:space="0" w:color="000000"/>
+              <w:bottom w:val="single" w:sz="4" w:space="0" w:color="000000"/>
+              <w:right w:val="single" w:sz="4" w:space="0" w:color="000000"/>
+            </w:tcBorders>
+            <w:shd w:val="clear" w:color="auto" w:fill="FFFFFF"/>
+          </w:tcPr>
+          <w:p>
+            <w:r>
+              <w:rPr>
+                <w:b/>
+                <w:color w:val="FFFFFF"/>
+              </w:rPr>
+              <w:t>Package / Transport</w:t>
+            </w:r>
+          </w:p>
+        </w:tc>
+        <w:tc>
+          <w:tcPr>
+            <w:tcW w:w="2880" w:type="dxa"/>
+            <w:tcBorders>
+              <w:top w:val="single" w:sz="4" w:space="0" w:color="000000"/>
+              <w:left w:val="single" w:sz="4" w:space="0" w:color="000000"/>
+              <w:bottom w:val="single" w:sz="4" w:space="0" w:color="000000"/>
+              <w:right w:val="single" w:sz="4" w:space="0" w:color="000000"/>
+            </w:tcBorders>
+            <w:shd w:val="clear" w:color="auto" w:fill="FFFFFF"/>
+          </w:tcPr>
+          <w:p>
+            <w:r>
+              <w:rPr>
+                <w:b/>
+                <w:color w:val="FFFFFF"/>
+              </w:rPr>
+              <w:t>What Copilot Can Do</w:t>
+            </w:r>
+          </w:p>
+        </w:tc>
+      </w:tr>
+      <w:tr>
+        <w:tc>
+          <w:tcPr>
+            <w:tcW w:w="2880" w:type="dxa"/>
+            <w:tcBorders>
+              <w:top w:val="single" w:sz="4" w:space="0" w:color="000000"/>
+              <w:left w:val="single" w:sz="4" w:space="0" w:color="000000"/>
+              <w:bottom w:val="single" w:sz="4" w:space="0" w:color="000000"/>
+              <w:right w:val="single" w:sz="4" w:space="0" w:color="000000"/>
+            </w:tcBorders>
+            <w:shd w:val="clear" w:color="auto" w:fill="EEF3FB"/>
+          </w:tcPr>
+          <w:p>
+            <w:r>
+              <w:t>github</w:t>
+            </w:r>
+          </w:p>
+        </w:tc>
+        <w:tc>
+          <w:tcPr>
+            <w:tcW w:w="2880" w:type="dxa"/>
+            <w:tcBorders>
+              <w:top w:val="single" w:sz="4" w:space="0" w:color="000000"/>
+              <w:left w:val="single" w:sz="4" w:space="0" w:color="000000"/>
+              <w:bottom w:val="single" w:sz="4" w:space="0" w:color="000000"/>
+              <w:right w:val="single" w:sz="4" w:space="0" w:color="000000"/>
+            </w:tcBorders>
+            <w:shd w:val="clear" w:color="auto" w:fill="EEF3FB"/>
+          </w:tcPr>
+          <w:p>
+            <w:r>
+              <w:t>GitHub Copilot MCP (remote URL)</w:t>
+            </w:r>
+          </w:p>
+        </w:tc>
+        <w:tc>
+          <w:tcPr>
+            <w:tcW w:w="2880" w:type="dxa"/>
+            <w:tcBorders>
+              <w:top w:val="single" w:sz="4" w:space="0" w:color="000000"/>
+              <w:left w:val="single" w:sz="4" w:space="0" w:color="000000"/>
+              <w:bottom w:val="single" w:sz="4" w:space="0" w:color="000000"/>
+              <w:right w:val="single" w:sz="4" w:space="0" w:color="000000"/>
+            </w:tcBorders>
+            <w:shd w:val="clear" w:color="auto" w:fill="EEF3FB"/>
+          </w:tcPr>
+          <w:p>
+            <w:r>
+              <w:t>Manage repos, branches, pull requests, issues, file contents, and search across GitHub</w:t>
+            </w:r>
+          </w:p>
+        </w:tc>
+      </w:tr>
+      <w:tr>
+        <w:tc>
+          <w:tcPr>
+            <w:tcW w:w="2880" w:type="dxa"/>
+            <w:tcBorders>
+              <w:top w:val="single" w:sz="4" w:space="0" w:color="000000"/>
+              <w:left w:val="single" w:sz="4" w:space="0" w:color="000000"/>
+              <w:bottom w:val="single" w:sz="4" w:space="0" w:color="000000"/>
+              <w:right w:val="single" w:sz="4" w:space="0" w:color="000000"/>
+            </w:tcBorders>
+            <w:shd w:val="clear" w:color="auto" w:fill="FFFFFF"/>
+          </w:tcPr>
+          <w:p>
+            <w:r>
+              <w:t>playwright</w:t>
+            </w:r>
+          </w:p>
+        </w:tc>
+        <w:tc>
+          <w:tcPr>
+            <w:tcW w:w="2880" w:type="dxa"/>
+            <w:tcBorders>
+              <w:top w:val="single" w:sz="4" w:space="0" w:color="000000"/>
+              <w:left w:val="single" w:sz="4" w:space="0" w:color="000000"/>
+              <w:bottom w:val="single" w:sz="4" w:space="0" w:color="000000"/>
+              <w:right w:val="single" w:sz="4" w:space="0" w:color="000000"/>
+            </w:tcBorders>
+            <w:shd w:val="clear" w:color="auto" w:fill="FFFFFF"/>
+          </w:tcPr>
+          <w:p>
+            <w:r>
+              <w:t>@playwright/mcp@latest  (npx)</w:t>
+            </w:r>
+          </w:p>
+        </w:tc>
+        <w:tc>
+          <w:tcPr>
+            <w:tcW w:w="2880" w:type="dxa"/>
+            <w:tcBorders>
+              <w:top w:val="single" w:sz="4" w:space="0" w:color="000000"/>
+              <w:left w:val="single" w:sz="4" w:space="0" w:color="000000"/>
+              <w:bottom w:val="single" w:sz="4" w:space="0" w:color="000000"/>
+              <w:right w:val="single" w:sz="4" w:space="0" w:color="000000"/>
+            </w:tcBorders>
+            <w:shd w:val="clear" w:color="auto" w:fill="FFFFFF"/>
+          </w:tcPr>
+          <w:p>
+            <w:r>
+              <w:t>Navigate URLs, click elements, fill forms, take screenshots, capture accessibility snapshots</w:t>
+            </w:r>
+          </w:p>
+        </w:tc>
+      </w:tr>
+      <w:tr>
+        <w:tc>
+          <w:tcPr>
+            <w:tcW w:w="2880" w:type="dxa"/>
+            <w:tcBorders>
+              <w:top w:val="single" w:sz="4" w:space="0" w:color="000000"/>
+              <w:left w:val="single" w:sz="4" w:space="0" w:color="000000"/>
+              <w:bottom w:val="single" w:sz="4" w:space="0" w:color="000000"/>
+              <w:right w:val="single" w:sz="4" w:space="0" w:color="000000"/>
+            </w:tcBorders>
+            <w:shd w:val="clear" w:color="auto" w:fill="EEF3FB"/>
+          </w:tcPr>
+          <w:p>
+            <w:r>
+              <w:t>selenium</w:t>
+            </w:r>
+          </w:p>
+        </w:tc>
+        <w:tc>
+          <w:tcPr>
+            <w:tcW w:w="2880" w:type="dxa"/>
+            <w:tcBorders>
+              <w:top w:val="single" w:sz="4" w:space="0" w:color="000000"/>
+              <w:left w:val="single" w:sz="4" w:space="0" w:color="000000"/>
+              <w:bottom w:val="single" w:sz="4" w:space="0" w:color="000000"/>
+              <w:right w:val="single" w:sz="4" w:space="0" w:color="000000"/>
+            </w:tcBorders>
+            <w:shd w:val="clear" w:color="auto" w:fill="EEF3FB"/>
+          </w:tcPr>
+          <w:p>
+            <w:r>
+              <w:t>@angiejones/mcp-selenium  (npx)</w:t>
+            </w:r>
+          </w:p>
+        </w:tc>
+        <w:tc>
+          <w:tcPr>
+            <w:tcW w:w="2880" w:type="dxa"/>
+            <w:tcBorders>
+              <w:top w:val="single" w:sz="4" w:space="0" w:color="000000"/>
+              <w:left w:val="single" w:sz="4" w:space="0" w:color="000000"/>
+              <w:bottom w:val="single" w:sz="4" w:space="0" w:color="000000"/>
+              <w:right w:val="single" w:sz="4" w:space="0" w:color="000000"/>
+            </w:tcBorders>
+            <w:shd w:val="clear" w:color="auto" w:fill="EEF3FB"/>
+          </w:tcPr>
+          <w:p>
+            <w:r>
+              <w:t>Drive a browser via Selenium WebDriver — interact with elements, run scripts, capture screenshots</w:t>
+            </w:r>
+          </w:p>
+        </w:tc>
+      </w:tr>
+      <w:tr>
+        <w:tc>
+          <w:tcPr>
+            <w:tcW w:w="2880" w:type="dxa"/>
+            <w:tcBorders>
+              <w:top w:val="single" w:sz="4" w:space="0" w:color="000000"/>
+              <w:left w:val="single" w:sz="4" w:space="0" w:color="000000"/>
+              <w:bottom w:val="single" w:sz="4" w:space="0" w:color="000000"/>
+              <w:right w:val="single" w:sz="4" w:space="0" w:color="000000"/>
+            </w:tcBorders>
+            <w:shd w:val="clear" w:color="auto" w:fill="FFFFFF"/>
+          </w:tcPr>
+          <w:p>
+            <w:r>
+              <w:t>filesystem</w:t>
+            </w:r>
+          </w:p>
+        </w:tc>
+        <w:tc>
+          <w:tcPr>
+            <w:tcW w:w="2880" w:type="dxa"/>
+            <w:tcBorders>
+              <w:top w:val="single" w:sz="4" w:space="0" w:color="000000"/>
+              <w:left w:val="single" w:sz="4" w:space="0" w:color="000000"/>
+              <w:bottom w:val="single" w:sz="4" w:space="0" w:color="000000"/>
+              <w:right w:val="single" w:sz="4" w:space="0" w:color="000000"/>
+            </w:tcBorders>
+            <w:shd w:val="clear" w:color="auto" w:fill="FFFFFF"/>
+          </w:tcPr>
+          <w:p>
+            <w:r>
+              <w:t>@modelcontextprotocol/server-filesystem  (npx)</w:t>
+            </w:r>
+          </w:p>
+        </w:tc>
+        <w:tc>
+          <w:tcPr>
+            <w:tcW w:w="2880" w:type="dxa"/>
+            <w:tcBorders>
+              <w:top w:val="single" w:sz="4" w:space="0" w:color="000000"/>
+              <w:left w:val="single" w:sz="4" w:space="0" w:color="000000"/>
+              <w:bottom w:val="single" w:sz="4" w:space="0" w:color="000000"/>
+              <w:right w:val="single" w:sz="4" w:space="0" w:color="000000"/>
+            </w:tcBorders>
+            <w:shd w:val="clear" w:color="auto" w:fill="FFFFFF"/>
+          </w:tcPr>
+          <w:p>
+            <w:r>
+              <w:t>Read, write, move, and search files inside allowed local directories</w:t>
+            </w:r>
+          </w:p>
+        </w:tc>
+      </w:tr>
+      <w:tr>
+        <w:tc>
+          <w:tcPr>
+            <w:tcW w:w="2880" w:type="dxa"/>
+            <w:tcBorders>
+              <w:top w:val="single" w:sz="4" w:space="0" w:color="000000"/>
+              <w:left w:val="single" w:sz="4" w:space="0" w:color="000000"/>
+              <w:bottom w:val="single" w:sz="4" w:space="0" w:color="000000"/>
+              <w:right w:val="single" w:sz="4" w:space="0" w:color="000000"/>
+            </w:tcBorders>
+            <w:shd w:val="clear" w:color="auto" w:fill="EEF3FB"/>
+          </w:tcPr>
+          <w:p>
+            <w:r>
+              <w:t>excel</w:t>
+            </w:r>
+          </w:p>
+        </w:tc>
+        <w:tc>
+          <w:tcPr>
+            <w:tcW w:w="2880" w:type="dxa"/>
+            <w:tcBorders>
+              <w:top w:val="single" w:sz="4" w:space="0" w:color="000000"/>
+              <w:left w:val="single" w:sz="4" w:space="0" w:color="000000"/>
+              <w:bottom w:val="single" w:sz="4" w:space="0" w:color="000000"/>
+              <w:right w:val="single" w:sz="4" w:space="0" w:color="000000"/>
+            </w:tcBorders>
+            <w:shd w:val="clear" w:color="auto" w:fill="EEF3FB"/>
+          </w:tcPr>
+          <w:p>
+            <w:r>
+              <w:t>@negokaz/excel-mcp-server  (npx via cmd)</w:t>
+            </w:r>
+          </w:p>
+        </w:tc>
+        <w:tc>
+          <w:tcPr>
+            <w:tcW w:w="2880" w:type="dxa"/>
+            <w:tcBorders>
+              <w:top w:val="single" w:sz="4" w:space="0" w:color="000000"/>
+              <w:left w:val="single" w:sz="4" w:space="0" w:color="000000"/>
+              <w:bottom w:val="single" w:sz="4" w:space="0" w:color="000000"/>
+              <w:right w:val="single" w:sz="4" w:space="0" w:color="000000"/>
+            </w:tcBorders>
+            <w:shd w:val="clear" w:color="auto" w:fill="EEF3FB"/>
+          </w:tcPr>
+          <w:p>
+            <w:r>
+              <w:t>Read sheets with pagination, write cell values, copy sheets, format ranges in .xlsx workbooks</w:t>
+            </w:r>
+          </w:p>
+        </w:tc>
+      </w:tr>
+      <w:tr>
+        <w:tc>
+          <w:tcPr>
+            <w:tcW w:w="2880" w:type="dxa"/>
+            <w:tcBorders>
+              <w:top w:val="single" w:sz="4" w:space="0" w:color="000000"/>
+              <w:left w:val="single" w:sz="4" w:space="0" w:color="000000"/>
+              <w:bottom w:val="single" w:sz="4" w:space="0" w:color="000000"/>
+              <w:right w:val="single" w:sz="4" w:space="0" w:color="000000"/>
+            </w:tcBorders>
+            <w:shd w:val="clear" w:color="auto" w:fill="FFFFFF"/>
+          </w:tcPr>
+          <w:p>
+            <w:r>
+              <w:t>rest-api</w:t>
+            </w:r>
+          </w:p>
+        </w:tc>
+        <w:tc>
+          <w:tcPr>
+            <w:tcW w:w="2880" w:type="dxa"/>
+            <w:tcBorders>
+              <w:top w:val="single" w:sz="4" w:space="0" w:color="000000"/>
+              <w:left w:val="single" w:sz="4" w:space="0" w:color="000000"/>
+              <w:bottom w:val="single" w:sz="4" w:space="0" w:color="000000"/>
+              <w:right w:val="single" w:sz="4" w:space="0" w:color="000000"/>
+            </w:tcBorders>
+            <w:shd w:val="clear" w:color="auto" w:fill="FFFFFF"/>
+          </w:tcPr>
+          <w:p>
+            <w:r>
+              <w:t>dkmaker-mcp-rest-api  (node)</w:t>
+            </w:r>
+          </w:p>
+        </w:tc>
+        <w:tc>
+          <w:tcPr>
+            <w:tcW w:w="2880" w:type="dxa"/>
+            <w:tcBorders>
+              <w:top w:val="single" w:sz="4" w:space="0" w:color="000000"/>
+              <w:left w:val="single" w:sz="4" w:space="0" w:color="000000"/>
+              <w:bottom w:val="single" w:sz="4" w:space="0" w:color="000000"/>
+              <w:right w:val="single" w:sz="4" w:space="0" w:color="000000"/>
+            </w:tcBorders>
+            <w:shd w:val="clear" w:color="auto" w:fill="FFFFFF"/>
+          </w:tcPr>
+          <w:p>
+            <w:r>
+              <w:t xml:space="preserve">Send GET / POST / PUT / </w:t>
+            </w:r>
+            <w:r>
+              <w:lastRenderedPageBreak/>
+              <w:t>DELETE requests to REST APIs and inspect responses (base URL: rahulshettyacademy.com)</w:t>
+            </w:r>
+          </w:p>
+        </w:tc>
+      </w:tr>
+      <w:tr>
+        <w:tc>
+          <w:tcPr>
+            <w:tcW w:w="2880" w:type="dxa"/>
+            <w:tcBorders>
+              <w:top w:val="single" w:sz="4" w:space="0" w:color="000000"/>
+              <w:left w:val="single" w:sz="4" w:space="0" w:color="000000"/>
+              <w:bottom w:val="single" w:sz="4" w:space="0" w:color="000000"/>
+              <w:right w:val="single" w:sz="4" w:space="0" w:color="000000"/>
+            </w:tcBorders>
+            <w:shd w:val="clear" w:color="auto" w:fill="EEF3FB"/>
+          </w:tcPr>
+          <w:p>
+            <w:r>
+              <w:lastRenderedPageBreak/>
+              <w:t>mysql</w:t>
+            </w:r>
+          </w:p>
+        </w:tc>
+        <w:tc>
+          <w:tcPr>
+            <w:tcW w:w="2880" w:type="dxa"/>
+            <w:tcBorders>
+              <w:top w:val="single" w:sz="4" w:space="0" w:color="000000"/>
+              <w:left w:val="single" w:sz="4" w:space="0" w:color="000000"/>
+              <w:bottom w:val="single" w:sz="4" w:space="0" w:color="000000"/>
+              <w:right w:val="single" w:sz="4" w:space="0" w:color="000000"/>
+            </w:tcBorders>
+            <w:shd w:val="clear" w:color="auto" w:fill="EEF3FB"/>
+          </w:tcPr>
+          <w:p>
+            <w:r>
+              <w:t>mysql_mcp_server  (Python uv)</w:t>
+            </w:r>
+          </w:p>
+        </w:tc>
+        <w:tc>
+          <w:tcPr>
+            <w:tcW w:w="2880" w:type="dxa"/>
+            <w:tcBorders>
+              <w:top w:val="single" w:sz="4" w:space="0" w:color="000000"/>
+              <w:left w:val="single" w:sz="4" w:space="0" w:color="000000"/>
+              <w:bottom w:val="single" w:sz="4" w:space="0" w:color="000000"/>
+              <w:right w:val="single" w:sz="4" w:space="0" w:color="000000"/>
+            </w:tcBorders>
+            <w:shd w:val="clear" w:color="auto" w:fill="EEF3FB"/>
+          </w:tcPr>
+          <w:p>
+            <w:r>
+              <w:t>Execute SQL queries against a local MySQL database and return structured results</w:t>
+            </w:r>
+          </w:p>
+        </w:tc>
+      </w:tr>
+      <w:tr>
+        <w:tc>
+          <w:tcPr>
+            <w:tcW w:w="2880" w:type="dxa"/>
+            <w:tcBorders>
+              <w:top w:val="single" w:sz="4" w:space="0" w:color="000000"/>
+              <w:left w:val="single" w:sz="4" w:space="0" w:color="000000"/>
+              <w:bottom w:val="single" w:sz="4" w:space="0" w:color="000000"/>
+              <w:right w:val="single" w:sz="4" w:space="0" w:color="000000"/>
+            </w:tcBorders>
+            <w:shd w:val="clear" w:color="auto" w:fill="FFFFFF"/>
+          </w:tcPr>
+          <w:p>
+            <w:r>
+              <w:t>word-document-server</w:t>
+            </w:r>
+          </w:p>
+        </w:tc>
+        <w:tc>
+          <w:tcPr>
+            <w:tcW w:w="2880" w:type="dxa"/>
+            <w:tcBorders>
+              <w:top w:val="single" w:sz="4" w:space="0" w:color="000000"/>
+              <w:left w:val="single" w:sz="4" w:space="0" w:color="000000"/>
+              <w:bottom w:val="single" w:sz="4" w:space="0" w:color="000000"/>
+              <w:right w:val="single" w:sz="4" w:space="0" w:color="000000"/>
+            </w:tcBorders>
+            <w:shd w:val="clear" w:color="auto" w:fill="FFFFFF"/>
+          </w:tcPr>
+          <w:p>
+            <w:r>
+              <w:t>office-word-mcp-server  (uvx)</w:t>
+            </w:r>
+          </w:p>
+        </w:tc>
+        <w:tc>
+          <w:tcPr>
+            <w:tcW w:w="2880" w:type="dxa"/>
+            <w:tcBorders>
+              <w:top w:val="single" w:sz="4" w:space="0" w:color="000000"/>
+              <w:left w:val="single" w:sz="4" w:space="0" w:color="000000"/>
+              <w:bottom w:val="single" w:sz="4" w:space="0" w:color="000000"/>
+              <w:right w:val="single" w:sz="4" w:space="0" w:color="000000"/>
+            </w:tcBorders>
+            <w:shd w:val="clear" w:color="auto" w:fill="FFFFFF"/>
+          </w:tcPr>
+          <w:p>
+            <w:r>
+              <w:t>Create, read, edit, and format Word .docx documents — headings, paragraphs, tables, styles</w:t>
             </w:r>
           </w:p>
         </w:tc>
@@ -31548,6 +32844,132 @@
       <w:u w:val="single"/>
     </w:rPr>
   </w:style>
+  <w:style w:type="paragraph" w:styleId="TOC4">
+    <w:name w:val="toc 4"/>
+    <w:basedOn w:val="Normal"/>
+    <w:next w:val="Normal"/>
+    <w:autoRedefine/>
+    <w:uiPriority w:val="39"/>
+    <w:unhideWhenUsed/>
+    <w:rsid w:val="00B07092"/>
+    <w:pPr>
+      <w:spacing w:after="100" w:line="278" w:lineRule="auto"/>
+      <w:ind w:left="720"/>
+    </w:pPr>
+    <w:rPr>
+      <w:kern w:val="2"/>
+      <w:sz w:val="24"/>
+      <w:szCs w:val="24"/>
+      <w14:ligatures w14:val="standardContextual"/>
+    </w:rPr>
+  </w:style>
+  <w:style w:type="paragraph" w:styleId="TOC5">
+    <w:name w:val="toc 5"/>
+    <w:basedOn w:val="Normal"/>
+    <w:next w:val="Normal"/>
+    <w:autoRedefine/>
+    <w:uiPriority w:val="39"/>
+    <w:unhideWhenUsed/>
+    <w:rsid w:val="00B07092"/>
+    <w:pPr>
+      <w:spacing w:after="100" w:line="278" w:lineRule="auto"/>
+      <w:ind w:left="960"/>
+    </w:pPr>
+    <w:rPr>
+      <w:kern w:val="2"/>
+      <w:sz w:val="24"/>
+      <w:szCs w:val="24"/>
+      <w14:ligatures w14:val="standardContextual"/>
+    </w:rPr>
+  </w:style>
+  <w:style w:type="paragraph" w:styleId="TOC6">
+    <w:name w:val="toc 6"/>
+    <w:basedOn w:val="Normal"/>
+    <w:next w:val="Normal"/>
+    <w:autoRedefine/>
+    <w:uiPriority w:val="39"/>
+    <w:unhideWhenUsed/>
+    <w:rsid w:val="00B07092"/>
+    <w:pPr>
+      <w:spacing w:after="100" w:line="278" w:lineRule="auto"/>
+      <w:ind w:left="1200"/>
+    </w:pPr>
+    <w:rPr>
+      <w:kern w:val="2"/>
+      <w:sz w:val="24"/>
+      <w:szCs w:val="24"/>
+      <w14:ligatures w14:val="standardContextual"/>
+    </w:rPr>
+  </w:style>
+  <w:style w:type="paragraph" w:styleId="TOC7">
+    <w:name w:val="toc 7"/>
+    <w:basedOn w:val="Normal"/>
+    <w:next w:val="Normal"/>
+    <w:autoRedefine/>
+    <w:uiPriority w:val="39"/>
+    <w:unhideWhenUsed/>
+    <w:rsid w:val="00B07092"/>
+    <w:pPr>
+      <w:spacing w:after="100" w:line="278" w:lineRule="auto"/>
+      <w:ind w:left="1440"/>
+    </w:pPr>
+    <w:rPr>
+      <w:kern w:val="2"/>
+      <w:sz w:val="24"/>
+      <w:szCs w:val="24"/>
+      <w14:ligatures w14:val="standardContextual"/>
+    </w:rPr>
+  </w:style>
+  <w:style w:type="paragraph" w:styleId="TOC8">
+    <w:name w:val="toc 8"/>
+    <w:basedOn w:val="Normal"/>
+    <w:next w:val="Normal"/>
+    <w:autoRedefine/>
+    <w:uiPriority w:val="39"/>
+    <w:unhideWhenUsed/>
+    <w:rsid w:val="00B07092"/>
+    <w:pPr>
+      <w:spacing w:after="100" w:line="278" w:lineRule="auto"/>
+      <w:ind w:left="1680"/>
+    </w:pPr>
+    <w:rPr>
+      <w:kern w:val="2"/>
+      <w:sz w:val="24"/>
+      <w:szCs w:val="24"/>
+      <w14:ligatures w14:val="standardContextual"/>
+    </w:rPr>
+  </w:style>
+  <w:style w:type="paragraph" w:styleId="TOC9">
+    <w:name w:val="toc 9"/>
+    <w:basedOn w:val="Normal"/>
+    <w:next w:val="Normal"/>
+    <w:autoRedefine/>
+    <w:uiPriority w:val="39"/>
+    <w:unhideWhenUsed/>
+    <w:rsid w:val="00B07092"/>
+    <w:pPr>
+      <w:spacing w:after="100" w:line="278" w:lineRule="auto"/>
+      <w:ind w:left="1920"/>
+    </w:pPr>
+    <w:rPr>
+      <w:kern w:val="2"/>
+      <w:sz w:val="24"/>
+      <w:szCs w:val="24"/>
+      <w14:ligatures w14:val="standardContextual"/>
+    </w:rPr>
+  </w:style>
+  <w:style w:type="character" w:styleId="UnresolvedMention">
+    <w:name w:val="Unresolved Mention"/>
+    <w:basedOn w:val="DefaultParagraphFont"/>
+    <w:uiPriority w:val="99"/>
+    <w:semiHidden/>
+    <w:unhideWhenUsed/>
+    <w:rsid w:val="00B07092"/>
+    <w:rPr>
+      <w:color w:val="605E5C"/>
+      <w:shd w:val="clear" w:color="auto" w:fill="E1DFDD"/>
+    </w:rPr>
+  </w:style>
 </w:styles>
 </file>
 

</xml_diff>

<commit_message>
ci: update workflow to use JSONPLACEHOLDER service and marker
  - Replace SERVICE_NAME=REQRES with SERVICE_NAME=JSONPLACEHOLDER in ci.yml
  - Update pytest marker from "pta or reqres" to "pta or jsonplaceholder"
  - Bump tutorial.docx to v1.2 with updated API chapter and all reqres/commerce_tools references replaced
</commit_message>
<xml_diff>
--- a/tutorial/tutorial.docx
+++ b/tutorial/tutorial.docx
@@ -7,7 +7,7 @@
         <w:pStyle w:val="Heading1"/>
       </w:pPr>
       <w:bookmarkStart w:id="0" w:name="_Toc227102997"/>
-      <w:bookmarkStart w:id="1" w:name="_Toc227333393"/>
+      <w:bookmarkStart w:id="1" w:name="_Toc227442673"/>
       <w:r>
         <w:rPr>
           <w:sz w:val="52"/>
@@ -82,7 +82,7 @@
         <w:rPr>
           <w:color w:val="595959"/>
         </w:rPr>
-        <w:t xml:space="preserve"> 1.1 | </w:t>
+        <w:t xml:space="preserve"> 1.2 | </w:t>
       </w:r>
       <w:r>
         <w:rPr>
@@ -157,7 +157,7 @@
           <w:r>
             <w:fldChar w:fldCharType="separate"/>
           </w:r>
-          <w:hyperlink w:anchor="_Toc227333393" w:history="1">
+          <w:hyperlink w:anchor="_Toc227442673" w:history="1">
             <w:r>
               <w:rPr>
                 <w:rStyle w:val="Hyperlink"/>
@@ -184,7 +184,7 @@
                 <w:noProof/>
                 <w:webHidden/>
               </w:rPr>
-              <w:instrText xml:space="preserve"> PAGEREF _Toc227333393 \h </w:instrText>
+              <w:instrText xml:space="preserve"> PAGEREF _Toc227442673 \h </w:instrText>
             </w:r>
             <w:r>
               <w:rPr>
@@ -229,7 +229,7 @@
               <w14:ligatures w14:val="standardContextual"/>
             </w:rPr>
           </w:pPr>
-          <w:hyperlink w:anchor="_Toc227333394" w:history="1">
+          <w:hyperlink w:anchor="_Toc227442674" w:history="1">
             <w:r>
               <w:rPr>
                 <w:rStyle w:val="Hyperlink"/>
@@ -256,7 +256,7 @@
                 <w:noProof/>
                 <w:webHidden/>
               </w:rPr>
-              <w:instrText xml:space="preserve"> PAGEREF _Toc227333394 \h </w:instrText>
+              <w:instrText xml:space="preserve"> PAGEREF _Toc227442674 \h </w:instrText>
             </w:r>
             <w:r>
               <w:rPr>
@@ -301,13 +301,13 @@
               <w14:ligatures w14:val="standardContextual"/>
             </w:rPr>
           </w:pPr>
-          <w:hyperlink w:anchor="_Toc227333395" w:history="1">
+          <w:hyperlink w:anchor="_Toc227442675" w:history="1">
             <w:r>
               <w:rPr>
                 <w:rStyle w:val="Hyperlink"/>
                 <w:noProof/>
               </w:rPr>
-              <w:t>1.1 What is This Framework?</w:t>
+              <w:t>1.2 What is This Framework?</w:t>
             </w:r>
             <w:r>
               <w:rPr>
@@ -328,7 +328,7 @@
                 <w:noProof/>
                 <w:webHidden/>
               </w:rPr>
-              <w:instrText xml:space="preserve"> PAGEREF _Toc227333395 \h </w:instrText>
+              <w:instrText xml:space="preserve"> PAGEREF _Toc227442675 \h </w:instrText>
             </w:r>
             <w:r>
               <w:rPr>
@@ -373,7 +373,7 @@
               <w14:ligatures w14:val="standardContextual"/>
             </w:rPr>
           </w:pPr>
-          <w:hyperlink w:anchor="_Toc227333396" w:history="1">
+          <w:hyperlink w:anchor="_Toc227442676" w:history="1">
             <w:r>
               <w:rPr>
                 <w:rStyle w:val="Hyperlink"/>
@@ -400,7 +400,7 @@
                 <w:noProof/>
                 <w:webHidden/>
               </w:rPr>
-              <w:instrText xml:space="preserve"> PAGEREF _Toc227333396 \h </w:instrText>
+              <w:instrText xml:space="preserve"> PAGEREF _Toc227442676 \h </w:instrText>
             </w:r>
             <w:r>
               <w:rPr>
@@ -445,7 +445,7 @@
               <w14:ligatures w14:val="standardContextual"/>
             </w:rPr>
           </w:pPr>
-          <w:hyperlink w:anchor="_Toc227333397" w:history="1">
+          <w:hyperlink w:anchor="_Toc227442677" w:history="1">
             <w:r>
               <w:rPr>
                 <w:rStyle w:val="Hyperlink"/>
@@ -472,7 +472,7 @@
                 <w:noProof/>
                 <w:webHidden/>
               </w:rPr>
-              <w:instrText xml:space="preserve"> PAGEREF _Toc227333397 \h </w:instrText>
+              <w:instrText xml:space="preserve"> PAGEREF _Toc227442677 \h </w:instrText>
             </w:r>
             <w:r>
               <w:rPr>
@@ -517,7 +517,7 @@
               <w14:ligatures w14:val="standardContextual"/>
             </w:rPr>
           </w:pPr>
-          <w:hyperlink w:anchor="_Toc227333398" w:history="1">
+          <w:hyperlink w:anchor="_Toc227442678" w:history="1">
             <w:r>
               <w:rPr>
                 <w:rStyle w:val="Hyperlink"/>
@@ -544,7 +544,7 @@
                 <w:noProof/>
                 <w:webHidden/>
               </w:rPr>
-              <w:instrText xml:space="preserve"> PAGEREF _Toc227333398 \h </w:instrText>
+              <w:instrText xml:space="preserve"> PAGEREF _Toc227442678 \h </w:instrText>
             </w:r>
             <w:r>
               <w:rPr>
@@ -589,7 +589,7 @@
               <w14:ligatures w14:val="standardContextual"/>
             </w:rPr>
           </w:pPr>
-          <w:hyperlink w:anchor="_Toc227333399" w:history="1">
+          <w:hyperlink w:anchor="_Toc227442679" w:history="1">
             <w:r>
               <w:rPr>
                 <w:rStyle w:val="Hyperlink"/>
@@ -616,7 +616,7 @@
                 <w:noProof/>
                 <w:webHidden/>
               </w:rPr>
-              <w:instrText xml:space="preserve"> PAGEREF _Toc227333399 \h </w:instrText>
+              <w:instrText xml:space="preserve"> PAGEREF _Toc227442679 \h </w:instrText>
             </w:r>
             <w:r>
               <w:rPr>
@@ -661,7 +661,7 @@
               <w14:ligatures w14:val="standardContextual"/>
             </w:rPr>
           </w:pPr>
-          <w:hyperlink w:anchor="_Toc227333400" w:history="1">
+          <w:hyperlink w:anchor="_Toc227442680" w:history="1">
             <w:r>
               <w:rPr>
                 <w:rStyle w:val="Hyperlink"/>
@@ -688,7 +688,7 @@
                 <w:noProof/>
                 <w:webHidden/>
               </w:rPr>
-              <w:instrText xml:space="preserve"> PAGEREF _Toc227333400 \h </w:instrText>
+              <w:instrText xml:space="preserve"> PAGEREF _Toc227442680 \h </w:instrText>
             </w:r>
             <w:r>
               <w:rPr>
@@ -733,7 +733,7 @@
               <w14:ligatures w14:val="standardContextual"/>
             </w:rPr>
           </w:pPr>
-          <w:hyperlink w:anchor="_Toc227333401" w:history="1">
+          <w:hyperlink w:anchor="_Toc227442681" w:history="1">
             <w:r>
               <w:rPr>
                 <w:rStyle w:val="Hyperlink"/>
@@ -760,7 +760,7 @@
                 <w:noProof/>
                 <w:webHidden/>
               </w:rPr>
-              <w:instrText xml:space="preserve"> PAGEREF _Toc227333401 \h </w:instrText>
+              <w:instrText xml:space="preserve"> PAGEREF _Toc227442681 \h </w:instrText>
             </w:r>
             <w:r>
               <w:rPr>
@@ -805,7 +805,7 @@
               <w14:ligatures w14:val="standardContextual"/>
             </w:rPr>
           </w:pPr>
-          <w:hyperlink w:anchor="_Toc227333402" w:history="1">
+          <w:hyperlink w:anchor="_Toc227442682" w:history="1">
             <w:r>
               <w:rPr>
                 <w:rStyle w:val="Hyperlink"/>
@@ -832,7 +832,7 @@
                 <w:noProof/>
                 <w:webHidden/>
               </w:rPr>
-              <w:instrText xml:space="preserve"> PAGEREF _Toc227333402 \h </w:instrText>
+              <w:instrText xml:space="preserve"> PAGEREF _Toc227442682 \h </w:instrText>
             </w:r>
             <w:r>
               <w:rPr>
@@ -877,7 +877,7 @@
               <w14:ligatures w14:val="standardContextual"/>
             </w:rPr>
           </w:pPr>
-          <w:hyperlink w:anchor="_Toc227333403" w:history="1">
+          <w:hyperlink w:anchor="_Toc227442683" w:history="1">
             <w:r>
               <w:rPr>
                 <w:rStyle w:val="Hyperlink"/>
@@ -904,7 +904,7 @@
                 <w:noProof/>
                 <w:webHidden/>
               </w:rPr>
-              <w:instrText xml:space="preserve"> PAGEREF _Toc227333403 \h </w:instrText>
+              <w:instrText xml:space="preserve"> PAGEREF _Toc227442683 \h </w:instrText>
             </w:r>
             <w:r>
               <w:rPr>
@@ -949,7 +949,7 @@
               <w14:ligatures w14:val="standardContextual"/>
             </w:rPr>
           </w:pPr>
-          <w:hyperlink w:anchor="_Toc227333404" w:history="1">
+          <w:hyperlink w:anchor="_Toc227442684" w:history="1">
             <w:r>
               <w:rPr>
                 <w:rStyle w:val="Hyperlink"/>
@@ -976,7 +976,7 @@
                 <w:noProof/>
                 <w:webHidden/>
               </w:rPr>
-              <w:instrText xml:space="preserve"> PAGEREF _Toc227333404 \h </w:instrText>
+              <w:instrText xml:space="preserve"> PAGEREF _Toc227442684 \h </w:instrText>
             </w:r>
             <w:r>
               <w:rPr>
@@ -1021,7 +1021,7 @@
               <w14:ligatures w14:val="standardContextual"/>
             </w:rPr>
           </w:pPr>
-          <w:hyperlink w:anchor="_Toc227333405" w:history="1">
+          <w:hyperlink w:anchor="_Toc227442685" w:history="1">
             <w:r>
               <w:rPr>
                 <w:rStyle w:val="Hyperlink"/>
@@ -1048,7 +1048,7 @@
                 <w:noProof/>
                 <w:webHidden/>
               </w:rPr>
-              <w:instrText xml:space="preserve"> PAGEREF _Toc227333405 \h </w:instrText>
+              <w:instrText xml:space="preserve"> PAGEREF _Toc227442685 \h </w:instrText>
             </w:r>
             <w:r>
               <w:rPr>
@@ -1093,7 +1093,7 @@
               <w14:ligatures w14:val="standardContextual"/>
             </w:rPr>
           </w:pPr>
-          <w:hyperlink w:anchor="_Toc227333406" w:history="1">
+          <w:hyperlink w:anchor="_Toc227442686" w:history="1">
             <w:r>
               <w:rPr>
                 <w:rStyle w:val="Hyperlink"/>
@@ -1120,7 +1120,7 @@
                 <w:noProof/>
                 <w:webHidden/>
               </w:rPr>
-              <w:instrText xml:space="preserve"> PAGEREF _Toc227333406 \h </w:instrText>
+              <w:instrText xml:space="preserve"> PAGEREF _Toc227442686 \h </w:instrText>
             </w:r>
             <w:r>
               <w:rPr>
@@ -1165,7 +1165,7 @@
               <w14:ligatures w14:val="standardContextual"/>
             </w:rPr>
           </w:pPr>
-          <w:hyperlink w:anchor="_Toc227333407" w:history="1">
+          <w:hyperlink w:anchor="_Toc227442687" w:history="1">
             <w:r>
               <w:rPr>
                 <w:rStyle w:val="Hyperlink"/>
@@ -1192,7 +1192,7 @@
                 <w:noProof/>
                 <w:webHidden/>
               </w:rPr>
-              <w:instrText xml:space="preserve"> PAGEREF _Toc227333407 \h </w:instrText>
+              <w:instrText xml:space="preserve"> PAGEREF _Toc227442687 \h </w:instrText>
             </w:r>
             <w:r>
               <w:rPr>
@@ -1237,7 +1237,7 @@
               <w14:ligatures w14:val="standardContextual"/>
             </w:rPr>
           </w:pPr>
-          <w:hyperlink w:anchor="_Toc227333408" w:history="1">
+          <w:hyperlink w:anchor="_Toc227442688" w:history="1">
             <w:r>
               <w:rPr>
                 <w:rStyle w:val="Hyperlink"/>
@@ -1264,7 +1264,7 @@
                 <w:noProof/>
                 <w:webHidden/>
               </w:rPr>
-              <w:instrText xml:space="preserve"> PAGEREF _Toc227333408 \h </w:instrText>
+              <w:instrText xml:space="preserve"> PAGEREF _Toc227442688 \h </w:instrText>
             </w:r>
             <w:r>
               <w:rPr>
@@ -1309,7 +1309,7 @@
               <w14:ligatures w14:val="standardContextual"/>
             </w:rPr>
           </w:pPr>
-          <w:hyperlink w:anchor="_Toc227333409" w:history="1">
+          <w:hyperlink w:anchor="_Toc227442689" w:history="1">
             <w:r>
               <w:rPr>
                 <w:rStyle w:val="Hyperlink"/>
@@ -1336,7 +1336,7 @@
                 <w:noProof/>
                 <w:webHidden/>
               </w:rPr>
-              <w:instrText xml:space="preserve"> PAGEREF _Toc227333409 \h </w:instrText>
+              <w:instrText xml:space="preserve"> PAGEREF _Toc227442689 \h </w:instrText>
             </w:r>
             <w:r>
               <w:rPr>
@@ -1356,7 +1356,7 @@
                 <w:noProof/>
                 <w:webHidden/>
               </w:rPr>
-              <w:t>11</w:t>
+              <w:t>12</w:t>
             </w:r>
             <w:r>
               <w:rPr>
@@ -1381,7 +1381,7 @@
               <w14:ligatures w14:val="standardContextual"/>
             </w:rPr>
           </w:pPr>
-          <w:hyperlink w:anchor="_Toc227333410" w:history="1">
+          <w:hyperlink w:anchor="_Toc227442690" w:history="1">
             <w:r>
               <w:rPr>
                 <w:rStyle w:val="Hyperlink"/>
@@ -1408,7 +1408,7 @@
                 <w:noProof/>
                 <w:webHidden/>
               </w:rPr>
-              <w:instrText xml:space="preserve"> PAGEREF _Toc227333410 \h </w:instrText>
+              <w:instrText xml:space="preserve"> PAGEREF _Toc227442690 \h </w:instrText>
             </w:r>
             <w:r>
               <w:rPr>
@@ -1453,7 +1453,7 @@
               <w14:ligatures w14:val="standardContextual"/>
             </w:rPr>
           </w:pPr>
-          <w:hyperlink w:anchor="_Toc227333411" w:history="1">
+          <w:hyperlink w:anchor="_Toc227442691" w:history="1">
             <w:r>
               <w:rPr>
                 <w:rStyle w:val="Hyperlink"/>
@@ -1480,7 +1480,7 @@
                 <w:noProof/>
                 <w:webHidden/>
               </w:rPr>
-              <w:instrText xml:space="preserve"> PAGEREF _Toc227333411 \h </w:instrText>
+              <w:instrText xml:space="preserve"> PAGEREF _Toc227442691 \h </w:instrText>
             </w:r>
             <w:r>
               <w:rPr>
@@ -1525,7 +1525,7 @@
               <w14:ligatures w14:val="standardContextual"/>
             </w:rPr>
           </w:pPr>
-          <w:hyperlink w:anchor="_Toc227333412" w:history="1">
+          <w:hyperlink w:anchor="_Toc227442692" w:history="1">
             <w:r>
               <w:rPr>
                 <w:rStyle w:val="Hyperlink"/>
@@ -1552,7 +1552,7 @@
                 <w:noProof/>
                 <w:webHidden/>
               </w:rPr>
-              <w:instrText xml:space="preserve"> PAGEREF _Toc227333412 \h </w:instrText>
+              <w:instrText xml:space="preserve"> PAGEREF _Toc227442692 \h </w:instrText>
             </w:r>
             <w:r>
               <w:rPr>
@@ -1597,7 +1597,7 @@
               <w14:ligatures w14:val="standardContextual"/>
             </w:rPr>
           </w:pPr>
-          <w:hyperlink w:anchor="_Toc227333413" w:history="1">
+          <w:hyperlink w:anchor="_Toc227442693" w:history="1">
             <w:r>
               <w:rPr>
                 <w:rStyle w:val="Hyperlink"/>
@@ -1624,7 +1624,7 @@
                 <w:noProof/>
                 <w:webHidden/>
               </w:rPr>
-              <w:instrText xml:space="preserve"> PAGEREF _Toc227333413 \h </w:instrText>
+              <w:instrText xml:space="preserve"> PAGEREF _Toc227442693 \h </w:instrText>
             </w:r>
             <w:r>
               <w:rPr>
@@ -1669,7 +1669,7 @@
               <w14:ligatures w14:val="standardContextual"/>
             </w:rPr>
           </w:pPr>
-          <w:hyperlink w:anchor="_Toc227333414" w:history="1">
+          <w:hyperlink w:anchor="_Toc227442694" w:history="1">
             <w:r>
               <w:rPr>
                 <w:rStyle w:val="Hyperlink"/>
@@ -1696,7 +1696,7 @@
                 <w:noProof/>
                 <w:webHidden/>
               </w:rPr>
-              <w:instrText xml:space="preserve"> PAGEREF _Toc227333414 \h </w:instrText>
+              <w:instrText xml:space="preserve"> PAGEREF _Toc227442694 \h </w:instrText>
             </w:r>
             <w:r>
               <w:rPr>
@@ -1741,7 +1741,7 @@
               <w14:ligatures w14:val="standardContextual"/>
             </w:rPr>
           </w:pPr>
-          <w:hyperlink w:anchor="_Toc227333415" w:history="1">
+          <w:hyperlink w:anchor="_Toc227442695" w:history="1">
             <w:r>
               <w:rPr>
                 <w:rStyle w:val="Hyperlink"/>
@@ -1768,7 +1768,7 @@
                 <w:noProof/>
                 <w:webHidden/>
               </w:rPr>
-              <w:instrText xml:space="preserve"> PAGEREF _Toc227333415 \h </w:instrText>
+              <w:instrText xml:space="preserve"> PAGEREF _Toc227442695 \h </w:instrText>
             </w:r>
             <w:r>
               <w:rPr>
@@ -1813,7 +1813,7 @@
               <w14:ligatures w14:val="standardContextual"/>
             </w:rPr>
           </w:pPr>
-          <w:hyperlink w:anchor="_Toc227333416" w:history="1">
+          <w:hyperlink w:anchor="_Toc227442696" w:history="1">
             <w:r>
               <w:rPr>
                 <w:rStyle w:val="Hyperlink"/>
@@ -1840,7 +1840,7 @@
                 <w:noProof/>
                 <w:webHidden/>
               </w:rPr>
-              <w:instrText xml:space="preserve"> PAGEREF _Toc227333416 \h </w:instrText>
+              <w:instrText xml:space="preserve"> PAGEREF _Toc227442696 \h </w:instrText>
             </w:r>
             <w:r>
               <w:rPr>
@@ -1885,7 +1885,7 @@
               <w14:ligatures w14:val="standardContextual"/>
             </w:rPr>
           </w:pPr>
-          <w:hyperlink w:anchor="_Toc227333417" w:history="1">
+          <w:hyperlink w:anchor="_Toc227442697" w:history="1">
             <w:r>
               <w:rPr>
                 <w:rStyle w:val="Hyperlink"/>
@@ -1912,7 +1912,7 @@
                 <w:noProof/>
                 <w:webHidden/>
               </w:rPr>
-              <w:instrText xml:space="preserve"> PAGEREF _Toc227333417 \h </w:instrText>
+              <w:instrText xml:space="preserve"> PAGEREF _Toc227442697 \h </w:instrText>
             </w:r>
             <w:r>
               <w:rPr>
@@ -1957,7 +1957,7 @@
               <w14:ligatures w14:val="standardContextual"/>
             </w:rPr>
           </w:pPr>
-          <w:hyperlink w:anchor="_Toc227333418" w:history="1">
+          <w:hyperlink w:anchor="_Toc227442698" w:history="1">
             <w:r>
               <w:rPr>
                 <w:rStyle w:val="Hyperlink"/>
@@ -1984,7 +1984,7 @@
                 <w:noProof/>
                 <w:webHidden/>
               </w:rPr>
-              <w:instrText xml:space="preserve"> PAGEREF _Toc227333418 \h </w:instrText>
+              <w:instrText xml:space="preserve"> PAGEREF _Toc227442698 \h </w:instrText>
             </w:r>
             <w:r>
               <w:rPr>
@@ -2029,7 +2029,7 @@
               <w14:ligatures w14:val="standardContextual"/>
             </w:rPr>
           </w:pPr>
-          <w:hyperlink w:anchor="_Toc227333419" w:history="1">
+          <w:hyperlink w:anchor="_Toc227442699" w:history="1">
             <w:r>
               <w:rPr>
                 <w:rStyle w:val="Hyperlink"/>
@@ -2056,7 +2056,7 @@
                 <w:noProof/>
                 <w:webHidden/>
               </w:rPr>
-              <w:instrText xml:space="preserve"> PAGEREF _Toc227333419 \h </w:instrText>
+              <w:instrText xml:space="preserve"> PAGEREF _Toc227442699 \h </w:instrText>
             </w:r>
             <w:r>
               <w:rPr>
@@ -2101,7 +2101,7 @@
               <w14:ligatures w14:val="standardContextual"/>
             </w:rPr>
           </w:pPr>
-          <w:hyperlink w:anchor="_Toc227333420" w:history="1">
+          <w:hyperlink w:anchor="_Toc227442700" w:history="1">
             <w:r>
               <w:rPr>
                 <w:rStyle w:val="Hyperlink"/>
@@ -2128,7 +2128,7 @@
                 <w:noProof/>
                 <w:webHidden/>
               </w:rPr>
-              <w:instrText xml:space="preserve"> PAGEREF _Toc227333420 \h </w:instrText>
+              <w:instrText xml:space="preserve"> PAGEREF _Toc227442700 \h </w:instrText>
             </w:r>
             <w:r>
               <w:rPr>
@@ -2173,7 +2173,7 @@
               <w14:ligatures w14:val="standardContextual"/>
             </w:rPr>
           </w:pPr>
-          <w:hyperlink w:anchor="_Toc227333421" w:history="1">
+          <w:hyperlink w:anchor="_Toc227442701" w:history="1">
             <w:r>
               <w:rPr>
                 <w:rStyle w:val="Hyperlink"/>
@@ -2200,7 +2200,7 @@
                 <w:noProof/>
                 <w:webHidden/>
               </w:rPr>
-              <w:instrText xml:space="preserve"> PAGEREF _Toc227333421 \h </w:instrText>
+              <w:instrText xml:space="preserve"> PAGEREF _Toc227442701 \h </w:instrText>
             </w:r>
             <w:r>
               <w:rPr>
@@ -2245,7 +2245,7 @@
               <w14:ligatures w14:val="standardContextual"/>
             </w:rPr>
           </w:pPr>
-          <w:hyperlink w:anchor="_Toc227333422" w:history="1">
+          <w:hyperlink w:anchor="_Toc227442702" w:history="1">
             <w:r>
               <w:rPr>
                 <w:rStyle w:val="Hyperlink"/>
@@ -2272,7 +2272,7 @@
                 <w:noProof/>
                 <w:webHidden/>
               </w:rPr>
-              <w:instrText xml:space="preserve"> PAGEREF _Toc227333422 \h </w:instrText>
+              <w:instrText xml:space="preserve"> PAGEREF _Toc227442702 \h </w:instrText>
             </w:r>
             <w:r>
               <w:rPr>
@@ -2317,7 +2317,7 @@
               <w14:ligatures w14:val="standardContextual"/>
             </w:rPr>
           </w:pPr>
-          <w:hyperlink w:anchor="_Toc227333423" w:history="1">
+          <w:hyperlink w:anchor="_Toc227442703" w:history="1">
             <w:r>
               <w:rPr>
                 <w:rStyle w:val="Hyperlink"/>
@@ -2344,7 +2344,7 @@
                 <w:noProof/>
                 <w:webHidden/>
               </w:rPr>
-              <w:instrText xml:space="preserve"> PAGEREF _Toc227333423 \h </w:instrText>
+              <w:instrText xml:space="preserve"> PAGEREF _Toc227442703 \h </w:instrText>
             </w:r>
             <w:r>
               <w:rPr>
@@ -2389,7 +2389,7 @@
               <w14:ligatures w14:val="standardContextual"/>
             </w:rPr>
           </w:pPr>
-          <w:hyperlink w:anchor="_Toc227333424" w:history="1">
+          <w:hyperlink w:anchor="_Toc227442704" w:history="1">
             <w:r>
               <w:rPr>
                 <w:rStyle w:val="Hyperlink"/>
@@ -2416,7 +2416,7 @@
                 <w:noProof/>
                 <w:webHidden/>
               </w:rPr>
-              <w:instrText xml:space="preserve"> PAGEREF _Toc227333424 \h </w:instrText>
+              <w:instrText xml:space="preserve"> PAGEREF _Toc227442704 \h </w:instrText>
             </w:r>
             <w:r>
               <w:rPr>
@@ -2461,7 +2461,7 @@
               <w14:ligatures w14:val="standardContextual"/>
             </w:rPr>
           </w:pPr>
-          <w:hyperlink w:anchor="_Toc227333425" w:history="1">
+          <w:hyperlink w:anchor="_Toc227442705" w:history="1">
             <w:r>
               <w:rPr>
                 <w:rStyle w:val="Hyperlink"/>
@@ -2488,7 +2488,7 @@
                 <w:noProof/>
                 <w:webHidden/>
               </w:rPr>
-              <w:instrText xml:space="preserve"> PAGEREF _Toc227333425 \h </w:instrText>
+              <w:instrText xml:space="preserve"> PAGEREF _Toc227442705 \h </w:instrText>
             </w:r>
             <w:r>
               <w:rPr>
@@ -2533,7 +2533,7 @@
               <w14:ligatures w14:val="standardContextual"/>
             </w:rPr>
           </w:pPr>
-          <w:hyperlink w:anchor="_Toc227333426" w:history="1">
+          <w:hyperlink w:anchor="_Toc227442706" w:history="1">
             <w:r>
               <w:rPr>
                 <w:rStyle w:val="Hyperlink"/>
@@ -2560,7 +2560,7 @@
                 <w:noProof/>
                 <w:webHidden/>
               </w:rPr>
-              <w:instrText xml:space="preserve"> PAGEREF _Toc227333426 \h </w:instrText>
+              <w:instrText xml:space="preserve"> PAGEREF _Toc227442706 \h </w:instrText>
             </w:r>
             <w:r>
               <w:rPr>
@@ -2605,7 +2605,7 @@
               <w14:ligatures w14:val="standardContextual"/>
             </w:rPr>
           </w:pPr>
-          <w:hyperlink w:anchor="_Toc227333427" w:history="1">
+          <w:hyperlink w:anchor="_Toc227442707" w:history="1">
             <w:r>
               <w:rPr>
                 <w:rStyle w:val="Hyperlink"/>
@@ -2632,7 +2632,7 @@
                 <w:noProof/>
                 <w:webHidden/>
               </w:rPr>
-              <w:instrText xml:space="preserve"> PAGEREF _Toc227333427 \h </w:instrText>
+              <w:instrText xml:space="preserve"> PAGEREF _Toc227442707 \h </w:instrText>
             </w:r>
             <w:r>
               <w:rPr>
@@ -2677,7 +2677,7 @@
               <w14:ligatures w14:val="standardContextual"/>
             </w:rPr>
           </w:pPr>
-          <w:hyperlink w:anchor="_Toc227333428" w:history="1">
+          <w:hyperlink w:anchor="_Toc227442708" w:history="1">
             <w:r>
               <w:rPr>
                 <w:rStyle w:val="Hyperlink"/>
@@ -2704,7 +2704,7 @@
                 <w:noProof/>
                 <w:webHidden/>
               </w:rPr>
-              <w:instrText xml:space="preserve"> PAGEREF _Toc227333428 \h </w:instrText>
+              <w:instrText xml:space="preserve"> PAGEREF _Toc227442708 \h </w:instrText>
             </w:r>
             <w:r>
               <w:rPr>
@@ -2724,7 +2724,7 @@
                 <w:noProof/>
                 <w:webHidden/>
               </w:rPr>
-              <w:t>21</w:t>
+              <w:t>22</w:t>
             </w:r>
             <w:r>
               <w:rPr>
@@ -2749,7 +2749,7 @@
               <w14:ligatures w14:val="standardContextual"/>
             </w:rPr>
           </w:pPr>
-          <w:hyperlink w:anchor="_Toc227333429" w:history="1">
+          <w:hyperlink w:anchor="_Toc227442709" w:history="1">
             <w:r>
               <w:rPr>
                 <w:rStyle w:val="Hyperlink"/>
@@ -2776,7 +2776,7 @@
                 <w:noProof/>
                 <w:webHidden/>
               </w:rPr>
-              <w:instrText xml:space="preserve"> PAGEREF _Toc227333429 \h </w:instrText>
+              <w:instrText xml:space="preserve"> PAGEREF _Toc227442709 \h </w:instrText>
             </w:r>
             <w:r>
               <w:rPr>
@@ -2796,7 +2796,7 @@
                 <w:noProof/>
                 <w:webHidden/>
               </w:rPr>
-              <w:t>21</w:t>
+              <w:t>22</w:t>
             </w:r>
             <w:r>
               <w:rPr>
@@ -2821,13 +2821,13 @@
               <w14:ligatures w14:val="standardContextual"/>
             </w:rPr>
           </w:pPr>
-          <w:hyperlink w:anchor="_Toc227333430" w:history="1">
+          <w:hyperlink w:anchor="_Toc227442710" w:history="1">
             <w:r>
               <w:rPr>
                 <w:rStyle w:val="Hyperlink"/>
                 <w:noProof/>
               </w:rPr>
-              <w:t>7.2 Writing API Tests — Example (Reqres)</w:t>
+              <w:t>7.2 Writing API Tests — Example (JSONPlaceholder)</w:t>
             </w:r>
             <w:r>
               <w:rPr>
@@ -2848,7 +2848,7 @@
                 <w:noProof/>
                 <w:webHidden/>
               </w:rPr>
-              <w:instrText xml:space="preserve"> PAGEREF _Toc227333430 \h </w:instrText>
+              <w:instrText xml:space="preserve"> PAGEREF _Toc227442710 \h </w:instrText>
             </w:r>
             <w:r>
               <w:rPr>
@@ -2893,13 +2893,13 @@
               <w14:ligatures w14:val="standardContextual"/>
             </w:rPr>
           </w:pPr>
-          <w:hyperlink w:anchor="_Toc227333431" w:history="1">
+          <w:hyperlink w:anchor="_Toc227442711" w:history="1">
             <w:r>
               <w:rPr>
                 <w:rStyle w:val="Hyperlink"/>
                 <w:noProof/>
               </w:rPr>
-              <w:t>7.3 OAuth2 Authentication (Commerce Tools)</w:t>
+              <w:t>7.3 No-Auth APIs and the APIClient.patch() Method</w:t>
             </w:r>
             <w:r>
               <w:rPr>
@@ -2920,7 +2920,7 @@
                 <w:noProof/>
                 <w:webHidden/>
               </w:rPr>
-              <w:instrText xml:space="preserve"> PAGEREF _Toc227333431 \h </w:instrText>
+              <w:instrText xml:space="preserve"> PAGEREF _Toc227442711 \h </w:instrText>
             </w:r>
             <w:r>
               <w:rPr>
@@ -2965,7 +2965,7 @@
               <w14:ligatures w14:val="standardContextual"/>
             </w:rPr>
           </w:pPr>
-          <w:hyperlink w:anchor="_Toc227333432" w:history="1">
+          <w:hyperlink w:anchor="_Toc227442712" w:history="1">
             <w:r>
               <w:rPr>
                 <w:rStyle w:val="Hyperlink"/>
@@ -2992,7 +2992,7 @@
                 <w:noProof/>
                 <w:webHidden/>
               </w:rPr>
-              <w:instrText xml:space="preserve"> PAGEREF _Toc227333432 \h </w:instrText>
+              <w:instrText xml:space="preserve"> PAGEREF _Toc227442712 \h </w:instrText>
             </w:r>
             <w:r>
               <w:rPr>
@@ -3037,7 +3037,7 @@
               <w14:ligatures w14:val="standardContextual"/>
             </w:rPr>
           </w:pPr>
-          <w:hyperlink w:anchor="_Toc227333433" w:history="1">
+          <w:hyperlink w:anchor="_Toc227442713" w:history="1">
             <w:r>
               <w:rPr>
                 <w:rStyle w:val="Hyperlink"/>
@@ -3064,7 +3064,7 @@
                 <w:noProof/>
                 <w:webHidden/>
               </w:rPr>
-              <w:instrText xml:space="preserve"> PAGEREF _Toc227333433 \h </w:instrText>
+              <w:instrText xml:space="preserve"> PAGEREF _Toc227442713 \h </w:instrText>
             </w:r>
             <w:r>
               <w:rPr>
@@ -3109,7 +3109,7 @@
               <w14:ligatures w14:val="standardContextual"/>
             </w:rPr>
           </w:pPr>
-          <w:hyperlink w:anchor="_Toc227333434" w:history="1">
+          <w:hyperlink w:anchor="_Toc227442714" w:history="1">
             <w:r>
               <w:rPr>
                 <w:rStyle w:val="Hyperlink"/>
@@ -3136,7 +3136,7 @@
                 <w:noProof/>
                 <w:webHidden/>
               </w:rPr>
-              <w:instrText xml:space="preserve"> PAGEREF _Toc227333434 \h </w:instrText>
+              <w:instrText xml:space="preserve"> PAGEREF _Toc227442714 \h </w:instrText>
             </w:r>
             <w:r>
               <w:rPr>
@@ -3181,7 +3181,7 @@
               <w14:ligatures w14:val="standardContextual"/>
             </w:rPr>
           </w:pPr>
-          <w:hyperlink w:anchor="_Toc227333435" w:history="1">
+          <w:hyperlink w:anchor="_Toc227442715" w:history="1">
             <w:r>
               <w:rPr>
                 <w:rStyle w:val="Hyperlink"/>
@@ -3208,7 +3208,7 @@
                 <w:noProof/>
                 <w:webHidden/>
               </w:rPr>
-              <w:instrText xml:space="preserve"> PAGEREF _Toc227333435 \h </w:instrText>
+              <w:instrText xml:space="preserve"> PAGEREF _Toc227442715 \h </w:instrText>
             </w:r>
             <w:r>
               <w:rPr>
@@ -3253,7 +3253,7 @@
               <w14:ligatures w14:val="standardContextual"/>
             </w:rPr>
           </w:pPr>
-          <w:hyperlink w:anchor="_Toc227333436" w:history="1">
+          <w:hyperlink w:anchor="_Toc227442716" w:history="1">
             <w:r>
               <w:rPr>
                 <w:rStyle w:val="Hyperlink"/>
@@ -3280,7 +3280,7 @@
                 <w:noProof/>
                 <w:webHidden/>
               </w:rPr>
-              <w:instrText xml:space="preserve"> PAGEREF _Toc227333436 \h </w:instrText>
+              <w:instrText xml:space="preserve"> PAGEREF _Toc227442716 \h </w:instrText>
             </w:r>
             <w:r>
               <w:rPr>
@@ -3325,7 +3325,7 @@
               <w14:ligatures w14:val="standardContextual"/>
             </w:rPr>
           </w:pPr>
-          <w:hyperlink w:anchor="_Toc227333437" w:history="1">
+          <w:hyperlink w:anchor="_Toc227442717" w:history="1">
             <w:r>
               <w:rPr>
                 <w:rStyle w:val="Hyperlink"/>
@@ -3352,7 +3352,7 @@
                 <w:noProof/>
                 <w:webHidden/>
               </w:rPr>
-              <w:instrText xml:space="preserve"> PAGEREF _Toc227333437 \h </w:instrText>
+              <w:instrText xml:space="preserve"> PAGEREF _Toc227442717 \h </w:instrText>
             </w:r>
             <w:r>
               <w:rPr>
@@ -3397,7 +3397,7 @@
               <w14:ligatures w14:val="standardContextual"/>
             </w:rPr>
           </w:pPr>
-          <w:hyperlink w:anchor="_Toc227333438" w:history="1">
+          <w:hyperlink w:anchor="_Toc227442718" w:history="1">
             <w:r>
               <w:rPr>
                 <w:rStyle w:val="Hyperlink"/>
@@ -3424,7 +3424,7 @@
                 <w:noProof/>
                 <w:webHidden/>
               </w:rPr>
-              <w:instrText xml:space="preserve"> PAGEREF _Toc227333438 \h </w:instrText>
+              <w:instrText xml:space="preserve"> PAGEREF _Toc227442718 \h </w:instrText>
             </w:r>
             <w:r>
               <w:rPr>
@@ -3469,7 +3469,7 @@
               <w14:ligatures w14:val="standardContextual"/>
             </w:rPr>
           </w:pPr>
-          <w:hyperlink w:anchor="_Toc227333439" w:history="1">
+          <w:hyperlink w:anchor="_Toc227442719" w:history="1">
             <w:r>
               <w:rPr>
                 <w:rStyle w:val="Hyperlink"/>
@@ -3496,7 +3496,7 @@
                 <w:noProof/>
                 <w:webHidden/>
               </w:rPr>
-              <w:instrText xml:space="preserve"> PAGEREF _Toc227333439 \h </w:instrText>
+              <w:instrText xml:space="preserve"> PAGEREF _Toc227442719 \h </w:instrText>
             </w:r>
             <w:r>
               <w:rPr>
@@ -3541,7 +3541,7 @@
               <w14:ligatures w14:val="standardContextual"/>
             </w:rPr>
           </w:pPr>
-          <w:hyperlink w:anchor="_Toc227333440" w:history="1">
+          <w:hyperlink w:anchor="_Toc227442720" w:history="1">
             <w:r>
               <w:rPr>
                 <w:rStyle w:val="Hyperlink"/>
@@ -3568,7 +3568,7 @@
                 <w:noProof/>
                 <w:webHidden/>
               </w:rPr>
-              <w:instrText xml:space="preserve"> PAGEREF _Toc227333440 \h </w:instrText>
+              <w:instrText xml:space="preserve"> PAGEREF _Toc227442720 \h </w:instrText>
             </w:r>
             <w:r>
               <w:rPr>
@@ -3613,7 +3613,7 @@
               <w14:ligatures w14:val="standardContextual"/>
             </w:rPr>
           </w:pPr>
-          <w:hyperlink w:anchor="_Toc227333441" w:history="1">
+          <w:hyperlink w:anchor="_Toc227442721" w:history="1">
             <w:r>
               <w:rPr>
                 <w:rStyle w:val="Hyperlink"/>
@@ -3640,7 +3640,7 @@
                 <w:noProof/>
                 <w:webHidden/>
               </w:rPr>
-              <w:instrText xml:space="preserve"> PAGEREF _Toc227333441 \h </w:instrText>
+              <w:instrText xml:space="preserve"> PAGEREF _Toc227442721 \h </w:instrText>
             </w:r>
             <w:r>
               <w:rPr>
@@ -3685,7 +3685,7 @@
               <w14:ligatures w14:val="standardContextual"/>
             </w:rPr>
           </w:pPr>
-          <w:hyperlink w:anchor="_Toc227333442" w:history="1">
+          <w:hyperlink w:anchor="_Toc227442722" w:history="1">
             <w:r>
               <w:rPr>
                 <w:rStyle w:val="Hyperlink"/>
@@ -3712,7 +3712,7 @@
                 <w:noProof/>
                 <w:webHidden/>
               </w:rPr>
-              <w:instrText xml:space="preserve"> PAGEREF _Toc227333442 \h </w:instrText>
+              <w:instrText xml:space="preserve"> PAGEREF _Toc227442722 \h </w:instrText>
             </w:r>
             <w:r>
               <w:rPr>
@@ -3757,7 +3757,7 @@
               <w14:ligatures w14:val="standardContextual"/>
             </w:rPr>
           </w:pPr>
-          <w:hyperlink w:anchor="_Toc227333443" w:history="1">
+          <w:hyperlink w:anchor="_Toc227442723" w:history="1">
             <w:r>
               <w:rPr>
                 <w:rStyle w:val="Hyperlink"/>
@@ -3784,7 +3784,7 @@
                 <w:noProof/>
                 <w:webHidden/>
               </w:rPr>
-              <w:instrText xml:space="preserve"> PAGEREF _Toc227333443 \h </w:instrText>
+              <w:instrText xml:space="preserve"> PAGEREF _Toc227442723 \h </w:instrText>
             </w:r>
             <w:r>
               <w:rPr>
@@ -3829,7 +3829,7 @@
               <w14:ligatures w14:val="standardContextual"/>
             </w:rPr>
           </w:pPr>
-          <w:hyperlink w:anchor="_Toc227333444" w:history="1">
+          <w:hyperlink w:anchor="_Toc227442724" w:history="1">
             <w:r>
               <w:rPr>
                 <w:rStyle w:val="Hyperlink"/>
@@ -3856,7 +3856,7 @@
                 <w:noProof/>
                 <w:webHidden/>
               </w:rPr>
-              <w:instrText xml:space="preserve"> PAGEREF _Toc227333444 \h </w:instrText>
+              <w:instrText xml:space="preserve"> PAGEREF _Toc227442724 \h </w:instrText>
             </w:r>
             <w:r>
               <w:rPr>
@@ -3901,7 +3901,7 @@
               <w14:ligatures w14:val="standardContextual"/>
             </w:rPr>
           </w:pPr>
-          <w:hyperlink w:anchor="_Toc227333445" w:history="1">
+          <w:hyperlink w:anchor="_Toc227442725" w:history="1">
             <w:r>
               <w:rPr>
                 <w:rStyle w:val="Hyperlink"/>
@@ -3928,7 +3928,7 @@
                 <w:noProof/>
                 <w:webHidden/>
               </w:rPr>
-              <w:instrText xml:space="preserve"> PAGEREF _Toc227333445 \h </w:instrText>
+              <w:instrText xml:space="preserve"> PAGEREF _Toc227442725 \h </w:instrText>
             </w:r>
             <w:r>
               <w:rPr>
@@ -3973,7 +3973,7 @@
               <w14:ligatures w14:val="standardContextual"/>
             </w:rPr>
           </w:pPr>
-          <w:hyperlink w:anchor="_Toc227333446" w:history="1">
+          <w:hyperlink w:anchor="_Toc227442726" w:history="1">
             <w:r>
               <w:rPr>
                 <w:rStyle w:val="Hyperlink"/>
@@ -4000,7 +4000,7 @@
                 <w:noProof/>
                 <w:webHidden/>
               </w:rPr>
-              <w:instrText xml:space="preserve"> PAGEREF _Toc227333446 \h </w:instrText>
+              <w:instrText xml:space="preserve"> PAGEREF _Toc227442726 \h </w:instrText>
             </w:r>
             <w:r>
               <w:rPr>
@@ -4045,13 +4045,13 @@
               <w14:ligatures w14:val="standardContextual"/>
             </w:rPr>
           </w:pPr>
-          <w:hyperlink w:anchor="_Toc227333447" w:history="1">
+          <w:hyperlink w:anchor="_Toc227442727" w:history="1">
             <w:r>
               <w:rPr>
                 <w:rStyle w:val="Hyperlink"/>
                 <w:noProof/>
               </w:rPr>
-              <w:t>11.1 Parallel Execution with pytest-xdist</w:t>
+              <w:t>11.2 Parallel Execution with pytest-xdist</w:t>
             </w:r>
             <w:r>
               <w:rPr>
@@ -4072,7 +4072,7 @@
                 <w:noProof/>
                 <w:webHidden/>
               </w:rPr>
-              <w:instrText xml:space="preserve"> PAGEREF _Toc227333447 \h </w:instrText>
+              <w:instrText xml:space="preserve"> PAGEREF _Toc227442727 \h </w:instrText>
             </w:r>
             <w:r>
               <w:rPr>
@@ -4117,7 +4117,7 @@
               <w14:ligatures w14:val="standardContextual"/>
             </w:rPr>
           </w:pPr>
-          <w:hyperlink w:anchor="_Toc227333448" w:history="1">
+          <w:hyperlink w:anchor="_Toc227442728" w:history="1">
             <w:r>
               <w:rPr>
                 <w:rStyle w:val="Hyperlink"/>
@@ -4144,7 +4144,7 @@
                 <w:noProof/>
                 <w:webHidden/>
               </w:rPr>
-              <w:instrText xml:space="preserve"> PAGEREF _Toc227333448 \h </w:instrText>
+              <w:instrText xml:space="preserve"> PAGEREF _Toc227442728 \h </w:instrText>
             </w:r>
             <w:r>
               <w:rPr>
@@ -4189,7 +4189,7 @@
               <w14:ligatures w14:val="standardContextual"/>
             </w:rPr>
           </w:pPr>
-          <w:hyperlink w:anchor="_Toc227333449" w:history="1">
+          <w:hyperlink w:anchor="_Toc227442729" w:history="1">
             <w:r>
               <w:rPr>
                 <w:rStyle w:val="Hyperlink"/>
@@ -4216,7 +4216,7 @@
                 <w:noProof/>
                 <w:webHidden/>
               </w:rPr>
-              <w:instrText xml:space="preserve"> PAGEREF _Toc227333449 \h </w:instrText>
+              <w:instrText xml:space="preserve"> PAGEREF _Toc227442729 \h </w:instrText>
             </w:r>
             <w:r>
               <w:rPr>
@@ -4261,7 +4261,7 @@
               <w14:ligatures w14:val="standardContextual"/>
             </w:rPr>
           </w:pPr>
-          <w:hyperlink w:anchor="_Toc227333450" w:history="1">
+          <w:hyperlink w:anchor="_Toc227442730" w:history="1">
             <w:r>
               <w:rPr>
                 <w:rStyle w:val="Hyperlink"/>
@@ -4288,7 +4288,7 @@
                 <w:noProof/>
                 <w:webHidden/>
               </w:rPr>
-              <w:instrText xml:space="preserve"> PAGEREF _Toc227333450 \h </w:instrText>
+              <w:instrText xml:space="preserve"> PAGEREF _Toc227442730 \h </w:instrText>
             </w:r>
             <w:r>
               <w:rPr>
@@ -4333,7 +4333,7 @@
               <w14:ligatures w14:val="standardContextual"/>
             </w:rPr>
           </w:pPr>
-          <w:hyperlink w:anchor="_Toc227333451" w:history="1">
+          <w:hyperlink w:anchor="_Toc227442731" w:history="1">
             <w:r>
               <w:rPr>
                 <w:rStyle w:val="Hyperlink"/>
@@ -4360,7 +4360,7 @@
                 <w:noProof/>
                 <w:webHidden/>
               </w:rPr>
-              <w:instrText xml:space="preserve"> PAGEREF _Toc227333451 \h </w:instrText>
+              <w:instrText xml:space="preserve"> PAGEREF _Toc227442731 \h </w:instrText>
             </w:r>
             <w:r>
               <w:rPr>
@@ -4405,7 +4405,7 @@
               <w14:ligatures w14:val="standardContextual"/>
             </w:rPr>
           </w:pPr>
-          <w:hyperlink w:anchor="_Toc227333452" w:history="1">
+          <w:hyperlink w:anchor="_Toc227442732" w:history="1">
             <w:r>
               <w:rPr>
                 <w:rStyle w:val="Hyperlink"/>
@@ -4432,7 +4432,7 @@
                 <w:noProof/>
                 <w:webHidden/>
               </w:rPr>
-              <w:instrText xml:space="preserve"> PAGEREF _Toc227333452 \h </w:instrText>
+              <w:instrText xml:space="preserve"> PAGEREF _Toc227442732 \h </w:instrText>
             </w:r>
             <w:r>
               <w:rPr>
@@ -4477,7 +4477,7 @@
               <w14:ligatures w14:val="standardContextual"/>
             </w:rPr>
           </w:pPr>
-          <w:hyperlink w:anchor="_Toc227333453" w:history="1">
+          <w:hyperlink w:anchor="_Toc227442733" w:history="1">
             <w:r>
               <w:rPr>
                 <w:rStyle w:val="Hyperlink"/>
@@ -4504,7 +4504,7 @@
                 <w:noProof/>
                 <w:webHidden/>
               </w:rPr>
-              <w:instrText xml:space="preserve"> PAGEREF _Toc227333453 \h </w:instrText>
+              <w:instrText xml:space="preserve"> PAGEREF _Toc227442733 \h </w:instrText>
             </w:r>
             <w:r>
               <w:rPr>
@@ -4549,7 +4549,7 @@
               <w14:ligatures w14:val="standardContextual"/>
             </w:rPr>
           </w:pPr>
-          <w:hyperlink w:anchor="_Toc227333454" w:history="1">
+          <w:hyperlink w:anchor="_Toc227442734" w:history="1">
             <w:r>
               <w:rPr>
                 <w:rStyle w:val="Hyperlink"/>
@@ -4576,7 +4576,7 @@
                 <w:noProof/>
                 <w:webHidden/>
               </w:rPr>
-              <w:instrText xml:space="preserve"> PAGEREF _Toc227333454 \h </w:instrText>
+              <w:instrText xml:space="preserve"> PAGEREF _Toc227442734 \h </w:instrText>
             </w:r>
             <w:r>
               <w:rPr>
@@ -4621,7 +4621,7 @@
               <w14:ligatures w14:val="standardContextual"/>
             </w:rPr>
           </w:pPr>
-          <w:hyperlink w:anchor="_Toc227333455" w:history="1">
+          <w:hyperlink w:anchor="_Toc227442735" w:history="1">
             <w:r>
               <w:rPr>
                 <w:rStyle w:val="Hyperlink"/>
@@ -4648,7 +4648,7 @@
                 <w:noProof/>
                 <w:webHidden/>
               </w:rPr>
-              <w:instrText xml:space="preserve"> PAGEREF _Toc227333455 \h </w:instrText>
+              <w:instrText xml:space="preserve"> PAGEREF _Toc227442735 \h </w:instrText>
             </w:r>
             <w:r>
               <w:rPr>
@@ -4693,7 +4693,7 @@
               <w14:ligatures w14:val="standardContextual"/>
             </w:rPr>
           </w:pPr>
-          <w:hyperlink w:anchor="_Toc227333456" w:history="1">
+          <w:hyperlink w:anchor="_Toc227442736" w:history="1">
             <w:r>
               <w:rPr>
                 <w:rStyle w:val="Hyperlink"/>
@@ -4720,7 +4720,7 @@
                 <w:noProof/>
                 <w:webHidden/>
               </w:rPr>
-              <w:instrText xml:space="preserve"> PAGEREF _Toc227333456 \h </w:instrText>
+              <w:instrText xml:space="preserve"> PAGEREF _Toc227442736 \h </w:instrText>
             </w:r>
             <w:r>
               <w:rPr>
@@ -4765,7 +4765,7 @@
               <w14:ligatures w14:val="standardContextual"/>
             </w:rPr>
           </w:pPr>
-          <w:hyperlink w:anchor="_Toc227333457" w:history="1">
+          <w:hyperlink w:anchor="_Toc227442737" w:history="1">
             <w:r>
               <w:rPr>
                 <w:rStyle w:val="Hyperlink"/>
@@ -4792,7 +4792,7 @@
                 <w:noProof/>
                 <w:webHidden/>
               </w:rPr>
-              <w:instrText xml:space="preserve"> PAGEREF _Toc227333457 \h </w:instrText>
+              <w:instrText xml:space="preserve"> PAGEREF _Toc227442737 \h </w:instrText>
             </w:r>
             <w:r>
               <w:rPr>
@@ -4837,7 +4837,7 @@
               <w14:ligatures w14:val="standardContextual"/>
             </w:rPr>
           </w:pPr>
-          <w:hyperlink w:anchor="_Toc227333458" w:history="1">
+          <w:hyperlink w:anchor="_Toc227442738" w:history="1">
             <w:r>
               <w:rPr>
                 <w:rStyle w:val="Hyperlink"/>
@@ -4864,7 +4864,7 @@
                 <w:noProof/>
                 <w:webHidden/>
               </w:rPr>
-              <w:instrText xml:space="preserve"> PAGEREF _Toc227333458 \h </w:instrText>
+              <w:instrText xml:space="preserve"> PAGEREF _Toc227442738 \h </w:instrText>
             </w:r>
             <w:r>
               <w:rPr>
@@ -4909,7 +4909,7 @@
               <w14:ligatures w14:val="standardContextual"/>
             </w:rPr>
           </w:pPr>
-          <w:hyperlink w:anchor="_Toc227333459" w:history="1">
+          <w:hyperlink w:anchor="_Toc227442739" w:history="1">
             <w:r>
               <w:rPr>
                 <w:rStyle w:val="Hyperlink"/>
@@ -4936,7 +4936,7 @@
                 <w:noProof/>
                 <w:webHidden/>
               </w:rPr>
-              <w:instrText xml:space="preserve"> PAGEREF _Toc227333459 \h </w:instrText>
+              <w:instrText xml:space="preserve"> PAGEREF _Toc227442739 \h </w:instrText>
             </w:r>
             <w:r>
               <w:rPr>
@@ -4981,7 +4981,7 @@
               <w14:ligatures w14:val="standardContextual"/>
             </w:rPr>
           </w:pPr>
-          <w:hyperlink w:anchor="_Toc227333460" w:history="1">
+          <w:hyperlink w:anchor="_Toc227442740" w:history="1">
             <w:r>
               <w:rPr>
                 <w:rStyle w:val="Hyperlink"/>
@@ -5008,7 +5008,7 @@
                 <w:noProof/>
                 <w:webHidden/>
               </w:rPr>
-              <w:instrText xml:space="preserve"> PAGEREF _Toc227333460 \h </w:instrText>
+              <w:instrText xml:space="preserve"> PAGEREF _Toc227442740 \h </w:instrText>
             </w:r>
             <w:r>
               <w:rPr>
@@ -5053,7 +5053,7 @@
               <w14:ligatures w14:val="standardContextual"/>
             </w:rPr>
           </w:pPr>
-          <w:hyperlink w:anchor="_Toc227333461" w:history="1">
+          <w:hyperlink w:anchor="_Toc227442741" w:history="1">
             <w:r>
               <w:rPr>
                 <w:rStyle w:val="Hyperlink"/>
@@ -5080,7 +5080,7 @@
                 <w:noProof/>
                 <w:webHidden/>
               </w:rPr>
-              <w:instrText xml:space="preserve"> PAGEREF _Toc227333461 \h </w:instrText>
+              <w:instrText xml:space="preserve"> PAGEREF _Toc227442741 \h </w:instrText>
             </w:r>
             <w:r>
               <w:rPr>
@@ -5125,7 +5125,7 @@
               <w14:ligatures w14:val="standardContextual"/>
             </w:rPr>
           </w:pPr>
-          <w:hyperlink w:anchor="_Toc227333462" w:history="1">
+          <w:hyperlink w:anchor="_Toc227442742" w:history="1">
             <w:r>
               <w:rPr>
                 <w:rStyle w:val="Hyperlink"/>
@@ -5152,7 +5152,7 @@
                 <w:noProof/>
                 <w:webHidden/>
               </w:rPr>
-              <w:instrText xml:space="preserve"> PAGEREF _Toc227333462 \h </w:instrText>
+              <w:instrText xml:space="preserve"> PAGEREF _Toc227442742 \h </w:instrText>
             </w:r>
             <w:r>
               <w:rPr>
@@ -5197,7 +5197,7 @@
               <w14:ligatures w14:val="standardContextual"/>
             </w:rPr>
           </w:pPr>
-          <w:hyperlink w:anchor="_Toc227333463" w:history="1">
+          <w:hyperlink w:anchor="_Toc227442743" w:history="1">
             <w:r>
               <w:rPr>
                 <w:rStyle w:val="Hyperlink"/>
@@ -5224,7 +5224,7 @@
                 <w:noProof/>
                 <w:webHidden/>
               </w:rPr>
-              <w:instrText xml:space="preserve"> PAGEREF _Toc227333463 \h </w:instrText>
+              <w:instrText xml:space="preserve"> PAGEREF _Toc227442743 \h </w:instrText>
             </w:r>
             <w:r>
               <w:rPr>
@@ -5269,7 +5269,7 @@
               <w14:ligatures w14:val="standardContextual"/>
             </w:rPr>
           </w:pPr>
-          <w:hyperlink w:anchor="_Toc227333464" w:history="1">
+          <w:hyperlink w:anchor="_Toc227442744" w:history="1">
             <w:r>
               <w:rPr>
                 <w:rStyle w:val="Hyperlink"/>
@@ -5296,7 +5296,7 @@
                 <w:noProof/>
                 <w:webHidden/>
               </w:rPr>
-              <w:instrText xml:space="preserve"> PAGEREF _Toc227333464 \h </w:instrText>
+              <w:instrText xml:space="preserve"> PAGEREF _Toc227442744 \h </w:instrText>
             </w:r>
             <w:r>
               <w:rPr>
@@ -5341,7 +5341,7 @@
               <w14:ligatures w14:val="standardContextual"/>
             </w:rPr>
           </w:pPr>
-          <w:hyperlink w:anchor="_Toc227333465" w:history="1">
+          <w:hyperlink w:anchor="_Toc227442745" w:history="1">
             <w:r>
               <w:rPr>
                 <w:rStyle w:val="Hyperlink"/>
@@ -5368,7 +5368,7 @@
                 <w:noProof/>
                 <w:webHidden/>
               </w:rPr>
-              <w:instrText xml:space="preserve"> PAGEREF _Toc227333465 \h </w:instrText>
+              <w:instrText xml:space="preserve"> PAGEREF _Toc227442745 \h </w:instrText>
             </w:r>
             <w:r>
               <w:rPr>
@@ -5413,7 +5413,7 @@
               <w14:ligatures w14:val="standardContextual"/>
             </w:rPr>
           </w:pPr>
-          <w:hyperlink w:anchor="_Toc227333466" w:history="1">
+          <w:hyperlink w:anchor="_Toc227442746" w:history="1">
             <w:r>
               <w:rPr>
                 <w:rStyle w:val="Hyperlink"/>
@@ -5440,7 +5440,7 @@
                 <w:noProof/>
                 <w:webHidden/>
               </w:rPr>
-              <w:instrText xml:space="preserve"> PAGEREF _Toc227333466 \h </w:instrText>
+              <w:instrText xml:space="preserve"> PAGEREF _Toc227442746 \h </w:instrText>
             </w:r>
             <w:r>
               <w:rPr>
@@ -5485,7 +5485,7 @@
               <w14:ligatures w14:val="standardContextual"/>
             </w:rPr>
           </w:pPr>
-          <w:hyperlink w:anchor="_Toc227333467" w:history="1">
+          <w:hyperlink w:anchor="_Toc227442747" w:history="1">
             <w:r>
               <w:rPr>
                 <w:rStyle w:val="Hyperlink"/>
@@ -5512,7 +5512,7 @@
                 <w:noProof/>
                 <w:webHidden/>
               </w:rPr>
-              <w:instrText xml:space="preserve"> PAGEREF _Toc227333467 \h </w:instrText>
+              <w:instrText xml:space="preserve"> PAGEREF _Toc227442747 \h </w:instrText>
             </w:r>
             <w:r>
               <w:rPr>
@@ -5557,7 +5557,7 @@
               <w14:ligatures w14:val="standardContextual"/>
             </w:rPr>
           </w:pPr>
-          <w:hyperlink w:anchor="_Toc227333468" w:history="1">
+          <w:hyperlink w:anchor="_Toc227442748" w:history="1">
             <w:r>
               <w:rPr>
                 <w:rStyle w:val="Hyperlink"/>
@@ -5584,7 +5584,7 @@
                 <w:noProof/>
                 <w:webHidden/>
               </w:rPr>
-              <w:instrText xml:space="preserve"> PAGEREF _Toc227333468 \h </w:instrText>
+              <w:instrText xml:space="preserve"> PAGEREF _Toc227442748 \h </w:instrText>
             </w:r>
             <w:r>
               <w:rPr>
@@ -5629,7 +5629,7 @@
               <w14:ligatures w14:val="standardContextual"/>
             </w:rPr>
           </w:pPr>
-          <w:hyperlink w:anchor="_Toc227333469" w:history="1">
+          <w:hyperlink w:anchor="_Toc227442749" w:history="1">
             <w:r>
               <w:rPr>
                 <w:rStyle w:val="Hyperlink"/>
@@ -5656,7 +5656,7 @@
                 <w:noProof/>
                 <w:webHidden/>
               </w:rPr>
-              <w:instrText xml:space="preserve"> PAGEREF _Toc227333469 \h </w:instrText>
+              <w:instrText xml:space="preserve"> PAGEREF _Toc227442749 \h </w:instrText>
             </w:r>
             <w:r>
               <w:rPr>
@@ -5701,7 +5701,7 @@
               <w14:ligatures w14:val="standardContextual"/>
             </w:rPr>
           </w:pPr>
-          <w:hyperlink w:anchor="_Toc227333470" w:history="1">
+          <w:hyperlink w:anchor="_Toc227442750" w:history="1">
             <w:r>
               <w:rPr>
                 <w:rStyle w:val="Hyperlink"/>
@@ -5728,7 +5728,7 @@
                 <w:noProof/>
                 <w:webHidden/>
               </w:rPr>
-              <w:instrText xml:space="preserve"> PAGEREF _Toc227333470 \h </w:instrText>
+              <w:instrText xml:space="preserve"> PAGEREF _Toc227442750 \h </w:instrText>
             </w:r>
             <w:r>
               <w:rPr>
@@ -5773,7 +5773,7 @@
               <w14:ligatures w14:val="standardContextual"/>
             </w:rPr>
           </w:pPr>
-          <w:hyperlink w:anchor="_Toc227333471" w:history="1">
+          <w:hyperlink w:anchor="_Toc227442751" w:history="1">
             <w:r>
               <w:rPr>
                 <w:rStyle w:val="Hyperlink"/>
@@ -5800,7 +5800,7 @@
                 <w:noProof/>
                 <w:webHidden/>
               </w:rPr>
-              <w:instrText xml:space="preserve"> PAGEREF _Toc227333471 \h </w:instrText>
+              <w:instrText xml:space="preserve"> PAGEREF _Toc227442751 \h </w:instrText>
             </w:r>
             <w:r>
               <w:rPr>
@@ -5845,7 +5845,7 @@
               <w14:ligatures w14:val="standardContextual"/>
             </w:rPr>
           </w:pPr>
-          <w:hyperlink w:anchor="_Toc227333472" w:history="1">
+          <w:hyperlink w:anchor="_Toc227442752" w:history="1">
             <w:r>
               <w:rPr>
                 <w:rStyle w:val="Hyperlink"/>
@@ -5872,7 +5872,7 @@
                 <w:noProof/>
                 <w:webHidden/>
               </w:rPr>
-              <w:instrText xml:space="preserve"> PAGEREF _Toc227333472 \h </w:instrText>
+              <w:instrText xml:space="preserve"> PAGEREF _Toc227442752 \h </w:instrText>
             </w:r>
             <w:r>
               <w:rPr>
@@ -5917,7 +5917,7 @@
               <w14:ligatures w14:val="standardContextual"/>
             </w:rPr>
           </w:pPr>
-          <w:hyperlink w:anchor="_Toc227333473" w:history="1">
+          <w:hyperlink w:anchor="_Toc227442753" w:history="1">
             <w:r>
               <w:rPr>
                 <w:rStyle w:val="Hyperlink"/>
@@ -5944,7 +5944,7 @@
                 <w:noProof/>
                 <w:webHidden/>
               </w:rPr>
-              <w:instrText xml:space="preserve"> PAGEREF _Toc227333473 \h </w:instrText>
+              <w:instrText xml:space="preserve"> PAGEREF _Toc227442753 \h </w:instrText>
             </w:r>
             <w:r>
               <w:rPr>
@@ -5989,7 +5989,7 @@
               <w14:ligatures w14:val="standardContextual"/>
             </w:rPr>
           </w:pPr>
-          <w:hyperlink w:anchor="_Toc227333474" w:history="1">
+          <w:hyperlink w:anchor="_Toc227442754" w:history="1">
             <w:r>
               <w:rPr>
                 <w:rStyle w:val="Hyperlink"/>
@@ -6016,7 +6016,7 @@
                 <w:noProof/>
                 <w:webHidden/>
               </w:rPr>
-              <w:instrText xml:space="preserve"> PAGEREF _Toc227333474 \h </w:instrText>
+              <w:instrText xml:space="preserve"> PAGEREF _Toc227442754 \h </w:instrText>
             </w:r>
             <w:r>
               <w:rPr>
@@ -6061,7 +6061,7 @@
               <w14:ligatures w14:val="standardContextual"/>
             </w:rPr>
           </w:pPr>
-          <w:hyperlink w:anchor="_Toc227333475" w:history="1">
+          <w:hyperlink w:anchor="_Toc227442755" w:history="1">
             <w:r>
               <w:rPr>
                 <w:rStyle w:val="Hyperlink"/>
@@ -6088,7 +6088,7 @@
                 <w:noProof/>
                 <w:webHidden/>
               </w:rPr>
-              <w:instrText xml:space="preserve"> PAGEREF _Toc227333475 \h </w:instrText>
+              <w:instrText xml:space="preserve"> PAGEREF _Toc227442755 \h </w:instrText>
             </w:r>
             <w:r>
               <w:rPr>
@@ -6133,7 +6133,7 @@
               <w14:ligatures w14:val="standardContextual"/>
             </w:rPr>
           </w:pPr>
-          <w:hyperlink w:anchor="_Toc227333476" w:history="1">
+          <w:hyperlink w:anchor="_Toc227442756" w:history="1">
             <w:r>
               <w:rPr>
                 <w:rStyle w:val="Hyperlink"/>
@@ -6160,7 +6160,7 @@
                 <w:noProof/>
                 <w:webHidden/>
               </w:rPr>
-              <w:instrText xml:space="preserve"> PAGEREF _Toc227333476 \h </w:instrText>
+              <w:instrText xml:space="preserve"> PAGEREF _Toc227442756 \h </w:instrText>
             </w:r>
             <w:r>
               <w:rPr>
@@ -6205,7 +6205,7 @@
               <w14:ligatures w14:val="standardContextual"/>
             </w:rPr>
           </w:pPr>
-          <w:hyperlink w:anchor="_Toc227333477" w:history="1">
+          <w:hyperlink w:anchor="_Toc227442757" w:history="1">
             <w:r>
               <w:rPr>
                 <w:rStyle w:val="Hyperlink"/>
@@ -6232,7 +6232,7 @@
                 <w:noProof/>
                 <w:webHidden/>
               </w:rPr>
-              <w:instrText xml:space="preserve"> PAGEREF _Toc227333477 \h </w:instrText>
+              <w:instrText xml:space="preserve"> PAGEREF _Toc227442757 \h </w:instrText>
             </w:r>
             <w:r>
               <w:rPr>
@@ -6277,7 +6277,7 @@
               <w14:ligatures w14:val="standardContextual"/>
             </w:rPr>
           </w:pPr>
-          <w:hyperlink w:anchor="_Toc227333478" w:history="1">
+          <w:hyperlink w:anchor="_Toc227442758" w:history="1">
             <w:r>
               <w:rPr>
                 <w:rStyle w:val="Hyperlink"/>
@@ -6304,7 +6304,7 @@
                 <w:noProof/>
                 <w:webHidden/>
               </w:rPr>
-              <w:instrText xml:space="preserve"> PAGEREF _Toc227333478 \h </w:instrText>
+              <w:instrText xml:space="preserve"> PAGEREF _Toc227442758 \h </w:instrText>
             </w:r>
             <w:r>
               <w:rPr>
@@ -6349,7 +6349,7 @@
               <w14:ligatures w14:val="standardContextual"/>
             </w:rPr>
           </w:pPr>
-          <w:hyperlink w:anchor="_Toc227333479" w:history="1">
+          <w:hyperlink w:anchor="_Toc227442759" w:history="1">
             <w:r>
               <w:rPr>
                 <w:rStyle w:val="Hyperlink"/>
@@ -6376,7 +6376,7 @@
                 <w:noProof/>
                 <w:webHidden/>
               </w:rPr>
-              <w:instrText xml:space="preserve"> PAGEREF _Toc227333479 \h </w:instrText>
+              <w:instrText xml:space="preserve"> PAGEREF _Toc227442759 \h </w:instrText>
             </w:r>
             <w:r>
               <w:rPr>
@@ -6421,7 +6421,7 @@
               <w14:ligatures w14:val="standardContextual"/>
             </w:rPr>
           </w:pPr>
-          <w:hyperlink w:anchor="_Toc227333480" w:history="1">
+          <w:hyperlink w:anchor="_Toc227442760" w:history="1">
             <w:r>
               <w:rPr>
                 <w:rStyle w:val="Hyperlink"/>
@@ -6448,7 +6448,7 @@
                 <w:noProof/>
                 <w:webHidden/>
               </w:rPr>
-              <w:instrText xml:space="preserve"> PAGEREF _Toc227333480 \h </w:instrText>
+              <w:instrText xml:space="preserve"> PAGEREF _Toc227442760 \h </w:instrText>
             </w:r>
             <w:r>
               <w:rPr>
@@ -6493,7 +6493,7 @@
               <w14:ligatures w14:val="standardContextual"/>
             </w:rPr>
           </w:pPr>
-          <w:hyperlink w:anchor="_Toc227333481" w:history="1">
+          <w:hyperlink w:anchor="_Toc227442761" w:history="1">
             <w:r>
               <w:rPr>
                 <w:rStyle w:val="Hyperlink"/>
@@ -6520,7 +6520,7 @@
                 <w:noProof/>
                 <w:webHidden/>
               </w:rPr>
-              <w:instrText xml:space="preserve"> PAGEREF _Toc227333481 \h </w:instrText>
+              <w:instrText xml:space="preserve"> PAGEREF _Toc227442761 \h </w:instrText>
             </w:r>
             <w:r>
               <w:rPr>
@@ -6565,7 +6565,7 @@
               <w14:ligatures w14:val="standardContextual"/>
             </w:rPr>
           </w:pPr>
-          <w:hyperlink w:anchor="_Toc227333482" w:history="1">
+          <w:hyperlink w:anchor="_Toc227442762" w:history="1">
             <w:r>
               <w:rPr>
                 <w:rStyle w:val="Hyperlink"/>
@@ -6592,7 +6592,7 @@
                 <w:noProof/>
                 <w:webHidden/>
               </w:rPr>
-              <w:instrText xml:space="preserve"> PAGEREF _Toc227333482 \h </w:instrText>
+              <w:instrText xml:space="preserve"> PAGEREF _Toc227442762 \h </w:instrText>
             </w:r>
             <w:r>
               <w:rPr>
@@ -6637,7 +6637,7 @@
               <w14:ligatures w14:val="standardContextual"/>
             </w:rPr>
           </w:pPr>
-          <w:hyperlink w:anchor="_Toc227333483" w:history="1">
+          <w:hyperlink w:anchor="_Toc227442763" w:history="1">
             <w:r>
               <w:rPr>
                 <w:rStyle w:val="Hyperlink"/>
@@ -6664,7 +6664,7 @@
                 <w:noProof/>
                 <w:webHidden/>
               </w:rPr>
-              <w:instrText xml:space="preserve"> PAGEREF _Toc227333483 \h </w:instrText>
+              <w:instrText xml:space="preserve"> PAGEREF _Toc227442763 \h </w:instrText>
             </w:r>
             <w:r>
               <w:rPr>
@@ -6709,7 +6709,7 @@
               <w14:ligatures w14:val="standardContextual"/>
             </w:rPr>
           </w:pPr>
-          <w:hyperlink w:anchor="_Toc227333484" w:history="1">
+          <w:hyperlink w:anchor="_Toc227442764" w:history="1">
             <w:r>
               <w:rPr>
                 <w:rStyle w:val="Hyperlink"/>
@@ -6736,7 +6736,7 @@
                 <w:noProof/>
                 <w:webHidden/>
               </w:rPr>
-              <w:instrText xml:space="preserve"> PAGEREF _Toc227333484 \h </w:instrText>
+              <w:instrText xml:space="preserve"> PAGEREF _Toc227442764 \h </w:instrText>
             </w:r>
             <w:r>
               <w:rPr>
@@ -6781,7 +6781,7 @@
               <w14:ligatures w14:val="standardContextual"/>
             </w:rPr>
           </w:pPr>
-          <w:hyperlink w:anchor="_Toc227333485" w:history="1">
+          <w:hyperlink w:anchor="_Toc227442765" w:history="1">
             <w:r>
               <w:rPr>
                 <w:rStyle w:val="Hyperlink"/>
@@ -6808,7 +6808,7 @@
                 <w:noProof/>
                 <w:webHidden/>
               </w:rPr>
-              <w:instrText xml:space="preserve"> PAGEREF _Toc227333485 \h </w:instrText>
+              <w:instrText xml:space="preserve"> PAGEREF _Toc227442765 \h </w:instrText>
             </w:r>
             <w:r>
               <w:rPr>
@@ -6853,7 +6853,7 @@
               <w14:ligatures w14:val="standardContextual"/>
             </w:rPr>
           </w:pPr>
-          <w:hyperlink w:anchor="_Toc227333486" w:history="1">
+          <w:hyperlink w:anchor="_Toc227442766" w:history="1">
             <w:r>
               <w:rPr>
                 <w:rStyle w:val="Hyperlink"/>
@@ -6880,7 +6880,7 @@
                 <w:noProof/>
                 <w:webHidden/>
               </w:rPr>
-              <w:instrText xml:space="preserve"> PAGEREF _Toc227333486 \h </w:instrText>
+              <w:instrText xml:space="preserve"> PAGEREF _Toc227442766 \h </w:instrText>
             </w:r>
             <w:r>
               <w:rPr>
@@ -6925,7 +6925,7 @@
               <w14:ligatures w14:val="standardContextual"/>
             </w:rPr>
           </w:pPr>
-          <w:hyperlink w:anchor="_Toc227333487" w:history="1">
+          <w:hyperlink w:anchor="_Toc227442767" w:history="1">
             <w:r>
               <w:rPr>
                 <w:rStyle w:val="Hyperlink"/>
@@ -6952,7 +6952,7 @@
                 <w:noProof/>
                 <w:webHidden/>
               </w:rPr>
-              <w:instrText xml:space="preserve"> PAGEREF _Toc227333487 \h </w:instrText>
+              <w:instrText xml:space="preserve"> PAGEREF _Toc227442767 \h </w:instrText>
             </w:r>
             <w:r>
               <w:rPr>
@@ -6997,7 +6997,7 @@
               <w14:ligatures w14:val="standardContextual"/>
             </w:rPr>
           </w:pPr>
-          <w:hyperlink w:anchor="_Toc227333488" w:history="1">
+          <w:hyperlink w:anchor="_Toc227442768" w:history="1">
             <w:r>
               <w:rPr>
                 <w:rStyle w:val="Hyperlink"/>
@@ -7024,7 +7024,7 @@
                 <w:noProof/>
                 <w:webHidden/>
               </w:rPr>
-              <w:instrText xml:space="preserve"> PAGEREF _Toc227333488 \h </w:instrText>
+              <w:instrText xml:space="preserve"> PAGEREF _Toc227442768 \h </w:instrText>
             </w:r>
             <w:r>
               <w:rPr>
@@ -7069,7 +7069,7 @@
               <w14:ligatures w14:val="standardContextual"/>
             </w:rPr>
           </w:pPr>
-          <w:hyperlink w:anchor="_Toc227333489" w:history="1">
+          <w:hyperlink w:anchor="_Toc227442769" w:history="1">
             <w:r>
               <w:rPr>
                 <w:rStyle w:val="Hyperlink"/>
@@ -7096,7 +7096,7 @@
                 <w:noProof/>
                 <w:webHidden/>
               </w:rPr>
-              <w:instrText xml:space="preserve"> PAGEREF _Toc227333489 \h </w:instrText>
+              <w:instrText xml:space="preserve"> PAGEREF _Toc227442769 \h </w:instrText>
             </w:r>
             <w:r>
               <w:rPr>
@@ -7141,7 +7141,7 @@
               <w14:ligatures w14:val="standardContextual"/>
             </w:rPr>
           </w:pPr>
-          <w:hyperlink w:anchor="_Toc227333490" w:history="1">
+          <w:hyperlink w:anchor="_Toc227442770" w:history="1">
             <w:r>
               <w:rPr>
                 <w:rStyle w:val="Hyperlink"/>
@@ -7168,7 +7168,7 @@
                 <w:noProof/>
                 <w:webHidden/>
               </w:rPr>
-              <w:instrText xml:space="preserve"> PAGEREF _Toc227333490 \h </w:instrText>
+              <w:instrText xml:space="preserve"> PAGEREF _Toc227442770 \h </w:instrText>
             </w:r>
             <w:r>
               <w:rPr>
@@ -7213,7 +7213,7 @@
               <w14:ligatures w14:val="standardContextual"/>
             </w:rPr>
           </w:pPr>
-          <w:hyperlink w:anchor="_Toc227333491" w:history="1">
+          <w:hyperlink w:anchor="_Toc227442771" w:history="1">
             <w:r>
               <w:rPr>
                 <w:rStyle w:val="Hyperlink"/>
@@ -7240,7 +7240,7 @@
                 <w:noProof/>
                 <w:webHidden/>
               </w:rPr>
-              <w:instrText xml:space="preserve"> PAGEREF _Toc227333491 \h </w:instrText>
+              <w:instrText xml:space="preserve"> PAGEREF _Toc227442771 \h </w:instrText>
             </w:r>
             <w:r>
               <w:rPr>
@@ -7285,7 +7285,7 @@
               <w14:ligatures w14:val="standardContextual"/>
             </w:rPr>
           </w:pPr>
-          <w:hyperlink w:anchor="_Toc227333492" w:history="1">
+          <w:hyperlink w:anchor="_Toc227442772" w:history="1">
             <w:r>
               <w:rPr>
                 <w:rStyle w:val="Hyperlink"/>
@@ -7312,7 +7312,7 @@
                 <w:noProof/>
                 <w:webHidden/>
               </w:rPr>
-              <w:instrText xml:space="preserve"> PAGEREF _Toc227333492 \h </w:instrText>
+              <w:instrText xml:space="preserve"> PAGEREF _Toc227442772 \h </w:instrText>
             </w:r>
             <w:r>
               <w:rPr>
@@ -7357,7 +7357,7 @@
               <w14:ligatures w14:val="standardContextual"/>
             </w:rPr>
           </w:pPr>
-          <w:hyperlink w:anchor="_Toc227333493" w:history="1">
+          <w:hyperlink w:anchor="_Toc227442773" w:history="1">
             <w:r>
               <w:rPr>
                 <w:rStyle w:val="Hyperlink"/>
@@ -7384,7 +7384,7 @@
                 <w:noProof/>
                 <w:webHidden/>
               </w:rPr>
-              <w:instrText xml:space="preserve"> PAGEREF _Toc227333493 \h </w:instrText>
+              <w:instrText xml:space="preserve"> PAGEREF _Toc227442773 \h </w:instrText>
             </w:r>
             <w:r>
               <w:rPr>
@@ -7429,7 +7429,7 @@
               <w14:ligatures w14:val="standardContextual"/>
             </w:rPr>
           </w:pPr>
-          <w:hyperlink w:anchor="_Toc227333494" w:history="1">
+          <w:hyperlink w:anchor="_Toc227442774" w:history="1">
             <w:r>
               <w:rPr>
                 <w:rStyle w:val="Hyperlink"/>
@@ -7456,7 +7456,7 @@
                 <w:noProof/>
                 <w:webHidden/>
               </w:rPr>
-              <w:instrText xml:space="preserve"> PAGEREF _Toc227333494 \h </w:instrText>
+              <w:instrText xml:space="preserve"> PAGEREF _Toc227442774 \h </w:instrText>
             </w:r>
             <w:r>
               <w:rPr>
@@ -7501,7 +7501,7 @@
               <w14:ligatures w14:val="standardContextual"/>
             </w:rPr>
           </w:pPr>
-          <w:hyperlink w:anchor="_Toc227333495" w:history="1">
+          <w:hyperlink w:anchor="_Toc227442775" w:history="1">
             <w:r>
               <w:rPr>
                 <w:rStyle w:val="Hyperlink"/>
@@ -7528,7 +7528,7 @@
                 <w:noProof/>
                 <w:webHidden/>
               </w:rPr>
-              <w:instrText xml:space="preserve"> PAGEREF _Toc227333495 \h </w:instrText>
+              <w:instrText xml:space="preserve"> PAGEREF _Toc227442775 \h </w:instrText>
             </w:r>
             <w:r>
               <w:rPr>
@@ -7573,7 +7573,7 @@
               <w14:ligatures w14:val="standardContextual"/>
             </w:rPr>
           </w:pPr>
-          <w:hyperlink w:anchor="_Toc227333496" w:history="1">
+          <w:hyperlink w:anchor="_Toc227442776" w:history="1">
             <w:r>
               <w:rPr>
                 <w:rStyle w:val="Hyperlink"/>
@@ -7600,7 +7600,7 @@
                 <w:noProof/>
                 <w:webHidden/>
               </w:rPr>
-              <w:instrText xml:space="preserve"> PAGEREF _Toc227333496 \h </w:instrText>
+              <w:instrText xml:space="preserve"> PAGEREF _Toc227442776 \h </w:instrText>
             </w:r>
             <w:r>
               <w:rPr>
@@ -7645,7 +7645,7 @@
               <w14:ligatures w14:val="standardContextual"/>
             </w:rPr>
           </w:pPr>
-          <w:hyperlink w:anchor="_Toc227333497" w:history="1">
+          <w:hyperlink w:anchor="_Toc227442777" w:history="1">
             <w:r>
               <w:rPr>
                 <w:rStyle w:val="Hyperlink"/>
@@ -7672,7 +7672,7 @@
                 <w:noProof/>
                 <w:webHidden/>
               </w:rPr>
-              <w:instrText xml:space="preserve"> PAGEREF _Toc227333497 \h </w:instrText>
+              <w:instrText xml:space="preserve"> PAGEREF _Toc227442777 \h </w:instrText>
             </w:r>
             <w:r>
               <w:rPr>
@@ -7717,7 +7717,7 @@
               <w14:ligatures w14:val="standardContextual"/>
             </w:rPr>
           </w:pPr>
-          <w:hyperlink w:anchor="_Toc227333498" w:history="1">
+          <w:hyperlink w:anchor="_Toc227442778" w:history="1">
             <w:r>
               <w:rPr>
                 <w:rStyle w:val="Hyperlink"/>
@@ -7744,7 +7744,7 @@
                 <w:noProof/>
                 <w:webHidden/>
               </w:rPr>
-              <w:instrText xml:space="preserve"> PAGEREF _Toc227333498 \h </w:instrText>
+              <w:instrText xml:space="preserve"> PAGEREF _Toc227442778 \h </w:instrText>
             </w:r>
             <w:r>
               <w:rPr>
@@ -7789,7 +7789,7 @@
               <w14:ligatures w14:val="standardContextual"/>
             </w:rPr>
           </w:pPr>
-          <w:hyperlink w:anchor="_Toc227333499" w:history="1">
+          <w:hyperlink w:anchor="_Toc227442779" w:history="1">
             <w:r>
               <w:rPr>
                 <w:rStyle w:val="Hyperlink"/>
@@ -7816,7 +7816,7 @@
                 <w:noProof/>
                 <w:webHidden/>
               </w:rPr>
-              <w:instrText xml:space="preserve"> PAGEREF _Toc227333499 \h </w:instrText>
+              <w:instrText xml:space="preserve"> PAGEREF _Toc227442779 \h </w:instrText>
             </w:r>
             <w:r>
               <w:rPr>
@@ -7861,7 +7861,7 @@
               <w14:ligatures w14:val="standardContextual"/>
             </w:rPr>
           </w:pPr>
-          <w:hyperlink w:anchor="_Toc227333500" w:history="1">
+          <w:hyperlink w:anchor="_Toc227442780" w:history="1">
             <w:r>
               <w:rPr>
                 <w:rStyle w:val="Hyperlink"/>
@@ -7888,7 +7888,7 @@
                 <w:noProof/>
                 <w:webHidden/>
               </w:rPr>
-              <w:instrText xml:space="preserve"> PAGEREF _Toc227333500 \h </w:instrText>
+              <w:instrText xml:space="preserve"> PAGEREF _Toc227442780 \h </w:instrText>
             </w:r>
             <w:r>
               <w:rPr>
@@ -7908,7 +7908,7 @@
                 <w:noProof/>
                 <w:webHidden/>
               </w:rPr>
-              <w:t>56</w:t>
+              <w:t>55</w:t>
             </w:r>
             <w:r>
               <w:rPr>
@@ -7933,7 +7933,7 @@
               <w14:ligatures w14:val="standardContextual"/>
             </w:rPr>
           </w:pPr>
-          <w:hyperlink w:anchor="_Toc227333501" w:history="1">
+          <w:hyperlink w:anchor="_Toc227442781" w:history="1">
             <w:r>
               <w:rPr>
                 <w:rStyle w:val="Hyperlink"/>
@@ -7960,7 +7960,7 @@
                 <w:noProof/>
                 <w:webHidden/>
               </w:rPr>
-              <w:instrText xml:space="preserve"> PAGEREF _Toc227333501 \h </w:instrText>
+              <w:instrText xml:space="preserve"> PAGEREF _Toc227442781 \h </w:instrText>
             </w:r>
             <w:r>
               <w:rPr>
@@ -8016,7 +8016,7 @@
         </w:pBdr>
       </w:pPr>
       <w:bookmarkStart w:id="2" w:name="_Toc227102999"/>
-      <w:bookmarkStart w:id="3" w:name="_Toc227333394"/>
+      <w:bookmarkStart w:id="3" w:name="_Toc227442674"/>
       <w:r>
         <w:rPr>
           <w:sz w:val="36"/>
@@ -8049,9 +8049,9 @@
         <w:pStyle w:val="Heading2"/>
       </w:pPr>
       <w:bookmarkStart w:id="4" w:name="_Toc227103000"/>
-      <w:bookmarkStart w:id="5" w:name="_Toc227333395"/>
-      <w:r>
-        <w:t>1.1 What is This Framework?</w:t>
+      <w:bookmarkStart w:id="5" w:name="_Toc227442675"/>
+      <w:r>
+        <w:t>1.2 What is This Framework?</w:t>
       </w:r>
       <w:bookmarkEnd w:id="4"/>
       <w:bookmarkEnd w:id="5"/>
@@ -8060,6 +8060,334 @@
       <w:r>
         <w:t>This is a production-grade, multi-layer test automation framework built with Python. It supports three types of testing out-of-the-box:</w:t>
       </w:r>
+    </w:p>
+    <w:tbl>
+      <w:tblPr>
+        <w:tblStyle w:val="TableGrid"/>
+        <w:tblW w:w="0" w:type="auto"/>
+        <w:tblLook w:val="04A0" w:firstRow="1" w:lastRow="0" w:firstColumn="1" w:lastColumn="0" w:noHBand="0" w:noVBand="1"/>
+      </w:tblPr>
+      <w:tblGrid>
+        <w:gridCol w:w="2556"/>
+        <w:gridCol w:w="2594"/>
+        <w:gridCol w:w="3706"/>
+      </w:tblGrid>
+      <w:tr>
+        <w:tc>
+          <w:tcPr>
+            <w:tcW w:w="2880" w:type="dxa"/>
+            <w:shd w:val="clear" w:color="auto" w:fill="2E74B5"/>
+          </w:tcPr>
+          <w:p>
+            <w:r>
+              <w:rPr>
+                <w:b/>
+                <w:color w:val="FFFFFF"/>
+              </w:rPr>
+              <w:t>Test Type</w:t>
+            </w:r>
+          </w:p>
+        </w:tc>
+        <w:tc>
+          <w:tcPr>
+            <w:tcW w:w="2880" w:type="dxa"/>
+            <w:shd w:val="clear" w:color="auto" w:fill="2E74B5"/>
+          </w:tcPr>
+          <w:p>
+            <w:r>
+              <w:rPr>
+                <w:b/>
+                <w:color w:val="FFFFFF"/>
+              </w:rPr>
+              <w:t>Tool / Technology</w:t>
+            </w:r>
+          </w:p>
+        </w:tc>
+        <w:tc>
+          <w:tcPr>
+            <w:tcW w:w="2880" w:type="dxa"/>
+            <w:shd w:val="clear" w:color="auto" w:fill="2E74B5"/>
+          </w:tcPr>
+          <w:p>
+            <w:r>
+              <w:rPr>
+                <w:b/>
+                <w:color w:val="FFFFFF"/>
+              </w:rPr>
+              <w:t>Example Application</w:t>
+            </w:r>
+          </w:p>
+        </w:tc>
+      </w:tr>
+      <w:tr>
+        <w:tc>
+          <w:tcPr>
+            <w:tcW w:w="2880" w:type="dxa"/>
+          </w:tcPr>
+          <w:p>
+            <w:r>
+              <w:t>UI (Browser)</w:t>
+            </w:r>
+          </w:p>
+        </w:tc>
+        <w:tc>
+          <w:tcPr>
+            <w:tcW w:w="2880" w:type="dxa"/>
+          </w:tcPr>
+          <w:p>
+            <w:r>
+              <w:t>Selenium WebDriver 4.x</w:t>
+            </w:r>
+          </w:p>
+        </w:tc>
+        <w:tc>
+          <w:tcPr>
+            <w:tcW w:w="2880" w:type="dxa"/>
+          </w:tcPr>
+          <w:p>
+            <w:r>
+              <w:t>PTA website, The Internet Herokuapp</w:t>
+            </w:r>
+          </w:p>
+        </w:tc>
+      </w:tr>
+      <w:tr>
+        <w:tc>
+          <w:tcPr>
+            <w:tcW w:w="2880" w:type="dxa"/>
+          </w:tcPr>
+          <w:p>
+            <w:r>
+              <w:t>API (REST)</w:t>
+            </w:r>
+          </w:p>
+        </w:tc>
+        <w:tc>
+          <w:tcPr>
+            <w:tcW w:w="2880" w:type="dxa"/>
+          </w:tcPr>
+          <w:p>
+            <w:r>
+              <w:t>Python requests + APIClient</w:t>
+            </w:r>
+          </w:p>
+        </w:tc>
+        <w:tc>
+          <w:tcPr>
+            <w:tcW w:w="2880" w:type="dxa"/>
+          </w:tcPr>
+          <w:p>
+            <w:r>
+              <w:t>JSONPlaceholder (jsonplaceholder.typicode.com)Tools</w:t>
+            </w:r>
+          </w:p>
+        </w:tc>
+      </w:tr>
+      <w:tr>
+        <w:tc>
+          <w:tcPr>
+            <w:tcW w:w="2880" w:type="dxa"/>
+          </w:tcPr>
+          <w:p>
+            <w:r>
+              <w:t>Mobile (Android)</w:t>
+            </w:r>
+          </w:p>
+        </w:tc>
+        <w:tc>
+          <w:tcPr>
+            <w:tcW w:w="2880" w:type="dxa"/>
+          </w:tcPr>
+          <w:p>
+            <w:r>
+              <w:t>Appium + Android Emulator</w:t>
+            </w:r>
+          </w:p>
+        </w:tc>
+        <w:tc>
+          <w:tcPr>
+            <w:tcW w:w="2880" w:type="dxa"/>
+          </w:tcPr>
+          <w:p>
+            <w:r>
+              <w:t>KWA Demo App</w:t>
+            </w:r>
+          </w:p>
+        </w:tc>
+      </w:tr>
+    </w:tbl>
+    <w:p>
+      <w:pPr>
+        <w:pStyle w:val="Heading2"/>
+      </w:pPr>
+      <w:bookmarkStart w:id="6" w:name="_Toc227103001"/>
+      <w:bookmarkStart w:id="7" w:name="_Toc227442676"/>
+      <w:r>
+        <w:t>1.2 Key Capabilities</w:t>
+      </w:r>
+      <w:bookmarkEnd w:id="6"/>
+      <w:bookmarkEnd w:id="7"/>
+    </w:p>
+    <w:p>
+      <w:r>
+        <w:t>This framework is designed to scale from a single developer running one test locally to a full CI/CD pipeline running hundreds of tests in parallel inside Docker containers. Here is what it gives you:</w:t>
+      </w:r>
+    </w:p>
+    <w:p>
+      <w:pPr>
+        <w:pStyle w:val="ListParagraph"/>
+        <w:numPr>
+          <w:ilvl w:val="0"/>
+          <w:numId w:val="1"/>
+        </w:numPr>
+      </w:pPr>
+      <w:r>
+        <w:t>Page Object Model (POM) — clean separation of locators, actions, and test logic</w:t>
+      </w:r>
+    </w:p>
+    <w:p>
+      <w:pPr>
+        <w:pStyle w:val="ListParagraph"/>
+        <w:numPr>
+          <w:ilvl w:val="0"/>
+          <w:numId w:val="1"/>
+        </w:numPr>
+      </w:pPr>
+      <w:r>
+        <w:t>Configuration-driven execution — swap environments (QA/Stage/Prod) with a single env variable</w:t>
+      </w:r>
+    </w:p>
+    <w:p>
+      <w:pPr>
+        <w:pStyle w:val="ListParagraph"/>
+        <w:numPr>
+          <w:ilvl w:val="0"/>
+          <w:numId w:val="1"/>
+        </w:numPr>
+      </w:pPr>
+      <w:r>
+        <w:t>Multi-browser support — Chrome, Firefox, and Edge with headless mode for CI/CD</w:t>
+      </w:r>
+    </w:p>
+    <w:p>
+      <w:pPr>
+        <w:pStyle w:val="ListParagraph"/>
+        <w:numPr>
+          <w:ilvl w:val="0"/>
+          <w:numId w:val="1"/>
+        </w:numPr>
+      </w:pPr>
+      <w:r>
+        <w:t>Parallel test execution — run tests concurrently with pytest-xdist (-n 4)</w:t>
+      </w:r>
+    </w:p>
+    <w:p>
+      <w:pPr>
+        <w:pStyle w:val="ListParagraph"/>
+        <w:numPr>
+          <w:ilvl w:val="0"/>
+          <w:numId w:val="1"/>
+        </w:numPr>
+      </w:pPr>
+      <w:r>
+        <w:t>Automatic screenshot on failure — never lose a visual clue when a test breaks</w:t>
+      </w:r>
+    </w:p>
+    <w:p>
+      <w:pPr>
+        <w:pStyle w:val="ListParagraph"/>
+        <w:numPr>
+          <w:ilvl w:val="0"/>
+          <w:numId w:val="1"/>
+        </w:numPr>
+      </w:pPr>
+      <w:r>
+        <w:t>Video recording of every test — recorded via ffmpeg, deleted on pass to save disk space</w:t>
+      </w:r>
+    </w:p>
+    <w:p>
+      <w:pPr>
+        <w:pStyle w:val="ListParagraph"/>
+        <w:numPr>
+          <w:ilvl w:val="0"/>
+          <w:numId w:val="1"/>
+        </w:numPr>
+      </w:pPr>
+      <w:r>
+        <w:t>Allure + HTML reports — rich, interactive reports with history trends</w:t>
+      </w:r>
+    </w:p>
+    <w:p>
+      <w:pPr>
+        <w:pStyle w:val="ListParagraph"/>
+        <w:numPr>
+          <w:ilvl w:val="0"/>
+          <w:numId w:val="1"/>
+        </w:numPr>
+      </w:pPr>
+      <w:r>
+        <w:t>Docker containerization — zero-configuration test runs on any machine</w:t>
+      </w:r>
+    </w:p>
+    <w:p>
+      <w:pPr>
+        <w:pStyle w:val="ListParagraph"/>
+        <w:numPr>
+          <w:ilvl w:val="0"/>
+          <w:numId w:val="1"/>
+        </w:numPr>
+      </w:pPr>
+      <w:r>
+        <w:t>Jenkins CI/CD pipeline — automated build → test → report archival</w:t>
+      </w:r>
+    </w:p>
+    <w:p>
+      <w:pPr>
+        <w:pStyle w:val="ListParagraph"/>
+        <w:numPr>
+          <w:ilvl w:val="0"/>
+          <w:numId w:val="1"/>
+        </w:numPr>
+      </w:pPr>
+      <w:r>
+        <w:t>BDD support — write tests in Gherkin with pytest-bdd</w:t>
+      </w:r>
+    </w:p>
+    <w:p>
+      <w:pPr>
+        <w:pStyle w:val="ListParagraph"/>
+        <w:numPr>
+          <w:ilvl w:val="0"/>
+          <w:numId w:val="1"/>
+        </w:numPr>
+      </w:pPr>
+      <w:r>
+        <w:t>Full HTTP verb coverage — GET, POST, PUT, PATCH, DELETE via the APIClient class</w:t>
+      </w:r>
+    </w:p>
+    <w:p>
+      <w:pPr>
+        <w:pStyle w:val="ListParagraph"/>
+        <w:numPr>
+          <w:ilvl w:val="0"/>
+          <w:numId w:val="1"/>
+        </w:numPr>
+      </w:pPr>
+      <w:r>
+        <w:t>Rotating file logger with colored console output</w:t>
+      </w:r>
+    </w:p>
+    <w:p>
+      <w:pPr>
+        <w:pStyle w:val="Heading2"/>
+      </w:pPr>
+      <w:bookmarkStart w:id="8" w:name="_Toc227103002"/>
+      <w:bookmarkStart w:id="9" w:name="_Toc227442677"/>
+      <w:r>
+        <w:t>1.3 Technology Stack</w:t>
+      </w:r>
+      <w:bookmarkEnd w:id="8"/>
+      <w:bookmarkEnd w:id="9"/>
     </w:p>
     <w:tbl>
       <w:tblPr>
@@ -8076,7 +8404,7 @@
         <w:tc>
           <w:tcPr>
             <w:tcW w:w="2880" w:type="dxa"/>
-            <w:shd w:val="clear" w:color="auto" w:fill="2E74B5"/>
+            <w:shd w:val="clear" w:color="auto" w:fill="FFFFFF"/>
           </w:tcPr>
           <w:p>
             <w:r>
@@ -8084,14 +8412,14 @@
                 <w:b/>
                 <w:color w:val="FFFFFF"/>
               </w:rPr>
-              <w:t>Test Type</w:t>
-            </w:r>
-          </w:p>
-        </w:tc>
-        <w:tc>
-          <w:tcPr>
-            <w:tcW w:w="2880" w:type="dxa"/>
-            <w:shd w:val="clear" w:color="auto" w:fill="2E74B5"/>
+              <w:t>Package</w:t>
+            </w:r>
+          </w:p>
+        </w:tc>
+        <w:tc>
+          <w:tcPr>
+            <w:tcW w:w="2880" w:type="dxa"/>
+            <w:shd w:val="clear" w:color="auto" w:fill="FFFFFF"/>
           </w:tcPr>
           <w:p>
             <w:r>
@@ -8099,14 +8427,14 @@
                 <w:b/>
                 <w:color w:val="FFFFFF"/>
               </w:rPr>
-              <w:t>Tool / Technology</w:t>
-            </w:r>
-          </w:p>
-        </w:tc>
-        <w:tc>
-          <w:tcPr>
-            <w:tcW w:w="2880" w:type="dxa"/>
-            <w:shd w:val="clear" w:color="auto" w:fill="2E74B5"/>
+              <w:t>Version</w:t>
+            </w:r>
+          </w:p>
+        </w:tc>
+        <w:tc>
+          <w:tcPr>
+            <w:tcW w:w="2880" w:type="dxa"/>
+            <w:shd w:val="clear" w:color="auto" w:fill="FFFFFF"/>
           </w:tcPr>
           <w:p>
             <w:r>
@@ -8114,7 +8442,7 @@
                 <w:b/>
                 <w:color w:val="FFFFFF"/>
               </w:rPr>
-              <w:t>Example Application</w:t>
+              <w:t>Purpose</w:t>
             </w:r>
           </w:p>
         </w:tc>
@@ -8123,30 +8451,33 @@
         <w:tc>
           <w:tcPr>
             <w:tcW w:w="2880" w:type="dxa"/>
-          </w:tcPr>
-          <w:p>
-            <w:r>
-              <w:t>UI (Browser)</w:t>
-            </w:r>
-          </w:p>
-        </w:tc>
-        <w:tc>
-          <w:tcPr>
-            <w:tcW w:w="2880" w:type="dxa"/>
-          </w:tcPr>
-          <w:p>
-            <w:r>
-              <w:t>Selenium WebDriver 4.x</w:t>
-            </w:r>
-          </w:p>
-        </w:tc>
-        <w:tc>
-          <w:tcPr>
-            <w:tcW w:w="2880" w:type="dxa"/>
-          </w:tcPr>
-          <w:p>
-            <w:r>
-              <w:t>PTA website, The Internet Herokuapp</w:t>
+            <w:shd w:val="clear" w:color="auto" w:fill="EBF3FB"/>
+          </w:tcPr>
+          <w:p>
+            <w:r>
+              <w:t>selenium</w:t>
+            </w:r>
+          </w:p>
+        </w:tc>
+        <w:tc>
+          <w:tcPr>
+            <w:tcW w:w="2880" w:type="dxa"/>
+            <w:shd w:val="clear" w:color="auto" w:fill="EBF3FB"/>
+          </w:tcPr>
+          <w:p>
+            <w:r>
+              <w:t>4.43.0</w:t>
+            </w:r>
+          </w:p>
+        </w:tc>
+        <w:tc>
+          <w:tcPr>
+            <w:tcW w:w="2880" w:type="dxa"/>
+            <w:shd w:val="clear" w:color="auto" w:fill="EBF3FB"/>
+          </w:tcPr>
+          <w:p>
+            <w:r>
+              <w:t>Browser automation WebDriver</w:t>
             </w:r>
           </w:p>
         </w:tc>
@@ -8155,30 +8486,33 @@
         <w:tc>
           <w:tcPr>
             <w:tcW w:w="2880" w:type="dxa"/>
-          </w:tcPr>
-          <w:p>
-            <w:r>
-              <w:t>API (REST)</w:t>
-            </w:r>
-          </w:p>
-        </w:tc>
-        <w:tc>
-          <w:tcPr>
-            <w:tcW w:w="2880" w:type="dxa"/>
-          </w:tcPr>
-          <w:p>
-            <w:r>
-              <w:t>Python requests + APIClient</w:t>
-            </w:r>
-          </w:p>
-        </w:tc>
-        <w:tc>
-          <w:tcPr>
-            <w:tcW w:w="2880" w:type="dxa"/>
-          </w:tcPr>
-          <w:p>
-            <w:r>
-              <w:t>Reqres.in, Commerce Tools</w:t>
+            <w:shd w:val="clear" w:color="auto" w:fill="FFFFFF"/>
+          </w:tcPr>
+          <w:p>
+            <w:r>
+              <w:t>pytest</w:t>
+            </w:r>
+          </w:p>
+        </w:tc>
+        <w:tc>
+          <w:tcPr>
+            <w:tcW w:w="2880" w:type="dxa"/>
+            <w:shd w:val="clear" w:color="auto" w:fill="FFFFFF"/>
+          </w:tcPr>
+          <w:p>
+            <w:r>
+              <w:t>9.0.3</w:t>
+            </w:r>
+          </w:p>
+        </w:tc>
+        <w:tc>
+          <w:tcPr>
+            <w:tcW w:w="2880" w:type="dxa"/>
+            <w:shd w:val="clear" w:color="auto" w:fill="FFFFFF"/>
+          </w:tcPr>
+          <w:p>
+            <w:r>
+              <w:t>Test runner and fixture engine</w:t>
             </w:r>
           </w:p>
         </w:tc>
@@ -8187,262 +8521,33 @@
         <w:tc>
           <w:tcPr>
             <w:tcW w:w="2880" w:type="dxa"/>
-          </w:tcPr>
-          <w:p>
-            <w:r>
-              <w:t>Mobile (Android)</w:t>
-            </w:r>
-          </w:p>
-        </w:tc>
-        <w:tc>
-          <w:tcPr>
-            <w:tcW w:w="2880" w:type="dxa"/>
-          </w:tcPr>
-          <w:p>
-            <w:r>
-              <w:t>Appium + Android Emulator</w:t>
-            </w:r>
-          </w:p>
-        </w:tc>
-        <w:tc>
-          <w:tcPr>
-            <w:tcW w:w="2880" w:type="dxa"/>
-          </w:tcPr>
-          <w:p>
-            <w:r>
-              <w:t>KWA Demo App</w:t>
-            </w:r>
-          </w:p>
-        </w:tc>
-      </w:tr>
-    </w:tbl>
-    <w:p>
-      <w:pPr>
-        <w:pStyle w:val="Heading2"/>
-      </w:pPr>
-      <w:bookmarkStart w:id="6" w:name="_Toc227103001"/>
-      <w:bookmarkStart w:id="7" w:name="_Toc227333396"/>
-      <w:r>
-        <w:t>1.2 Key Capabilities</w:t>
-      </w:r>
-      <w:bookmarkEnd w:id="6"/>
-      <w:bookmarkEnd w:id="7"/>
-    </w:p>
-    <w:p>
-      <w:r>
-        <w:t>This framework is designed to scale from a single developer running one test locally to a full CI/CD pipeline running hundreds of tests in parallel inside Docker containers. Here is what it gives you:</w:t>
-      </w:r>
-    </w:p>
-    <w:p>
-      <w:pPr>
-        <w:pStyle w:val="ListParagraph"/>
-        <w:numPr>
-          <w:ilvl w:val="0"/>
-          <w:numId w:val="1"/>
-        </w:numPr>
-      </w:pPr>
-      <w:r>
-        <w:t>Page Object Model (POM) — clean separation of locators, actions, and test logic</w:t>
-      </w:r>
-    </w:p>
-    <w:p>
-      <w:pPr>
-        <w:pStyle w:val="ListParagraph"/>
-        <w:numPr>
-          <w:ilvl w:val="0"/>
-          <w:numId w:val="1"/>
-        </w:numPr>
-      </w:pPr>
-      <w:r>
-        <w:t>Configuration-driven execution — swap environments (QA/Stage/Prod) with a single env variable</w:t>
-      </w:r>
-    </w:p>
-    <w:p>
-      <w:pPr>
-        <w:pStyle w:val="ListParagraph"/>
-        <w:numPr>
-          <w:ilvl w:val="0"/>
-          <w:numId w:val="1"/>
-        </w:numPr>
-      </w:pPr>
-      <w:r>
-        <w:t>Multi-browser support — Chrome, Firefox, and Edge with headless mode for CI/CD</w:t>
-      </w:r>
-    </w:p>
-    <w:p>
-      <w:pPr>
-        <w:pStyle w:val="ListParagraph"/>
-        <w:numPr>
-          <w:ilvl w:val="0"/>
-          <w:numId w:val="1"/>
-        </w:numPr>
-      </w:pPr>
-      <w:r>
-        <w:t>Parallel test execution — run tests concurrently with pytest-xdist (-n 4)</w:t>
-      </w:r>
-    </w:p>
-    <w:p>
-      <w:pPr>
-        <w:pStyle w:val="ListParagraph"/>
-        <w:numPr>
-          <w:ilvl w:val="0"/>
-          <w:numId w:val="1"/>
-        </w:numPr>
-      </w:pPr>
-      <w:r>
-        <w:t>Automatic screenshot on failure — never lose a visual clue when a test breaks</w:t>
-      </w:r>
-    </w:p>
-    <w:p>
-      <w:pPr>
-        <w:pStyle w:val="ListParagraph"/>
-        <w:numPr>
-          <w:ilvl w:val="0"/>
-          <w:numId w:val="1"/>
-        </w:numPr>
-      </w:pPr>
-      <w:r>
-        <w:t>Video recording of every test — recorded via ffmpeg, deleted on pass to save disk space</w:t>
-      </w:r>
-    </w:p>
-    <w:p>
-      <w:pPr>
-        <w:pStyle w:val="ListParagraph"/>
-        <w:numPr>
-          <w:ilvl w:val="0"/>
-          <w:numId w:val="1"/>
-        </w:numPr>
-      </w:pPr>
-      <w:r>
-        <w:t>Allure + HTML reports — rich, interactive reports with history trends</w:t>
-      </w:r>
-    </w:p>
-    <w:p>
-      <w:pPr>
-        <w:pStyle w:val="ListParagraph"/>
-        <w:numPr>
-          <w:ilvl w:val="0"/>
-          <w:numId w:val="1"/>
-        </w:numPr>
-      </w:pPr>
-      <w:r>
-        <w:t>Docker containerization — zero-configuration test runs on any machine</w:t>
-      </w:r>
-    </w:p>
-    <w:p>
-      <w:pPr>
-        <w:pStyle w:val="ListParagraph"/>
-        <w:numPr>
-          <w:ilvl w:val="0"/>
-          <w:numId w:val="1"/>
-        </w:numPr>
-      </w:pPr>
-      <w:r>
-        <w:t>Jenkins CI/CD pipeline — automated build → test → report archival</w:t>
-      </w:r>
-    </w:p>
-    <w:p>
-      <w:pPr>
-        <w:pStyle w:val="ListParagraph"/>
-        <w:numPr>
-          <w:ilvl w:val="0"/>
-          <w:numId w:val="1"/>
-        </w:numPr>
-      </w:pPr>
-      <w:r>
-        <w:t>BDD support — write tests in Gherkin with pytest-bdd</w:t>
-      </w:r>
-    </w:p>
-    <w:p>
-      <w:pPr>
-        <w:pStyle w:val="ListParagraph"/>
-        <w:numPr>
-          <w:ilvl w:val="0"/>
-          <w:numId w:val="1"/>
-        </w:numPr>
-      </w:pPr>
-      <w:r>
-        <w:t>OAuth2 API client — built-in token acquisition for secured APIs</w:t>
-      </w:r>
-    </w:p>
-    <w:p>
-      <w:pPr>
-        <w:pStyle w:val="ListParagraph"/>
-        <w:numPr>
-          <w:ilvl w:val="0"/>
-          <w:numId w:val="1"/>
-        </w:numPr>
-      </w:pPr>
-      <w:r>
-        <w:t>Rotating file logger with colored console output</w:t>
-      </w:r>
-    </w:p>
-    <w:p>
-      <w:pPr>
-        <w:pStyle w:val="Heading2"/>
-      </w:pPr>
-      <w:bookmarkStart w:id="8" w:name="_Toc227103002"/>
-      <w:bookmarkStart w:id="9" w:name="_Toc227333397"/>
-      <w:r>
-        <w:t>1.3 Technology Stack</w:t>
-      </w:r>
-      <w:bookmarkEnd w:id="8"/>
-      <w:bookmarkEnd w:id="9"/>
-    </w:p>
-    <w:tbl>
-      <w:tblPr>
-        <w:tblStyle w:val="TableGrid"/>
-        <w:tblW w:w="0" w:type="auto"/>
-        <w:tblLook w:val="04A0" w:firstRow="1" w:lastRow="0" w:firstColumn="1" w:lastColumn="0" w:noHBand="0" w:noVBand="1"/>
-      </w:tblPr>
-      <w:tblGrid>
-        <w:gridCol w:w="2880"/>
-        <w:gridCol w:w="2880"/>
-        <w:gridCol w:w="2880"/>
-      </w:tblGrid>
-      <w:tr>
-        <w:tc>
-          <w:tcPr>
-            <w:tcW w:w="2880" w:type="dxa"/>
-            <w:shd w:val="clear" w:color="auto" w:fill="FFFFFF"/>
-          </w:tcPr>
-          <w:p>
-            <w:r>
-              <w:rPr>
-                <w:b/>
-                <w:color w:val="FFFFFF"/>
-              </w:rPr>
-              <w:t>Package</w:t>
-            </w:r>
-          </w:p>
-        </w:tc>
-        <w:tc>
-          <w:tcPr>
-            <w:tcW w:w="2880" w:type="dxa"/>
-            <w:shd w:val="clear" w:color="auto" w:fill="FFFFFF"/>
-          </w:tcPr>
-          <w:p>
-            <w:r>
-              <w:rPr>
-                <w:b/>
-                <w:color w:val="FFFFFF"/>
-              </w:rPr>
-              <w:t>Version</w:t>
-            </w:r>
-          </w:p>
-        </w:tc>
-        <w:tc>
-          <w:tcPr>
-            <w:tcW w:w="2880" w:type="dxa"/>
-            <w:shd w:val="clear" w:color="auto" w:fill="FFFFFF"/>
-          </w:tcPr>
-          <w:p>
-            <w:r>
-              <w:rPr>
-                <w:b/>
-                <w:color w:val="FFFFFF"/>
-              </w:rPr>
-              <w:t>Purpose</w:t>
+            <w:shd w:val="clear" w:color="auto" w:fill="EBF3FB"/>
+          </w:tcPr>
+          <w:p>
+            <w:r>
+              <w:t>pytest-xdist</w:t>
+            </w:r>
+          </w:p>
+        </w:tc>
+        <w:tc>
+          <w:tcPr>
+            <w:tcW w:w="2880" w:type="dxa"/>
+            <w:shd w:val="clear" w:color="auto" w:fill="EBF3FB"/>
+          </w:tcPr>
+          <w:p>
+            <w:r>
+              <w:t>3.8.0</w:t>
+            </w:r>
+          </w:p>
+        </w:tc>
+        <w:tc>
+          <w:tcPr>
+            <w:tcW w:w="2880" w:type="dxa"/>
+            <w:shd w:val="clear" w:color="auto" w:fill="EBF3FB"/>
+          </w:tcPr>
+          <w:p>
+            <w:r>
+              <w:t>Parallel test execution</w:t>
             </w:r>
           </w:p>
         </w:tc>
@@ -8451,33 +8556,34 @@
         <w:tc>
           <w:tcPr>
             <w:tcW w:w="2880" w:type="dxa"/>
-            <w:shd w:val="clear" w:color="auto" w:fill="EBF3FB"/>
-          </w:tcPr>
-          <w:p>
-            <w:r>
-              <w:t>selenium</w:t>
-            </w:r>
-          </w:p>
-        </w:tc>
-        <w:tc>
-          <w:tcPr>
-            <w:tcW w:w="2880" w:type="dxa"/>
-            <w:shd w:val="clear" w:color="auto" w:fill="EBF3FB"/>
-          </w:tcPr>
-          <w:p>
-            <w:r>
-              <w:t>4.43.0</w:t>
-            </w:r>
-          </w:p>
-        </w:tc>
-        <w:tc>
-          <w:tcPr>
-            <w:tcW w:w="2880" w:type="dxa"/>
-            <w:shd w:val="clear" w:color="auto" w:fill="EBF3FB"/>
-          </w:tcPr>
-          <w:p>
-            <w:r>
-              <w:t>Browser automation WebDriver</w:t>
+            <w:shd w:val="clear" w:color="auto" w:fill="FFFFFF"/>
+          </w:tcPr>
+          <w:p>
+            <w:r>
+              <w:lastRenderedPageBreak/>
+              <w:t>pytest-html</w:t>
+            </w:r>
+          </w:p>
+        </w:tc>
+        <w:tc>
+          <w:tcPr>
+            <w:tcW w:w="2880" w:type="dxa"/>
+            <w:shd w:val="clear" w:color="auto" w:fill="FFFFFF"/>
+          </w:tcPr>
+          <w:p>
+            <w:r>
+              <w:t>4.2.0</w:t>
+            </w:r>
+          </w:p>
+        </w:tc>
+        <w:tc>
+          <w:tcPr>
+            <w:tcW w:w="2880" w:type="dxa"/>
+            <w:shd w:val="clear" w:color="auto" w:fill="FFFFFF"/>
+          </w:tcPr>
+          <w:p>
+            <w:r>
+              <w:t>HTML test reports</w:t>
             </w:r>
           </w:p>
         </w:tc>
@@ -8486,116 +8592,10 @@
         <w:tc>
           <w:tcPr>
             <w:tcW w:w="2880" w:type="dxa"/>
-            <w:shd w:val="clear" w:color="auto" w:fill="FFFFFF"/>
-          </w:tcPr>
-          <w:p>
-            <w:r>
-              <w:t>pytest</w:t>
-            </w:r>
-          </w:p>
-        </w:tc>
-        <w:tc>
-          <w:tcPr>
-            <w:tcW w:w="2880" w:type="dxa"/>
-            <w:shd w:val="clear" w:color="auto" w:fill="FFFFFF"/>
-          </w:tcPr>
-          <w:p>
-            <w:r>
-              <w:t>9.0.3</w:t>
-            </w:r>
-          </w:p>
-        </w:tc>
-        <w:tc>
-          <w:tcPr>
-            <w:tcW w:w="2880" w:type="dxa"/>
-            <w:shd w:val="clear" w:color="auto" w:fill="FFFFFF"/>
-          </w:tcPr>
-          <w:p>
-            <w:r>
-              <w:t>Test runner and fixture engine</w:t>
-            </w:r>
-          </w:p>
-        </w:tc>
-      </w:tr>
-      <w:tr>
-        <w:tc>
-          <w:tcPr>
-            <w:tcW w:w="2880" w:type="dxa"/>
             <w:shd w:val="clear" w:color="auto" w:fill="EBF3FB"/>
           </w:tcPr>
           <w:p>
             <w:r>
-              <w:t>pytest-xdist</w:t>
-            </w:r>
-          </w:p>
-        </w:tc>
-        <w:tc>
-          <w:tcPr>
-            <w:tcW w:w="2880" w:type="dxa"/>
-            <w:shd w:val="clear" w:color="auto" w:fill="EBF3FB"/>
-          </w:tcPr>
-          <w:p>
-            <w:r>
-              <w:t>3.8.0</w:t>
-            </w:r>
-          </w:p>
-        </w:tc>
-        <w:tc>
-          <w:tcPr>
-            <w:tcW w:w="2880" w:type="dxa"/>
-            <w:shd w:val="clear" w:color="auto" w:fill="EBF3FB"/>
-          </w:tcPr>
-          <w:p>
-            <w:r>
-              <w:t>Parallel test execution</w:t>
-            </w:r>
-          </w:p>
-        </w:tc>
-      </w:tr>
-      <w:tr>
-        <w:tc>
-          <w:tcPr>
-            <w:tcW w:w="2880" w:type="dxa"/>
-            <w:shd w:val="clear" w:color="auto" w:fill="FFFFFF"/>
-          </w:tcPr>
-          <w:p>
-            <w:r>
-              <w:t>pytest-html</w:t>
-            </w:r>
-          </w:p>
-        </w:tc>
-        <w:tc>
-          <w:tcPr>
-            <w:tcW w:w="2880" w:type="dxa"/>
-            <w:shd w:val="clear" w:color="auto" w:fill="FFFFFF"/>
-          </w:tcPr>
-          <w:p>
-            <w:r>
-              <w:t>4.2.0</w:t>
-            </w:r>
-          </w:p>
-        </w:tc>
-        <w:tc>
-          <w:tcPr>
-            <w:tcW w:w="2880" w:type="dxa"/>
-            <w:shd w:val="clear" w:color="auto" w:fill="FFFFFF"/>
-          </w:tcPr>
-          <w:p>
-            <w:r>
-              <w:t>HTML test reports</w:t>
-            </w:r>
-          </w:p>
-        </w:tc>
-      </w:tr>
-      <w:tr>
-        <w:tc>
-          <w:tcPr>
-            <w:tcW w:w="2880" w:type="dxa"/>
-            <w:shd w:val="clear" w:color="auto" w:fill="EBF3FB"/>
-          </w:tcPr>
-          <w:p>
-            <w:r>
-              <w:lastRenderedPageBreak/>
               <w:t>pytest-rerunfailures</w:t>
             </w:r>
           </w:p>
@@ -8952,7 +8952,7 @@
         </w:pBdr>
       </w:pPr>
       <w:bookmarkStart w:id="10" w:name="_Toc227103003"/>
-      <w:bookmarkStart w:id="11" w:name="_Toc227333398"/>
+      <w:bookmarkStart w:id="11" w:name="_Toc227442678"/>
       <w:r>
         <w:rPr>
           <w:sz w:val="36"/>
@@ -8980,7 +8980,7 @@
         <w:pStyle w:val="Heading2"/>
       </w:pPr>
       <w:bookmarkStart w:id="12" w:name="_Toc227103004"/>
-      <w:bookmarkStart w:id="13" w:name="_Toc227333399"/>
+      <w:bookmarkStart w:id="13" w:name="_Toc227442679"/>
       <w:r>
         <w:t>2.1 What You Need Before You Start</w:t>
       </w:r>
@@ -9331,7 +9331,7 @@
         <w:pStyle w:val="Heading2"/>
       </w:pPr>
       <w:bookmarkStart w:id="14" w:name="_Toc227103005"/>
-      <w:bookmarkStart w:id="15" w:name="_Toc227333400"/>
+      <w:bookmarkStart w:id="15" w:name="_Toc227442680"/>
       <w:r>
         <w:t>2.2 Step-by-Step Installation</w:t>
       </w:r>
@@ -9343,7 +9343,7 @@
         <w:pStyle w:val="Heading3"/>
       </w:pPr>
       <w:bookmarkStart w:id="16" w:name="_Toc227103006"/>
-      <w:bookmarkStart w:id="17" w:name="_Toc227333401"/>
+      <w:bookmarkStart w:id="17" w:name="_Toc227442681"/>
       <w:r>
         <w:t>Step 1 — Clone the Repository</w:t>
       </w:r>
@@ -9360,7 +9360,7 @@
         <w:pStyle w:val="Heading3"/>
       </w:pPr>
       <w:bookmarkStart w:id="18" w:name="_Toc227103007"/>
-      <w:bookmarkStart w:id="19" w:name="_Toc227333402"/>
+      <w:bookmarkStart w:id="19" w:name="_Toc227442682"/>
       <w:r>
         <w:t>Step 2 — Create a Virtual Environment</w:t>
       </w:r>
@@ -9427,7 +9427,7 @@
         <w:pStyle w:val="Heading3"/>
       </w:pPr>
       <w:bookmarkStart w:id="20" w:name="_Toc227103008"/>
-      <w:bookmarkStart w:id="21" w:name="_Toc227333403"/>
+      <w:bookmarkStart w:id="21" w:name="_Toc227442683"/>
       <w:r>
         <w:t>Step 3 — Install All Dependencies</w:t>
       </w:r>
@@ -9458,7 +9458,7 @@
         <w:pStyle w:val="Heading3"/>
       </w:pPr>
       <w:bookmarkStart w:id="22" w:name="_Toc227103009"/>
-      <w:bookmarkStart w:id="23" w:name="_Toc227333404"/>
+      <w:bookmarkStart w:id="23" w:name="_Toc227442684"/>
       <w:r>
         <w:lastRenderedPageBreak/>
         <w:t>Step 4 — Verify the Installation</w:t>
@@ -9488,7 +9488,7 @@
         <w:pStyle w:val="Heading2"/>
       </w:pPr>
       <w:bookmarkStart w:id="24" w:name="_Toc227103010"/>
-      <w:bookmarkStart w:id="25" w:name="_Toc227333405"/>
+      <w:bookmarkStart w:id="25" w:name="_Toc227442685"/>
       <w:r>
         <w:t>2.3 Environment Variables Reference</w:t>
       </w:r>
@@ -9509,7 +9509,7 @@
       <w:tblGrid>
         <w:gridCol w:w="2160"/>
         <w:gridCol w:w="2160"/>
-        <w:gridCol w:w="2160"/>
+        <w:gridCol w:w="2366"/>
         <w:gridCol w:w="2160"/>
       </w:tblGrid>
       <w:tr>
@@ -9650,7 +9650,7 @@
           </w:tcPr>
           <w:p>
             <w:r>
-              <w:t>REQRES, COMMERCE_TOOLS</w:t>
+              <w:t>JSONPLACEHOLDERLS</w:t>
             </w:r>
           </w:p>
         </w:tc>
@@ -9873,7 +9873,7 @@
         </w:pBdr>
       </w:pPr>
       <w:bookmarkStart w:id="26" w:name="_Toc227103011"/>
-      <w:bookmarkStart w:id="27" w:name="_Toc227333406"/>
+      <w:bookmarkStart w:id="27" w:name="_Toc227442686"/>
       <w:r>
         <w:rPr>
           <w:sz w:val="36"/>
@@ -9901,7 +9901,7 @@
         <w:pStyle w:val="Heading2"/>
       </w:pPr>
       <w:bookmarkStart w:id="28" w:name="_Toc227103012"/>
-      <w:bookmarkStart w:id="29" w:name="_Toc227333407"/>
+      <w:bookmarkStart w:id="29" w:name="_Toc227442687"/>
       <w:r>
         <w:t>3.1 Folder Layout</w:t>
       </w:r>
@@ -9935,7 +9935,23 @@
           <w:sz w:val="18"/>
         </w:rPr>
         <w:br/>
-        <w:t>|-- config/                          &lt;- All configuration files (YAML / JSON / Excel)</w:t>
+        <w:t>Selenium-Python-Automation-Framework/</w:t>
+      </w:r>
+      <w:r>
+        <w:rPr>
+          <w:rFonts w:ascii="Courier New" w:hAnsi="Courier New"/>
+          <w:sz w:val="18"/>
+        </w:rPr>
+        <w:br/>
+        <w:t>|</w:t>
+      </w:r>
+      <w:r>
+        <w:rPr>
+          <w:rFonts w:ascii="Courier New" w:hAnsi="Courier New"/>
+          <w:sz w:val="18"/>
+        </w:rPr>
+        <w:br/>
+        <w:t>|-- config/                          &lt;- All configuration filesles (YAML / JSON / Excel)</w:t>
       </w:r>
       <w:r>
         <w:rPr>
@@ -9983,15 +9999,15 @@
           <w:sz w:val="18"/>
         </w:rPr>
         <w:br/>
-        <w:t>|   |-- api/reqres/                  &lt;- API configs for Reqres service</w:t>
-      </w:r>
-      <w:r>
-        <w:rPr>
-          <w:rFonts w:ascii="Courier New" w:hAnsi="Courier New"/>
-          <w:sz w:val="18"/>
-        </w:rPr>
-        <w:br/>
-        <w:t>|   |-- api/commerce_tools/          &lt;- API configs for Commerce Tools service</w:t>
+        <w:t>|   |-- api/jsonplaceholder/                  &lt;- API configs for JSONPlaceholder service</w:t>
+      </w:r>
+      <w:r>
+        <w:rPr>
+          <w:rFonts w:ascii="Courier New" w:hAnsi="Courier New"/>
+          <w:sz w:val="18"/>
+        </w:rPr>
+        <w:br/>
+        <w:t>|   |-- api/jsonplaceholder/          &lt;- API configs for JSONPlaceholder service</w:t>
       </w:r>
       <w:r>
         <w:rPr>
@@ -10159,7 +10175,15 @@
           <w:sz w:val="18"/>
         </w:rPr>
         <w:br/>
-        <w:t>|   |   |   |-- pages/               &lt;- Page Objects for PTA (HomePage, LoginPage, etc.)</w:t>
+        <w:t xml:space="preserve">|   |   |   |-- pages/               &lt;- Page Objects for PTA (HomePage, </w:t>
+      </w:r>
+      <w:r>
+        <w:rPr>
+          <w:rFonts w:ascii="Courier New" w:hAnsi="Courier New"/>
+          <w:sz w:val="18"/>
+        </w:rPr>
+        <w:lastRenderedPageBreak/>
+        <w:t>LoginPage, etc.)</w:t>
       </w:r>
       <w:r>
         <w:rPr>
@@ -10191,13 +10215,6 @@
           <w:sz w:val="18"/>
         </w:rPr>
         <w:br/>
-      </w:r>
-      <w:r>
-        <w:rPr>
-          <w:rFonts w:ascii="Courier New" w:hAnsi="Courier New"/>
-          <w:sz w:val="18"/>
-        </w:rPr>
-        <w:lastRenderedPageBreak/>
         <w:t>|   |   |   |-- test_pta_tutorial_version.py &lt;- Heavily documented tutorial tests</w:t>
       </w:r>
       <w:r>
@@ -10246,15 +10263,15 @@
           <w:sz w:val="18"/>
         </w:rPr>
         <w:br/>
-        <w:t>|   |   |-- reqres/test_reqres.py    &lt;- Reqres REST API tests</w:t>
-      </w:r>
-      <w:r>
-        <w:rPr>
-          <w:rFonts w:ascii="Courier New" w:hAnsi="Courier New"/>
-          <w:sz w:val="18"/>
-        </w:rPr>
-        <w:br/>
-        <w:t>|   |   |-- commerce_tools/          &lt;- Commerce Tools API tests</w:t>
+        <w:t>|   |   |-- jsonplaceholder/test_jsonplaceholder.py    &lt;- JSONPlaceholder REST API tests</w:t>
+      </w:r>
+      <w:r>
+        <w:rPr>
+          <w:rFonts w:ascii="Courier New" w:hAnsi="Courier New"/>
+          <w:sz w:val="18"/>
+        </w:rPr>
+        <w:br/>
+        <w:t>|   |   |-- jsonplaceholder/          &lt;- JSONPlaceholder API tests</w:t>
       </w:r>
       <w:r>
         <w:rPr>
@@ -10382,7 +10399,7 @@
         <w:pStyle w:val="Heading2"/>
       </w:pPr>
       <w:bookmarkStart w:id="30" w:name="_Toc227103013"/>
-      <w:bookmarkStart w:id="31" w:name="_Toc227333408"/>
+      <w:bookmarkStart w:id="31" w:name="_Toc227442688"/>
       <w:r>
         <w:t>3.2 The Page Object Model (POM) Pattern</w:t>
       </w:r>
@@ -10455,8 +10472,9 @@
         <w:pStyle w:val="Heading2"/>
       </w:pPr>
       <w:bookmarkStart w:id="32" w:name="_Toc227103014"/>
-      <w:bookmarkStart w:id="33" w:name="_Toc227333409"/>
-      <w:r>
+      <w:bookmarkStart w:id="33" w:name="_Toc227442689"/>
+      <w:r>
+        <w:lastRenderedPageBreak/>
         <w:t>3.3 Fixture Chain — How Tests Wire Together</w:t>
       </w:r>
       <w:bookmarkEnd w:id="32"/>
@@ -10549,7 +10567,6 @@
           </w:tcPr>
           <w:p>
             <w:r>
-              <w:lastRenderedPageBreak/>
               <w:t>1 - Session</w:t>
             </w:r>
           </w:p>
@@ -10740,7 +10757,7 @@
         </w:pBdr>
       </w:pPr>
       <w:bookmarkStart w:id="34" w:name="_Toc227103015"/>
-      <w:bookmarkStart w:id="35" w:name="_Toc227333410"/>
+      <w:bookmarkStart w:id="35" w:name="_Toc227442690"/>
       <w:r>
         <w:rPr>
           <w:sz w:val="36"/>
@@ -10756,7 +10773,7 @@
         <w:pStyle w:val="Heading2"/>
       </w:pPr>
       <w:bookmarkStart w:id="36" w:name="_Toc227103016"/>
-      <w:bookmarkStart w:id="37" w:name="_Toc227333411"/>
+      <w:bookmarkStart w:id="37" w:name="_Toc227442691"/>
       <w:r>
         <w:t>4.1 How ConfigParser Works</w:t>
       </w:r>
@@ -10860,7 +10877,7 @@
         <w:pStyle w:val="Heading2"/>
       </w:pPr>
       <w:bookmarkStart w:id="38" w:name="_Toc227103017"/>
-      <w:bookmarkStart w:id="39" w:name="_Toc227333412"/>
+      <w:bookmarkStart w:id="39" w:name="_Toc227442692"/>
       <w:r>
         <w:t>4.2 YAML Config Structure</w:t>
       </w:r>
@@ -11001,7 +11018,7 @@
         <w:pStyle w:val="Heading2"/>
       </w:pPr>
       <w:bookmarkStart w:id="40" w:name="_Toc227103018"/>
-      <w:bookmarkStart w:id="41" w:name="_Toc227333413"/>
+      <w:bookmarkStart w:id="41" w:name="_Toc227442693"/>
       <w:r>
         <w:t>4.3 Adding a New Config File</w:t>
       </w:r>
@@ -11058,7 +11075,7 @@
         </w:pBdr>
       </w:pPr>
       <w:bookmarkStart w:id="42" w:name="_Toc227103019"/>
-      <w:bookmarkStart w:id="43" w:name="_Toc227333414"/>
+      <w:bookmarkStart w:id="43" w:name="_Toc227442694"/>
       <w:r>
         <w:rPr>
           <w:sz w:val="36"/>
@@ -11074,7 +11091,7 @@
         <w:pStyle w:val="Heading2"/>
       </w:pPr>
       <w:bookmarkStart w:id="44" w:name="_Toc227103020"/>
-      <w:bookmarkStart w:id="45" w:name="_Toc227333415"/>
+      <w:bookmarkStart w:id="45" w:name="_Toc227442695"/>
       <w:r>
         <w:t>5.1 What is pytest?</w:t>
       </w:r>
@@ -11091,7 +11108,7 @@
         <w:pStyle w:val="Heading2"/>
       </w:pPr>
       <w:bookmarkStart w:id="46" w:name="_Toc227103021"/>
-      <w:bookmarkStart w:id="47" w:name="_Toc227333416"/>
+      <w:bookmarkStart w:id="47" w:name="_Toc227442696"/>
       <w:r>
         <w:t>5.2 Running Tests — Command Reference</w:t>
       </w:r>
@@ -11220,7 +11237,7 @@
           </w:tcPr>
           <w:p>
             <w:r>
-              <w:t>pytest -m 'pta or reqres' tests/</w:t>
+              <w:t>pytest -m 'pta or jsonplaceholder' tests/</w:t>
             </w:r>
           </w:p>
         </w:tc>
@@ -11231,7 +11248,7 @@
           </w:tcPr>
           <w:p>
             <w:r>
-              <w:t>Run tests tagged pta OR reqres</w:t>
+              <w:t>Run tests tagged pta OR jsonplaceholder</w:t>
             </w:r>
           </w:p>
         </w:tc>
@@ -11482,7 +11499,7 @@
         <w:pStyle w:val="Heading2"/>
       </w:pPr>
       <w:bookmarkStart w:id="48" w:name="_Toc227103022"/>
-      <w:bookmarkStart w:id="49" w:name="_Toc227333417"/>
+      <w:bookmarkStart w:id="49" w:name="_Toc227442697"/>
       <w:r>
         <w:t>5.3 Pytest Markers</w:t>
       </w:r>
@@ -11575,7 +11592,7 @@
           </w:tcPr>
           <w:p>
             <w:r>
-              <w:t>UI tests for The Internet Herokuapp website</w:t>
+              <w:t>UI tests for The Internet Herokuappernet Herokuapp website</w:t>
             </w:r>
           </w:p>
         </w:tc>
@@ -11609,7 +11626,7 @@
           </w:tcPr>
           <w:p>
             <w:r>
-              <w:t>reqres</w:t>
+              <w:t>jsonplaceholder</w:t>
             </w:r>
           </w:p>
         </w:tc>
@@ -11619,7 +11636,7 @@
           </w:tcPr>
           <w:p>
             <w:r>
-              <w:t>API tests for Reqres.in REST service</w:t>
+              <w:t>API tests for JSONPlaceholder fake REST API</w:t>
             </w:r>
           </w:p>
         </w:tc>
@@ -11631,7 +11648,7 @@
           </w:tcPr>
           <w:p>
             <w:r>
-              <w:t>commerce_tools</w:t>
+              <w:t>jsonplaceholder</w:t>
             </w:r>
           </w:p>
         </w:tc>
@@ -11641,7 +11658,11 @@
           </w:tcPr>
           <w:p>
             <w:r>
-              <w:t>API tests for Commerce Tools service</w:t>
+              <w:t xml:space="preserve">API tests for JSONPlaceholder fake REST </w:t>
+            </w:r>
+            <w:r>
+              <w:lastRenderedPageBreak/>
+              <w:t>API</w:t>
             </w:r>
           </w:p>
         </w:tc>
@@ -11653,6 +11674,7 @@
           </w:tcPr>
           <w:p>
             <w:r>
+              <w:lastRenderedPageBreak/>
               <w:t>excel</w:t>
             </w:r>
           </w:p>
@@ -11675,7 +11697,6 @@
           </w:tcPr>
           <w:p>
             <w:r>
-              <w:lastRenderedPageBreak/>
               <w:t>param</w:t>
             </w:r>
           </w:p>
@@ -11719,7 +11740,7 @@
         <w:pStyle w:val="Heading2"/>
       </w:pPr>
       <w:bookmarkStart w:id="50" w:name="_Toc227103023"/>
-      <w:bookmarkStart w:id="51" w:name="_Toc227333418"/>
+      <w:bookmarkStart w:id="51" w:name="_Toc227442698"/>
       <w:r>
         <w:t>5.4 Pytest Fixtures Explained</w:t>
       </w:r>
@@ -11988,7 +12009,7 @@
         </w:pBdr>
       </w:pPr>
       <w:bookmarkStart w:id="52" w:name="_Toc227103024"/>
-      <w:bookmarkStart w:id="53" w:name="_Toc227333419"/>
+      <w:bookmarkStart w:id="53" w:name="_Toc227442699"/>
       <w:r>
         <w:rPr>
           <w:sz w:val="36"/>
@@ -12004,7 +12025,7 @@
         <w:pStyle w:val="Heading2"/>
       </w:pPr>
       <w:bookmarkStart w:id="54" w:name="_Toc227103025"/>
-      <w:bookmarkStart w:id="55" w:name="_Toc227333420"/>
+      <w:bookmarkStart w:id="55" w:name="_Toc227442700"/>
       <w:r>
         <w:t>6.1 BasePage — The Foundation of All UI Tests</w:t>
       </w:r>
@@ -12500,7 +12521,7 @@
         <w:pStyle w:val="Heading2"/>
       </w:pPr>
       <w:bookmarkStart w:id="56" w:name="_Toc227103026"/>
-      <w:bookmarkStart w:id="57" w:name="_Toc227333421"/>
+      <w:bookmarkStart w:id="57" w:name="_Toc227442701"/>
       <w:r>
         <w:t>6.2 Writing a Page Object — Step by Step</w:t>
       </w:r>
@@ -12920,7 +12941,7 @@
         <w:pStyle w:val="Heading2"/>
       </w:pPr>
       <w:bookmarkStart w:id="58" w:name="_Toc227103027"/>
-      <w:bookmarkStart w:id="59" w:name="_Toc227333422"/>
+      <w:bookmarkStart w:id="59" w:name="_Toc227442702"/>
       <w:r>
         <w:t>6.3 Writing a Test Case — Full Walkthrough</w:t>
       </w:r>
@@ -13302,7 +13323,7 @@
         <w:pStyle w:val="Heading2"/>
       </w:pPr>
       <w:bookmarkStart w:id="60" w:name="_Toc227103028"/>
-      <w:bookmarkStart w:id="61" w:name="_Toc227333423"/>
+      <w:bookmarkStart w:id="61" w:name="_Toc227442703"/>
       <w:r>
         <w:t xml:space="preserve">6.4 EventFiringWebDriver </w:t>
       </w:r>
@@ -13325,7 +13346,7 @@
         <w:pStyle w:val="Heading2"/>
       </w:pPr>
       <w:bookmarkStart w:id="62" w:name="_Toc227103029"/>
-      <w:bookmarkStart w:id="63" w:name="_Toc227333424"/>
+      <w:bookmarkStart w:id="63" w:name="_Toc227442704"/>
       <w:r>
         <w:t>6.5 Running UI Tests</w:t>
       </w:r>
@@ -13434,7 +13455,7 @@
       <w:pPr>
         <w:pStyle w:val="Heading2"/>
       </w:pPr>
-      <w:bookmarkStart w:id="64" w:name="_Toc227333425"/>
+      <w:bookmarkStart w:id="64" w:name="_Toc227442705"/>
       <w:r>
         <w:lastRenderedPageBreak/>
         <w:t>6.6 The Hirokuapp Test Suite — Seven Real-World Examples</w:t>
@@ -13450,7 +13471,7 @@
       <w:pPr>
         <w:pStyle w:val="Heading3"/>
       </w:pPr>
-      <w:bookmarkStart w:id="65" w:name="_Toc227333426"/>
+      <w:bookmarkStart w:id="65" w:name="_Toc227442706"/>
       <w:r>
         <w:t>Deep Dive: test_challenging_dom — Handling Dynamic Element IDs</w:t>
       </w:r>
@@ -13475,7 +13496,7 @@
       <w:pPr>
         <w:pStyle w:val="Heading3"/>
       </w:pPr>
-      <w:bookmarkStart w:id="66" w:name="_Toc227333427"/>
+      <w:bookmarkStart w:id="66" w:name="_Toc227442707"/>
       <w:r>
         <w:t>Deep Dive: test_digest_auth — Hybrid HTTP + CDP Authentication</w:t>
       </w:r>
@@ -13488,7 +13509,7 @@
     </w:p>
     <w:p>
       <w:r>
-        <w:t>Page objects added: tests/ui/hirokuapp/pages/digest_auth_page.py — mirrors basic_auth_page.py with is_authenticated() checking for the success message paragraph.</w:t>
+        <w:t>Page objects added: tests/ui/hirokuapp/pages/digest_auth_page.py — mirrors basic_auth_page.py with is_page_loaded() and is_authenticated() methods. Note: the finally block uses except WebDriverException (not the broad except Exception) to avoid the "Too broad exception clause" pylint warning when clearing the CDP injected header.s_authenticated() checking for the success message paragraph.</w:t>
       </w:r>
     </w:p>
     <w:p>
@@ -13499,11 +13520,12 @@
         </w:pBdr>
       </w:pPr>
       <w:bookmarkStart w:id="67" w:name="_Toc227103030"/>
-      <w:bookmarkStart w:id="68" w:name="_Toc227333428"/>
+      <w:bookmarkStart w:id="68" w:name="_Toc227442708"/>
       <w:r>
         <w:rPr>
           <w:sz w:val="36"/>
         </w:rPr>
+        <w:lastRenderedPageBreak/>
         <w:t>Chapter 7: API Test Automation</w:t>
       </w:r>
       <w:bookmarkEnd w:id="67"/>
@@ -13514,7 +13536,7 @@
         <w:pStyle w:val="Heading2"/>
       </w:pPr>
       <w:bookmarkStart w:id="69" w:name="_Toc227103031"/>
-      <w:bookmarkStart w:id="70" w:name="_Toc227333429"/>
+      <w:bookmarkStart w:id="70" w:name="_Toc227442709"/>
       <w:r>
         <w:t>7.1 The APIClient Class</w:t>
       </w:r>
@@ -13548,7 +13570,6 @@
                 <w:b/>
                 <w:color w:val="FFFFFF"/>
               </w:rPr>
-              <w:lastRenderedPageBreak/>
               <w:t>Method</w:t>
             </w:r>
           </w:p>
@@ -13598,7 +13619,7 @@
           </w:tcPr>
           <w:p>
             <w:r>
-              <w:t>post(endpoint, data, json, **kwargs)</w:t>
+              <w:t>post(endpoint, data, json, **kwargs) json, **kwargs)</w:t>
             </w:r>
           </w:p>
         </w:tc>
@@ -13608,7 +13629,7 @@
           </w:tcPr>
           <w:p>
             <w:r>
-              <w:t>HTTP POST with form data or JSON body</w:t>
+              <w:t>HTTP POST — accepts form data or JSON bodydata or JSON body</w:t>
             </w:r>
           </w:p>
         </w:tc>
@@ -13685,16 +13706,16 @@
         <w:pStyle w:val="Heading2"/>
       </w:pPr>
       <w:bookmarkStart w:id="71" w:name="_Toc227103032"/>
-      <w:bookmarkStart w:id="72" w:name="_Toc227333430"/>
-      <w:r>
-        <w:t>7.2 Writing API Tests — Example (Reqres)</w:t>
+      <w:bookmarkStart w:id="72" w:name="_Toc227442710"/>
+      <w:r>
+        <w:t>7.2 Writing API Tests — Example (JSONPlaceholder)</w:t>
       </w:r>
       <w:bookmarkEnd w:id="71"/>
       <w:bookmarkEnd w:id="72"/>
     </w:p>
     <w:p>
       <w:r>
-        <w:t>API tests receive the api_client fixture (defined in tests/api/conftest.py) which is already configured with the correct base URL and auth headers for the selected service:</w:t>
+        <w:t>API tests receive the api_client fixture (defined in tests/api/conftest.py) which is already configured with the correct base URL. JSONPlaceholder (https://jsonplaceholder.typicode.com) is a completely free, registration-free fake REST API used for testing. It supports GET, POST, PUT, PATCH, and DELETE — making it ideal for demonstrating all HTTP verbs without any authentication setup.red with the correct base URL and auth headers for the selected service:</w:t>
       </w:r>
     </w:p>
     <w:p>
@@ -13718,30 +13739,30 @@
           <w:sz w:val="18"/>
         </w:rPr>
         <w:br/>
-        <w:t>@pytest.mark.reqres</w:t>
-      </w:r>
-      <w:r>
-        <w:rPr>
-          <w:rFonts w:ascii="Courier New" w:hAnsi="Courier New"/>
-          <w:sz w:val="18"/>
-        </w:rPr>
-        <w:br/>
-        <w:t>class TestReqresAPI:</w:t>
-      </w:r>
-      <w:r>
-        <w:rPr>
-          <w:rFonts w:ascii="Courier New" w:hAnsi="Courier New"/>
-          <w:sz w:val="18"/>
-        </w:rPr>
-        <w:br/>
-      </w:r>
-      <w:r>
-        <w:rPr>
-          <w:rFonts w:ascii="Courier New" w:hAnsi="Courier New"/>
-          <w:sz w:val="18"/>
-        </w:rPr>
-        <w:br/>
-        <w:t xml:space="preserve">    def test_get_single_user(self, api_client):</w:t>
+        <w:t>@pytest.mark.jsonplaceholder</w:t>
+      </w:r>
+      <w:r>
+        <w:rPr>
+          <w:rFonts w:ascii="Courier New" w:hAnsi="Courier New"/>
+          <w:sz w:val="18"/>
+        </w:rPr>
+        <w:br/>
+        <w:t>class TestJsonPlaceholder:</w:t>
+      </w:r>
+      <w:r>
+        <w:rPr>
+          <w:rFonts w:ascii="Courier New" w:hAnsi="Courier New"/>
+          <w:sz w:val="18"/>
+        </w:rPr>
+        <w:br/>
+      </w:r>
+      <w:r>
+        <w:rPr>
+          <w:rFonts w:ascii="Courier New" w:hAnsi="Courier New"/>
+          <w:sz w:val="18"/>
+        </w:rPr>
+        <w:br/>
+        <w:t xml:space="preserve">    def test_get_single_post(self, api_client):</w:t>
       </w:r>
       <w:r>
         <w:rPr>
@@ -13874,6 +13895,13 @@
           <w:sz w:val="18"/>
         </w:rPr>
         <w:br/>
+      </w:r>
+      <w:r>
+        <w:rPr>
+          <w:rFonts w:ascii="Courier New" w:hAnsi="Courier New"/>
+          <w:sz w:val="18"/>
+        </w:rPr>
+        <w:lastRenderedPageBreak/>
         <w:t xml:space="preserve">        assert "id" in body, "Response should contain a generated id"</w:t>
       </w:r>
       <w:r>
@@ -13968,17 +13996,16 @@
         <w:pStyle w:val="Heading2"/>
       </w:pPr>
       <w:bookmarkStart w:id="73" w:name="_Toc227103033"/>
-      <w:bookmarkStart w:id="74" w:name="_Toc227333431"/>
-      <w:r>
-        <w:lastRenderedPageBreak/>
-        <w:t>7.3 OAuth2 Authentication (Commerce Tools)</w:t>
+      <w:bookmarkStart w:id="74" w:name="_Toc227442711"/>
+      <w:r>
+        <w:t>7.3 No-Auth APIs and the APIClient.patch() Method</w:t>
       </w:r>
       <w:bookmarkEnd w:id="73"/>
       <w:bookmarkEnd w:id="74"/>
     </w:p>
     <w:p>
       <w:r>
-        <w:t>For services that require OAuth2 authentication (like Commerce Tools), the api_client fixture in tests/api/conftest.py automatically handles the entire token exchange flow before any test runs. Here is how the flow works:</w:t>
+        <w:t>JSONPlaceholder requires no API key or registration — the tests/api/conftest.py fixture simply reads the base URL from the YAML config and instantiates APIClient with no extra headers. A new patch() method was added to APIClient to support HTTP PATCH requests alongside the existing GET, POST, PUT, and DELETE methods. PATCH is used for partial updates — only the fields you want to change are sent in the payload, unlike PUT which requires the full resource body.ts/api/conftest.py automatically handles the entire token exchange flow before any test runs. Here is how the flow works:</w:t>
       </w:r>
     </w:p>
     <w:p>
@@ -13990,7 +14017,7 @@
         </w:numPr>
       </w:pPr>
       <w:r>
-        <w:t>The api_client fixture reads auth_url, client_id, and client_secret from the YAML config.</w:t>
+        <w:t>The SERVICE_NAME environment variable selects the API under test. For JSONPlaceholder, set SERVICE_NAME=JSONPLACEHOLDER. The fixture reads the base_url from config/api/jsonplaceholder/api_test_env_config.yml and returns a plain APIClient instance.</w:t>
       </w:r>
     </w:p>
     <w:p>
@@ -14002,7 +14029,7 @@
         </w:numPr>
       </w:pPr>
       <w:r>
-        <w:t>It calls APIClient.get_oauth_token() which POSTs to the /oauth/token endpoint using HTTP Basic Auth (client_id:client_secret).</w:t>
+        <w:t>The test data payload (POST body, PUT body, PATCH body) is loaded from config/api/jsonplaceholder/api_test_data_config.json via ConfigParser.load_config("jsonplaceholder_api_test_data_config").(client_id:client_secret).</w:t>
       </w:r>
     </w:p>
     <w:p>
@@ -14014,7 +14041,7 @@
         </w:numPr>
       </w:pPr>
       <w:r>
-        <w:t>The method asserts that the response contains a valid Bearer token with expires_in &gt; 0.</w:t>
+        <w:t>Nine test cases cover all major HTTP verbs: GET (list + single), POST, PUT, PATCH, DELETE, nested resource (comments), users list, and nested todos.</w:t>
       </w:r>
     </w:p>
     <w:p>
@@ -14026,7 +14053,7 @@
         </w:numPr>
       </w:pPr>
       <w:r>
-        <w:t>The token is injected into the session headers as Authorization: Bearer &lt;token&gt;.</w:t>
+        <w:t>Run the full suite with: SERVICE_NAME=JSONPLACEHOLDER REGION=QA pytest -vvv -m "jsonplaceholder" tests/</w:t>
       </w:r>
     </w:p>
     <w:p>
@@ -14038,7 +14065,7 @@
         </w:numPr>
       </w:pPr>
       <w:r>
-        <w:t>Every subsequent API call in the test automatically includes this header — no manual header management needed.</w:t>
+        <w:t>Because JSONPlaceholder is a fake API, write/mutate operations (POST, PUT, PATCH, DELETE) return simulated responses — the data is not actually persisted. This is ideal for learning and demonstrating HTTP verb semantics without side effects.nt needed.</w:t>
       </w:r>
     </w:p>
     <w:p>
@@ -14046,7 +14073,7 @@
         <w:pStyle w:val="Heading2"/>
       </w:pPr>
       <w:bookmarkStart w:id="75" w:name="_Toc227103034"/>
-      <w:bookmarkStart w:id="76" w:name="_Toc227333432"/>
+      <w:bookmarkStart w:id="76" w:name="_Toc227442712"/>
       <w:r>
         <w:t>7.4 Running API Tests</w:t>
       </w:r>
@@ -14059,38 +14086,38 @@
           <w:rFonts w:ascii="Courier New" w:hAnsi="Courier New"/>
           <w:sz w:val="18"/>
         </w:rPr>
-        <w:t># Reqres API tests</w:t>
-      </w:r>
-      <w:r>
-        <w:rPr>
-          <w:rFonts w:ascii="Courier New" w:hAnsi="Courier New"/>
-          <w:sz w:val="18"/>
-        </w:rPr>
-        <w:br/>
-        <w:t>SERVICE_NAME=REQRES REGION=QA pytest -vvv -m "reqres" tests/</w:t>
-      </w:r>
-      <w:r>
-        <w:rPr>
-          <w:rFonts w:ascii="Courier New" w:hAnsi="Courier New"/>
-          <w:sz w:val="18"/>
-        </w:rPr>
-        <w:br/>
-      </w:r>
-      <w:r>
-        <w:rPr>
-          <w:rFonts w:ascii="Courier New" w:hAnsi="Courier New"/>
-          <w:sz w:val="18"/>
-        </w:rPr>
-        <w:br/>
-        <w:t># Commerce Tools API tests (with OAuth2 token exchange)</w:t>
-      </w:r>
-      <w:r>
-        <w:rPr>
-          <w:rFonts w:ascii="Courier New" w:hAnsi="Courier New"/>
-          <w:sz w:val="18"/>
-        </w:rPr>
-        <w:br/>
-        <w:t>SERVICE_NAME=COMMERCE_TOOLS REGION=QA pytest -vvv -m "commerce_tools" tests/</w:t>
+        <w:t># JSONPlaceholder API tests</w:t>
+      </w:r>
+      <w:r>
+        <w:rPr>
+          <w:rFonts w:ascii="Courier New" w:hAnsi="Courier New"/>
+          <w:sz w:val="18"/>
+        </w:rPr>
+        <w:br/>
+        <w:t>SERVICE_NAME=JSONPLACEHOLDER REGION=QA pytest -vvv -m "jsonplaceholder" tests/</w:t>
+      </w:r>
+      <w:r>
+        <w:rPr>
+          <w:rFonts w:ascii="Courier New" w:hAnsi="Courier New"/>
+          <w:sz w:val="18"/>
+        </w:rPr>
+        <w:br/>
+      </w:r>
+      <w:r>
+        <w:rPr>
+          <w:rFonts w:ascii="Courier New" w:hAnsi="Courier New"/>
+          <w:sz w:val="18"/>
+        </w:rPr>
+        <w:br/>
+        <w:t># JSONPlaceholder API tests (with OAuth2 token exchange)</w:t>
+      </w:r>
+      <w:r>
+        <w:rPr>
+          <w:rFonts w:ascii="Courier New" w:hAnsi="Courier New"/>
+          <w:sz w:val="18"/>
+        </w:rPr>
+        <w:br/>
+        <w:t>SERVICE_NAME=JSONPLACEHOLDER REGION=QA pytest -vvv -m "jsonplaceholder" tests/</w:t>
       </w:r>
     </w:p>
     <w:p>
@@ -14106,7 +14133,7 @@
         </w:pBdr>
       </w:pPr>
       <w:bookmarkStart w:id="77" w:name="_Toc227103035"/>
-      <w:bookmarkStart w:id="78" w:name="_Toc227333433"/>
+      <w:bookmarkStart w:id="78" w:name="_Toc227442713"/>
       <w:r>
         <w:rPr>
           <w:sz w:val="36"/>
@@ -14122,7 +14149,7 @@
         <w:pStyle w:val="Heading2"/>
       </w:pPr>
       <w:bookmarkStart w:id="79" w:name="_Toc227103036"/>
-      <w:bookmarkStart w:id="80" w:name="_Toc227333434"/>
+      <w:bookmarkStart w:id="80" w:name="_Toc227442714"/>
       <w:r>
         <w:t>8.1 How Mobile Testing Works in This Framework</w:t>
       </w:r>
@@ -14139,7 +14166,7 @@
         <w:pStyle w:val="Heading2"/>
       </w:pPr>
       <w:bookmarkStart w:id="81" w:name="_Toc227103037"/>
-      <w:bookmarkStart w:id="82" w:name="_Toc227333435"/>
+      <w:bookmarkStart w:id="82" w:name="_Toc227442715"/>
       <w:r>
         <w:t>8.2 Mobile Setup Requirements</w:t>
       </w:r>
@@ -14362,7 +14389,7 @@
         <w:pStyle w:val="Heading2"/>
       </w:pPr>
       <w:bookmarkStart w:id="83" w:name="_Toc227103038"/>
-      <w:bookmarkStart w:id="84" w:name="_Toc227333436"/>
+      <w:bookmarkStart w:id="84" w:name="_Toc227442716"/>
       <w:r>
         <w:t>8.3 Running Mobile Tests</w:t>
       </w:r>
@@ -14399,7 +14426,7 @@
         </w:pBdr>
       </w:pPr>
       <w:bookmarkStart w:id="85" w:name="_Toc227103039"/>
-      <w:bookmarkStart w:id="86" w:name="_Toc227333437"/>
+      <w:bookmarkStart w:id="86" w:name="_Toc227442717"/>
       <w:r>
         <w:rPr>
           <w:sz w:val="36"/>
@@ -14427,7 +14454,7 @@
         <w:pStyle w:val="Heading2"/>
       </w:pPr>
       <w:bookmarkStart w:id="87" w:name="_Toc227103040"/>
-      <w:bookmarkStart w:id="88" w:name="_Toc227333438"/>
+      <w:bookmarkStart w:id="88" w:name="_Toc227442718"/>
       <w:r>
         <w:t>9.1 Custom Logger</w:t>
       </w:r>
@@ -14578,7 +14605,7 @@
         <w:pStyle w:val="Heading2"/>
       </w:pPr>
       <w:bookmarkStart w:id="89" w:name="_Toc227103041"/>
-      <w:bookmarkStart w:id="90" w:name="_Toc227333439"/>
+      <w:bookmarkStart w:id="90" w:name="_Toc227442719"/>
       <w:r>
         <w:t>9.2 Automatic Screenshot on Failure</w:t>
       </w:r>
@@ -14600,7 +14627,7 @@
         <w:pStyle w:val="Heading2"/>
       </w:pPr>
       <w:bookmarkStart w:id="91" w:name="_Toc227103042"/>
-      <w:bookmarkStart w:id="92" w:name="_Toc227333440"/>
+      <w:bookmarkStart w:id="92" w:name="_Toc227442720"/>
       <w:r>
         <w:t>9.3 Video Recording with ffmpeg</w:t>
       </w:r>
@@ -14714,7 +14741,7 @@
         <w:pStyle w:val="Heading2"/>
       </w:pPr>
       <w:bookmarkStart w:id="93" w:name="_Toc227103043"/>
-      <w:bookmarkStart w:id="94" w:name="_Toc227333441"/>
+      <w:bookmarkStart w:id="94" w:name="_Toc227442721"/>
       <w:r>
         <w:t>9.4 Output Folder — What Gets Created</w:t>
       </w:r>
@@ -14902,7 +14929,7 @@
         </w:pBdr>
       </w:pPr>
       <w:bookmarkStart w:id="95" w:name="_Toc227103044"/>
-      <w:bookmarkStart w:id="96" w:name="_Toc227333442"/>
+      <w:bookmarkStart w:id="96" w:name="_Toc227442722"/>
       <w:r>
         <w:rPr>
           <w:sz w:val="36"/>
@@ -14930,7 +14957,7 @@
         <w:pStyle w:val="Heading2"/>
       </w:pPr>
       <w:bookmarkStart w:id="97" w:name="_Toc227103045"/>
-      <w:bookmarkStart w:id="98" w:name="_Toc227333443"/>
+      <w:bookmarkStart w:id="98" w:name="_Toc227442723"/>
       <w:r>
         <w:t>10.1 pytest-html Report</w:t>
       </w:r>
@@ -14995,7 +15022,7 @@
         <w:pStyle w:val="Heading2"/>
       </w:pPr>
       <w:bookmarkStart w:id="99" w:name="_Toc227103046"/>
-      <w:bookmarkStart w:id="100" w:name="_Toc227333444"/>
+      <w:bookmarkStart w:id="100" w:name="_Toc227442724"/>
       <w:r>
         <w:t>10.2 Allure Report</w:t>
       </w:r>
@@ -15200,7 +15227,7 @@
         <w:pStyle w:val="Heading2"/>
       </w:pPr>
       <w:bookmarkStart w:id="101" w:name="_Toc227103047"/>
-      <w:bookmarkStart w:id="102" w:name="_Toc227333445"/>
+      <w:bookmarkStart w:id="102" w:name="_Toc227442725"/>
       <w:r>
         <w:t>10.3 Full Command — All Reporting Options Combined</w:t>
       </w:r>
@@ -15264,7 +15291,7 @@
         </w:pBdr>
       </w:pPr>
       <w:bookmarkStart w:id="103" w:name="_Toc227103048"/>
-      <w:bookmarkStart w:id="104" w:name="_Toc227333446"/>
+      <w:bookmarkStart w:id="104" w:name="_Toc227442726"/>
       <w:r>
         <w:rPr>
           <w:sz w:val="36"/>
@@ -15292,9 +15319,9 @@
         <w:pStyle w:val="Heading2"/>
       </w:pPr>
       <w:bookmarkStart w:id="105" w:name="_Toc227103049"/>
-      <w:bookmarkStart w:id="106" w:name="_Toc227333447"/>
-      <w:r>
-        <w:t>11.1 Parallel Execution with pytest-xdist</w:t>
+      <w:bookmarkStart w:id="106" w:name="_Toc227442727"/>
+      <w:r>
+        <w:t>11.2 Parallel Execution with pytest-xdist</w:t>
       </w:r>
       <w:bookmarkEnd w:id="105"/>
       <w:bookmarkEnd w:id="106"/>
@@ -15358,7 +15385,7 @@
         <w:pStyle w:val="Heading2"/>
       </w:pPr>
       <w:bookmarkStart w:id="107" w:name="_Toc227103050"/>
-      <w:bookmarkStart w:id="108" w:name="_Toc227333448"/>
+      <w:bookmarkStart w:id="108" w:name="_Toc227442728"/>
       <w:r>
         <w:t>11.2 Automatic Retry of Failed Tests</w:t>
       </w:r>
@@ -15431,7 +15458,7 @@
         <w:pStyle w:val="Heading2"/>
       </w:pPr>
       <w:bookmarkStart w:id="109" w:name="_Toc227103051"/>
-      <w:bookmarkStart w:id="110" w:name="_Toc227333449"/>
+      <w:bookmarkStart w:id="110" w:name="_Toc227442729"/>
       <w:r>
         <w:t>11.3 Parametrized (Data-Driven) Tests</w:t>
       </w:r>
@@ -15561,7 +15588,7 @@
         <w:pStyle w:val="Heading2"/>
       </w:pPr>
       <w:bookmarkStart w:id="111" w:name="_Toc227103052"/>
-      <w:bookmarkStart w:id="112" w:name="_Toc227333450"/>
+      <w:bookmarkStart w:id="112" w:name="_Toc227442730"/>
       <w:r>
         <w:lastRenderedPageBreak/>
         <w:t>11.4 Excel-Driven Tests</w:t>
@@ -15658,7 +15685,7 @@
         <w:pStyle w:val="Heading2"/>
       </w:pPr>
       <w:bookmarkStart w:id="113" w:name="_Toc227103053"/>
-      <w:bookmarkStart w:id="114" w:name="_Toc227333451"/>
+      <w:bookmarkStart w:id="114" w:name="_Toc227442731"/>
       <w:r>
         <w:t>11.5 BDD with pytest-bdd (Gherkin)</w:t>
       </w:r>
@@ -15779,7 +15806,7 @@
         </w:pBdr>
       </w:pPr>
       <w:bookmarkStart w:id="115" w:name="_Toc227103054"/>
-      <w:bookmarkStart w:id="116" w:name="_Toc227333452"/>
+      <w:bookmarkStart w:id="116" w:name="_Toc227442732"/>
       <w:r>
         <w:rPr>
           <w:sz w:val="36"/>
@@ -15795,7 +15822,7 @@
         <w:pStyle w:val="Heading2"/>
       </w:pPr>
       <w:bookmarkStart w:id="117" w:name="_Toc227103055"/>
-      <w:bookmarkStart w:id="118" w:name="_Toc227333453"/>
+      <w:bookmarkStart w:id="118" w:name="_Toc227442733"/>
       <w:r>
         <w:t>12.1 Why Docker?</w:t>
       </w:r>
@@ -15812,7 +15839,7 @@
         <w:pStyle w:val="Heading2"/>
       </w:pPr>
       <w:bookmarkStart w:id="119" w:name="_Toc227103056"/>
-      <w:bookmarkStart w:id="120" w:name="_Toc227333454"/>
+      <w:bookmarkStart w:id="120" w:name="_Toc227442734"/>
       <w:r>
         <w:t>12.2 Dockerfile Walkthrough</w:t>
       </w:r>
@@ -16083,7 +16110,7 @@
         <w:pStyle w:val="Heading2"/>
       </w:pPr>
       <w:bookmarkStart w:id="121" w:name="_Toc227103057"/>
-      <w:bookmarkStart w:id="122" w:name="_Toc227333455"/>
+      <w:bookmarkStart w:id="122" w:name="_Toc227442735"/>
       <w:r>
         <w:t>12.3 Building and Running Tests in Docker</w:t>
       </w:r>
@@ -16269,7 +16296,7 @@
         <w:pStyle w:val="Heading2"/>
       </w:pPr>
       <w:bookmarkStart w:id="123" w:name="_Toc227103058"/>
-      <w:bookmarkStart w:id="124" w:name="_Toc227333456"/>
+      <w:bookmarkStart w:id="124" w:name="_Toc227442736"/>
       <w:r>
         <w:t>12.4 Docker Layer Caching — Speed Tip</w:t>
       </w:r>
@@ -16294,7 +16321,7 @@
         </w:pBdr>
       </w:pPr>
       <w:bookmarkStart w:id="125" w:name="_Toc227103059"/>
-      <w:bookmarkStart w:id="126" w:name="_Toc227333457"/>
+      <w:bookmarkStart w:id="126" w:name="_Toc227442737"/>
       <w:r>
         <w:rPr>
           <w:sz w:val="36"/>
@@ -16310,7 +16337,7 @@
         <w:pStyle w:val="Heading2"/>
       </w:pPr>
       <w:bookmarkStart w:id="127" w:name="_Toc227103060"/>
-      <w:bookmarkStart w:id="128" w:name="_Toc227333458"/>
+      <w:bookmarkStart w:id="128" w:name="_Toc227442738"/>
       <w:r>
         <w:t>13.1 What is CI/CD?</w:t>
       </w:r>
@@ -16327,7 +16354,7 @@
         <w:pStyle w:val="Heading2"/>
       </w:pPr>
       <w:bookmarkStart w:id="129" w:name="_Toc227103061"/>
-      <w:bookmarkStart w:id="130" w:name="_Toc227333459"/>
+      <w:bookmarkStart w:id="130" w:name="_Toc227442739"/>
       <w:r>
         <w:t>13.2 Jenkins Pipeline Stages</w:t>
       </w:r>
@@ -16497,7 +16524,7 @@
           </w:tcPr>
           <w:p>
             <w:r>
-              <w:t>docker run --name selenium_test_container ...  pytest -m 'pta or reqres' -n 4 --reruns 3</w:t>
+              <w:t>docker run --name selenium_test_container ...  pytest -m 'pta or jsonplaceholder' -n 4 --reruns 3</w:t>
             </w:r>
           </w:p>
         </w:tc>
@@ -16578,7 +16605,7 @@
         <w:pStyle w:val="Heading2"/>
       </w:pPr>
       <w:bookmarkStart w:id="131" w:name="_Toc227103062"/>
-      <w:bookmarkStart w:id="132" w:name="_Toc227333460"/>
+      <w:bookmarkStart w:id="132" w:name="_Toc227442740"/>
       <w:r>
         <w:t>13.3 Jenkins Pipeline Parameters</w:t>
       </w:r>
@@ -16599,7 +16626,7 @@
         <w:pStyle w:val="Heading2"/>
       </w:pPr>
       <w:bookmarkStart w:id="133" w:name="_Toc227103063"/>
-      <w:bookmarkStart w:id="134" w:name="_Toc227333461"/>
+      <w:bookmarkStart w:id="134" w:name="_Toc227442741"/>
       <w:r>
         <w:t>13.4 Post-Build: Report Archival</w:t>
       </w:r>
@@ -16616,7 +16643,7 @@
         <w:pStyle w:val="Heading2"/>
       </w:pPr>
       <w:bookmarkStart w:id="135" w:name="_Toc227103064"/>
-      <w:bookmarkStart w:id="136" w:name="_Toc227333462"/>
+      <w:bookmarkStart w:id="136" w:name="_Toc227442742"/>
       <w:r>
         <w:t>13.5 Setting Up the Jenkins Job — Step by Step</w:t>
       </w:r>
@@ -16734,7 +16761,7 @@
           <w:sz w:val="36"/>
         </w:rPr>
       </w:pPr>
-      <w:bookmarkStart w:id="137" w:name="_Toc227333463"/>
+      <w:bookmarkStart w:id="137" w:name="_Toc227442743"/>
       <w:r>
         <w:rPr>
           <w:sz w:val="36"/>
@@ -16748,7 +16775,7 @@
       <w:pPr>
         <w:pStyle w:val="Heading2"/>
       </w:pPr>
-      <w:bookmarkStart w:id="138" w:name="_Toc227333464"/>
+      <w:bookmarkStart w:id="138" w:name="_Toc227442744"/>
       <w:r>
         <w:t>13B.1 Why GitHub Actions?</w:t>
       </w:r>
@@ -16840,7 +16867,7 @@
       <w:pPr>
         <w:pStyle w:val="Heading2"/>
       </w:pPr>
-      <w:bookmarkStart w:id="139" w:name="_Toc227333465"/>
+      <w:bookmarkStart w:id="139" w:name="_Toc227442745"/>
       <w:r>
         <w:t>13B.2 Workflow File Structure</w:t>
       </w:r>
@@ -16896,7 +16923,7 @@
       <w:pPr>
         <w:pStyle w:val="Heading2"/>
       </w:pPr>
-      <w:bookmarkStart w:id="140" w:name="_Toc227333466"/>
+      <w:bookmarkStart w:id="140" w:name="_Toc227442746"/>
       <w:r>
         <w:t>13B.3 Complete Workflow File — Annotated</w:t>
       </w:r>
@@ -17146,7 +17173,7 @@
       </w:r>
       <w:r>
         <w:br/>
-        <w:t xml:space="preserve">      # Step 6: Run PTA UI tests + Reqres API tests in headless mode</w:t>
+        <w:t xml:space="preserve">      # Step 6: Run PTA UI tests + JSONPlaceholder API tests in headless mode</w:t>
       </w:r>
       <w:r>
         <w:br/>
@@ -17162,7 +17189,7 @@
       </w:r>
       <w:r>
         <w:br/>
-        <w:t xml:space="preserve">          SERVICE_NAME: REQRES</w:t>
+        <w:t xml:space="preserve">          SERVICE_NAME: JSONPLACEHOLDER</w:t>
       </w:r>
       <w:r>
         <w:br/>
@@ -17182,7 +17209,7 @@
       </w:r>
       <w:r>
         <w:br/>
-        <w:t xml:space="preserve">          pytest -vvv -m "pta or reqres" \</w:t>
+        <w:t xml:space="preserve">          pytest -vvv -m "pta or jsonplaceholder" \</w:t>
       </w:r>
       <w:r>
         <w:br/>
@@ -17321,7 +17348,7 @@
       <w:pPr>
         <w:pStyle w:val="Heading2"/>
       </w:pPr>
-      <w:bookmarkStart w:id="141" w:name="_Toc227333467"/>
+      <w:bookmarkStart w:id="141" w:name="_Toc227442747"/>
       <w:r>
         <w:t>13B.4 Workflow Steps Explained</w:t>
       </w:r>
@@ -17336,7 +17363,7 @@
       <w:pPr>
         <w:pStyle w:val="Heading2"/>
       </w:pPr>
-      <w:bookmarkStart w:id="142" w:name="_Toc227333468"/>
+      <w:bookmarkStart w:id="142" w:name="_Toc227442748"/>
       <w:r>
         <w:t>13B.5 Storing Secrets in GitHub</w:t>
       </w:r>
@@ -17403,7 +17430,7 @@
       <w:pPr>
         <w:pStyle w:val="Heading2"/>
       </w:pPr>
-      <w:bookmarkStart w:id="143" w:name="_Toc227333469"/>
+      <w:bookmarkStart w:id="143" w:name="_Toc227442749"/>
       <w:r>
         <w:lastRenderedPageBreak/>
         <w:t>13B.6 Setting Up the Workflow — Step by Step</w:t>
@@ -17519,7 +17546,7 @@
         </w:pBdr>
       </w:pPr>
       <w:bookmarkStart w:id="144" w:name="_Toc227103065"/>
-      <w:bookmarkStart w:id="145" w:name="_Toc227333470"/>
+      <w:bookmarkStart w:id="145" w:name="_Toc227442750"/>
       <w:r>
         <w:rPr>
           <w:sz w:val="36"/>
@@ -17546,7 +17573,7 @@
         <w:pStyle w:val="Heading2"/>
       </w:pPr>
       <w:bookmarkStart w:id="146" w:name="_Toc227103066"/>
-      <w:bookmarkStart w:id="147" w:name="_Toc227333471"/>
+      <w:bookmarkStart w:id="147" w:name="_Toc227442751"/>
       <w:r>
         <w:t>14.1 What is Pylint?</w:t>
       </w:r>
@@ -17563,7 +17590,7 @@
         <w:pStyle w:val="Heading2"/>
       </w:pPr>
       <w:bookmarkStart w:id="148" w:name="_Toc227103067"/>
-      <w:bookmarkStart w:id="149" w:name="_Toc227333472"/>
+      <w:bookmarkStart w:id="149" w:name="_Toc227442752"/>
       <w:r>
         <w:t>14.2 Running Pylint</w:t>
       </w:r>
@@ -17661,7 +17688,7 @@
         <w:pStyle w:val="Heading2"/>
       </w:pPr>
       <w:bookmarkStart w:id="150" w:name="_Toc227103068"/>
-      <w:bookmarkStart w:id="151" w:name="_Toc227333473"/>
+      <w:bookmarkStart w:id="151" w:name="_Toc227442753"/>
       <w:r>
         <w:t>14.3 Suppressing Pylint Warnings</w:t>
       </w:r>
@@ -17727,7 +17754,7 @@
         <w:pStyle w:val="Heading2"/>
       </w:pPr>
       <w:bookmarkStart w:id="152" w:name="_Toc227103069"/>
-      <w:bookmarkStart w:id="153" w:name="_Toc227333474"/>
+      <w:bookmarkStart w:id="153" w:name="_Toc227442754"/>
       <w:r>
         <w:t>14.4 Commit Style — Conventional Commits</w:t>
       </w:r>
@@ -18057,7 +18084,7 @@
         <w:rPr>
           <w:b/>
         </w:rPr>
-        <w:t>Known scopes in this project: deps, conftest, logger, common, config, pta, hirokuapp, reqres, kwa, ci, readme</w:t>
+        <w:t>Known scopes in this project: deps, conftest, logger, common, config, pta, hirokuapp, jsonplaceholder, kwa, ci, readme</w:t>
       </w:r>
     </w:p>
     <w:p>
@@ -18073,7 +18100,7 @@
         </w:pBdr>
       </w:pPr>
       <w:bookmarkStart w:id="154" w:name="_Toc227103070"/>
-      <w:bookmarkStart w:id="155" w:name="_Toc227333475"/>
+      <w:bookmarkStart w:id="155" w:name="_Toc227442755"/>
       <w:r>
         <w:rPr>
           <w:sz w:val="36"/>
@@ -18101,7 +18128,7 @@
         <w:pStyle w:val="Heading2"/>
       </w:pPr>
       <w:bookmarkStart w:id="156" w:name="_Toc227103071"/>
-      <w:bookmarkStart w:id="157" w:name="_Toc227333476"/>
+      <w:bookmarkStart w:id="157" w:name="_Toc227442756"/>
       <w:r>
         <w:t>15.1 The Golden Rules of Test Automation</w:t>
       </w:r>
@@ -18396,7 +18423,7 @@
         <w:pStyle w:val="Heading2"/>
       </w:pPr>
       <w:bookmarkStart w:id="158" w:name="_Toc227103072"/>
-      <w:bookmarkStart w:id="159" w:name="_Toc227333477"/>
+      <w:bookmarkStart w:id="159" w:name="_Toc227442757"/>
       <w:r>
         <w:t>15.2 Adding a New UI Application — Checklist</w:t>
       </w:r>
@@ -18517,7 +18544,7 @@
         <w:pStyle w:val="Heading2"/>
       </w:pPr>
       <w:bookmarkStart w:id="160" w:name="_Toc227103073"/>
-      <w:bookmarkStart w:id="161" w:name="_Toc227333478"/>
+      <w:bookmarkStart w:id="161" w:name="_Toc227442758"/>
       <w:r>
         <w:t>15.3 Complete Command Quick Reference</w:t>
       </w:r>
@@ -18622,7 +18649,7 @@
           </w:tcPr>
           <w:p>
             <w:r>
-              <w:t>Run all Reqres API tests</w:t>
+              <w:t>Run all JSONPlaceholder API tests</w:t>
             </w:r>
           </w:p>
         </w:tc>
@@ -18633,7 +18660,7 @@
           </w:tcPr>
           <w:p>
             <w:r>
-              <w:t>SERVICE_NAME=REQRES REGION=QA pytest -vvv -m reqres tests/</w:t>
+              <w:t>SERVICE_NAME=JSONPLACEHOLDER REGION=QA pytest -vvv -m jsonplaceholder tests/</w:t>
             </w:r>
           </w:p>
         </w:tc>
@@ -18646,7 +18673,7 @@
           </w:tcPr>
           <w:p>
             <w:r>
-              <w:t>Run all Commerce Tools API tests</w:t>
+              <w:t>Run all JSONPlaceholder API tests</w:t>
             </w:r>
           </w:p>
         </w:tc>
@@ -18657,7 +18684,7 @@
           </w:tcPr>
           <w:p>
             <w:r>
-              <w:t>SERVICE_NAME=COMMERCE_TOOLS REGION=QA pytest -vvv -m commerce_tools tests/</w:t>
+              <w:t>SERVICE_NAME=JSONPLACEHOLDER REGION=QA pytest -vvv -m jsonplaceholder tests/</w:t>
             </w:r>
           </w:p>
         </w:tc>
@@ -19004,7 +19031,7 @@
         <w:pStyle w:val="Heading2"/>
       </w:pPr>
       <w:bookmarkStart w:id="162" w:name="_Toc227103074"/>
-      <w:bookmarkStart w:id="163" w:name="_Toc227333479"/>
+      <w:bookmarkStart w:id="163" w:name="_Toc227442759"/>
       <w:r>
         <w:t>15.4 Troubleshooting Common Issues</w:t>
       </w:r>
@@ -19360,7 +19387,7 @@
         <w:pStyle w:val="Heading2"/>
       </w:pPr>
       <w:bookmarkStart w:id="164" w:name="_Toc227103075"/>
-      <w:bookmarkStart w:id="165" w:name="_Toc227333480"/>
+      <w:bookmarkStart w:id="165" w:name="_Toc227442760"/>
       <w:r>
         <w:t>15.5 Framework Architecture Summary Diagram</w:t>
       </w:r>
@@ -19851,7 +19878,7 @@
         <w:pStyle w:val="Heading2"/>
       </w:pPr>
       <w:bookmarkStart w:id="166" w:name="_Toc227103076"/>
-      <w:bookmarkStart w:id="167" w:name="_Toc227333481"/>
+      <w:bookmarkStart w:id="167" w:name="_Toc227442761"/>
       <w:r>
         <w:lastRenderedPageBreak/>
         <w:t>15.6 Learning Path — What to Study Next</w:t>
@@ -20092,7 +20119,7 @@
           </w:tcPr>
           <w:p>
             <w:r>
-              <w:t>Add a new test to tests/api/reqres/ using the existing api_client fixture</w:t>
+              <w:t>Add a new test to tests/api/jsonplaceholder/ using the existing api_client fixture</w:t>
             </w:r>
           </w:p>
         </w:tc>
@@ -20321,7 +20348,7 @@
         </w:pBdr>
       </w:pPr>
       <w:bookmarkStart w:id="168" w:name="_Toc227103077"/>
-      <w:bookmarkStart w:id="169" w:name="_Toc227333482"/>
+      <w:bookmarkStart w:id="169" w:name="_Toc227442762"/>
       <w:r>
         <w:rPr>
           <w:sz w:val="36"/>
@@ -20334,7 +20361,7 @@
     </w:p>
     <w:p>
       <w:r>
-        <w:t>Additional files added in Version 1.1 of this framework:</w:t>
+        <w:t>Additional files added in Version 1.2 of this framework: JSONPlaceholder API integration (config/api/jsonplaceholder/, tests/api/jsonplaceholder/ — 9 test cases covering GET, POST, PUT, PATCH, DELETE, comments, users, todos), APIClient.patch() method added, commit-message skill updated to run git add -A first so no files are missed, test_digest_auth finally block uses except WebDriverException instead of broad except Exception.</w:t>
       </w:r>
     </w:p>
     <w:tbl>
@@ -20880,7 +20907,11 @@
           </w:tcPr>
           <w:p>
             <w:r>
-              <w:t>Register all custom markers to avoid PytestUnknownMarkWarning</w:t>
+              <w:t xml:space="preserve">Register all custom markers </w:t>
+            </w:r>
+            <w:r>
+              <w:lastRenderedPageBreak/>
+              <w:t>to avoid PytestUnknownMarkWarning</w:t>
             </w:r>
           </w:p>
         </w:tc>
@@ -20893,6 +20924,7 @@
           </w:tcPr>
           <w:p>
             <w:r>
+              <w:lastRenderedPageBreak/>
               <w:t>Dockerfile</w:t>
             </w:r>
           </w:p>
@@ -20915,11 +20947,7 @@
           </w:tcPr>
           <w:p>
             <w:r>
-              <w:t xml:space="preserve">Multi-stage container: Python 3.13 + Chrome + Firefox + </w:t>
-            </w:r>
-            <w:r>
-              <w:lastRenderedPageBreak/>
-              <w:t>Edge + ffmpeg</w:t>
+              <w:t>Multi-stage container: Python 3.13 + Chrome + Firefox + Edge + ffmpeg</w:t>
             </w:r>
           </w:p>
         </w:tc>
@@ -20932,7 +20960,6 @@
           </w:tcPr>
           <w:p>
             <w:r>
-              <w:lastRenderedPageBreak/>
               <w:t>Jenkinsfile</w:t>
             </w:r>
           </w:p>
@@ -21011,7 +21038,7 @@
           <w:sz w:val="36"/>
         </w:rPr>
       </w:pPr>
-      <w:bookmarkStart w:id="170" w:name="_Toc227333483"/>
+      <w:bookmarkStart w:id="170" w:name="_Toc227442763"/>
       <w:r>
         <w:rPr>
           <w:sz w:val="36"/>
@@ -21025,7 +21052,7 @@
       <w:pPr>
         <w:pStyle w:val="Heading2"/>
       </w:pPr>
-      <w:bookmarkStart w:id="171" w:name="_Toc227333484"/>
+      <w:bookmarkStart w:id="171" w:name="_Toc227442764"/>
       <w:r>
         <w:t>16.1 What is MCP?</w:t>
       </w:r>
@@ -21045,7 +21072,7 @@
       <w:pPr>
         <w:pStyle w:val="Heading2"/>
       </w:pPr>
-      <w:bookmarkStart w:id="172" w:name="_Toc227333485"/>
+      <w:bookmarkStart w:id="172" w:name="_Toc227442765"/>
       <w:r>
         <w:t>16.2 Configuration File Location</w:t>
       </w:r>
@@ -21089,7 +21116,7 @@
       <w:pPr>
         <w:pStyle w:val="Heading2"/>
       </w:pPr>
-      <w:bookmarkStart w:id="173" w:name="_Toc227333486"/>
+      <w:bookmarkStart w:id="173" w:name="_Toc227442766"/>
       <w:r>
         <w:t>16.3 The mcp.json File — Annotated</w:t>
       </w:r>
@@ -21113,7 +21140,7 @@
       <w:pPr>
         <w:pStyle w:val="Heading2"/>
       </w:pPr>
-      <w:bookmarkStart w:id="174" w:name="_Toc227333487"/>
+      <w:bookmarkStart w:id="174" w:name="_Toc227442767"/>
       <w:r>
         <w:t>16.4 MCP Server Reference</w:t>
       </w:r>
@@ -21128,7 +21155,7 @@
       <w:pPr>
         <w:pStyle w:val="Heading2"/>
       </w:pPr>
-      <w:bookmarkStart w:id="175" w:name="_Toc227333488"/>
+      <w:bookmarkStart w:id="175" w:name="_Toc227442768"/>
       <w:r>
         <w:t>16.5 Prerequisites — Installing MCP Server Dependencies</w:t>
       </w:r>
@@ -21193,7 +21220,7 @@
       <w:pPr>
         <w:pStyle w:val="Heading2"/>
       </w:pPr>
-      <w:bookmarkStart w:id="176" w:name="_Toc227333489"/>
+      <w:bookmarkStart w:id="176" w:name="_Toc227442769"/>
       <w:r>
         <w:t>16.6 How Each MCP Server Relates to This Framework</w:t>
       </w:r>
@@ -21327,7 +21354,7 @@
           <w:sz w:val="36"/>
         </w:rPr>
       </w:pPr>
-      <w:bookmarkStart w:id="177" w:name="_Toc227333490"/>
+      <w:bookmarkStart w:id="177" w:name="_Toc227442770"/>
       <w:r>
         <w:rPr>
           <w:sz w:val="36"/>
@@ -21341,7 +21368,7 @@
       <w:pPr>
         <w:pStyle w:val="Heading2"/>
       </w:pPr>
-      <w:bookmarkStart w:id="178" w:name="_Toc227333491"/>
+      <w:bookmarkStart w:id="178" w:name="_Toc227442771"/>
       <w:r>
         <w:t>17.1 What is CLAUDE.md?</w:t>
       </w:r>
@@ -21361,7 +21388,7 @@
       <w:pPr>
         <w:pStyle w:val="Heading2"/>
       </w:pPr>
-      <w:bookmarkStart w:id="179" w:name="_Toc227333492"/>
+      <w:bookmarkStart w:id="179" w:name="_Toc227442772"/>
       <w:r>
         <w:t>17.2 Commands Section</w:t>
       </w:r>
@@ -21381,7 +21408,7 @@
       <w:pPr>
         <w:pStyle w:val="Heading2"/>
       </w:pPr>
-      <w:bookmarkStart w:id="180" w:name="_Toc227333493"/>
+      <w:bookmarkStart w:id="180" w:name="_Toc227442773"/>
       <w:r>
         <w:t>17.3 Architecture Overview</w:t>
       </w:r>
@@ -21472,7 +21499,7 @@
       <w:pPr>
         <w:pStyle w:val="Heading2"/>
       </w:pPr>
-      <w:bookmarkStart w:id="181" w:name="_Toc227333494"/>
+      <w:bookmarkStart w:id="181" w:name="_Toc227442774"/>
       <w:r>
         <w:t>17.4 Configuration Loading, Fixture Chain &amp; Page Object Pattern</w:t>
       </w:r>
@@ -21502,7 +21529,7 @@
       <w:pPr>
         <w:pStyle w:val="Heading2"/>
       </w:pPr>
-      <w:bookmarkStart w:id="182" w:name="_Toc227333495"/>
+      <w:bookmarkStart w:id="182" w:name="_Toc227442775"/>
       <w:r>
         <w:t>17.5 Logging, Markers &amp; Commit Style</w:t>
       </w:r>
@@ -21515,19 +21542,19 @@
     </w:p>
     <w:p>
       <w:r>
-        <w:t>Markers and Scopes: CLAUDE.md lists all registered pytest markers and maps them 1-to-1 to app/service names: pta, hirokuapp, kwa, reqres, commerce_tools, excel, param, retry. When an AI assistant creates a new test class, it knows which marker to apply and that the marker must be registered in pytest.ini.</w:t>
-      </w:r>
-    </w:p>
-    <w:p>
-      <w:r>
-        <w:t>Commit Style: CLAUDE.md enforces the Conventional Commits specification and lists known scopes for this project: deps, conftest, logger, common, config, pta, hirokuapp, reqres, kwa, ci, readme. Every AI-generated commit message suggestion will follow the format type(scope): short description.</w:t>
+        <w:t>Markers and Scopes: CLAUDE.md lists all registered pytest markers and maps them 1-to-1 to app/service names: pta, hirokuapp, kwa, jsonplaceholder, jsonplaceholder, excel, param, retry. When an AI assistant creates a new test class, it knows which marker to apply and that the marker must be registered in pytest.ini.</w:t>
+      </w:r>
+    </w:p>
+    <w:p>
+      <w:r>
+        <w:t>Commit Style: CLAUDE.md enforces the Conventional Commits specification and lists known scopes for this project: deps, conftest, logger, common, config, pta, hirokuapp, jsonplaceholder, kwa, ci, readme. Every AI-generated commit message suggestion will follow the format type(scope): short description.</w:t>
       </w:r>
     </w:p>
     <w:p>
       <w:pPr>
         <w:pStyle w:val="Heading2"/>
       </w:pPr>
-      <w:bookmarkStart w:id="183" w:name="_Toc227333496"/>
+      <w:bookmarkStart w:id="183" w:name="_Toc227442776"/>
       <w:r>
         <w:lastRenderedPageBreak/>
         <w:t>17.6 The Full CLAUDE.md File</w:t>
@@ -21606,11 +21633,11 @@
       </w:r>
       <w:r>
         <w:br/>
-        <w:t># API - Reqres</w:t>
-      </w:r>
-      <w:r>
-        <w:br/>
-        <w:t>SERVICE_NAME=REQRES REGION=QA pytest -vvv -m "reqres" tests/</w:t>
+        <w:t># API - JSONPlaceholder</w:t>
+      </w:r>
+      <w:r>
+        <w:br/>
+        <w:t>SERVICE_NAME=JSONPLACEHOLDER REGION=QA pytest -vvv -m "jsonplaceholder" tests/</w:t>
       </w:r>
       <w:r>
         <w:br/>
@@ -21684,7 +21711,7 @@
       </w:r>
       <w:r>
         <w:br/>
-        <w:t>pta, hirokuapp, kwa, reqres, commerce_tools, excel, param, retry</w:t>
+        <w:t>pta, hirokuapp, kwa, jsonplaceholder, jsonplaceholder, excel, param, retry</w:t>
       </w:r>
       <w:r>
         <w:br/>
@@ -21698,7 +21725,7 @@
       </w:r>
       <w:r>
         <w:br/>
-        <w:t>This project enforces Conventional Commits. Known scopes: deps, conftest, logger, common, config, pta, hirokuapp, reqres, kwa, ci, readme.</w:t>
+        <w:t>This project enforces Conventional Commits. Known scopes: deps, conftest, logger, common, config, pta, hirokuapp, jsonplaceholder, kwa, ci, readme.</w:t>
       </w:r>
       <w:r>
         <w:br/>
@@ -21712,7 +21739,7 @@
       <w:pPr>
         <w:pStyle w:val="Heading2"/>
       </w:pPr>
-      <w:bookmarkStart w:id="184" w:name="_Toc227333497"/>
+      <w:bookmarkStart w:id="184" w:name="_Toc227442777"/>
       <w:r>
         <w:t>17.7 Creating CLAUDE.md with the claude init Command</w:t>
       </w:r>
@@ -21747,7 +21774,7 @@
       <w:pPr>
         <w:pStyle w:val="Heading2"/>
       </w:pPr>
-      <w:bookmarkStart w:id="185" w:name="_Toc227333498"/>
+      <w:bookmarkStart w:id="185" w:name="_Toc227442778"/>
       <w:r>
         <w:t>17.8 Claude Skills — .claude/skills/</w:t>
       </w:r>
@@ -21773,7 +21800,7 @@
       <w:pPr>
         <w:pStyle w:val="Heading3"/>
       </w:pPr>
-      <w:bookmarkStart w:id="186" w:name="_Toc227333499"/>
+      <w:bookmarkStart w:id="186" w:name="_Toc227442779"/>
       <w:r>
         <w:t>The commit-message Skill — .claude/skills/commit-message/SKILL.md</w:t>
       </w:r>
@@ -21821,27 +21848,27 @@
     </w:p>
     <w:p>
       <w:r>
-        <w:t>1. Run `git status` and `git diff --cached` to understand what is staged.</w:t>
-      </w:r>
-    </w:p>
-    <w:p>
-      <w:r>
-        <w:t>2. Read README.md's "Conventional Commit Message Reference" section for the format rules.</w:t>
-      </w:r>
-    </w:p>
-    <w:p>
-      <w:r>
-        <w:t>3. Draft a commit message following the format.</w:t>
-      </w:r>
-    </w:p>
-    <w:p>
-      <w:r>
-        <w:t>4. Present it to the user and ask for confirmation.</w:t>
-      </w:r>
-    </w:p>
-    <w:p>
-      <w:r>
-        <w:t>5. If confirmed, run `git add` and `git commit` with the message.</w:t>
+        <w:t>1. Run `git add -A` to stage all changed, new, and deleted files.</w:t>
+      </w:r>
+    </w:p>
+    <w:p>
+      <w:r>
+        <w:t>2. Run `git status` and `git diff --cached` to see the full set of staged changes.</w:t>
+      </w:r>
+    </w:p>
+    <w:p>
+      <w:r>
+        <w:t>3. Read README.md's "Conventional Commit Message Reference" section for the format rules.</w:t>
+      </w:r>
+    </w:p>
+    <w:p>
+      <w:r>
+        <w:t>4. Draft a commit message following the format and present it to the user for confirmation.</w:t>
+      </w:r>
+    </w:p>
+    <w:p>
+      <w:r>
+        <w:t>5. If confirmed, run `git commit` with the message (everything is already staged from step 1).</w:t>
       </w:r>
     </w:p>
     <w:p>
@@ -21858,7 +21885,7 @@
       <w:pPr>
         <w:pStyle w:val="Heading3"/>
       </w:pPr>
-      <w:bookmarkStart w:id="187" w:name="_Toc227333500"/>
+      <w:bookmarkStart w:id="187" w:name="_Toc227442780"/>
       <w:r>
         <w:t>Creating Your Own Skills</w:t>
       </w:r>
@@ -21866,12 +21893,15 @@
     </w:p>
     <w:p>
       <w:r>
-        <w:t>You can create a skill for any repetitive multi-step workflow in your project. Good candidates for this framework include: running the full test suite and generating an Allure report, adding a new page object following the three-section pattern, or scaffolding a complete new app test suite (config YAML + page objects + test file + pytest marker).</w:t>
-      </w:r>
-    </w:p>
-    <w:p>
+        <w:t xml:space="preserve">You can create a skill for any repetitive multi-step workflow in your project. Good candidates for this framework include: running the full test suite and generating an Allure </w:t>
+      </w:r>
       <w:r>
         <w:lastRenderedPageBreak/>
+        <w:t>report, adding a new page object following the three-section pattern, or scaffolding a complete new app test suite (config YAML + page objects + test file + pytest marker).</w:t>
+      </w:r>
+    </w:p>
+    <w:p>
+      <w:r>
         <w:t xml:space="preserve">To create a new skill: </w:t>
       </w:r>
     </w:p>
@@ -21903,7 +21933,7 @@
         </w:pBdr>
       </w:pPr>
       <w:bookmarkStart w:id="188" w:name="_Toc227103078"/>
-      <w:bookmarkStart w:id="189" w:name="_Toc227333501"/>
+      <w:bookmarkStart w:id="189" w:name="_Toc227442781"/>
       <w:r>
         <w:rPr>
           <w:sz w:val="36"/>
@@ -22097,7 +22127,11 @@
           </w:tcPr>
           <w:p>
             <w:r>
-              <w:t>Installs Python 3.13 and caches the pip download cache — dramatically speeds up runs after the first one.</w:t>
+              <w:t xml:space="preserve">Installs Python 3.13 and caches the pip download cache — dramatically speeds up runs after the </w:t>
+            </w:r>
+            <w:r>
+              <w:lastRenderedPageBreak/>
+              <w:t>first one.</w:t>
             </w:r>
           </w:p>
         </w:tc>
@@ -22110,6 +22144,7 @@
           </w:tcPr>
           <w:p>
             <w:r>
+              <w:lastRenderedPageBreak/>
               <w:t>3. Install dependencies</w:t>
             </w:r>
           </w:p>
@@ -22132,11 +22167,7 @@
           </w:tcPr>
           <w:p>
             <w:r>
-              <w:t>Installs all pinned packages (selenium, pytest, allure-</w:t>
-            </w:r>
-            <w:r>
-              <w:lastRenderedPageBreak/>
-              <w:t>pytest, etc.) inside the runner's Python environment.</w:t>
+              <w:t>Installs all pinned packages (selenium, pytest, allure-pytest, etc.) inside the runner's Python environment.</w:t>
             </w:r>
           </w:p>
         </w:tc>
@@ -22149,7 +22180,6 @@
           </w:tcPr>
           <w:p>
             <w:r>
-              <w:lastRenderedPageBreak/>
               <w:t>4. Install ffmpeg</w:t>
             </w:r>
           </w:p>
@@ -22567,7 +22597,11 @@
           </w:tcPr>
           <w:p>
             <w:r>
-              <w:t>@angiejones/mcp-selenium  (npx)</w:t>
+              <w:t xml:space="preserve">@angiejones/mcp-selenium  </w:t>
+            </w:r>
+            <w:r>
+              <w:lastRenderedPageBreak/>
+              <w:t>(npx)</w:t>
             </w:r>
           </w:p>
         </w:tc>
@@ -22584,7 +22618,12 @@
           </w:tcPr>
           <w:p>
             <w:r>
-              <w:t>Drive a browser via Selenium WebDriver — interact with elements, run scripts, capture screenshots</w:t>
+              <w:lastRenderedPageBreak/>
+              <w:t xml:space="preserve">Drive a browser via </w:t>
+            </w:r>
+            <w:r>
+              <w:lastRenderedPageBreak/>
+              <w:t>Selenium WebDriver — interact with elements, run scripts, capture screenshots</w:t>
             </w:r>
           </w:p>
         </w:tc>
@@ -23095,7 +23134,11 @@
           </w:tcPr>
           <w:p>
             <w:r>
-              <w:t>Stale element detection + dynamic UUID button IDs; proves DOM was fully re-rendered on click</w:t>
+              <w:t xml:space="preserve">Stale element detection + dynamic UUID button </w:t>
+            </w:r>
+            <w:r>
+              <w:lastRenderedPageBreak/>
+              <w:t>IDs; proves DOM was fully re-rendered on click</w:t>
             </w:r>
           </w:p>
         </w:tc>
@@ -23107,6 +23150,7 @@
           </w:tcPr>
           <w:p>
             <w:r>
+              <w:lastRenderedPageBreak/>
               <w:t>test_digest_auth</w:t>
             </w:r>
           </w:p>
@@ -23128,11 +23172,7 @@
           </w:tcPr>
           <w:p>
             <w:r>
-              <w:t xml:space="preserve">Hybrid approach: </w:t>
-            </w:r>
-            <w:r>
-              <w:lastRenderedPageBreak/>
-              <w:t>requests.HTTPDigestAuth for HTTP-level verification + CDP header injection for browser rendering</w:t>
+              <w:t>Hybrid approach: requests.HTTPDigestAuth for HTTP-level verification + CDP header injection for browser rendering</w:t>
             </w:r>
           </w:p>
         </w:tc>
@@ -23145,7 +23185,6 @@
           </w:tcPr>
           <w:p>
             <w:r>
-              <w:lastRenderedPageBreak/>
               <w:t>Command</w:t>
             </w:r>
           </w:p>
@@ -23242,7 +23281,7 @@
           </w:tcPr>
           <w:p>
             <w:r>
-              <w:t>SERVICE_NAME=REQRES REGION=QA pytest -vvv -m "reqres" tests/</w:t>
+              <w:t>SERVICE_NAME=JSONPLACEHOLDER REGION=QA pytest -vvv -m "jsonplaceholder" tests/</w:t>
             </w:r>
           </w:p>
         </w:tc>
@@ -23253,7 +23292,7 @@
           </w:tcPr>
           <w:p>
             <w:r>
-              <w:t>Run Reqres API tests</w:t>
+              <w:t>Run JSONPlaceholder API tests</w:t>
             </w:r>
           </w:p>
         </w:tc>
@@ -23481,11 +23520,11 @@
           </w:tcPr>
           <w:p>
             <w:r>
-              <w:t xml:space="preserve">Page Object for /digest_auth. Mirrors basic_auth_page.py with is_page_loaded() and is_authenticated() </w:t>
+              <w:t xml:space="preserve">Page Object for /digest_auth. Mirrors </w:t>
             </w:r>
             <w:r>
               <w:lastRenderedPageBreak/>
-              <w:t>targeting the Digest Auth heading and Congratulations success message.</w:t>
+              <w:t>basic_auth_page.py with is_page_loaded() and is_authenticated() targeting the Digest Auth heading and Congratulations success message.</w:t>
             </w:r>
           </w:p>
         </w:tc>
@@ -23519,7 +23558,7 @@
           </w:tcPr>
           <w:p>
             <w:r>
-              <w:t>Updated in v1.1: added digest_auth_username and digest_auth_password keys to all region blocks (DEV / QA / STAGE / PROD).</w:t>
+              <w:t>Updated in v1.2: added digest_auth_username and digest_auth_password keys to all region blocks (DEV / QA / STAGE / PROD).</w:t>
             </w:r>
           </w:p>
         </w:tc>

</xml_diff>